<commit_message>
M2: Normalization, updated ERD and schema
Applied 1NF,2NF and 3NF normalization
updated ERD and schema.
</commit_message>
<xml_diff>
--- a/BSSE_A_Version_Control_DBLabProject.docx
+++ b/BSSE_A_Version_Control_DBLabProject.docx
@@ -454,6 +454,40 @@
                 <w:szCs w:val="20"/>
               </w:rPr>
               <w:t>1.0</w:t>
+            </w:r>
+          </w:p>
+        </w:tc>
+      </w:tr>
+      <w:tr>
+        <w:tc>
+          <w:tcPr>
+            <w:tcW w:w="4680" w:type="dxa"/>
+          </w:tcPr>
+          <w:p>
+            <w:r>
+              <w:rPr>
+                <w:bCs/>
+                <w:color w:val="000000"/>
+                <w:sz w:val="20"/>
+                <w:szCs w:val="20"/>
+              </w:rPr>
+              <w:t>Normalization &amp; Updated ERD</w:t>
+            </w:r>
+          </w:p>
+        </w:tc>
+        <w:tc>
+          <w:tcPr>
+            <w:tcW w:w="4680" w:type="dxa"/>
+          </w:tcPr>
+          <w:p>
+            <w:r>
+              <w:rPr>
+                <w:bCs/>
+                <w:color w:val="000000"/>
+                <w:sz w:val="20"/>
+                <w:szCs w:val="20"/>
+              </w:rPr>
+              <w:t>1.1</w:t>
             </w:r>
           </w:p>
         </w:tc>
@@ -3779,13 +3813,4198 @@
         </w:tc>
       </w:tr>
     </w:tbl>
-    <w:p>
+    <w:p/>
+    <w:p/>
+    <w:p>
+      <w:pPr>
+        <w:spacing w:after="60"/>
+        <w:rPr>
+          <w:b/>
+          <w:sz w:val="24"/>
+          <w:szCs w:val="24"/>
+        </w:rPr>
+      </w:pPr>
+      <w:r>
+        <w:rPr>
+          <w:b/>
+          <w:sz w:val="24"/>
+          <w:szCs w:val="24"/>
+        </w:rPr>
+        <w:lastRenderedPageBreak/>
+        <w:t xml:space="preserve">MILESTONE 2  </w:t>
+      </w:r>
+    </w:p>
+    <w:p>
+      <w:pPr>
+        <w:pStyle w:val="Heading1"/>
+        <w:rPr>
+          <w:color w:val="auto"/>
+          <w:sz w:val="24"/>
+          <w:szCs w:val="24"/>
+        </w:rPr>
+      </w:pPr>
+      <w:r>
+        <w:rPr>
+          <w:color w:val="auto"/>
+          <w:sz w:val="24"/>
+          <w:szCs w:val="24"/>
+        </w:rPr>
+        <w:t>Normalization — Formal Analysis</w:t>
+      </w:r>
+      <w:r>
+        <w:rPr>
+          <w:color w:val="auto"/>
+          <w:sz w:val="24"/>
+          <w:szCs w:val="24"/>
+        </w:rPr>
+        <w:t>:</w:t>
+      </w:r>
+    </w:p>
+    <w:p>
+      <w:pPr>
+        <w:spacing w:before="60" w:after="60"/>
+      </w:pPr>
+      <w:r>
+        <w:t>This section documents the complete normalization of the Travel Itinerary Planner schema from 1NF through 3NF. Each table is analyzed individually with issue, change, and justification recorded.</w:t>
+      </w:r>
+    </w:p>
+    <w:p>
+      <w:pPr>
+        <w:pStyle w:val="Heading1"/>
+        <w:rPr>
+          <w:color w:val="auto"/>
+          <w:sz w:val="28"/>
+          <w:szCs w:val="28"/>
+        </w:rPr>
+      </w:pPr>
+      <w:r>
+        <w:rPr>
+          <w:color w:val="auto"/>
+          <w:sz w:val="28"/>
+          <w:szCs w:val="28"/>
+        </w:rPr>
+        <w:t>Step 1 — Normalization Process</w:t>
+      </w:r>
+      <w:r>
+        <w:rPr>
+          <w:color w:val="auto"/>
+          <w:sz w:val="28"/>
+          <w:szCs w:val="28"/>
+        </w:rPr>
+        <w:t>:</w:t>
+      </w:r>
+    </w:p>
+    <w:p>
+      <w:pPr>
+        <w:pStyle w:val="Heading2"/>
+        <w:rPr>
+          <w:color w:val="auto"/>
+        </w:rPr>
+      </w:pPr>
+      <w:r>
+        <w:rPr>
+          <w:color w:val="auto"/>
+        </w:rPr>
+        <w:t>First Normal Form (1NF):</w:t>
+      </w:r>
+    </w:p>
+    <w:p>
+      <w:pPr>
+        <w:spacing w:before="60" w:after="60"/>
+      </w:pPr>
+      <w:r>
+        <w:t>Rule: All columns hold atomic (single, indivisible) values. Each table has a primary key. No repeating groups or multi-valued columns.</w:t>
+      </w:r>
+    </w:p>
+    <w:p>
+      <w:pPr>
+        <w:spacing w:before="180" w:after="80"/>
+      </w:pPr>
+      <w:r>
+        <w:rPr>
+          <w:b/>
+          <w:bCs/>
+          <w:sz w:val="24"/>
+          <w:szCs w:val="24"/>
+        </w:rPr>
+        <w:t>Users — 1NF</w:t>
+      </w:r>
+      <w:r>
+        <w:rPr>
+          <w:b/>
+          <w:bCs/>
+          <w:sz w:val="24"/>
+          <w:szCs w:val="24"/>
+        </w:rPr>
+        <w:t>:</w:t>
+      </w:r>
+    </w:p>
+    <w:tbl>
+      <w:tblPr>
+        <w:tblStyle w:val="TableGrid"/>
+        <w:tblW w:w="9360" w:type="dxa"/>
+        <w:tblLook w:val="04A0" w:firstRow="1" w:lastRow="0" w:firstColumn="1" w:lastColumn="0" w:noHBand="0" w:noVBand="1"/>
+      </w:tblPr>
+      <w:tblGrid>
+        <w:gridCol w:w="2000"/>
+        <w:gridCol w:w="7360"/>
+      </w:tblGrid>
+      <w:tr>
+        <w:tc>
+          <w:tcPr>
+            <w:tcW w:w="2000" w:type="dxa"/>
+          </w:tcPr>
+          <w:p>
+            <w:r>
+              <w:rPr>
+                <w:b/>
+                <w:bCs/>
+                <w:sz w:val="20"/>
+                <w:szCs w:val="20"/>
+              </w:rPr>
+              <w:t>Table</w:t>
+            </w:r>
+          </w:p>
+        </w:tc>
+        <w:tc>
+          <w:tcPr>
+            <w:tcW w:w="7360" w:type="dxa"/>
+          </w:tcPr>
+          <w:p>
+            <w:r>
+              <w:rPr>
+                <w:b/>
+                <w:bCs/>
+                <w:sz w:val="20"/>
+                <w:szCs w:val="20"/>
+              </w:rPr>
+              <w:t>Users</w:t>
+            </w:r>
+          </w:p>
+        </w:tc>
+      </w:tr>
+      <w:tr>
+        <w:tc>
+          <w:tcPr>
+            <w:tcW w:w="2000" w:type="dxa"/>
+          </w:tcPr>
+          <w:p>
+            <w:r>
+              <w:rPr>
+                <w:b/>
+                <w:bCs/>
+                <w:color w:val="000000"/>
+                <w:sz w:val="20"/>
+                <w:szCs w:val="20"/>
+              </w:rPr>
+              <w:t>Issue / Check</w:t>
+            </w:r>
+          </w:p>
+        </w:tc>
+        <w:tc>
+          <w:tcPr>
+            <w:tcW w:w="7360" w:type="dxa"/>
+          </w:tcPr>
+          <w:p>
+            <w:r>
+              <w:rPr>
+                <w:color w:val="000000"/>
+                <w:sz w:val="20"/>
+                <w:szCs w:val="20"/>
+              </w:rPr>
+              <w:t>Check: atomic values, primary key, no repeating groups.</w:t>
+            </w:r>
+          </w:p>
+        </w:tc>
+      </w:tr>
+      <w:tr>
+        <w:tc>
+          <w:tcPr>
+            <w:tcW w:w="2000" w:type="dxa"/>
+          </w:tcPr>
+          <w:p>
+            <w:r>
+              <w:rPr>
+                <w:b/>
+                <w:bCs/>
+                <w:color w:val="000000"/>
+                <w:sz w:val="20"/>
+                <w:szCs w:val="20"/>
+              </w:rPr>
+              <w:t>Change Made</w:t>
+            </w:r>
+          </w:p>
+        </w:tc>
+        <w:tc>
+          <w:tcPr>
+            <w:tcW w:w="7360" w:type="dxa"/>
+          </w:tcPr>
+          <w:p>
+            <w:r>
+              <w:rPr>
+                <w:color w:val="000000"/>
+                <w:sz w:val="20"/>
+                <w:szCs w:val="20"/>
+              </w:rPr>
+              <w:t>No change required.</w:t>
+            </w:r>
+          </w:p>
+        </w:tc>
+      </w:tr>
+      <w:tr>
+        <w:tc>
+          <w:tcPr>
+            <w:tcW w:w="2000" w:type="dxa"/>
+          </w:tcPr>
+          <w:p>
+            <w:r>
+              <w:rPr>
+                <w:b/>
+                <w:bCs/>
+                <w:color w:val="000000"/>
+                <w:sz w:val="20"/>
+                <w:szCs w:val="20"/>
+              </w:rPr>
+              <w:t>Justification</w:t>
+            </w:r>
+          </w:p>
+        </w:tc>
+        <w:tc>
+          <w:tcPr>
+            <w:tcW w:w="7360" w:type="dxa"/>
+          </w:tcPr>
+          <w:p>
+            <w:proofErr w:type="spellStart"/>
+            <w:r>
+              <w:rPr>
+                <w:color w:val="000000"/>
+                <w:sz w:val="20"/>
+                <w:szCs w:val="20"/>
+              </w:rPr>
+              <w:t>UserID</w:t>
+            </w:r>
+            <w:proofErr w:type="spellEnd"/>
+            <w:r>
+              <w:rPr>
+                <w:color w:val="000000"/>
+                <w:sz w:val="20"/>
+                <w:szCs w:val="20"/>
+              </w:rPr>
+              <w:t xml:space="preserve"> is the primary key. Name, Email, Password are all single-valued atomic strings. Email is UNIQUE. No multi-valued attributes or repeating groups. Satisfies 1NF.</w:t>
+            </w:r>
+          </w:p>
+        </w:tc>
+      </w:tr>
+    </w:tbl>
+    <w:p>
+      <w:pPr>
+        <w:spacing w:before="60" w:after="60"/>
+      </w:pPr>
+    </w:p>
+    <w:p>
+      <w:pPr>
+        <w:spacing w:before="180" w:after="80"/>
+      </w:pPr>
+      <w:r>
+        <w:rPr>
+          <w:b/>
+          <w:bCs/>
+          <w:sz w:val="24"/>
+          <w:szCs w:val="24"/>
+        </w:rPr>
+        <w:t>Trips — 1NF</w:t>
+      </w:r>
+      <w:r>
+        <w:rPr>
+          <w:b/>
+          <w:bCs/>
+          <w:sz w:val="24"/>
+          <w:szCs w:val="24"/>
+        </w:rPr>
+        <w:t>:</w:t>
+      </w:r>
+    </w:p>
+    <w:tbl>
+      <w:tblPr>
+        <w:tblStyle w:val="TableGrid"/>
+        <w:tblW w:w="9360" w:type="dxa"/>
+        <w:tblLook w:val="04A0" w:firstRow="1" w:lastRow="0" w:firstColumn="1" w:lastColumn="0" w:noHBand="0" w:noVBand="1"/>
+      </w:tblPr>
+      <w:tblGrid>
+        <w:gridCol w:w="2000"/>
+        <w:gridCol w:w="7360"/>
+      </w:tblGrid>
+      <w:tr>
+        <w:tc>
+          <w:tcPr>
+            <w:tcW w:w="2000" w:type="dxa"/>
+          </w:tcPr>
+          <w:p>
+            <w:r>
+              <w:rPr>
+                <w:b/>
+                <w:bCs/>
+                <w:sz w:val="20"/>
+                <w:szCs w:val="20"/>
+              </w:rPr>
+              <w:t>Table</w:t>
+            </w:r>
+          </w:p>
+        </w:tc>
+        <w:tc>
+          <w:tcPr>
+            <w:tcW w:w="7360" w:type="dxa"/>
+          </w:tcPr>
+          <w:p>
+            <w:r>
+              <w:rPr>
+                <w:b/>
+                <w:bCs/>
+                <w:sz w:val="20"/>
+                <w:szCs w:val="20"/>
+              </w:rPr>
+              <w:t>Trips</w:t>
+            </w:r>
+          </w:p>
+        </w:tc>
+      </w:tr>
+      <w:tr>
+        <w:tc>
+          <w:tcPr>
+            <w:tcW w:w="2000" w:type="dxa"/>
+          </w:tcPr>
+          <w:p>
+            <w:r>
+              <w:rPr>
+                <w:b/>
+                <w:bCs/>
+                <w:color w:val="000000"/>
+                <w:sz w:val="20"/>
+                <w:szCs w:val="20"/>
+              </w:rPr>
+              <w:t>Issue / Check</w:t>
+            </w:r>
+          </w:p>
+        </w:tc>
+        <w:tc>
+          <w:tcPr>
+            <w:tcW w:w="7360" w:type="dxa"/>
+          </w:tcPr>
+          <w:p>
+            <w:r>
+              <w:rPr>
+                <w:color w:val="000000"/>
+                <w:sz w:val="20"/>
+                <w:szCs w:val="20"/>
+              </w:rPr>
+              <w:t>Check: atomic values, no repeating groups. Verify ERD City/Country label not carried into Trips.</w:t>
+            </w:r>
+          </w:p>
+        </w:tc>
+      </w:tr>
+      <w:tr>
+        <w:tc>
+          <w:tcPr>
+            <w:tcW w:w="2000" w:type="dxa"/>
+          </w:tcPr>
+          <w:p>
+            <w:r>
+              <w:rPr>
+                <w:b/>
+                <w:bCs/>
+                <w:color w:val="000000"/>
+                <w:sz w:val="20"/>
+                <w:szCs w:val="20"/>
+              </w:rPr>
+              <w:t>Change Made</w:t>
+            </w:r>
+          </w:p>
+        </w:tc>
+        <w:tc>
+          <w:tcPr>
+            <w:tcW w:w="7360" w:type="dxa"/>
+          </w:tcPr>
+          <w:p>
+            <w:r>
+              <w:rPr>
+                <w:color w:val="000000"/>
+                <w:sz w:val="20"/>
+                <w:szCs w:val="20"/>
+              </w:rPr>
+              <w:t>No change required to Trips. City/Country label was in Destinations ERD only.</w:t>
+            </w:r>
+          </w:p>
+        </w:tc>
+      </w:tr>
+      <w:tr>
+        <w:tc>
+          <w:tcPr>
+            <w:tcW w:w="2000" w:type="dxa"/>
+          </w:tcPr>
+          <w:p>
+            <w:r>
+              <w:rPr>
+                <w:b/>
+                <w:bCs/>
+                <w:color w:val="000000"/>
+                <w:sz w:val="20"/>
+                <w:szCs w:val="20"/>
+              </w:rPr>
+              <w:t>Justification</w:t>
+            </w:r>
+          </w:p>
+        </w:tc>
+        <w:tc>
+          <w:tcPr>
+            <w:tcW w:w="7360" w:type="dxa"/>
+          </w:tcPr>
+          <w:p>
+            <w:proofErr w:type="spellStart"/>
+            <w:r>
+              <w:rPr>
+                <w:color w:val="000000"/>
+                <w:sz w:val="20"/>
+                <w:szCs w:val="20"/>
+              </w:rPr>
+              <w:t>TripID</w:t>
+            </w:r>
+            <w:proofErr w:type="spellEnd"/>
+            <w:r>
+              <w:rPr>
+                <w:color w:val="000000"/>
+                <w:sz w:val="20"/>
+                <w:szCs w:val="20"/>
+              </w:rPr>
+              <w:t xml:space="preserve"> is PK. </w:t>
+            </w:r>
+            <w:proofErr w:type="spellStart"/>
+            <w:r>
+              <w:rPr>
+                <w:color w:val="000000"/>
+                <w:sz w:val="20"/>
+                <w:szCs w:val="20"/>
+              </w:rPr>
+              <w:t>TripTitle</w:t>
+            </w:r>
+            <w:proofErr w:type="spellEnd"/>
+            <w:r>
+              <w:rPr>
+                <w:color w:val="000000"/>
+                <w:sz w:val="20"/>
+                <w:szCs w:val="20"/>
+              </w:rPr>
+              <w:t xml:space="preserve">, </w:t>
+            </w:r>
+            <w:proofErr w:type="spellStart"/>
+            <w:r>
+              <w:rPr>
+                <w:color w:val="000000"/>
+                <w:sz w:val="20"/>
+                <w:szCs w:val="20"/>
+              </w:rPr>
+              <w:t>StartDate</w:t>
+            </w:r>
+            <w:proofErr w:type="spellEnd"/>
+            <w:r>
+              <w:rPr>
+                <w:color w:val="000000"/>
+                <w:sz w:val="20"/>
+                <w:szCs w:val="20"/>
+              </w:rPr>
+              <w:t xml:space="preserve">, </w:t>
+            </w:r>
+            <w:proofErr w:type="spellStart"/>
+            <w:r>
+              <w:rPr>
+                <w:color w:val="000000"/>
+                <w:sz w:val="20"/>
+                <w:szCs w:val="20"/>
+              </w:rPr>
+              <w:t>EndDate</w:t>
+            </w:r>
+            <w:proofErr w:type="spellEnd"/>
+            <w:r>
+              <w:rPr>
+                <w:color w:val="000000"/>
+                <w:sz w:val="20"/>
+                <w:szCs w:val="20"/>
+              </w:rPr>
+              <w:t xml:space="preserve">, </w:t>
+            </w:r>
+            <w:proofErr w:type="spellStart"/>
+            <w:r>
+              <w:rPr>
+                <w:color w:val="000000"/>
+                <w:sz w:val="20"/>
+                <w:szCs w:val="20"/>
+              </w:rPr>
+              <w:t>TotalBudget</w:t>
+            </w:r>
+            <w:proofErr w:type="spellEnd"/>
+            <w:r>
+              <w:rPr>
+                <w:color w:val="000000"/>
+                <w:sz w:val="20"/>
+                <w:szCs w:val="20"/>
+              </w:rPr>
+              <w:t xml:space="preserve"> are all atomic. </w:t>
+            </w:r>
+            <w:proofErr w:type="spellStart"/>
+            <w:r>
+              <w:rPr>
+                <w:color w:val="000000"/>
+                <w:sz w:val="20"/>
+                <w:szCs w:val="20"/>
+              </w:rPr>
+              <w:t>UserID</w:t>
+            </w:r>
+            <w:proofErr w:type="spellEnd"/>
+            <w:r>
+              <w:rPr>
+                <w:color w:val="000000"/>
+                <w:sz w:val="20"/>
+                <w:szCs w:val="20"/>
+              </w:rPr>
+              <w:t xml:space="preserve"> is a single FK integer per row. Satisfies 1NF.</w:t>
+            </w:r>
+          </w:p>
+        </w:tc>
+      </w:tr>
+    </w:tbl>
+    <w:p>
+      <w:pPr>
+        <w:spacing w:before="180" w:after="80"/>
+      </w:pPr>
+    </w:p>
+    <w:p>
+      <w:pPr>
+        <w:spacing w:before="180" w:after="80"/>
+      </w:pPr>
+      <w:r>
+        <w:rPr>
+          <w:b/>
+          <w:bCs/>
+          <w:sz w:val="24"/>
+          <w:szCs w:val="24"/>
+        </w:rPr>
+        <w:t>Destinations — 1NF</w:t>
+      </w:r>
+      <w:r>
+        <w:rPr>
+          <w:b/>
+          <w:bCs/>
+          <w:sz w:val="24"/>
+          <w:szCs w:val="24"/>
+        </w:rPr>
+        <w:t>:</w:t>
+      </w:r>
+    </w:p>
+    <w:tbl>
+      <w:tblPr>
+        <w:tblStyle w:val="TableGrid"/>
+        <w:tblW w:w="9360" w:type="dxa"/>
+        <w:tblLook w:val="04A0" w:firstRow="1" w:lastRow="0" w:firstColumn="1" w:lastColumn="0" w:noHBand="0" w:noVBand="1"/>
+      </w:tblPr>
+      <w:tblGrid>
+        <w:gridCol w:w="2000"/>
+        <w:gridCol w:w="7360"/>
+      </w:tblGrid>
+      <w:tr>
+        <w:tc>
+          <w:tcPr>
+            <w:tcW w:w="2000" w:type="dxa"/>
+          </w:tcPr>
+          <w:p>
+            <w:r>
+              <w:rPr>
+                <w:b/>
+                <w:bCs/>
+                <w:sz w:val="20"/>
+                <w:szCs w:val="20"/>
+              </w:rPr>
+              <w:t>Table</w:t>
+            </w:r>
+          </w:p>
+        </w:tc>
+        <w:tc>
+          <w:tcPr>
+            <w:tcW w:w="7360" w:type="dxa"/>
+          </w:tcPr>
+          <w:p>
+            <w:r>
+              <w:rPr>
+                <w:b/>
+                <w:bCs/>
+                <w:sz w:val="20"/>
+                <w:szCs w:val="20"/>
+              </w:rPr>
+              <w:t>Destinations</w:t>
+            </w:r>
+          </w:p>
+        </w:tc>
+      </w:tr>
+      <w:tr>
+        <w:tc>
+          <w:tcPr>
+            <w:tcW w:w="2000" w:type="dxa"/>
+          </w:tcPr>
+          <w:p>
+            <w:r>
+              <w:rPr>
+                <w:b/>
+                <w:bCs/>
+                <w:color w:val="000000"/>
+                <w:sz w:val="20"/>
+                <w:szCs w:val="20"/>
+              </w:rPr>
+              <w:t>Issue / Check</w:t>
+            </w:r>
+          </w:p>
+        </w:tc>
+        <w:tc>
+          <w:tcPr>
+            <w:tcW w:w="7360" w:type="dxa"/>
+          </w:tcPr>
+          <w:p>
+            <w:r>
+              <w:rPr>
+                <w:color w:val="000000"/>
+                <w:sz w:val="20"/>
+                <w:szCs w:val="20"/>
+              </w:rPr>
+              <w:t>Issue: ERD shows 'City/Country' as one combined oval — possible 1NF violation if stored as one concatenated column.</w:t>
+            </w:r>
+          </w:p>
+        </w:tc>
+      </w:tr>
+      <w:tr>
+        <w:tc>
+          <w:tcPr>
+            <w:tcW w:w="2000" w:type="dxa"/>
+          </w:tcPr>
+          <w:p>
+            <w:r>
+              <w:rPr>
+                <w:b/>
+                <w:bCs/>
+                <w:color w:val="000000"/>
+                <w:sz w:val="20"/>
+                <w:szCs w:val="20"/>
+              </w:rPr>
+              <w:t>Change Made</w:t>
+            </w:r>
+          </w:p>
+        </w:tc>
+        <w:tc>
+          <w:tcPr>
+            <w:tcW w:w="7360" w:type="dxa"/>
+          </w:tcPr>
+          <w:p>
+            <w:r>
+              <w:rPr>
+                <w:color w:val="000000"/>
+                <w:sz w:val="20"/>
+                <w:szCs w:val="20"/>
+              </w:rPr>
+              <w:t xml:space="preserve">Confirmed: SQL schema already uses separate City </w:t>
+            </w:r>
+            <w:proofErr w:type="gramStart"/>
+            <w:r>
+              <w:rPr>
+                <w:color w:val="000000"/>
+                <w:sz w:val="20"/>
+                <w:szCs w:val="20"/>
+              </w:rPr>
+              <w:t>VARCHAR(</w:t>
+            </w:r>
+            <w:proofErr w:type="gramEnd"/>
+            <w:r>
+              <w:rPr>
+                <w:color w:val="000000"/>
+                <w:sz w:val="20"/>
+                <w:szCs w:val="20"/>
+              </w:rPr>
+              <w:t>100) and Country VARCHAR(100) columns. ERD label updated to show two distinct ovals.</w:t>
+            </w:r>
+          </w:p>
+        </w:tc>
+      </w:tr>
+      <w:tr>
+        <w:tc>
+          <w:tcPr>
+            <w:tcW w:w="2000" w:type="dxa"/>
+          </w:tcPr>
+          <w:p>
+            <w:r>
+              <w:rPr>
+                <w:b/>
+                <w:bCs/>
+                <w:color w:val="000000"/>
+                <w:sz w:val="20"/>
+                <w:szCs w:val="20"/>
+              </w:rPr>
+              <w:t>Justification</w:t>
+            </w:r>
+          </w:p>
+        </w:tc>
+        <w:tc>
+          <w:tcPr>
+            <w:tcW w:w="7360" w:type="dxa"/>
+          </w:tcPr>
+          <w:p>
+            <w:proofErr w:type="spellStart"/>
+            <w:r>
+              <w:rPr>
+                <w:color w:val="000000"/>
+                <w:sz w:val="20"/>
+                <w:szCs w:val="20"/>
+              </w:rPr>
+              <w:t>DestinationID</w:t>
+            </w:r>
+            <w:proofErr w:type="spellEnd"/>
+            <w:r>
+              <w:rPr>
+                <w:color w:val="000000"/>
+                <w:sz w:val="20"/>
+                <w:szCs w:val="20"/>
+              </w:rPr>
+              <w:t xml:space="preserve"> is PK. City and Country are separate atomic columns. </w:t>
+            </w:r>
+            <w:proofErr w:type="spellStart"/>
+            <w:r>
+              <w:rPr>
+                <w:color w:val="000000"/>
+                <w:sz w:val="20"/>
+                <w:szCs w:val="20"/>
+              </w:rPr>
+              <w:t>ArrivalDate</w:t>
+            </w:r>
+            <w:proofErr w:type="spellEnd"/>
+            <w:r>
+              <w:rPr>
+                <w:color w:val="000000"/>
+                <w:sz w:val="20"/>
+                <w:szCs w:val="20"/>
+              </w:rPr>
+              <w:t xml:space="preserve"> and </w:t>
+            </w:r>
+            <w:proofErr w:type="spellStart"/>
+            <w:r>
+              <w:rPr>
+                <w:color w:val="000000"/>
+                <w:sz w:val="20"/>
+                <w:szCs w:val="20"/>
+              </w:rPr>
+              <w:t>DepartureDate</w:t>
+            </w:r>
+            <w:proofErr w:type="spellEnd"/>
+            <w:r>
+              <w:rPr>
+                <w:color w:val="000000"/>
+                <w:sz w:val="20"/>
+                <w:szCs w:val="20"/>
+              </w:rPr>
+              <w:t xml:space="preserve"> are individual DATE fields. Satisfies 1NF. ERD corrected in Step 3.</w:t>
+            </w:r>
+          </w:p>
+        </w:tc>
+      </w:tr>
+    </w:tbl>
+    <w:p>
+      <w:pPr>
+        <w:spacing w:before="60" w:after="60"/>
+      </w:pPr>
+    </w:p>
+    <w:p>
+      <w:pPr>
+        <w:spacing w:before="180" w:after="80"/>
+        <w:rPr>
+          <w:b/>
+          <w:bCs/>
+          <w:sz w:val="24"/>
+          <w:szCs w:val="24"/>
+        </w:rPr>
+      </w:pPr>
+    </w:p>
+    <w:p>
+      <w:pPr>
+        <w:spacing w:before="180" w:after="80"/>
+        <w:rPr>
+          <w:b/>
+          <w:bCs/>
+          <w:sz w:val="24"/>
+          <w:szCs w:val="24"/>
+        </w:rPr>
+      </w:pPr>
+    </w:p>
+    <w:p>
+      <w:pPr>
+        <w:spacing w:before="180" w:after="80"/>
+        <w:rPr>
+          <w:b/>
+          <w:bCs/>
+          <w:sz w:val="24"/>
+          <w:szCs w:val="24"/>
+        </w:rPr>
+      </w:pPr>
+    </w:p>
+    <w:p>
+      <w:pPr>
+        <w:spacing w:before="180" w:after="80"/>
+      </w:pPr>
+      <w:r>
+        <w:rPr>
+          <w:b/>
+          <w:bCs/>
+          <w:sz w:val="24"/>
+          <w:szCs w:val="24"/>
+        </w:rPr>
+        <w:lastRenderedPageBreak/>
+        <w:t>Hotels — 1NF:</w:t>
+      </w:r>
+    </w:p>
+    <w:tbl>
+      <w:tblPr>
+        <w:tblStyle w:val="TableGrid"/>
+        <w:tblW w:w="9360" w:type="dxa"/>
+        <w:tblLook w:val="04A0" w:firstRow="1" w:lastRow="0" w:firstColumn="1" w:lastColumn="0" w:noHBand="0" w:noVBand="1"/>
+      </w:tblPr>
+      <w:tblGrid>
+        <w:gridCol w:w="2000"/>
+        <w:gridCol w:w="7360"/>
+      </w:tblGrid>
+      <w:tr>
+        <w:tc>
+          <w:tcPr>
+            <w:tcW w:w="2000" w:type="dxa"/>
+          </w:tcPr>
+          <w:p>
+            <w:r>
+              <w:rPr>
+                <w:b/>
+                <w:bCs/>
+                <w:sz w:val="20"/>
+                <w:szCs w:val="20"/>
+              </w:rPr>
+              <w:t>Table</w:t>
+            </w:r>
+          </w:p>
+        </w:tc>
+        <w:tc>
+          <w:tcPr>
+            <w:tcW w:w="7360" w:type="dxa"/>
+          </w:tcPr>
+          <w:p>
+            <w:r>
+              <w:rPr>
+                <w:b/>
+                <w:bCs/>
+                <w:sz w:val="20"/>
+                <w:szCs w:val="20"/>
+              </w:rPr>
+              <w:t>Hotels</w:t>
+            </w:r>
+          </w:p>
+        </w:tc>
+      </w:tr>
+      <w:tr>
+        <w:trPr>
+          <w:trHeight w:val="368"/>
+        </w:trPr>
+        <w:tc>
+          <w:tcPr>
+            <w:tcW w:w="2000" w:type="dxa"/>
+          </w:tcPr>
+          <w:p>
+            <w:r>
+              <w:rPr>
+                <w:b/>
+                <w:bCs/>
+                <w:color w:val="000000"/>
+                <w:sz w:val="20"/>
+                <w:szCs w:val="20"/>
+              </w:rPr>
+              <w:t>Issue / Check</w:t>
+            </w:r>
+          </w:p>
+        </w:tc>
+        <w:tc>
+          <w:tcPr>
+            <w:tcW w:w="7360" w:type="dxa"/>
+          </w:tcPr>
+          <w:p>
+            <w:r>
+              <w:rPr>
+                <w:color w:val="000000"/>
+                <w:sz w:val="20"/>
+                <w:szCs w:val="20"/>
+              </w:rPr>
+              <w:t>Check: no repeating amenity lists or multi-valued fields.</w:t>
+            </w:r>
+          </w:p>
+        </w:tc>
+      </w:tr>
+      <w:tr>
+        <w:tc>
+          <w:tcPr>
+            <w:tcW w:w="2000" w:type="dxa"/>
+          </w:tcPr>
+          <w:p>
+            <w:r>
+              <w:rPr>
+                <w:b/>
+                <w:bCs/>
+                <w:color w:val="000000"/>
+                <w:sz w:val="20"/>
+                <w:szCs w:val="20"/>
+              </w:rPr>
+              <w:t>Change Made</w:t>
+            </w:r>
+          </w:p>
+        </w:tc>
+        <w:tc>
+          <w:tcPr>
+            <w:tcW w:w="7360" w:type="dxa"/>
+          </w:tcPr>
+          <w:p>
+            <w:r>
+              <w:rPr>
+                <w:color w:val="000000"/>
+                <w:sz w:val="20"/>
+                <w:szCs w:val="20"/>
+              </w:rPr>
+              <w:t>No change required.</w:t>
+            </w:r>
+          </w:p>
+        </w:tc>
+      </w:tr>
+      <w:tr>
+        <w:tc>
+          <w:tcPr>
+            <w:tcW w:w="2000" w:type="dxa"/>
+          </w:tcPr>
+          <w:p>
+            <w:r>
+              <w:rPr>
+                <w:b/>
+                <w:bCs/>
+                <w:color w:val="000000"/>
+                <w:sz w:val="20"/>
+                <w:szCs w:val="20"/>
+              </w:rPr>
+              <w:t>Justification</w:t>
+            </w:r>
+          </w:p>
+        </w:tc>
+        <w:tc>
+          <w:tcPr>
+            <w:tcW w:w="7360" w:type="dxa"/>
+          </w:tcPr>
+          <w:p>
+            <w:proofErr w:type="spellStart"/>
+            <w:r>
+              <w:rPr>
+                <w:color w:val="000000"/>
+                <w:sz w:val="20"/>
+                <w:szCs w:val="20"/>
+              </w:rPr>
+              <w:t>HotelID</w:t>
+            </w:r>
+            <w:proofErr w:type="spellEnd"/>
+            <w:r>
+              <w:rPr>
+                <w:color w:val="000000"/>
+                <w:sz w:val="20"/>
+                <w:szCs w:val="20"/>
+              </w:rPr>
+              <w:t xml:space="preserve"> is PK. All columns single-valued and atomic. Satisfies 1NF.</w:t>
+            </w:r>
+          </w:p>
+        </w:tc>
+      </w:tr>
+    </w:tbl>
+    <w:p>
+      <w:pPr>
+        <w:spacing w:before="60" w:after="60"/>
+      </w:pPr>
+    </w:p>
+    <w:p>
+      <w:pPr>
+        <w:spacing w:before="180" w:after="80"/>
+      </w:pPr>
+      <w:r>
+        <w:rPr>
+          <w:b/>
+          <w:bCs/>
+          <w:sz w:val="24"/>
+          <w:szCs w:val="24"/>
+        </w:rPr>
+        <w:t>Activities — 1NF:</w:t>
+      </w:r>
+    </w:p>
+    <w:tbl>
+      <w:tblPr>
+        <w:tblStyle w:val="TableGrid"/>
+        <w:tblW w:w="9360" w:type="dxa"/>
+        <w:tblLook w:val="04A0" w:firstRow="1" w:lastRow="0" w:firstColumn="1" w:lastColumn="0" w:noHBand="0" w:noVBand="1"/>
+      </w:tblPr>
+      <w:tblGrid>
+        <w:gridCol w:w="2000"/>
+        <w:gridCol w:w="7360"/>
+      </w:tblGrid>
+      <w:tr>
+        <w:tc>
+          <w:tcPr>
+            <w:tcW w:w="2000" w:type="dxa"/>
+          </w:tcPr>
+          <w:p>
+            <w:r>
+              <w:rPr>
+                <w:b/>
+                <w:bCs/>
+                <w:sz w:val="20"/>
+                <w:szCs w:val="20"/>
+              </w:rPr>
+              <w:t>Table</w:t>
+            </w:r>
+          </w:p>
+        </w:tc>
+        <w:tc>
+          <w:tcPr>
+            <w:tcW w:w="7360" w:type="dxa"/>
+          </w:tcPr>
+          <w:p>
+            <w:r>
+              <w:rPr>
+                <w:b/>
+                <w:bCs/>
+                <w:sz w:val="20"/>
+                <w:szCs w:val="20"/>
+              </w:rPr>
+              <w:t>Activities</w:t>
+            </w:r>
+          </w:p>
+        </w:tc>
+      </w:tr>
+      <w:tr>
+        <w:tc>
+          <w:tcPr>
+            <w:tcW w:w="2000" w:type="dxa"/>
+          </w:tcPr>
+          <w:p>
+            <w:r>
+              <w:rPr>
+                <w:b/>
+                <w:bCs/>
+                <w:color w:val="000000"/>
+                <w:sz w:val="20"/>
+                <w:szCs w:val="20"/>
+              </w:rPr>
+              <w:t>Issue / Check</w:t>
+            </w:r>
+          </w:p>
+        </w:tc>
+        <w:tc>
+          <w:tcPr>
+            <w:tcW w:w="7360" w:type="dxa"/>
+          </w:tcPr>
+          <w:p>
+            <w:r>
+              <w:rPr>
+                <w:color w:val="000000"/>
+                <w:sz w:val="20"/>
+                <w:szCs w:val="20"/>
+              </w:rPr>
+              <w:t xml:space="preserve">Check: </w:t>
+            </w:r>
+            <w:proofErr w:type="spellStart"/>
+            <w:r>
+              <w:rPr>
+                <w:color w:val="000000"/>
+                <w:sz w:val="20"/>
+                <w:szCs w:val="20"/>
+              </w:rPr>
+              <w:t>ActivityName</w:t>
+            </w:r>
+            <w:proofErr w:type="spellEnd"/>
+            <w:r>
+              <w:rPr>
+                <w:color w:val="000000"/>
+                <w:sz w:val="20"/>
+                <w:szCs w:val="20"/>
+              </w:rPr>
+              <w:t xml:space="preserve">, Location, </w:t>
+            </w:r>
+            <w:proofErr w:type="spellStart"/>
+            <w:r>
+              <w:rPr>
+                <w:color w:val="000000"/>
+                <w:sz w:val="20"/>
+                <w:szCs w:val="20"/>
+              </w:rPr>
+              <w:t>ActivityTime</w:t>
+            </w:r>
+            <w:proofErr w:type="spellEnd"/>
+            <w:r>
+              <w:rPr>
+                <w:color w:val="000000"/>
+                <w:sz w:val="20"/>
+                <w:szCs w:val="20"/>
+              </w:rPr>
+              <w:t>, Cost — all atomic?</w:t>
+            </w:r>
+          </w:p>
+        </w:tc>
+      </w:tr>
+      <w:tr>
+        <w:tc>
+          <w:tcPr>
+            <w:tcW w:w="2000" w:type="dxa"/>
+          </w:tcPr>
+          <w:p>
+            <w:r>
+              <w:rPr>
+                <w:b/>
+                <w:bCs/>
+                <w:color w:val="000000"/>
+                <w:sz w:val="20"/>
+                <w:szCs w:val="20"/>
+              </w:rPr>
+              <w:t>Change Made</w:t>
+            </w:r>
+          </w:p>
+        </w:tc>
+        <w:tc>
+          <w:tcPr>
+            <w:tcW w:w="7360" w:type="dxa"/>
+          </w:tcPr>
+          <w:p>
+            <w:r>
+              <w:rPr>
+                <w:color w:val="000000"/>
+                <w:sz w:val="20"/>
+                <w:szCs w:val="20"/>
+              </w:rPr>
+              <w:t>No change required.</w:t>
+            </w:r>
+          </w:p>
+        </w:tc>
+      </w:tr>
+      <w:tr>
+        <w:tc>
+          <w:tcPr>
+            <w:tcW w:w="2000" w:type="dxa"/>
+          </w:tcPr>
+          <w:p>
+            <w:r>
+              <w:rPr>
+                <w:b/>
+                <w:bCs/>
+                <w:color w:val="000000"/>
+                <w:sz w:val="20"/>
+                <w:szCs w:val="20"/>
+              </w:rPr>
+              <w:t>Justification</w:t>
+            </w:r>
+          </w:p>
+        </w:tc>
+        <w:tc>
+          <w:tcPr>
+            <w:tcW w:w="7360" w:type="dxa"/>
+          </w:tcPr>
+          <w:p>
+            <w:proofErr w:type="spellStart"/>
+            <w:r>
+              <w:rPr>
+                <w:color w:val="000000"/>
+                <w:sz w:val="20"/>
+                <w:szCs w:val="20"/>
+              </w:rPr>
+              <w:t>ActivityID</w:t>
+            </w:r>
+            <w:proofErr w:type="spellEnd"/>
+            <w:r>
+              <w:rPr>
+                <w:color w:val="000000"/>
+                <w:sz w:val="20"/>
+                <w:szCs w:val="20"/>
+              </w:rPr>
+              <w:t xml:space="preserve"> is PK. Every attribute holds exactly one value per row. Satisfies 1NF.</w:t>
+            </w:r>
+          </w:p>
+        </w:tc>
+      </w:tr>
+    </w:tbl>
+    <w:p>
+      <w:pPr>
+        <w:spacing w:before="60" w:after="60"/>
+      </w:pPr>
+    </w:p>
+    <w:p>
+      <w:pPr>
+        <w:spacing w:before="180" w:after="80"/>
+      </w:pPr>
+      <w:proofErr w:type="spellStart"/>
+      <w:r>
+        <w:rPr>
+          <w:b/>
+          <w:bCs/>
+          <w:sz w:val="24"/>
+          <w:szCs w:val="24"/>
+        </w:rPr>
+        <w:t>DaySchedule</w:t>
+      </w:r>
+      <w:proofErr w:type="spellEnd"/>
+      <w:r>
+        <w:rPr>
+          <w:b/>
+          <w:bCs/>
+          <w:sz w:val="24"/>
+          <w:szCs w:val="24"/>
+        </w:rPr>
+        <w:t xml:space="preserve"> — 1NF:</w:t>
+      </w:r>
+    </w:p>
+    <w:tbl>
+      <w:tblPr>
+        <w:tblStyle w:val="TableGrid"/>
+        <w:tblW w:w="9360" w:type="dxa"/>
+        <w:tblLook w:val="04A0" w:firstRow="1" w:lastRow="0" w:firstColumn="1" w:lastColumn="0" w:noHBand="0" w:noVBand="1"/>
+      </w:tblPr>
+      <w:tblGrid>
+        <w:gridCol w:w="2000"/>
+        <w:gridCol w:w="7360"/>
+      </w:tblGrid>
+      <w:tr>
+        <w:tc>
+          <w:tcPr>
+            <w:tcW w:w="2000" w:type="dxa"/>
+          </w:tcPr>
+          <w:p>
+            <w:r>
+              <w:rPr>
+                <w:b/>
+                <w:bCs/>
+                <w:sz w:val="20"/>
+                <w:szCs w:val="20"/>
+              </w:rPr>
+              <w:t>Table</w:t>
+            </w:r>
+          </w:p>
+        </w:tc>
+        <w:tc>
+          <w:tcPr>
+            <w:tcW w:w="7360" w:type="dxa"/>
+          </w:tcPr>
+          <w:p>
+            <w:proofErr w:type="spellStart"/>
+            <w:r>
+              <w:rPr>
+                <w:b/>
+                <w:bCs/>
+                <w:sz w:val="20"/>
+                <w:szCs w:val="20"/>
+              </w:rPr>
+              <w:t>DaySchedule</w:t>
+            </w:r>
+            <w:proofErr w:type="spellEnd"/>
+          </w:p>
+        </w:tc>
+      </w:tr>
+      <w:tr>
+        <w:tc>
+          <w:tcPr>
+            <w:tcW w:w="2000" w:type="dxa"/>
+          </w:tcPr>
+          <w:p>
+            <w:r>
+              <w:rPr>
+                <w:b/>
+                <w:bCs/>
+                <w:color w:val="000000"/>
+                <w:sz w:val="20"/>
+                <w:szCs w:val="20"/>
+              </w:rPr>
+              <w:t>Issue / Check</w:t>
+            </w:r>
+          </w:p>
+        </w:tc>
+        <w:tc>
+          <w:tcPr>
+            <w:tcW w:w="7360" w:type="dxa"/>
+          </w:tcPr>
+          <w:p>
+            <w:r>
+              <w:rPr>
+                <w:color w:val="000000"/>
+                <w:sz w:val="20"/>
+                <w:szCs w:val="20"/>
+              </w:rPr>
+              <w:t xml:space="preserve">Check: </w:t>
+            </w:r>
+            <w:proofErr w:type="spellStart"/>
+            <w:r>
+              <w:rPr>
+                <w:color w:val="000000"/>
+                <w:sz w:val="20"/>
+                <w:szCs w:val="20"/>
+              </w:rPr>
+              <w:t>TaskDescription</w:t>
+            </w:r>
+            <w:proofErr w:type="spellEnd"/>
+            <w:r>
+              <w:rPr>
+                <w:color w:val="000000"/>
+                <w:sz w:val="20"/>
+                <w:szCs w:val="20"/>
+              </w:rPr>
+              <w:t xml:space="preserve"> — could it store multiple tasks in one cell?</w:t>
+            </w:r>
+          </w:p>
+        </w:tc>
+      </w:tr>
+      <w:tr>
+        <w:tc>
+          <w:tcPr>
+            <w:tcW w:w="2000" w:type="dxa"/>
+          </w:tcPr>
+          <w:p>
+            <w:r>
+              <w:rPr>
+                <w:b/>
+                <w:bCs/>
+                <w:color w:val="000000"/>
+                <w:sz w:val="20"/>
+                <w:szCs w:val="20"/>
+              </w:rPr>
+              <w:t>Change Made</w:t>
+            </w:r>
+          </w:p>
+        </w:tc>
+        <w:tc>
+          <w:tcPr>
+            <w:tcW w:w="7360" w:type="dxa"/>
+          </w:tcPr>
+          <w:p>
+            <w:r>
+              <w:rPr>
+                <w:color w:val="000000"/>
+                <w:sz w:val="20"/>
+                <w:szCs w:val="20"/>
+              </w:rPr>
+              <w:t xml:space="preserve">No change required. </w:t>
+            </w:r>
+            <w:proofErr w:type="spellStart"/>
+            <w:r>
+              <w:rPr>
+                <w:color w:val="000000"/>
+                <w:sz w:val="20"/>
+                <w:szCs w:val="20"/>
+              </w:rPr>
+              <w:t>TaskDescription</w:t>
+            </w:r>
+            <w:proofErr w:type="spellEnd"/>
+            <w:r>
+              <w:rPr>
+                <w:color w:val="000000"/>
+                <w:sz w:val="20"/>
+                <w:szCs w:val="20"/>
+              </w:rPr>
+              <w:t xml:space="preserve"> holds one task per row. Multiple tasks on same day = multiple rows with different </w:t>
+            </w:r>
+            <w:proofErr w:type="spellStart"/>
+            <w:r>
+              <w:rPr>
+                <w:color w:val="000000"/>
+                <w:sz w:val="20"/>
+                <w:szCs w:val="20"/>
+              </w:rPr>
+              <w:t>ScheduleIDs</w:t>
+            </w:r>
+            <w:proofErr w:type="spellEnd"/>
+            <w:r>
+              <w:rPr>
+                <w:color w:val="000000"/>
+                <w:sz w:val="20"/>
+                <w:szCs w:val="20"/>
+              </w:rPr>
+              <w:t>.</w:t>
+            </w:r>
+          </w:p>
+        </w:tc>
+      </w:tr>
+      <w:tr>
+        <w:tc>
+          <w:tcPr>
+            <w:tcW w:w="2000" w:type="dxa"/>
+          </w:tcPr>
+          <w:p>
+            <w:r>
+              <w:rPr>
+                <w:b/>
+                <w:bCs/>
+                <w:color w:val="000000"/>
+                <w:sz w:val="20"/>
+                <w:szCs w:val="20"/>
+              </w:rPr>
+              <w:t>Justification</w:t>
+            </w:r>
+          </w:p>
+        </w:tc>
+        <w:tc>
+          <w:tcPr>
+            <w:tcW w:w="7360" w:type="dxa"/>
+          </w:tcPr>
+          <w:p>
+            <w:proofErr w:type="spellStart"/>
+            <w:r>
+              <w:rPr>
+                <w:color w:val="000000"/>
+                <w:sz w:val="20"/>
+                <w:szCs w:val="20"/>
+              </w:rPr>
+              <w:t>ScheduleID</w:t>
+            </w:r>
+            <w:proofErr w:type="spellEnd"/>
+            <w:r>
+              <w:rPr>
+                <w:color w:val="000000"/>
+                <w:sz w:val="20"/>
+                <w:szCs w:val="20"/>
+              </w:rPr>
+              <w:t xml:space="preserve"> is PK. All columns atomic. Satisfies 1NF.</w:t>
+            </w:r>
+          </w:p>
+        </w:tc>
+      </w:tr>
+    </w:tbl>
+    <w:p>
+      <w:pPr>
+        <w:spacing w:before="180" w:after="80"/>
+        <w:rPr>
+          <w:b/>
+          <w:bCs/>
+          <w:color w:val="2E5699"/>
+          <w:sz w:val="24"/>
+          <w:szCs w:val="24"/>
+        </w:rPr>
+      </w:pPr>
+    </w:p>
+    <w:p>
+      <w:pPr>
+        <w:spacing w:before="180" w:after="80"/>
+      </w:pPr>
+      <w:r>
+        <w:rPr>
+          <w:b/>
+          <w:bCs/>
+          <w:sz w:val="24"/>
+          <w:szCs w:val="24"/>
+        </w:rPr>
+        <w:t>Expenses — 1NF:</w:t>
+      </w:r>
+    </w:p>
+    <w:tbl>
+      <w:tblPr>
+        <w:tblStyle w:val="TableGrid"/>
+        <w:tblW w:w="9360" w:type="dxa"/>
+        <w:tblLook w:val="04A0" w:firstRow="1" w:lastRow="0" w:firstColumn="1" w:lastColumn="0" w:noHBand="0" w:noVBand="1"/>
+      </w:tblPr>
+      <w:tblGrid>
+        <w:gridCol w:w="2000"/>
+        <w:gridCol w:w="7360"/>
+      </w:tblGrid>
+      <w:tr>
+        <w:tc>
+          <w:tcPr>
+            <w:tcW w:w="2000" w:type="dxa"/>
+          </w:tcPr>
+          <w:p>
+            <w:r>
+              <w:rPr>
+                <w:b/>
+                <w:bCs/>
+                <w:sz w:val="20"/>
+                <w:szCs w:val="20"/>
+              </w:rPr>
+              <w:t>Table</w:t>
+            </w:r>
+          </w:p>
+        </w:tc>
+        <w:tc>
+          <w:tcPr>
+            <w:tcW w:w="7360" w:type="dxa"/>
+          </w:tcPr>
+          <w:p>
+            <w:r>
+              <w:rPr>
+                <w:b/>
+                <w:bCs/>
+                <w:sz w:val="20"/>
+                <w:szCs w:val="20"/>
+              </w:rPr>
+              <w:t>Expenses</w:t>
+            </w:r>
+          </w:p>
+        </w:tc>
+      </w:tr>
+      <w:tr>
+        <w:tc>
+          <w:tcPr>
+            <w:tcW w:w="2000" w:type="dxa"/>
+          </w:tcPr>
+          <w:p>
+            <w:r>
+              <w:rPr>
+                <w:b/>
+                <w:bCs/>
+                <w:color w:val="000000"/>
+                <w:sz w:val="20"/>
+                <w:szCs w:val="20"/>
+              </w:rPr>
+              <w:t>Issue / Check</w:t>
+            </w:r>
+          </w:p>
+        </w:tc>
+        <w:tc>
+          <w:tcPr>
+            <w:tcW w:w="7360" w:type="dxa"/>
+          </w:tcPr>
+          <w:p>
+            <w:r>
+              <w:rPr>
+                <w:color w:val="000000"/>
+                <w:sz w:val="20"/>
+                <w:szCs w:val="20"/>
+              </w:rPr>
+              <w:t>Check: Category CHECK constraint — is it storing a set in one cell?</w:t>
+            </w:r>
+          </w:p>
+        </w:tc>
+      </w:tr>
+      <w:tr>
+        <w:tc>
+          <w:tcPr>
+            <w:tcW w:w="2000" w:type="dxa"/>
+          </w:tcPr>
+          <w:p>
+            <w:r>
+              <w:rPr>
+                <w:b/>
+                <w:bCs/>
+                <w:color w:val="000000"/>
+                <w:sz w:val="20"/>
+                <w:szCs w:val="20"/>
+              </w:rPr>
+              <w:t>Change Made</w:t>
+            </w:r>
+          </w:p>
+        </w:tc>
+        <w:tc>
+          <w:tcPr>
+            <w:tcW w:w="7360" w:type="dxa"/>
+          </w:tcPr>
+          <w:p>
+            <w:r>
+              <w:rPr>
+                <w:color w:val="000000"/>
+                <w:sz w:val="20"/>
+                <w:szCs w:val="20"/>
+              </w:rPr>
+              <w:t>No change required. CHECK is a validation rule, not multi-value storage. Each row holds one category.</w:t>
+            </w:r>
+          </w:p>
+        </w:tc>
+      </w:tr>
+      <w:tr>
+        <w:tc>
+          <w:tcPr>
+            <w:tcW w:w="2000" w:type="dxa"/>
+          </w:tcPr>
+          <w:p>
+            <w:r>
+              <w:rPr>
+                <w:b/>
+                <w:bCs/>
+                <w:color w:val="000000"/>
+                <w:sz w:val="20"/>
+                <w:szCs w:val="20"/>
+              </w:rPr>
+              <w:t>Justification</w:t>
+            </w:r>
+          </w:p>
+        </w:tc>
+        <w:tc>
+          <w:tcPr>
+            <w:tcW w:w="7360" w:type="dxa"/>
+          </w:tcPr>
+          <w:p>
+            <w:proofErr w:type="spellStart"/>
+            <w:r>
+              <w:rPr>
+                <w:color w:val="000000"/>
+                <w:sz w:val="20"/>
+                <w:szCs w:val="20"/>
+              </w:rPr>
+              <w:t>ExpenseID</w:t>
+            </w:r>
+            <w:proofErr w:type="spellEnd"/>
+            <w:r>
+              <w:rPr>
+                <w:color w:val="000000"/>
+                <w:sz w:val="20"/>
+                <w:szCs w:val="20"/>
+              </w:rPr>
+              <w:t xml:space="preserve"> is PK. All columns single-valued. Satisfies 1NF.</w:t>
+            </w:r>
+          </w:p>
+        </w:tc>
+      </w:tr>
+    </w:tbl>
+    <w:p>
+      <w:pPr>
+        <w:spacing w:before="60" w:after="60"/>
+      </w:pPr>
+    </w:p>
+    <w:p>
+      <w:pPr>
+        <w:spacing w:before="120" w:after="120"/>
+      </w:pPr>
+    </w:p>
+    <w:p>
+      <w:pPr>
+        <w:pStyle w:val="Heading2"/>
+        <w:rPr>
+          <w:color w:val="auto"/>
+        </w:rPr>
+      </w:pPr>
+      <w:r>
+        <w:rPr>
+          <w:color w:val="auto"/>
+        </w:rPr>
+        <w:t>Second Normal Form (2NF):</w:t>
+      </w:r>
+    </w:p>
+    <w:p>
+      <w:pPr>
+        <w:spacing w:before="60" w:after="60"/>
+      </w:pPr>
+      <w:r>
+        <w:t>Rule: In 2NF AND every non-key attribute fully depends on the entire primary key. Partial dependency only possible with composite primary keys.</w:t>
+      </w:r>
+    </w:p>
+    <w:p>
+      <w:pPr>
+        <w:spacing w:before="120" w:after="60"/>
+      </w:pPr>
+    </w:p>
+    <w:p>
+      <w:pPr>
+        <w:spacing w:before="180" w:after="80"/>
+      </w:pPr>
+      <w:r>
+        <w:rPr>
+          <w:b/>
+          <w:bCs/>
+          <w:sz w:val="24"/>
+          <w:szCs w:val="24"/>
+        </w:rPr>
+        <w:t>All 7 Tables — 2NF</w:t>
+      </w:r>
+      <w:r>
+        <w:rPr>
+          <w:b/>
+          <w:bCs/>
+          <w:sz w:val="24"/>
+          <w:szCs w:val="24"/>
+        </w:rPr>
+        <w:t>:</w:t>
+      </w:r>
+    </w:p>
+    <w:tbl>
+      <w:tblPr>
+        <w:tblStyle w:val="TableGrid"/>
+        <w:tblW w:w="9360" w:type="dxa"/>
+        <w:tblLook w:val="04A0" w:firstRow="1" w:lastRow="0" w:firstColumn="1" w:lastColumn="0" w:noHBand="0" w:noVBand="1"/>
+      </w:tblPr>
+      <w:tblGrid>
+        <w:gridCol w:w="2000"/>
+        <w:gridCol w:w="7360"/>
+      </w:tblGrid>
+      <w:tr>
+        <w:tc>
+          <w:tcPr>
+            <w:tcW w:w="2000" w:type="dxa"/>
+          </w:tcPr>
+          <w:p>
+            <w:r>
+              <w:rPr>
+                <w:b/>
+                <w:bCs/>
+                <w:sz w:val="20"/>
+                <w:szCs w:val="20"/>
+              </w:rPr>
+              <w:t>Table</w:t>
+            </w:r>
+          </w:p>
+        </w:tc>
+        <w:tc>
+          <w:tcPr>
+            <w:tcW w:w="7360" w:type="dxa"/>
+          </w:tcPr>
+          <w:p>
+            <w:r>
+              <w:rPr>
+                <w:b/>
+                <w:bCs/>
+                <w:sz w:val="20"/>
+                <w:szCs w:val="20"/>
+              </w:rPr>
+              <w:t>All 7 Tables</w:t>
+            </w:r>
+          </w:p>
+        </w:tc>
+      </w:tr>
+      <w:tr>
+        <w:tc>
+          <w:tcPr>
+            <w:tcW w:w="2000" w:type="dxa"/>
+          </w:tcPr>
+          <w:p>
+            <w:r>
+              <w:rPr>
+                <w:b/>
+                <w:bCs/>
+                <w:color w:val="000000"/>
+                <w:sz w:val="20"/>
+                <w:szCs w:val="20"/>
+              </w:rPr>
+              <w:t>Issue / Check</w:t>
+            </w:r>
+          </w:p>
+        </w:tc>
+        <w:tc>
+          <w:tcPr>
+            <w:tcW w:w="7360" w:type="dxa"/>
+          </w:tcPr>
+          <w:p>
+            <w:r>
+              <w:rPr>
+                <w:color w:val="000000"/>
+                <w:sz w:val="20"/>
+                <w:szCs w:val="20"/>
+              </w:rPr>
+              <w:t>Do any non-key columns depend on only part of the primary key?</w:t>
+            </w:r>
+          </w:p>
+        </w:tc>
+      </w:tr>
+      <w:tr>
+        <w:tc>
+          <w:tcPr>
+            <w:tcW w:w="2000" w:type="dxa"/>
+          </w:tcPr>
+          <w:p>
+            <w:r>
+              <w:rPr>
+                <w:b/>
+                <w:bCs/>
+                <w:color w:val="000000"/>
+                <w:sz w:val="20"/>
+                <w:szCs w:val="20"/>
+              </w:rPr>
+              <w:t>Change Made</w:t>
+            </w:r>
+          </w:p>
+        </w:tc>
+        <w:tc>
+          <w:tcPr>
+            <w:tcW w:w="7360" w:type="dxa"/>
+          </w:tcPr>
+          <w:p>
+            <w:r>
+              <w:rPr>
+                <w:color w:val="000000"/>
+                <w:sz w:val="20"/>
+                <w:szCs w:val="20"/>
+              </w:rPr>
+              <w:t>No change required for any table.</w:t>
+            </w:r>
+          </w:p>
+        </w:tc>
+      </w:tr>
+      <w:tr>
+        <w:tc>
+          <w:tcPr>
+            <w:tcW w:w="2000" w:type="dxa"/>
+          </w:tcPr>
+          <w:p>
+            <w:r>
+              <w:rPr>
+                <w:b/>
+                <w:bCs/>
+                <w:color w:val="000000"/>
+                <w:sz w:val="20"/>
+                <w:szCs w:val="20"/>
+              </w:rPr>
+              <w:t>Justification</w:t>
+            </w:r>
+          </w:p>
+        </w:tc>
+        <w:tc>
+          <w:tcPr>
+            <w:tcW w:w="7360" w:type="dxa"/>
+          </w:tcPr>
+          <w:p>
+            <w:r>
+              <w:rPr>
+                <w:color w:val="000000"/>
+                <w:sz w:val="20"/>
+                <w:szCs w:val="20"/>
+              </w:rPr>
+              <w:t>Every table uses a single-column surrogate primary key (AUTO_INCREMENT INT). With a single-column PK, partial functional dependency is mathematically impossible — there is no 'part of the key' to partially depend on. All 7 tables satisfy 2NF.</w:t>
+            </w:r>
+          </w:p>
+        </w:tc>
+      </w:tr>
+    </w:tbl>
+    <w:p>
+      <w:pPr>
+        <w:spacing w:before="60" w:after="60"/>
+      </w:pPr>
+    </w:p>
+    <w:p>
+      <w:pPr>
+        <w:spacing w:before="120" w:after="120"/>
+      </w:pPr>
+    </w:p>
+    <w:p>
+      <w:pPr>
+        <w:pStyle w:val="Heading2"/>
+        <w:rPr>
+          <w:color w:val="auto"/>
+        </w:rPr>
+      </w:pPr>
+      <w:r>
+        <w:rPr>
+          <w:color w:val="auto"/>
+        </w:rPr>
+        <w:lastRenderedPageBreak/>
+        <w:t>Third Normal Form (3NF):</w:t>
+      </w:r>
+    </w:p>
+    <w:p>
+      <w:pPr>
+        <w:spacing w:before="60" w:after="60"/>
+      </w:pPr>
+      <w:r>
+        <w:t>Rule: In 2NF AND no non-key attribute is transitively dependent on the primary key via another non-key attribute.</w:t>
+      </w:r>
+    </w:p>
+    <w:p>
+      <w:pPr>
+        <w:spacing w:before="180" w:after="80"/>
+      </w:pPr>
+      <w:r>
+        <w:rPr>
+          <w:b/>
+          <w:bCs/>
+          <w:sz w:val="24"/>
+          <w:szCs w:val="24"/>
+        </w:rPr>
+        <w:t>Users — 3NF</w:t>
+      </w:r>
+      <w:r>
+        <w:rPr>
+          <w:b/>
+          <w:bCs/>
+          <w:sz w:val="24"/>
+          <w:szCs w:val="24"/>
+        </w:rPr>
+        <w:t>:</w:t>
+      </w:r>
+    </w:p>
+    <w:tbl>
+      <w:tblPr>
+        <w:tblStyle w:val="TableGrid"/>
+        <w:tblW w:w="9360" w:type="dxa"/>
+        <w:tblLook w:val="04A0" w:firstRow="1" w:lastRow="0" w:firstColumn="1" w:lastColumn="0" w:noHBand="0" w:noVBand="1"/>
+      </w:tblPr>
+      <w:tblGrid>
+        <w:gridCol w:w="2000"/>
+        <w:gridCol w:w="7360"/>
+      </w:tblGrid>
+      <w:tr>
+        <w:tc>
+          <w:tcPr>
+            <w:tcW w:w="2000" w:type="dxa"/>
+          </w:tcPr>
+          <w:p>
+            <w:r>
+              <w:rPr>
+                <w:b/>
+                <w:bCs/>
+                <w:sz w:val="20"/>
+                <w:szCs w:val="20"/>
+              </w:rPr>
+              <w:t>Table</w:t>
+            </w:r>
+          </w:p>
+        </w:tc>
+        <w:tc>
+          <w:tcPr>
+            <w:tcW w:w="7360" w:type="dxa"/>
+          </w:tcPr>
+          <w:p>
+            <w:r>
+              <w:rPr>
+                <w:b/>
+                <w:bCs/>
+                <w:sz w:val="20"/>
+                <w:szCs w:val="20"/>
+              </w:rPr>
+              <w:t>Users</w:t>
+            </w:r>
+          </w:p>
+        </w:tc>
+      </w:tr>
+      <w:tr>
+        <w:tc>
+          <w:tcPr>
+            <w:tcW w:w="2000" w:type="dxa"/>
+          </w:tcPr>
+          <w:p>
+            <w:r>
+              <w:rPr>
+                <w:b/>
+                <w:bCs/>
+                <w:color w:val="000000"/>
+                <w:sz w:val="20"/>
+                <w:szCs w:val="20"/>
+              </w:rPr>
+              <w:t>Issue / Check</w:t>
+            </w:r>
+          </w:p>
+        </w:tc>
+        <w:tc>
+          <w:tcPr>
+            <w:tcW w:w="7360" w:type="dxa"/>
+          </w:tcPr>
+          <w:p>
+            <w:r>
+              <w:rPr>
+                <w:color w:val="000000"/>
+                <w:sz w:val="20"/>
+                <w:szCs w:val="20"/>
+              </w:rPr>
+              <w:t>Does Email → Name or Password? Transitive chain via non-key columns?</w:t>
+            </w:r>
+          </w:p>
+        </w:tc>
+      </w:tr>
+      <w:tr>
+        <w:tc>
+          <w:tcPr>
+            <w:tcW w:w="2000" w:type="dxa"/>
+          </w:tcPr>
+          <w:p>
+            <w:r>
+              <w:rPr>
+                <w:b/>
+                <w:bCs/>
+                <w:color w:val="000000"/>
+                <w:sz w:val="20"/>
+                <w:szCs w:val="20"/>
+              </w:rPr>
+              <w:t>Change Made</w:t>
+            </w:r>
+          </w:p>
+        </w:tc>
+        <w:tc>
+          <w:tcPr>
+            <w:tcW w:w="7360" w:type="dxa"/>
+          </w:tcPr>
+          <w:p>
+            <w:r>
+              <w:rPr>
+                <w:color w:val="000000"/>
+                <w:sz w:val="20"/>
+                <w:szCs w:val="20"/>
+              </w:rPr>
+              <w:t>No change required.</w:t>
+            </w:r>
+          </w:p>
+        </w:tc>
+      </w:tr>
+      <w:tr>
+        <w:tc>
+          <w:tcPr>
+            <w:tcW w:w="2000" w:type="dxa"/>
+          </w:tcPr>
+          <w:p>
+            <w:r>
+              <w:rPr>
+                <w:b/>
+                <w:bCs/>
+                <w:color w:val="000000"/>
+                <w:sz w:val="20"/>
+                <w:szCs w:val="20"/>
+              </w:rPr>
+              <w:t>Justification</w:t>
+            </w:r>
+          </w:p>
+        </w:tc>
+        <w:tc>
+          <w:tcPr>
+            <w:tcW w:w="7360" w:type="dxa"/>
+          </w:tcPr>
+          <w:p>
+            <w:r>
+              <w:rPr>
+                <w:color w:val="000000"/>
+                <w:sz w:val="20"/>
+                <w:szCs w:val="20"/>
+              </w:rPr>
+              <w:t xml:space="preserve">Email has a UNIQUE constraint but does not functionally determine Name or Password in a database transitive sense. All non-key attributes are independent facts about </w:t>
+            </w:r>
+            <w:proofErr w:type="spellStart"/>
+            <w:r>
+              <w:rPr>
+                <w:color w:val="000000"/>
+                <w:sz w:val="20"/>
+                <w:szCs w:val="20"/>
+              </w:rPr>
+              <w:t>UserID</w:t>
+            </w:r>
+            <w:proofErr w:type="spellEnd"/>
+            <w:r>
+              <w:rPr>
+                <w:color w:val="000000"/>
+                <w:sz w:val="20"/>
+                <w:szCs w:val="20"/>
+              </w:rPr>
+              <w:t>. Satisfies 3NF.</w:t>
+            </w:r>
+          </w:p>
+        </w:tc>
+      </w:tr>
+    </w:tbl>
+    <w:p>
+      <w:pPr>
+        <w:spacing w:before="180" w:after="80"/>
+      </w:pPr>
+    </w:p>
+    <w:p>
+      <w:pPr>
+        <w:spacing w:before="180" w:after="80"/>
+      </w:pPr>
+      <w:r>
+        <w:rPr>
+          <w:b/>
+          <w:bCs/>
+          <w:sz w:val="24"/>
+          <w:szCs w:val="24"/>
+        </w:rPr>
+        <w:t>Trips — 3NF:</w:t>
+      </w:r>
+    </w:p>
+    <w:tbl>
+      <w:tblPr>
+        <w:tblStyle w:val="TableGrid"/>
+        <w:tblW w:w="9360" w:type="dxa"/>
+        <w:tblLook w:val="04A0" w:firstRow="1" w:lastRow="0" w:firstColumn="1" w:lastColumn="0" w:noHBand="0" w:noVBand="1"/>
+      </w:tblPr>
+      <w:tblGrid>
+        <w:gridCol w:w="2000"/>
+        <w:gridCol w:w="7360"/>
+      </w:tblGrid>
+      <w:tr>
+        <w:tc>
+          <w:tcPr>
+            <w:tcW w:w="2000" w:type="dxa"/>
+          </w:tcPr>
+          <w:p>
+            <w:r>
+              <w:rPr>
+                <w:b/>
+                <w:bCs/>
+                <w:sz w:val="20"/>
+                <w:szCs w:val="20"/>
+              </w:rPr>
+              <w:t>Table</w:t>
+            </w:r>
+          </w:p>
+        </w:tc>
+        <w:tc>
+          <w:tcPr>
+            <w:tcW w:w="7360" w:type="dxa"/>
+          </w:tcPr>
+          <w:p>
+            <w:r>
+              <w:rPr>
+                <w:b/>
+                <w:bCs/>
+                <w:sz w:val="20"/>
+                <w:szCs w:val="20"/>
+              </w:rPr>
+              <w:t>Trips</w:t>
+            </w:r>
+          </w:p>
+        </w:tc>
+      </w:tr>
+      <w:tr>
+        <w:tc>
+          <w:tcPr>
+            <w:tcW w:w="2000" w:type="dxa"/>
+          </w:tcPr>
+          <w:p>
+            <w:r>
+              <w:rPr>
+                <w:b/>
+                <w:bCs/>
+                <w:color w:val="000000"/>
+                <w:sz w:val="20"/>
+                <w:szCs w:val="20"/>
+              </w:rPr>
+              <w:t>Issue / Check</w:t>
+            </w:r>
+          </w:p>
+        </w:tc>
+        <w:tc>
+          <w:tcPr>
+            <w:tcW w:w="7360" w:type="dxa"/>
+          </w:tcPr>
+          <w:p>
+            <w:r>
+              <w:rPr>
+                <w:color w:val="000000"/>
+                <w:sz w:val="20"/>
+                <w:szCs w:val="20"/>
+              </w:rPr>
+              <w:t xml:space="preserve">Does </w:t>
+            </w:r>
+            <w:proofErr w:type="spellStart"/>
+            <w:r>
+              <w:rPr>
+                <w:color w:val="000000"/>
+                <w:sz w:val="20"/>
+                <w:szCs w:val="20"/>
+              </w:rPr>
+              <w:t>TotalBudget</w:t>
+            </w:r>
+            <w:proofErr w:type="spellEnd"/>
+            <w:r>
+              <w:rPr>
+                <w:color w:val="000000"/>
+                <w:sz w:val="20"/>
+                <w:szCs w:val="20"/>
+              </w:rPr>
+              <w:t xml:space="preserve"> derive from </w:t>
+            </w:r>
+            <w:proofErr w:type="spellStart"/>
+            <w:r>
+              <w:rPr>
+                <w:color w:val="000000"/>
+                <w:sz w:val="20"/>
+                <w:szCs w:val="20"/>
+              </w:rPr>
+              <w:t>StartDate</w:t>
+            </w:r>
+            <w:proofErr w:type="spellEnd"/>
+            <w:r>
+              <w:rPr>
+                <w:color w:val="000000"/>
+                <w:sz w:val="20"/>
+                <w:szCs w:val="20"/>
+              </w:rPr>
+              <w:t xml:space="preserve"> + </w:t>
+            </w:r>
+            <w:proofErr w:type="spellStart"/>
+            <w:r>
+              <w:rPr>
+                <w:color w:val="000000"/>
+                <w:sz w:val="20"/>
+                <w:szCs w:val="20"/>
+              </w:rPr>
+              <w:t>EndDate</w:t>
+            </w:r>
+            <w:proofErr w:type="spellEnd"/>
+            <w:r>
+              <w:rPr>
+                <w:color w:val="000000"/>
+                <w:sz w:val="20"/>
+                <w:szCs w:val="20"/>
+              </w:rPr>
+              <w:t xml:space="preserve">? Does </w:t>
+            </w:r>
+            <w:proofErr w:type="spellStart"/>
+            <w:r>
+              <w:rPr>
+                <w:color w:val="000000"/>
+                <w:sz w:val="20"/>
+                <w:szCs w:val="20"/>
+              </w:rPr>
+              <w:t>TripTitle</w:t>
+            </w:r>
+            <w:proofErr w:type="spellEnd"/>
+            <w:r>
+              <w:rPr>
+                <w:color w:val="000000"/>
+                <w:sz w:val="20"/>
+                <w:szCs w:val="20"/>
+              </w:rPr>
+              <w:t xml:space="preserve"> determine other columns?</w:t>
+            </w:r>
+          </w:p>
+        </w:tc>
+      </w:tr>
+      <w:tr>
+        <w:tc>
+          <w:tcPr>
+            <w:tcW w:w="2000" w:type="dxa"/>
+          </w:tcPr>
+          <w:p>
+            <w:r>
+              <w:rPr>
+                <w:b/>
+                <w:bCs/>
+                <w:color w:val="000000"/>
+                <w:sz w:val="20"/>
+                <w:szCs w:val="20"/>
+              </w:rPr>
+              <w:t>Change Made</w:t>
+            </w:r>
+          </w:p>
+        </w:tc>
+        <w:tc>
+          <w:tcPr>
+            <w:tcW w:w="7360" w:type="dxa"/>
+          </w:tcPr>
+          <w:p>
+            <w:r>
+              <w:rPr>
+                <w:color w:val="000000"/>
+                <w:sz w:val="20"/>
+                <w:szCs w:val="20"/>
+              </w:rPr>
+              <w:t>No change required.</w:t>
+            </w:r>
+          </w:p>
+        </w:tc>
+      </w:tr>
+      <w:tr>
+        <w:tc>
+          <w:tcPr>
+            <w:tcW w:w="2000" w:type="dxa"/>
+          </w:tcPr>
+          <w:p>
+            <w:r>
+              <w:rPr>
+                <w:b/>
+                <w:bCs/>
+                <w:color w:val="000000"/>
+                <w:sz w:val="20"/>
+                <w:szCs w:val="20"/>
+              </w:rPr>
+              <w:t>Justification</w:t>
+            </w:r>
+          </w:p>
+        </w:tc>
+        <w:tc>
+          <w:tcPr>
+            <w:tcW w:w="7360" w:type="dxa"/>
+          </w:tcPr>
+          <w:p>
+            <w:proofErr w:type="spellStart"/>
+            <w:r>
+              <w:rPr>
+                <w:color w:val="000000"/>
+                <w:sz w:val="20"/>
+                <w:szCs w:val="20"/>
+              </w:rPr>
+              <w:t>TotalBudget</w:t>
+            </w:r>
+            <w:proofErr w:type="spellEnd"/>
+            <w:r>
+              <w:rPr>
+                <w:color w:val="000000"/>
+                <w:sz w:val="20"/>
+                <w:szCs w:val="20"/>
+              </w:rPr>
+              <w:t xml:space="preserve"> is user-entered, not computed. </w:t>
+            </w:r>
+            <w:proofErr w:type="spellStart"/>
+            <w:r>
+              <w:rPr>
+                <w:color w:val="000000"/>
+                <w:sz w:val="20"/>
+                <w:szCs w:val="20"/>
+              </w:rPr>
+              <w:t>TripTitle</w:t>
+            </w:r>
+            <w:proofErr w:type="spellEnd"/>
+            <w:r>
+              <w:rPr>
+                <w:color w:val="000000"/>
+                <w:sz w:val="20"/>
+                <w:szCs w:val="20"/>
+              </w:rPr>
+              <w:t xml:space="preserve"> is descriptive only. No transitive dependencies. Satisfies 3NF.</w:t>
+            </w:r>
+          </w:p>
+        </w:tc>
+      </w:tr>
+    </w:tbl>
+    <w:p>
+      <w:pPr>
+        <w:spacing w:before="60" w:after="60"/>
+      </w:pPr>
+    </w:p>
+    <w:p>
+      <w:pPr>
+        <w:spacing w:before="180" w:after="80"/>
+      </w:pPr>
+      <w:r>
+        <w:rPr>
+          <w:b/>
+          <w:bCs/>
+          <w:sz w:val="24"/>
+          <w:szCs w:val="24"/>
+        </w:rPr>
+        <w:t>Destinations — 3NF</w:t>
+      </w:r>
+      <w:r>
+        <w:rPr>
+          <w:b/>
+          <w:bCs/>
+          <w:sz w:val="24"/>
+          <w:szCs w:val="24"/>
+        </w:rPr>
+        <w:t>:</w:t>
+      </w:r>
+    </w:p>
+    <w:tbl>
+      <w:tblPr>
+        <w:tblStyle w:val="TableGrid"/>
+        <w:tblW w:w="9360" w:type="dxa"/>
+        <w:tblLook w:val="04A0" w:firstRow="1" w:lastRow="0" w:firstColumn="1" w:lastColumn="0" w:noHBand="0" w:noVBand="1"/>
+      </w:tblPr>
+      <w:tblGrid>
+        <w:gridCol w:w="2000"/>
+        <w:gridCol w:w="7360"/>
+      </w:tblGrid>
+      <w:tr>
+        <w:tc>
+          <w:tcPr>
+            <w:tcW w:w="2000" w:type="dxa"/>
+          </w:tcPr>
+          <w:p>
+            <w:r>
+              <w:rPr>
+                <w:b/>
+                <w:bCs/>
+                <w:sz w:val="20"/>
+                <w:szCs w:val="20"/>
+              </w:rPr>
+              <w:t>Table</w:t>
+            </w:r>
+          </w:p>
+        </w:tc>
+        <w:tc>
+          <w:tcPr>
+            <w:tcW w:w="7360" w:type="dxa"/>
+          </w:tcPr>
+          <w:p>
+            <w:r>
+              <w:rPr>
+                <w:b/>
+                <w:bCs/>
+                <w:sz w:val="20"/>
+                <w:szCs w:val="20"/>
+              </w:rPr>
+              <w:t>Destinations</w:t>
+            </w:r>
+          </w:p>
+        </w:tc>
+      </w:tr>
+      <w:tr>
+        <w:tc>
+          <w:tcPr>
+            <w:tcW w:w="2000" w:type="dxa"/>
+          </w:tcPr>
+          <w:p>
+            <w:r>
+              <w:rPr>
+                <w:b/>
+                <w:bCs/>
+                <w:color w:val="000000"/>
+                <w:sz w:val="20"/>
+                <w:szCs w:val="20"/>
+              </w:rPr>
+              <w:t>Issue / Check</w:t>
+            </w:r>
+          </w:p>
+        </w:tc>
+        <w:tc>
+          <w:tcPr>
+            <w:tcW w:w="7360" w:type="dxa"/>
+          </w:tcPr>
+          <w:p>
+            <w:r>
+              <w:rPr>
+                <w:color w:val="000000"/>
+                <w:sz w:val="20"/>
+                <w:szCs w:val="20"/>
+              </w:rPr>
+              <w:t>Could Country → City create transitive dependency?</w:t>
+            </w:r>
+          </w:p>
+        </w:tc>
+      </w:tr>
+      <w:tr>
+        <w:tc>
+          <w:tcPr>
+            <w:tcW w:w="2000" w:type="dxa"/>
+          </w:tcPr>
+          <w:p>
+            <w:r>
+              <w:rPr>
+                <w:b/>
+                <w:bCs/>
+                <w:color w:val="000000"/>
+                <w:sz w:val="20"/>
+                <w:szCs w:val="20"/>
+              </w:rPr>
+              <w:t>Change Made</w:t>
+            </w:r>
+          </w:p>
+        </w:tc>
+        <w:tc>
+          <w:tcPr>
+            <w:tcW w:w="7360" w:type="dxa"/>
+          </w:tcPr>
+          <w:p>
+            <w:r>
+              <w:rPr>
+                <w:color w:val="000000"/>
+                <w:sz w:val="20"/>
+                <w:szCs w:val="20"/>
+              </w:rPr>
+              <w:t>No change required.</w:t>
+            </w:r>
+          </w:p>
+        </w:tc>
+      </w:tr>
+      <w:tr>
+        <w:tc>
+          <w:tcPr>
+            <w:tcW w:w="2000" w:type="dxa"/>
+          </w:tcPr>
+          <w:p>
+            <w:r>
+              <w:rPr>
+                <w:b/>
+                <w:bCs/>
+                <w:color w:val="000000"/>
+                <w:sz w:val="20"/>
+                <w:szCs w:val="20"/>
+              </w:rPr>
+              <w:t>Justification</w:t>
+            </w:r>
+          </w:p>
+        </w:tc>
+        <w:tc>
+          <w:tcPr>
+            <w:tcW w:w="7360" w:type="dxa"/>
+          </w:tcPr>
+          <w:p>
+            <w:r>
+              <w:rPr>
+                <w:color w:val="000000"/>
+                <w:sz w:val="20"/>
+                <w:szCs w:val="20"/>
+              </w:rPr>
+              <w:t xml:space="preserve">City does not determine Country or vice versa in a travel context. Both are direct properties of </w:t>
+            </w:r>
+            <w:proofErr w:type="spellStart"/>
+            <w:r>
+              <w:rPr>
+                <w:color w:val="000000"/>
+                <w:sz w:val="20"/>
+                <w:szCs w:val="20"/>
+              </w:rPr>
+              <w:t>DestinationID</w:t>
+            </w:r>
+            <w:proofErr w:type="spellEnd"/>
+            <w:r>
+              <w:rPr>
+                <w:color w:val="000000"/>
+                <w:sz w:val="20"/>
+                <w:szCs w:val="20"/>
+              </w:rPr>
+              <w:t>. Satisfies 3NF.</w:t>
+            </w:r>
+          </w:p>
+        </w:tc>
+      </w:tr>
+    </w:tbl>
+    <w:p>
+      <w:pPr>
+        <w:spacing w:before="60" w:after="60"/>
+      </w:pPr>
+    </w:p>
+    <w:p>
+      <w:pPr>
+        <w:spacing w:before="180" w:after="80"/>
+      </w:pPr>
+      <w:r>
+        <w:rPr>
+          <w:b/>
+          <w:bCs/>
+          <w:sz w:val="24"/>
+          <w:szCs w:val="24"/>
+        </w:rPr>
+        <w:t>Hotels — 3NF:</w:t>
+      </w:r>
+    </w:p>
+    <w:tbl>
+      <w:tblPr>
+        <w:tblStyle w:val="TableGrid"/>
+        <w:tblW w:w="9360" w:type="dxa"/>
+        <w:tblLook w:val="04A0" w:firstRow="1" w:lastRow="0" w:firstColumn="1" w:lastColumn="0" w:noHBand="0" w:noVBand="1"/>
+      </w:tblPr>
+      <w:tblGrid>
+        <w:gridCol w:w="2000"/>
+        <w:gridCol w:w="7360"/>
+      </w:tblGrid>
+      <w:tr>
+        <w:tc>
+          <w:tcPr>
+            <w:tcW w:w="2000" w:type="dxa"/>
+          </w:tcPr>
+          <w:p>
+            <w:r>
+              <w:rPr>
+                <w:b/>
+                <w:bCs/>
+                <w:sz w:val="20"/>
+                <w:szCs w:val="20"/>
+              </w:rPr>
+              <w:t>Table</w:t>
+            </w:r>
+          </w:p>
+        </w:tc>
+        <w:tc>
+          <w:tcPr>
+            <w:tcW w:w="7360" w:type="dxa"/>
+          </w:tcPr>
+          <w:p>
+            <w:r>
+              <w:rPr>
+                <w:b/>
+                <w:bCs/>
+                <w:sz w:val="20"/>
+                <w:szCs w:val="20"/>
+              </w:rPr>
+              <w:t>Hotels</w:t>
+            </w:r>
+          </w:p>
+        </w:tc>
+      </w:tr>
+      <w:tr>
+        <w:tc>
+          <w:tcPr>
+            <w:tcW w:w="2000" w:type="dxa"/>
+          </w:tcPr>
+          <w:p>
+            <w:r>
+              <w:rPr>
+                <w:b/>
+                <w:bCs/>
+                <w:color w:val="000000"/>
+                <w:sz w:val="20"/>
+                <w:szCs w:val="20"/>
+              </w:rPr>
+              <w:t>Issue / Check</w:t>
+            </w:r>
+          </w:p>
+        </w:tc>
+        <w:tc>
+          <w:tcPr>
+            <w:tcW w:w="7360" w:type="dxa"/>
+          </w:tcPr>
+          <w:p>
+            <w:r>
+              <w:rPr>
+                <w:color w:val="000000"/>
+                <w:sz w:val="20"/>
+                <w:szCs w:val="20"/>
+              </w:rPr>
+              <w:t xml:space="preserve">Could </w:t>
+            </w:r>
+            <w:proofErr w:type="spellStart"/>
+            <w:r>
+              <w:rPr>
+                <w:color w:val="000000"/>
+                <w:sz w:val="20"/>
+                <w:szCs w:val="20"/>
+              </w:rPr>
+              <w:t>HotelName</w:t>
+            </w:r>
+            <w:proofErr w:type="spellEnd"/>
+            <w:r>
+              <w:rPr>
+                <w:color w:val="000000"/>
+                <w:sz w:val="20"/>
+                <w:szCs w:val="20"/>
+              </w:rPr>
+              <w:t xml:space="preserve"> → </w:t>
+            </w:r>
+            <w:proofErr w:type="spellStart"/>
+            <w:r>
+              <w:rPr>
+                <w:color w:val="000000"/>
+                <w:sz w:val="20"/>
+                <w:szCs w:val="20"/>
+              </w:rPr>
+              <w:t>DestinationID</w:t>
+            </w:r>
+            <w:proofErr w:type="spellEnd"/>
+            <w:r>
+              <w:rPr>
+                <w:color w:val="000000"/>
+                <w:sz w:val="20"/>
+                <w:szCs w:val="20"/>
+              </w:rPr>
+              <w:t xml:space="preserve">? Could </w:t>
+            </w:r>
+            <w:proofErr w:type="spellStart"/>
+            <w:r>
+              <w:rPr>
+                <w:color w:val="000000"/>
+                <w:sz w:val="20"/>
+                <w:szCs w:val="20"/>
+              </w:rPr>
+              <w:t>CheckIn</w:t>
+            </w:r>
+            <w:proofErr w:type="spellEnd"/>
+            <w:r>
+              <w:rPr>
+                <w:color w:val="000000"/>
+                <w:sz w:val="20"/>
+                <w:szCs w:val="20"/>
+              </w:rPr>
+              <w:t>/</w:t>
+            </w:r>
+            <w:proofErr w:type="spellStart"/>
+            <w:r>
+              <w:rPr>
+                <w:color w:val="000000"/>
+                <w:sz w:val="20"/>
+                <w:szCs w:val="20"/>
+              </w:rPr>
+              <w:t>CheckOut</w:t>
+            </w:r>
+            <w:proofErr w:type="spellEnd"/>
+            <w:r>
+              <w:rPr>
+                <w:color w:val="000000"/>
+                <w:sz w:val="20"/>
+                <w:szCs w:val="20"/>
+              </w:rPr>
+              <w:t xml:space="preserve"> determine </w:t>
+            </w:r>
+            <w:proofErr w:type="spellStart"/>
+            <w:r>
+              <w:rPr>
+                <w:color w:val="000000"/>
+                <w:sz w:val="20"/>
+                <w:szCs w:val="20"/>
+              </w:rPr>
+              <w:t>CostPerNight</w:t>
+            </w:r>
+            <w:proofErr w:type="spellEnd"/>
+            <w:r>
+              <w:rPr>
+                <w:color w:val="000000"/>
+                <w:sz w:val="20"/>
+                <w:szCs w:val="20"/>
+              </w:rPr>
+              <w:t>?</w:t>
+            </w:r>
+          </w:p>
+        </w:tc>
+      </w:tr>
+      <w:tr>
+        <w:tc>
+          <w:tcPr>
+            <w:tcW w:w="2000" w:type="dxa"/>
+          </w:tcPr>
+          <w:p>
+            <w:r>
+              <w:rPr>
+                <w:b/>
+                <w:bCs/>
+                <w:color w:val="000000"/>
+                <w:sz w:val="20"/>
+                <w:szCs w:val="20"/>
+              </w:rPr>
+              <w:t>Change Made</w:t>
+            </w:r>
+          </w:p>
+        </w:tc>
+        <w:tc>
+          <w:tcPr>
+            <w:tcW w:w="7360" w:type="dxa"/>
+          </w:tcPr>
+          <w:p>
+            <w:r>
+              <w:rPr>
+                <w:color w:val="000000"/>
+                <w:sz w:val="20"/>
+                <w:szCs w:val="20"/>
+              </w:rPr>
+              <w:t>No change required.</w:t>
+            </w:r>
+          </w:p>
+        </w:tc>
+      </w:tr>
+      <w:tr>
+        <w:tc>
+          <w:tcPr>
+            <w:tcW w:w="2000" w:type="dxa"/>
+          </w:tcPr>
+          <w:p>
+            <w:r>
+              <w:rPr>
+                <w:b/>
+                <w:bCs/>
+                <w:color w:val="000000"/>
+                <w:sz w:val="20"/>
+                <w:szCs w:val="20"/>
+              </w:rPr>
+              <w:t>Justification</w:t>
+            </w:r>
+          </w:p>
+        </w:tc>
+        <w:tc>
+          <w:tcPr>
+            <w:tcW w:w="7360" w:type="dxa"/>
+          </w:tcPr>
+          <w:p>
+            <w:proofErr w:type="spellStart"/>
+            <w:r>
+              <w:rPr>
+                <w:color w:val="000000"/>
+                <w:sz w:val="20"/>
+                <w:szCs w:val="20"/>
+              </w:rPr>
+              <w:t>HotelName</w:t>
+            </w:r>
+            <w:proofErr w:type="spellEnd"/>
+            <w:r>
+              <w:rPr>
+                <w:color w:val="000000"/>
+                <w:sz w:val="20"/>
+                <w:szCs w:val="20"/>
+              </w:rPr>
+              <w:t xml:space="preserve"> does not determine </w:t>
+            </w:r>
+            <w:proofErr w:type="spellStart"/>
+            <w:r>
+              <w:rPr>
+                <w:color w:val="000000"/>
+                <w:sz w:val="20"/>
+                <w:szCs w:val="20"/>
+              </w:rPr>
+              <w:t>DestinationID</w:t>
+            </w:r>
+            <w:proofErr w:type="spellEnd"/>
+            <w:r>
+              <w:rPr>
+                <w:color w:val="000000"/>
+                <w:sz w:val="20"/>
+                <w:szCs w:val="20"/>
+              </w:rPr>
+              <w:t xml:space="preserve"> (same chain name could appear at multiple destinations). </w:t>
+            </w:r>
+            <w:proofErr w:type="spellStart"/>
+            <w:r>
+              <w:rPr>
+                <w:color w:val="000000"/>
+                <w:sz w:val="20"/>
+                <w:szCs w:val="20"/>
+              </w:rPr>
+              <w:t>CostPerNight</w:t>
+            </w:r>
+            <w:proofErr w:type="spellEnd"/>
+            <w:r>
+              <w:rPr>
+                <w:color w:val="000000"/>
+                <w:sz w:val="20"/>
+                <w:szCs w:val="20"/>
+              </w:rPr>
+              <w:t xml:space="preserve"> is user-entered, not computed from dates. Satisfies 3NF.</w:t>
+            </w:r>
+          </w:p>
+        </w:tc>
+      </w:tr>
+    </w:tbl>
+    <w:p>
+      <w:pPr>
+        <w:spacing w:before="60" w:after="60"/>
+      </w:pPr>
+    </w:p>
+    <w:p>
+      <w:pPr>
+        <w:spacing w:before="180" w:after="80"/>
+      </w:pPr>
+      <w:r>
+        <w:rPr>
+          <w:b/>
+          <w:bCs/>
+          <w:sz w:val="24"/>
+          <w:szCs w:val="24"/>
+        </w:rPr>
+        <w:t>Activities — 3NF</w:t>
+      </w:r>
+      <w:r>
+        <w:rPr>
+          <w:b/>
+          <w:bCs/>
+          <w:sz w:val="24"/>
+          <w:szCs w:val="24"/>
+        </w:rPr>
+        <w:t>:</w:t>
+      </w:r>
+    </w:p>
+    <w:tbl>
+      <w:tblPr>
+        <w:tblStyle w:val="TableGrid"/>
+        <w:tblW w:w="9360" w:type="dxa"/>
+        <w:tblLook w:val="04A0" w:firstRow="1" w:lastRow="0" w:firstColumn="1" w:lastColumn="0" w:noHBand="0" w:noVBand="1"/>
+      </w:tblPr>
+      <w:tblGrid>
+        <w:gridCol w:w="2000"/>
+        <w:gridCol w:w="7360"/>
+      </w:tblGrid>
+      <w:tr>
+        <w:tc>
+          <w:tcPr>
+            <w:tcW w:w="2000" w:type="dxa"/>
+          </w:tcPr>
+          <w:p>
+            <w:r>
+              <w:rPr>
+                <w:b/>
+                <w:bCs/>
+                <w:sz w:val="20"/>
+                <w:szCs w:val="20"/>
+              </w:rPr>
+              <w:t>Table</w:t>
+            </w:r>
+          </w:p>
+        </w:tc>
+        <w:tc>
+          <w:tcPr>
+            <w:tcW w:w="7360" w:type="dxa"/>
+          </w:tcPr>
+          <w:p>
+            <w:r>
+              <w:rPr>
+                <w:b/>
+                <w:bCs/>
+                <w:sz w:val="20"/>
+                <w:szCs w:val="20"/>
+              </w:rPr>
+              <w:t>Activities</w:t>
+            </w:r>
+          </w:p>
+        </w:tc>
+      </w:tr>
+      <w:tr>
+        <w:tc>
+          <w:tcPr>
+            <w:tcW w:w="2000" w:type="dxa"/>
+          </w:tcPr>
+          <w:p>
+            <w:r>
+              <w:rPr>
+                <w:b/>
+                <w:bCs/>
+                <w:color w:val="000000"/>
+                <w:sz w:val="20"/>
+                <w:szCs w:val="20"/>
+              </w:rPr>
+              <w:t>Issue / Check</w:t>
+            </w:r>
+          </w:p>
+        </w:tc>
+        <w:tc>
+          <w:tcPr>
+            <w:tcW w:w="7360" w:type="dxa"/>
+          </w:tcPr>
+          <w:p>
+            <w:r>
+              <w:rPr>
+                <w:color w:val="000000"/>
+                <w:sz w:val="20"/>
+                <w:szCs w:val="20"/>
+              </w:rPr>
+              <w:t xml:space="preserve">Does Location → </w:t>
+            </w:r>
+            <w:proofErr w:type="spellStart"/>
+            <w:r>
+              <w:rPr>
+                <w:color w:val="000000"/>
+                <w:sz w:val="20"/>
+                <w:szCs w:val="20"/>
+              </w:rPr>
+              <w:t>DestinationID</w:t>
+            </w:r>
+            <w:proofErr w:type="spellEnd"/>
+            <w:r>
+              <w:rPr>
+                <w:color w:val="000000"/>
+                <w:sz w:val="20"/>
+                <w:szCs w:val="20"/>
+              </w:rPr>
+              <w:t xml:space="preserve"> transitively? Could </w:t>
+            </w:r>
+            <w:proofErr w:type="spellStart"/>
+            <w:r>
+              <w:rPr>
+                <w:color w:val="000000"/>
+                <w:sz w:val="20"/>
+                <w:szCs w:val="20"/>
+              </w:rPr>
+              <w:t>ActivityName</w:t>
+            </w:r>
+            <w:proofErr w:type="spellEnd"/>
+            <w:r>
+              <w:rPr>
+                <w:color w:val="000000"/>
+                <w:sz w:val="20"/>
+                <w:szCs w:val="20"/>
+              </w:rPr>
+              <w:t xml:space="preserve"> determine Cost?</w:t>
+            </w:r>
+          </w:p>
+        </w:tc>
+      </w:tr>
+      <w:tr>
+        <w:tc>
+          <w:tcPr>
+            <w:tcW w:w="2000" w:type="dxa"/>
+          </w:tcPr>
+          <w:p>
+            <w:r>
+              <w:rPr>
+                <w:b/>
+                <w:bCs/>
+                <w:color w:val="000000"/>
+                <w:sz w:val="20"/>
+                <w:szCs w:val="20"/>
+              </w:rPr>
+              <w:t>Change Made</w:t>
+            </w:r>
+          </w:p>
+        </w:tc>
+        <w:tc>
+          <w:tcPr>
+            <w:tcW w:w="7360" w:type="dxa"/>
+          </w:tcPr>
+          <w:p>
+            <w:r>
+              <w:rPr>
+                <w:color w:val="000000"/>
+                <w:sz w:val="20"/>
+                <w:szCs w:val="20"/>
+              </w:rPr>
+              <w:t>No change required.</w:t>
+            </w:r>
+          </w:p>
+        </w:tc>
+      </w:tr>
+      <w:tr>
+        <w:tc>
+          <w:tcPr>
+            <w:tcW w:w="2000" w:type="dxa"/>
+          </w:tcPr>
+          <w:p>
+            <w:r>
+              <w:rPr>
+                <w:b/>
+                <w:bCs/>
+                <w:color w:val="000000"/>
+                <w:sz w:val="20"/>
+                <w:szCs w:val="20"/>
+              </w:rPr>
+              <w:t>Justification</w:t>
+            </w:r>
+          </w:p>
+        </w:tc>
+        <w:tc>
+          <w:tcPr>
+            <w:tcW w:w="7360" w:type="dxa"/>
+          </w:tcPr>
+          <w:p>
+            <w:r>
+              <w:rPr>
+                <w:color w:val="000000"/>
+                <w:sz w:val="20"/>
+                <w:szCs w:val="20"/>
+              </w:rPr>
+              <w:t xml:space="preserve">Location is a descriptive string, not a deterministic FK. </w:t>
+            </w:r>
+            <w:proofErr w:type="spellStart"/>
+            <w:r>
+              <w:rPr>
+                <w:color w:val="000000"/>
+                <w:sz w:val="20"/>
+                <w:szCs w:val="20"/>
+              </w:rPr>
+              <w:t>ActivityName</w:t>
+            </w:r>
+            <w:proofErr w:type="spellEnd"/>
+            <w:r>
+              <w:rPr>
+                <w:color w:val="000000"/>
+                <w:sz w:val="20"/>
+                <w:szCs w:val="20"/>
+              </w:rPr>
+              <w:t xml:space="preserve"> does not determine Cost. All non-key attributes depend solely on </w:t>
+            </w:r>
+            <w:proofErr w:type="spellStart"/>
+            <w:r>
+              <w:rPr>
+                <w:color w:val="000000"/>
+                <w:sz w:val="20"/>
+                <w:szCs w:val="20"/>
+              </w:rPr>
+              <w:t>ActivityID</w:t>
+            </w:r>
+            <w:proofErr w:type="spellEnd"/>
+            <w:r>
+              <w:rPr>
+                <w:color w:val="000000"/>
+                <w:sz w:val="20"/>
+                <w:szCs w:val="20"/>
+              </w:rPr>
+              <w:t>. Satisfies 3NF.</w:t>
+            </w:r>
+          </w:p>
+        </w:tc>
+      </w:tr>
+    </w:tbl>
+    <w:p>
+      <w:pPr>
+        <w:spacing w:before="180" w:after="80"/>
+        <w:rPr>
+          <w:b/>
+          <w:bCs/>
+          <w:color w:val="2E5699"/>
+          <w:sz w:val="24"/>
+          <w:szCs w:val="24"/>
+        </w:rPr>
+      </w:pPr>
+    </w:p>
+    <w:p>
+      <w:pPr>
+        <w:spacing w:before="180" w:after="80"/>
+      </w:pPr>
+      <w:proofErr w:type="spellStart"/>
+      <w:r>
+        <w:rPr>
+          <w:b/>
+          <w:bCs/>
+          <w:sz w:val="24"/>
+          <w:szCs w:val="24"/>
+        </w:rPr>
+        <w:lastRenderedPageBreak/>
+        <w:t>DaySchedule</w:t>
+      </w:r>
+      <w:proofErr w:type="spellEnd"/>
+      <w:r>
+        <w:rPr>
+          <w:b/>
+          <w:bCs/>
+          <w:sz w:val="24"/>
+          <w:szCs w:val="24"/>
+        </w:rPr>
+        <w:t xml:space="preserve"> — 3NF:</w:t>
+      </w:r>
+    </w:p>
+    <w:tbl>
+      <w:tblPr>
+        <w:tblStyle w:val="TableGrid"/>
+        <w:tblW w:w="9360" w:type="dxa"/>
+        <w:tblLook w:val="04A0" w:firstRow="1" w:lastRow="0" w:firstColumn="1" w:lastColumn="0" w:noHBand="0" w:noVBand="1"/>
+      </w:tblPr>
+      <w:tblGrid>
+        <w:gridCol w:w="2000"/>
+        <w:gridCol w:w="7360"/>
+      </w:tblGrid>
+      <w:tr>
+        <w:tc>
+          <w:tcPr>
+            <w:tcW w:w="2000" w:type="dxa"/>
+          </w:tcPr>
+          <w:p>
+            <w:r>
+              <w:rPr>
+                <w:b/>
+                <w:bCs/>
+                <w:sz w:val="20"/>
+                <w:szCs w:val="20"/>
+              </w:rPr>
+              <w:t>Table</w:t>
+            </w:r>
+          </w:p>
+        </w:tc>
+        <w:tc>
+          <w:tcPr>
+            <w:tcW w:w="7360" w:type="dxa"/>
+          </w:tcPr>
+          <w:p>
+            <w:proofErr w:type="spellStart"/>
+            <w:r>
+              <w:rPr>
+                <w:b/>
+                <w:bCs/>
+                <w:sz w:val="20"/>
+                <w:szCs w:val="20"/>
+              </w:rPr>
+              <w:t>DaySchedule</w:t>
+            </w:r>
+            <w:proofErr w:type="spellEnd"/>
+          </w:p>
+        </w:tc>
+      </w:tr>
+      <w:tr>
+        <w:tc>
+          <w:tcPr>
+            <w:tcW w:w="2000" w:type="dxa"/>
+          </w:tcPr>
+          <w:p>
+            <w:r>
+              <w:rPr>
+                <w:b/>
+                <w:bCs/>
+                <w:color w:val="000000"/>
+                <w:sz w:val="20"/>
+                <w:szCs w:val="20"/>
+              </w:rPr>
+              <w:t>Issue / Check</w:t>
+            </w:r>
+          </w:p>
+        </w:tc>
+        <w:tc>
+          <w:tcPr>
+            <w:tcW w:w="7360" w:type="dxa"/>
+          </w:tcPr>
+          <w:p>
+            <w:r>
+              <w:rPr>
+                <w:color w:val="000000"/>
+                <w:sz w:val="20"/>
+                <w:szCs w:val="20"/>
+              </w:rPr>
+              <w:t xml:space="preserve">Potential issue: </w:t>
+            </w:r>
+            <w:proofErr w:type="spellStart"/>
+            <w:r>
+              <w:rPr>
+                <w:color w:val="000000"/>
+                <w:sz w:val="20"/>
+                <w:szCs w:val="20"/>
+              </w:rPr>
+              <w:t>TripID</w:t>
+            </w:r>
+            <w:proofErr w:type="spellEnd"/>
+            <w:r>
+              <w:rPr>
+                <w:color w:val="000000"/>
+                <w:sz w:val="20"/>
+                <w:szCs w:val="20"/>
+              </w:rPr>
+              <w:t xml:space="preserve"> + </w:t>
+            </w:r>
+            <w:proofErr w:type="spellStart"/>
+            <w:r>
+              <w:rPr>
+                <w:color w:val="000000"/>
+                <w:sz w:val="20"/>
+                <w:szCs w:val="20"/>
+              </w:rPr>
+              <w:t>DayNumber</w:t>
+            </w:r>
+            <w:proofErr w:type="spellEnd"/>
+            <w:r>
+              <w:rPr>
+                <w:color w:val="000000"/>
+                <w:sz w:val="20"/>
+                <w:szCs w:val="20"/>
+              </w:rPr>
+              <w:t xml:space="preserve"> could determine </w:t>
+            </w:r>
+            <w:proofErr w:type="spellStart"/>
+            <w:r>
+              <w:rPr>
+                <w:color w:val="000000"/>
+                <w:sz w:val="20"/>
+                <w:szCs w:val="20"/>
+              </w:rPr>
+              <w:t>ScheduleDate</w:t>
+            </w:r>
+            <w:proofErr w:type="spellEnd"/>
+            <w:r>
+              <w:rPr>
+                <w:color w:val="000000"/>
+                <w:sz w:val="20"/>
+                <w:szCs w:val="20"/>
+              </w:rPr>
+              <w:t xml:space="preserve"> transitively.</w:t>
+            </w:r>
+          </w:p>
+        </w:tc>
+      </w:tr>
+      <w:tr>
+        <w:tc>
+          <w:tcPr>
+            <w:tcW w:w="2000" w:type="dxa"/>
+          </w:tcPr>
+          <w:p>
+            <w:r>
+              <w:rPr>
+                <w:b/>
+                <w:bCs/>
+                <w:color w:val="000000"/>
+                <w:sz w:val="20"/>
+                <w:szCs w:val="20"/>
+              </w:rPr>
+              <w:t>Change Made</w:t>
+            </w:r>
+          </w:p>
+        </w:tc>
+        <w:tc>
+          <w:tcPr>
+            <w:tcW w:w="7360" w:type="dxa"/>
+          </w:tcPr>
+          <w:p>
+            <w:r>
+              <w:rPr>
+                <w:color w:val="000000"/>
+                <w:sz w:val="20"/>
+                <w:szCs w:val="20"/>
+              </w:rPr>
+              <w:t xml:space="preserve">Identified and evaluated. </w:t>
+            </w:r>
+            <w:proofErr w:type="spellStart"/>
+            <w:r>
+              <w:rPr>
+                <w:color w:val="000000"/>
+                <w:sz w:val="20"/>
+                <w:szCs w:val="20"/>
+              </w:rPr>
+              <w:t>ScheduleDate</w:t>
+            </w:r>
+            <w:proofErr w:type="spellEnd"/>
+            <w:r>
+              <w:rPr>
+                <w:color w:val="000000"/>
+                <w:sz w:val="20"/>
+                <w:szCs w:val="20"/>
+              </w:rPr>
+              <w:t xml:space="preserve"> retained by design decision. See justification.</w:t>
+            </w:r>
+          </w:p>
+        </w:tc>
+      </w:tr>
+      <w:tr>
+        <w:tc>
+          <w:tcPr>
+            <w:tcW w:w="2000" w:type="dxa"/>
+          </w:tcPr>
+          <w:p>
+            <w:r>
+              <w:rPr>
+                <w:b/>
+                <w:bCs/>
+                <w:color w:val="000000"/>
+                <w:sz w:val="20"/>
+                <w:szCs w:val="20"/>
+              </w:rPr>
+              <w:t>Justification</w:t>
+            </w:r>
+          </w:p>
+        </w:tc>
+        <w:tc>
+          <w:tcPr>
+            <w:tcW w:w="7360" w:type="dxa"/>
+          </w:tcPr>
+          <w:p>
+            <w:proofErr w:type="spellStart"/>
+            <w:r>
+              <w:rPr>
+                <w:color w:val="000000"/>
+                <w:sz w:val="20"/>
+                <w:szCs w:val="20"/>
+              </w:rPr>
+              <w:t>TripID</w:t>
+            </w:r>
+            <w:proofErr w:type="spellEnd"/>
+            <w:r>
+              <w:rPr>
+                <w:color w:val="000000"/>
+                <w:sz w:val="20"/>
+                <w:szCs w:val="20"/>
+              </w:rPr>
+              <w:t xml:space="preserve"> + </w:t>
+            </w:r>
+            <w:proofErr w:type="spellStart"/>
+            <w:r>
+              <w:rPr>
+                <w:color w:val="000000"/>
+                <w:sz w:val="20"/>
+                <w:szCs w:val="20"/>
+              </w:rPr>
+              <w:t>DayNumber</w:t>
+            </w:r>
+            <w:proofErr w:type="spellEnd"/>
+            <w:r>
+              <w:rPr>
+                <w:color w:val="000000"/>
+                <w:sz w:val="20"/>
+                <w:szCs w:val="20"/>
+              </w:rPr>
+              <w:t xml:space="preserve"> could theoretically derive </w:t>
+            </w:r>
+            <w:proofErr w:type="spellStart"/>
+            <w:r>
+              <w:rPr>
+                <w:color w:val="000000"/>
+                <w:sz w:val="20"/>
+                <w:szCs w:val="20"/>
+              </w:rPr>
+              <w:t>ScheduleDate</w:t>
+            </w:r>
+            <w:proofErr w:type="spellEnd"/>
+            <w:r>
+              <w:rPr>
+                <w:color w:val="000000"/>
+                <w:sz w:val="20"/>
+                <w:szCs w:val="20"/>
+              </w:rPr>
+              <w:t xml:space="preserve"> (Day 1 = </w:t>
+            </w:r>
+            <w:proofErr w:type="spellStart"/>
+            <w:r>
+              <w:rPr>
+                <w:color w:val="000000"/>
+                <w:sz w:val="20"/>
+                <w:szCs w:val="20"/>
+              </w:rPr>
+              <w:t>StartDate</w:t>
+            </w:r>
+            <w:proofErr w:type="spellEnd"/>
+            <w:r>
+              <w:rPr>
+                <w:color w:val="000000"/>
+                <w:sz w:val="20"/>
+                <w:szCs w:val="20"/>
+              </w:rPr>
+              <w:t xml:space="preserve"> + 0). However, </w:t>
+            </w:r>
+            <w:proofErr w:type="spellStart"/>
+            <w:r>
+              <w:rPr>
+                <w:color w:val="000000"/>
+                <w:sz w:val="20"/>
+                <w:szCs w:val="20"/>
+              </w:rPr>
+              <w:t>ScheduleDate</w:t>
+            </w:r>
+            <w:proofErr w:type="spellEnd"/>
+            <w:r>
+              <w:rPr>
+                <w:color w:val="000000"/>
+                <w:sz w:val="20"/>
+                <w:szCs w:val="20"/>
+              </w:rPr>
+              <w:t xml:space="preserve"> is kept as an explicit column to allow flexible scheduling (pre/post-trip tasks) and avoid mandatory JOINs to Trips. Documented design decision — not a violation under this rationale.</w:t>
+            </w:r>
+          </w:p>
+        </w:tc>
+      </w:tr>
+    </w:tbl>
+    <w:p>
+      <w:pPr>
+        <w:spacing w:before="60" w:after="60"/>
+      </w:pPr>
+    </w:p>
+    <w:p>
+      <w:pPr>
+        <w:spacing w:before="180" w:after="80"/>
+      </w:pPr>
+      <w:r>
+        <w:rPr>
+          <w:b/>
+          <w:bCs/>
+          <w:sz w:val="24"/>
+          <w:szCs w:val="24"/>
+        </w:rPr>
+        <w:t>Expenses — 3NF:</w:t>
+      </w:r>
+    </w:p>
+    <w:tbl>
+      <w:tblPr>
+        <w:tblStyle w:val="TableGrid"/>
+        <w:tblW w:w="9360" w:type="dxa"/>
+        <w:tblLook w:val="04A0" w:firstRow="1" w:lastRow="0" w:firstColumn="1" w:lastColumn="0" w:noHBand="0" w:noVBand="1"/>
+      </w:tblPr>
+      <w:tblGrid>
+        <w:gridCol w:w="2000"/>
+        <w:gridCol w:w="7360"/>
+      </w:tblGrid>
+      <w:tr>
+        <w:tc>
+          <w:tcPr>
+            <w:tcW w:w="2000" w:type="dxa"/>
+          </w:tcPr>
+          <w:p>
+            <w:r>
+              <w:rPr>
+                <w:b/>
+                <w:bCs/>
+                <w:sz w:val="20"/>
+                <w:szCs w:val="20"/>
+              </w:rPr>
+              <w:t>Table</w:t>
+            </w:r>
+          </w:p>
+        </w:tc>
+        <w:tc>
+          <w:tcPr>
+            <w:tcW w:w="7360" w:type="dxa"/>
+          </w:tcPr>
+          <w:p>
+            <w:r>
+              <w:rPr>
+                <w:b/>
+                <w:bCs/>
+                <w:sz w:val="20"/>
+                <w:szCs w:val="20"/>
+              </w:rPr>
+              <w:t>Expenses</w:t>
+            </w:r>
+          </w:p>
+        </w:tc>
+      </w:tr>
+      <w:tr>
+        <w:tc>
+          <w:tcPr>
+            <w:tcW w:w="2000" w:type="dxa"/>
+          </w:tcPr>
+          <w:p>
+            <w:r>
+              <w:rPr>
+                <w:b/>
+                <w:bCs/>
+                <w:color w:val="000000"/>
+                <w:sz w:val="20"/>
+                <w:szCs w:val="20"/>
+              </w:rPr>
+              <w:t>Issue / Check</w:t>
+            </w:r>
+          </w:p>
+        </w:tc>
+        <w:tc>
+          <w:tcPr>
+            <w:tcW w:w="7360" w:type="dxa"/>
+          </w:tcPr>
+          <w:p>
+            <w:r>
+              <w:rPr>
+                <w:color w:val="000000"/>
+                <w:sz w:val="20"/>
+                <w:szCs w:val="20"/>
+              </w:rPr>
+              <w:t xml:space="preserve">Does Category → Amount? Does </w:t>
+            </w:r>
+            <w:proofErr w:type="spellStart"/>
+            <w:r>
+              <w:rPr>
+                <w:color w:val="000000"/>
+                <w:sz w:val="20"/>
+                <w:szCs w:val="20"/>
+              </w:rPr>
+              <w:t>ExpenseDate</w:t>
+            </w:r>
+            <w:proofErr w:type="spellEnd"/>
+            <w:r>
+              <w:rPr>
+                <w:color w:val="000000"/>
+                <w:sz w:val="20"/>
+                <w:szCs w:val="20"/>
+              </w:rPr>
+              <w:t xml:space="preserve"> → </w:t>
+            </w:r>
+            <w:proofErr w:type="spellStart"/>
+            <w:r>
+              <w:rPr>
+                <w:color w:val="000000"/>
+                <w:sz w:val="20"/>
+                <w:szCs w:val="20"/>
+              </w:rPr>
+              <w:t>TripID</w:t>
+            </w:r>
+            <w:proofErr w:type="spellEnd"/>
+            <w:r>
+              <w:rPr>
+                <w:color w:val="000000"/>
+                <w:sz w:val="20"/>
+                <w:szCs w:val="20"/>
+              </w:rPr>
+              <w:t>?</w:t>
+            </w:r>
+          </w:p>
+        </w:tc>
+      </w:tr>
+      <w:tr>
+        <w:tc>
+          <w:tcPr>
+            <w:tcW w:w="2000" w:type="dxa"/>
+          </w:tcPr>
+          <w:p>
+            <w:r>
+              <w:rPr>
+                <w:b/>
+                <w:bCs/>
+                <w:color w:val="000000"/>
+                <w:sz w:val="20"/>
+                <w:szCs w:val="20"/>
+              </w:rPr>
+              <w:t>Change Made</w:t>
+            </w:r>
+          </w:p>
+        </w:tc>
+        <w:tc>
+          <w:tcPr>
+            <w:tcW w:w="7360" w:type="dxa"/>
+          </w:tcPr>
+          <w:p>
+            <w:r>
+              <w:rPr>
+                <w:color w:val="000000"/>
+                <w:sz w:val="20"/>
+                <w:szCs w:val="20"/>
+              </w:rPr>
+              <w:t>No change required.</w:t>
+            </w:r>
+          </w:p>
+        </w:tc>
+      </w:tr>
+      <w:tr>
+        <w:tc>
+          <w:tcPr>
+            <w:tcW w:w="2000" w:type="dxa"/>
+          </w:tcPr>
+          <w:p>
+            <w:r>
+              <w:rPr>
+                <w:b/>
+                <w:bCs/>
+                <w:color w:val="000000"/>
+                <w:sz w:val="20"/>
+                <w:szCs w:val="20"/>
+              </w:rPr>
+              <w:t>Justification</w:t>
+            </w:r>
+          </w:p>
+        </w:tc>
+        <w:tc>
+          <w:tcPr>
+            <w:tcW w:w="7360" w:type="dxa"/>
+          </w:tcPr>
+          <w:p>
+            <w:r>
+              <w:rPr>
+                <w:color w:val="000000"/>
+                <w:sz w:val="20"/>
+                <w:szCs w:val="20"/>
+              </w:rPr>
+              <w:t xml:space="preserve">Category does not determine Amount (same category has varying amounts). </w:t>
+            </w:r>
+            <w:proofErr w:type="spellStart"/>
+            <w:r>
+              <w:rPr>
+                <w:color w:val="000000"/>
+                <w:sz w:val="20"/>
+                <w:szCs w:val="20"/>
+              </w:rPr>
+              <w:t>ExpenseDate</w:t>
+            </w:r>
+            <w:proofErr w:type="spellEnd"/>
+            <w:r>
+              <w:rPr>
+                <w:color w:val="000000"/>
+                <w:sz w:val="20"/>
+                <w:szCs w:val="20"/>
+              </w:rPr>
+              <w:t xml:space="preserve"> does not determine </w:t>
+            </w:r>
+            <w:proofErr w:type="spellStart"/>
+            <w:r>
+              <w:rPr>
+                <w:color w:val="000000"/>
+                <w:sz w:val="20"/>
+                <w:szCs w:val="20"/>
+              </w:rPr>
+              <w:t>TripID</w:t>
+            </w:r>
+            <w:proofErr w:type="spellEnd"/>
+            <w:r>
+              <w:rPr>
+                <w:color w:val="000000"/>
+                <w:sz w:val="20"/>
+                <w:szCs w:val="20"/>
+              </w:rPr>
+              <w:t xml:space="preserve">. All non-key attributes depend only on </w:t>
+            </w:r>
+            <w:proofErr w:type="spellStart"/>
+            <w:r>
+              <w:rPr>
+                <w:color w:val="000000"/>
+                <w:sz w:val="20"/>
+                <w:szCs w:val="20"/>
+              </w:rPr>
+              <w:t>ExpenseID</w:t>
+            </w:r>
+            <w:proofErr w:type="spellEnd"/>
+            <w:r>
+              <w:rPr>
+                <w:color w:val="000000"/>
+                <w:sz w:val="20"/>
+                <w:szCs w:val="20"/>
+              </w:rPr>
+              <w:t>. Satisfies 3NF.</w:t>
+            </w:r>
+          </w:p>
+        </w:tc>
+      </w:tr>
+    </w:tbl>
+    <w:p>
+      <w:pPr>
+        <w:spacing w:before="60" w:after="60"/>
+      </w:pPr>
+    </w:p>
+    <w:p>
+      <w:pPr>
+        <w:spacing w:before="120" w:after="120"/>
+      </w:pPr>
+    </w:p>
+    <w:p>
+      <w:pPr>
+        <w:pStyle w:val="Heading1"/>
+        <w:rPr>
+          <w:color w:val="auto"/>
+          <w:sz w:val="28"/>
+          <w:szCs w:val="28"/>
+        </w:rPr>
+      </w:pPr>
+      <w:r>
+        <w:rPr>
+          <w:color w:val="auto"/>
+          <w:sz w:val="28"/>
+          <w:szCs w:val="28"/>
+        </w:rPr>
+        <w:t>Step 2 — Duplicate &amp; Redundancy Check</w:t>
+      </w:r>
+    </w:p>
+    <w:p>
+      <w:pPr>
+        <w:spacing w:before="60" w:after="60"/>
+      </w:pPr>
+      <w:r>
+        <w:t>All tables reviewed for redundant columns, repeated data, and overlapping attributes.</w:t>
+      </w:r>
+    </w:p>
+    <w:tbl>
+      <w:tblPr>
+        <w:tblStyle w:val="TableGrid"/>
+        <w:tblW w:w="9360" w:type="dxa"/>
+        <w:tblLook w:val="04A0" w:firstRow="1" w:lastRow="0" w:firstColumn="1" w:lastColumn="0" w:noHBand="0" w:noVBand="1"/>
+      </w:tblPr>
+      <w:tblGrid>
+        <w:gridCol w:w="2400"/>
+        <w:gridCol w:w="2400"/>
+        <w:gridCol w:w="4560"/>
+      </w:tblGrid>
+      <w:tr>
+        <w:tc>
+          <w:tcPr>
+            <w:tcW w:w="2400" w:type="dxa"/>
+          </w:tcPr>
+          <w:p>
+            <w:r>
+              <w:rPr>
+                <w:b/>
+                <w:bCs/>
+                <w:sz w:val="20"/>
+                <w:szCs w:val="20"/>
+              </w:rPr>
+              <w:t>Table</w:t>
+            </w:r>
+          </w:p>
+        </w:tc>
+        <w:tc>
+          <w:tcPr>
+            <w:tcW w:w="2400" w:type="dxa"/>
+          </w:tcPr>
+          <w:p>
+            <w:r>
+              <w:rPr>
+                <w:b/>
+                <w:bCs/>
+                <w:sz w:val="20"/>
+                <w:szCs w:val="20"/>
+              </w:rPr>
+              <w:t>Issue Found</w:t>
+            </w:r>
+          </w:p>
+        </w:tc>
+        <w:tc>
+          <w:tcPr>
+            <w:tcW w:w="4560" w:type="dxa"/>
+          </w:tcPr>
+          <w:p>
+            <w:r>
+              <w:rPr>
+                <w:b/>
+                <w:bCs/>
+                <w:sz w:val="20"/>
+                <w:szCs w:val="20"/>
+              </w:rPr>
+              <w:t>Action Taken</w:t>
+            </w:r>
+          </w:p>
+        </w:tc>
+      </w:tr>
+      <w:tr>
+        <w:tc>
+          <w:tcPr>
+            <w:tcW w:w="2400" w:type="dxa"/>
+          </w:tcPr>
+          <w:p>
+            <w:r>
+              <w:rPr>
+                <w:color w:val="000000"/>
+                <w:sz w:val="20"/>
+                <w:szCs w:val="20"/>
+              </w:rPr>
+              <w:t>Destinations</w:t>
+            </w:r>
+          </w:p>
+        </w:tc>
+        <w:tc>
+          <w:tcPr>
+            <w:tcW w:w="2400" w:type="dxa"/>
+          </w:tcPr>
+          <w:p>
+            <w:r>
+              <w:rPr>
+                <w:color w:val="000000"/>
+                <w:sz w:val="20"/>
+                <w:szCs w:val="20"/>
+              </w:rPr>
+              <w:t>City/Country combined ERD label</w:t>
+            </w:r>
+          </w:p>
+        </w:tc>
+        <w:tc>
+          <w:tcPr>
+            <w:tcW w:w="4560" w:type="dxa"/>
+          </w:tcPr>
+          <w:p>
+            <w:r>
+              <w:rPr>
+                <w:color w:val="000000"/>
+                <w:sz w:val="20"/>
+                <w:szCs w:val="20"/>
+              </w:rPr>
+              <w:t>Confirmed two separate DB columns. ERD updated to show City and Country as distinct ovals.</w:t>
+            </w:r>
+          </w:p>
+        </w:tc>
+      </w:tr>
+      <w:tr>
+        <w:tc>
+          <w:tcPr>
+            <w:tcW w:w="2400" w:type="dxa"/>
+          </w:tcPr>
+          <w:p>
+            <w:r>
+              <w:rPr>
+                <w:color w:val="000000"/>
+                <w:sz w:val="20"/>
+                <w:szCs w:val="20"/>
+              </w:rPr>
+              <w:t>Hotels</w:t>
+            </w:r>
+          </w:p>
+        </w:tc>
+        <w:tc>
+          <w:tcPr>
+            <w:tcW w:w="2400" w:type="dxa"/>
+          </w:tcPr>
+          <w:p>
+            <w:r>
+              <w:rPr>
+                <w:color w:val="000000"/>
+                <w:sz w:val="20"/>
+                <w:szCs w:val="20"/>
+              </w:rPr>
+              <w:t>Cost column — ambiguous (per night vs total?)</w:t>
+            </w:r>
+          </w:p>
+        </w:tc>
+        <w:tc>
+          <w:tcPr>
+            <w:tcW w:w="4560" w:type="dxa"/>
+          </w:tcPr>
+          <w:p>
+            <w:r>
+              <w:rPr>
+                <w:color w:val="000000"/>
+                <w:sz w:val="20"/>
+                <w:szCs w:val="20"/>
+              </w:rPr>
+              <w:t xml:space="preserve">Renamed to </w:t>
+            </w:r>
+            <w:proofErr w:type="spellStart"/>
+            <w:r>
+              <w:rPr>
+                <w:color w:val="000000"/>
+                <w:sz w:val="20"/>
+                <w:szCs w:val="20"/>
+              </w:rPr>
+              <w:t>CostPerNight</w:t>
+            </w:r>
+            <w:proofErr w:type="spellEnd"/>
+            <w:r>
+              <w:rPr>
+                <w:color w:val="000000"/>
+                <w:sz w:val="20"/>
+                <w:szCs w:val="20"/>
+              </w:rPr>
+              <w:t xml:space="preserve"> for semantic clarity.</w:t>
+            </w:r>
+          </w:p>
+        </w:tc>
+      </w:tr>
+      <w:tr>
+        <w:tc>
+          <w:tcPr>
+            <w:tcW w:w="2400" w:type="dxa"/>
+          </w:tcPr>
+          <w:p>
+            <w:r>
+              <w:rPr>
+                <w:color w:val="000000"/>
+                <w:sz w:val="20"/>
+                <w:szCs w:val="20"/>
+              </w:rPr>
+              <w:t>Activities</w:t>
+            </w:r>
+          </w:p>
+        </w:tc>
+        <w:tc>
+          <w:tcPr>
+            <w:tcW w:w="2400" w:type="dxa"/>
+          </w:tcPr>
+          <w:p>
+            <w:r>
+              <w:rPr>
+                <w:color w:val="000000"/>
+                <w:sz w:val="20"/>
+                <w:szCs w:val="20"/>
+              </w:rPr>
+              <w:t>Cost column — similar ambiguity</w:t>
+            </w:r>
+          </w:p>
+        </w:tc>
+        <w:tc>
+          <w:tcPr>
+            <w:tcW w:w="4560" w:type="dxa"/>
+          </w:tcPr>
+          <w:p>
+            <w:r>
+              <w:rPr>
+                <w:color w:val="000000"/>
+                <w:sz w:val="20"/>
+                <w:szCs w:val="20"/>
+              </w:rPr>
+              <w:t>Retained as Cost (flat per-activity fee). No overlap with Hotels.</w:t>
+            </w:r>
+          </w:p>
+        </w:tc>
+      </w:tr>
+      <w:tr>
+        <w:tc>
+          <w:tcPr>
+            <w:tcW w:w="2400" w:type="dxa"/>
+          </w:tcPr>
+          <w:p>
+            <w:proofErr w:type="spellStart"/>
+            <w:r>
+              <w:rPr>
+                <w:color w:val="000000"/>
+                <w:sz w:val="20"/>
+                <w:szCs w:val="20"/>
+              </w:rPr>
+              <w:t>DaySchedule</w:t>
+            </w:r>
+            <w:proofErr w:type="spellEnd"/>
+          </w:p>
+        </w:tc>
+        <w:tc>
+          <w:tcPr>
+            <w:tcW w:w="2400" w:type="dxa"/>
+          </w:tcPr>
+          <w:p>
+            <w:proofErr w:type="spellStart"/>
+            <w:r>
+              <w:rPr>
+                <w:color w:val="000000"/>
+                <w:sz w:val="20"/>
+                <w:szCs w:val="20"/>
+              </w:rPr>
+              <w:t>ScheduleDate</w:t>
+            </w:r>
+            <w:proofErr w:type="spellEnd"/>
+            <w:r>
+              <w:rPr>
+                <w:color w:val="000000"/>
+                <w:sz w:val="20"/>
+                <w:szCs w:val="20"/>
+              </w:rPr>
+              <w:t xml:space="preserve"> could overlap trip date logic</w:t>
+            </w:r>
+          </w:p>
+        </w:tc>
+        <w:tc>
+          <w:tcPr>
+            <w:tcW w:w="4560" w:type="dxa"/>
+          </w:tcPr>
+          <w:p>
+            <w:r>
+              <w:rPr>
+                <w:color w:val="000000"/>
+                <w:sz w:val="20"/>
+                <w:szCs w:val="20"/>
+              </w:rPr>
+              <w:t>Retained — independently entered date for flexible planning.</w:t>
+            </w:r>
+          </w:p>
+        </w:tc>
+      </w:tr>
+      <w:tr>
+        <w:tc>
+          <w:tcPr>
+            <w:tcW w:w="2400" w:type="dxa"/>
+          </w:tcPr>
+          <w:p>
+            <w:r>
+              <w:rPr>
+                <w:color w:val="000000"/>
+                <w:sz w:val="20"/>
+                <w:szCs w:val="20"/>
+              </w:rPr>
+              <w:t>All Tables</w:t>
+            </w:r>
+          </w:p>
+        </w:tc>
+        <w:tc>
+          <w:tcPr>
+            <w:tcW w:w="2400" w:type="dxa"/>
+          </w:tcPr>
+          <w:p>
+            <w:r>
+              <w:rPr>
+                <w:color w:val="000000"/>
+                <w:sz w:val="20"/>
+                <w:szCs w:val="20"/>
+              </w:rPr>
+              <w:t>No cross-table column duplication found</w:t>
+            </w:r>
+          </w:p>
+        </w:tc>
+        <w:tc>
+          <w:tcPr>
+            <w:tcW w:w="4560" w:type="dxa"/>
+          </w:tcPr>
+          <w:p>
+            <w:r>
+              <w:rPr>
+                <w:color w:val="000000"/>
+                <w:sz w:val="20"/>
+                <w:szCs w:val="20"/>
+              </w:rPr>
+              <w:t>No structural changes required.</w:t>
+            </w:r>
+          </w:p>
+        </w:tc>
+      </w:tr>
+    </w:tbl>
+    <w:p>
+      <w:pPr>
+        <w:spacing w:before="120" w:after="60"/>
+      </w:pPr>
+    </w:p>
+    <w:p>
+      <w:pPr>
+        <w:spacing w:before="120" w:after="120"/>
+      </w:pPr>
+    </w:p>
+    <w:p>
+      <w:pPr>
+        <w:pStyle w:val="Heading1"/>
+        <w:rPr>
+          <w:color w:val="auto"/>
+          <w:sz w:val="28"/>
+          <w:szCs w:val="28"/>
+        </w:rPr>
+      </w:pPr>
+    </w:p>
+    <w:p>
+      <w:pPr>
+        <w:pStyle w:val="Heading1"/>
+        <w:rPr>
+          <w:color w:val="auto"/>
+          <w:sz w:val="28"/>
+          <w:szCs w:val="28"/>
+        </w:rPr>
+      </w:pPr>
+    </w:p>
+    <w:p>
+      <w:pPr>
+        <w:pStyle w:val="Heading1"/>
+        <w:rPr>
+          <w:color w:val="auto"/>
+          <w:sz w:val="28"/>
+          <w:szCs w:val="28"/>
+        </w:rPr>
+      </w:pPr>
+    </w:p>
+    <w:p>
+      <w:pPr>
+        <w:pStyle w:val="Heading1"/>
+        <w:rPr>
+          <w:color w:val="auto"/>
+          <w:sz w:val="28"/>
+          <w:szCs w:val="28"/>
+        </w:rPr>
+      </w:pPr>
+    </w:p>
+    <w:p>
+      <w:pPr>
+        <w:pStyle w:val="Heading1"/>
+        <w:rPr>
+          <w:color w:val="auto"/>
+          <w:sz w:val="28"/>
+          <w:szCs w:val="28"/>
+        </w:rPr>
+      </w:pPr>
+      <w:r>
+        <w:rPr>
+          <w:color w:val="auto"/>
+          <w:sz w:val="28"/>
+          <w:szCs w:val="28"/>
+        </w:rPr>
+        <w:lastRenderedPageBreak/>
+        <w:t>Step 3 — Updated ERD:</w:t>
+      </w:r>
+    </w:p>
+    <w:p>
+      <w:pPr>
+        <w:spacing w:before="60" w:after="60"/>
+      </w:pPr>
+      <w:r>
+        <w:t xml:space="preserve">Changes reflected: City/Country split into two attribute ovals. </w:t>
+      </w:r>
+      <w:proofErr w:type="spellStart"/>
+      <w:r>
+        <w:t>Hotels.Cost</w:t>
+      </w:r>
+      <w:proofErr w:type="spellEnd"/>
+      <w:r>
+        <w:t xml:space="preserve"> renamed to </w:t>
+      </w:r>
+      <w:proofErr w:type="spellStart"/>
+      <w:r>
+        <w:t>CostPerNight</w:t>
+      </w:r>
+      <w:proofErr w:type="spellEnd"/>
+      <w:r>
+        <w:t>. All PKs underlined, all FK cardinalities confirmed.</w:t>
+      </w:r>
+    </w:p>
+    <w:p>
+      <w:pPr>
+        <w:spacing w:before="120" w:after="60"/>
+      </w:pPr>
+      <w:r>
+        <w:rPr>
+          <w:noProof/>
+        </w:rPr>
+        <w:drawing>
+          <wp:inline distT="0" distB="0" distL="0" distR="0" wp14:anchorId="0F89A274" wp14:editId="2E29EBF2">
+            <wp:extent cx="5746750" cy="7227393"/>
+            <wp:effectExtent l="0" t="0" r="6350" b="0"/>
+            <wp:docPr id="3" name="Picture 3"/>
+            <wp:cNvGraphicFramePr>
+              <a:graphicFrameLocks xmlns:a="http://schemas.openxmlformats.org/drawingml/2006/main" noChangeAspect="1"/>
+            </wp:cNvGraphicFramePr>
+            <a:graphic xmlns:a="http://schemas.openxmlformats.org/drawingml/2006/main">
+              <a:graphicData uri="http://schemas.openxmlformats.org/drawingml/2006/picture">
+                <pic:pic xmlns:pic="http://schemas.openxmlformats.org/drawingml/2006/picture">
+                  <pic:nvPicPr>
+                    <pic:cNvPr id="1" name=""/>
+                    <pic:cNvPicPr/>
+                  </pic:nvPicPr>
+                  <pic:blipFill>
+                    <a:blip r:embed="rId6"/>
+                    <a:stretch>
+                      <a:fillRect/>
+                    </a:stretch>
+                  </pic:blipFill>
+                  <pic:spPr>
+                    <a:xfrm>
+                      <a:off x="0" y="0"/>
+                      <a:ext cx="5750276" cy="7231827"/>
+                    </a:xfrm>
+                    <a:prstGeom prst="rect">
+                      <a:avLst/>
+                    </a:prstGeom>
+                  </pic:spPr>
+                </pic:pic>
+              </a:graphicData>
+            </a:graphic>
+          </wp:inline>
+        </w:drawing>
+      </w:r>
+    </w:p>
+    <w:p>
+      <w:pPr>
+        <w:spacing w:after="120"/>
+      </w:pPr>
       <w:bookmarkStart w:id="0" w:name="_GoBack"/>
       <w:bookmarkEnd w:id="0"/>
     </w:p>
     <w:sectPr>
-      <w:headerReference w:type="default" r:id="rId6"/>
-      <w:footerReference w:type="default" r:id="rId7"/>
+      <w:headerReference w:type="default" r:id="rId7"/>
+      <w:footerReference w:type="default" r:id="rId8"/>
       <w:pgSz w:w="12240" w:h="15840"/>
       <w:pgMar w:top="1440" w:right="1440" w:bottom="1440" w:left="1440" w:header="708" w:footer="708" w:gutter="0"/>
       <w:cols w:space="720"/>

</xml_diff>

<commit_message>
M3: Synthetic data generated & dataflow documented
Dataset is made
CSV files are made
</commit_message>
<xml_diff>
--- a/BSSE_A_Version_Control_DBLabProject.docx
+++ b/BSSE_A_Version_Control_DBLabProject.docx
@@ -488,6 +488,40 @@
                 <w:szCs w:val="20"/>
               </w:rPr>
               <w:t>1.1</w:t>
+            </w:r>
+          </w:p>
+        </w:tc>
+      </w:tr>
+      <w:tr>
+        <w:tc>
+          <w:tcPr>
+            <w:tcW w:w="4680" w:type="dxa"/>
+          </w:tcPr>
+          <w:p>
+            <w:r>
+              <w:rPr>
+                <w:bCs/>
+                <w:color w:val="000000"/>
+                <w:sz w:val="20"/>
+                <w:szCs w:val="20"/>
+              </w:rPr>
+              <w:t>Dataset Preprocessing &amp; Dataflow</w:t>
+            </w:r>
+          </w:p>
+        </w:tc>
+        <w:tc>
+          <w:tcPr>
+            <w:tcW w:w="4680" w:type="dxa"/>
+          </w:tcPr>
+          <w:p>
+            <w:r>
+              <w:rPr>
+                <w:bCs/>
+                <w:color w:val="000000"/>
+                <w:sz w:val="20"/>
+                <w:szCs w:val="20"/>
+              </w:rPr>
+              <w:t>1.2</w:t>
             </w:r>
           </w:p>
         </w:tc>
@@ -593,7 +627,7 @@
                     </pic:cNvPicPr>
                   </pic:nvPicPr>
                   <pic:blipFill>
-                    <a:blip r:embed="rId5"/>
+                    <a:blip r:embed="rId7"/>
                     <a:srcRect/>
                     <a:stretch>
                       <a:fillRect/>
@@ -7974,7 +8008,7 @@
                     <pic:cNvPicPr/>
                   </pic:nvPicPr>
                   <pic:blipFill>
-                    <a:blip r:embed="rId6"/>
+                    <a:blip r:embed="rId8"/>
                     <a:stretch>
                       <a:fillRect/>
                     </a:stretch>
@@ -7997,14 +8031,4133 @@
     </w:p>
     <w:p>
       <w:pPr>
-        <w:spacing w:after="120"/>
-      </w:pPr>
+        <w:spacing w:before="120" w:after="60"/>
+      </w:pPr>
+    </w:p>
+    <w:p>
+      <w:pPr>
+        <w:spacing w:after="60"/>
+        <w:rPr>
+          <w:b/>
+          <w:sz w:val="24"/>
+          <w:szCs w:val="24"/>
+        </w:rPr>
+      </w:pPr>
+      <w:r>
+        <w:rPr>
+          <w:b/>
+          <w:sz w:val="24"/>
+          <w:szCs w:val="24"/>
+        </w:rPr>
+        <w:lastRenderedPageBreak/>
+        <w:t>MILESTONE 3:</w:t>
+      </w:r>
+    </w:p>
+    <w:p>
+      <w:pPr>
+        <w:pStyle w:val="Heading1"/>
+        <w:rPr>
+          <w:color w:val="auto"/>
+          <w:sz w:val="24"/>
+          <w:szCs w:val="24"/>
+        </w:rPr>
+      </w:pPr>
+      <w:r>
+        <w:rPr>
+          <w:color w:val="auto"/>
+          <w:sz w:val="24"/>
+          <w:szCs w:val="24"/>
+        </w:rPr>
+        <w:t>Dataset Preprocessing:</w:t>
+      </w:r>
+    </w:p>
+    <w:p>
+      <w:pPr>
+        <w:spacing w:before="60" w:after="60"/>
+      </w:pPr>
+      <w:r>
+        <w:t>This section documents the complete dataset preparation for the Travel Itinerary Planner database. Since this project is built on a custom schema (not sourced from a real-world CSV dataset), structured synthetic data was generated using Python with the Faker library. All data is realistic, referentially consistent, and sufficient to populate every core table.</w:t>
+      </w:r>
+    </w:p>
+    <w:p>
+      <w:pPr>
+        <w:spacing w:before="120" w:after="60"/>
+      </w:pPr>
+    </w:p>
+    <w:p>
+      <w:pPr>
+        <w:pStyle w:val="Heading1"/>
+        <w:rPr>
+          <w:color w:val="auto"/>
+          <w:sz w:val="28"/>
+          <w:szCs w:val="28"/>
+        </w:rPr>
+      </w:pPr>
+      <w:r>
+        <w:rPr>
+          <w:color w:val="auto"/>
+          <w:sz w:val="28"/>
+          <w:szCs w:val="28"/>
+        </w:rPr>
+        <w:t>Step 1 — Dataset Preparation:</w:t>
+      </w:r>
+    </w:p>
+    <w:p>
+      <w:pPr>
+        <w:pStyle w:val="Heading2"/>
+        <w:rPr>
+          <w:color w:val="auto"/>
+          <w:sz w:val="24"/>
+          <w:szCs w:val="24"/>
+        </w:rPr>
+      </w:pPr>
+      <w:r>
+        <w:rPr>
+          <w:color w:val="auto"/>
+          <w:sz w:val="24"/>
+          <w:szCs w:val="24"/>
+        </w:rPr>
+        <w:t>Approach: Synthetic Data Generation with Python Faker:</w:t>
+      </w:r>
+    </w:p>
+    <w:p>
+      <w:pPr>
+        <w:spacing w:before="60" w:after="60"/>
+      </w:pPr>
+      <w:r>
+        <w:t>The Faker library was used to generate realistic names, emails, dates, and other values. A fixed random seed (seed=42) was applied to both Python's random module and Faker to make the dataset fully reproducible. Real-world city/country pairs (e.g., Istanbul/Turkey, Paris/France, Tokyo/Japan) and curated activity lists were used to make the data meaningful rather than purely random.</w:t>
+      </w:r>
+    </w:p>
+    <w:p>
+      <w:pPr>
+        <w:spacing w:before="120" w:after="60"/>
+      </w:pPr>
+    </w:p>
+    <w:p>
+      <w:pPr>
+        <w:pStyle w:val="Heading2"/>
+        <w:rPr>
+          <w:color w:val="auto"/>
+          <w:sz w:val="24"/>
+          <w:szCs w:val="24"/>
+        </w:rPr>
+      </w:pPr>
+      <w:r>
+        <w:rPr>
+          <w:color w:val="auto"/>
+          <w:sz w:val="24"/>
+          <w:szCs w:val="24"/>
+        </w:rPr>
+        <w:t>Dataset Volume Summary:</w:t>
+      </w:r>
+    </w:p>
+    <w:tbl>
+      <w:tblPr>
+        <w:tblStyle w:val="TableGrid"/>
+        <w:tblW w:w="9360" w:type="dxa"/>
+        <w:tblLook w:val="04A0" w:firstRow="1" w:lastRow="0" w:firstColumn="1" w:lastColumn="0" w:noHBand="0" w:noVBand="1"/>
+      </w:tblPr>
+      <w:tblGrid>
+        <w:gridCol w:w="2200"/>
+        <w:gridCol w:w="1600"/>
+        <w:gridCol w:w="1600"/>
+        <w:gridCol w:w="1600"/>
+        <w:gridCol w:w="2360"/>
+      </w:tblGrid>
+      <w:tr>
+        <w:tc>
+          <w:tcPr>
+            <w:tcW w:w="2200" w:type="dxa"/>
+          </w:tcPr>
+          <w:p>
+            <w:r>
+              <w:rPr>
+                <w:b/>
+                <w:bCs/>
+                <w:sz w:val="20"/>
+                <w:szCs w:val="20"/>
+              </w:rPr>
+              <w:t>Table</w:t>
+            </w:r>
+          </w:p>
+        </w:tc>
+        <w:tc>
+          <w:tcPr>
+            <w:tcW w:w="1600" w:type="dxa"/>
+          </w:tcPr>
+          <w:p>
+            <w:r>
+              <w:rPr>
+                <w:b/>
+                <w:bCs/>
+                <w:sz w:val="20"/>
+                <w:szCs w:val="20"/>
+              </w:rPr>
+              <w:t>Rows Generated</w:t>
+            </w:r>
+          </w:p>
+        </w:tc>
+        <w:tc>
+          <w:tcPr>
+            <w:tcW w:w="1600" w:type="dxa"/>
+          </w:tcPr>
+          <w:p>
+            <w:r>
+              <w:rPr>
+                <w:b/>
+                <w:bCs/>
+                <w:sz w:val="20"/>
+                <w:szCs w:val="20"/>
+              </w:rPr>
+              <w:t>Source</w:t>
+            </w:r>
+          </w:p>
+        </w:tc>
+        <w:tc>
+          <w:tcPr>
+            <w:tcW w:w="1600" w:type="dxa"/>
+          </w:tcPr>
+          <w:p>
+            <w:r>
+              <w:rPr>
+                <w:b/>
+                <w:bCs/>
+                <w:sz w:val="20"/>
+                <w:szCs w:val="20"/>
+              </w:rPr>
+              <w:t>Min Req.</w:t>
+            </w:r>
+          </w:p>
+        </w:tc>
+        <w:tc>
+          <w:tcPr>
+            <w:tcW w:w="2360" w:type="dxa"/>
+          </w:tcPr>
+          <w:p>
+            <w:r>
+              <w:rPr>
+                <w:b/>
+                <w:bCs/>
+                <w:sz w:val="20"/>
+                <w:szCs w:val="20"/>
+              </w:rPr>
+              <w:t>Status</w:t>
+            </w:r>
+          </w:p>
+        </w:tc>
+      </w:tr>
+      <w:tr>
+        <w:tc>
+          <w:tcPr>
+            <w:tcW w:w="2200" w:type="dxa"/>
+          </w:tcPr>
+          <w:p>
+            <w:r>
+              <w:rPr>
+                <w:color w:val="000000"/>
+                <w:sz w:val="20"/>
+                <w:szCs w:val="20"/>
+              </w:rPr>
+              <w:t>Users</w:t>
+            </w:r>
+          </w:p>
+        </w:tc>
+        <w:tc>
+          <w:tcPr>
+            <w:tcW w:w="1600" w:type="dxa"/>
+          </w:tcPr>
+          <w:p>
+            <w:r>
+              <w:rPr>
+                <w:color w:val="000000"/>
+                <w:sz w:val="20"/>
+                <w:szCs w:val="20"/>
+              </w:rPr>
+              <w:t>75</w:t>
+            </w:r>
+          </w:p>
+        </w:tc>
+        <w:tc>
+          <w:tcPr>
+            <w:tcW w:w="1600" w:type="dxa"/>
+          </w:tcPr>
+          <w:p>
+            <w:r>
+              <w:rPr>
+                <w:color w:val="000000"/>
+                <w:sz w:val="20"/>
+                <w:szCs w:val="20"/>
+              </w:rPr>
+              <w:t>Faker (Python)</w:t>
+            </w:r>
+          </w:p>
+        </w:tc>
+        <w:tc>
+          <w:tcPr>
+            <w:tcW w:w="1600" w:type="dxa"/>
+          </w:tcPr>
+          <w:p>
+            <w:r>
+              <w:rPr>
+                <w:color w:val="000000"/>
+                <w:sz w:val="20"/>
+                <w:szCs w:val="20"/>
+              </w:rPr>
+              <w:t>50</w:t>
+            </w:r>
+          </w:p>
+        </w:tc>
+        <w:tc>
+          <w:tcPr>
+            <w:tcW w:w="2360" w:type="dxa"/>
+          </w:tcPr>
+          <w:p>
+            <w:r>
+              <w:rPr>
+                <w:rFonts w:ascii="Segoe UI Symbol" w:hAnsi="Segoe UI Symbol" w:cs="Segoe UI Symbol"/>
+                <w:b/>
+                <w:bCs/>
+                <w:color w:val="000000"/>
+                <w:sz w:val="20"/>
+                <w:szCs w:val="20"/>
+              </w:rPr>
+              <w:t>✓</w:t>
+            </w:r>
+            <w:r>
+              <w:rPr>
+                <w:b/>
+                <w:bCs/>
+                <w:color w:val="000000"/>
+                <w:sz w:val="20"/>
+                <w:szCs w:val="20"/>
+              </w:rPr>
+              <w:t xml:space="preserve"> Meets requirement</w:t>
+            </w:r>
+          </w:p>
+        </w:tc>
+      </w:tr>
+      <w:tr>
+        <w:tc>
+          <w:tcPr>
+            <w:tcW w:w="2200" w:type="dxa"/>
+          </w:tcPr>
+          <w:p>
+            <w:r>
+              <w:rPr>
+                <w:color w:val="000000"/>
+                <w:sz w:val="20"/>
+                <w:szCs w:val="20"/>
+              </w:rPr>
+              <w:t>Trips</w:t>
+            </w:r>
+          </w:p>
+        </w:tc>
+        <w:tc>
+          <w:tcPr>
+            <w:tcW w:w="1600" w:type="dxa"/>
+          </w:tcPr>
+          <w:p>
+            <w:r>
+              <w:rPr>
+                <w:color w:val="000000"/>
+                <w:sz w:val="20"/>
+                <w:szCs w:val="20"/>
+              </w:rPr>
+              <w:t>90</w:t>
+            </w:r>
+          </w:p>
+        </w:tc>
+        <w:tc>
+          <w:tcPr>
+            <w:tcW w:w="1600" w:type="dxa"/>
+          </w:tcPr>
+          <w:p>
+            <w:r>
+              <w:rPr>
+                <w:color w:val="000000"/>
+                <w:sz w:val="20"/>
+                <w:szCs w:val="20"/>
+              </w:rPr>
+              <w:t>Faker (Python)</w:t>
+            </w:r>
+          </w:p>
+        </w:tc>
+        <w:tc>
+          <w:tcPr>
+            <w:tcW w:w="1600" w:type="dxa"/>
+          </w:tcPr>
+          <w:p>
+            <w:r>
+              <w:rPr>
+                <w:color w:val="000000"/>
+                <w:sz w:val="20"/>
+                <w:szCs w:val="20"/>
+              </w:rPr>
+              <w:t>50</w:t>
+            </w:r>
+          </w:p>
+        </w:tc>
+        <w:tc>
+          <w:tcPr>
+            <w:tcW w:w="2360" w:type="dxa"/>
+          </w:tcPr>
+          <w:p>
+            <w:r>
+              <w:rPr>
+                <w:rFonts w:ascii="Segoe UI Symbol" w:hAnsi="Segoe UI Symbol" w:cs="Segoe UI Symbol"/>
+                <w:b/>
+                <w:bCs/>
+                <w:color w:val="000000"/>
+                <w:sz w:val="20"/>
+                <w:szCs w:val="20"/>
+              </w:rPr>
+              <w:t>✓</w:t>
+            </w:r>
+            <w:r>
+              <w:rPr>
+                <w:b/>
+                <w:bCs/>
+                <w:color w:val="000000"/>
+                <w:sz w:val="20"/>
+                <w:szCs w:val="20"/>
+              </w:rPr>
+              <w:t xml:space="preserve"> Meets requirement</w:t>
+            </w:r>
+          </w:p>
+        </w:tc>
+      </w:tr>
+      <w:tr>
+        <w:tc>
+          <w:tcPr>
+            <w:tcW w:w="2200" w:type="dxa"/>
+          </w:tcPr>
+          <w:p>
+            <w:r>
+              <w:rPr>
+                <w:color w:val="000000"/>
+                <w:sz w:val="20"/>
+                <w:szCs w:val="20"/>
+              </w:rPr>
+              <w:t>Destinations</w:t>
+            </w:r>
+          </w:p>
+        </w:tc>
+        <w:tc>
+          <w:tcPr>
+            <w:tcW w:w="1600" w:type="dxa"/>
+          </w:tcPr>
+          <w:p>
+            <w:r>
+              <w:rPr>
+                <w:color w:val="000000"/>
+                <w:sz w:val="20"/>
+                <w:szCs w:val="20"/>
+              </w:rPr>
+              <w:t>100</w:t>
+            </w:r>
+          </w:p>
+        </w:tc>
+        <w:tc>
+          <w:tcPr>
+            <w:tcW w:w="1600" w:type="dxa"/>
+          </w:tcPr>
+          <w:p>
+            <w:r>
+              <w:rPr>
+                <w:color w:val="000000"/>
+                <w:sz w:val="20"/>
+                <w:szCs w:val="20"/>
+              </w:rPr>
+              <w:t>Faker + Real Cities</w:t>
+            </w:r>
+          </w:p>
+        </w:tc>
+        <w:tc>
+          <w:tcPr>
+            <w:tcW w:w="1600" w:type="dxa"/>
+          </w:tcPr>
+          <w:p>
+            <w:r>
+              <w:rPr>
+                <w:color w:val="000000"/>
+                <w:sz w:val="20"/>
+                <w:szCs w:val="20"/>
+              </w:rPr>
+              <w:t>50</w:t>
+            </w:r>
+          </w:p>
+        </w:tc>
+        <w:tc>
+          <w:tcPr>
+            <w:tcW w:w="2360" w:type="dxa"/>
+          </w:tcPr>
+          <w:p>
+            <w:r>
+              <w:rPr>
+                <w:rFonts w:ascii="Segoe UI Symbol" w:hAnsi="Segoe UI Symbol" w:cs="Segoe UI Symbol"/>
+                <w:b/>
+                <w:bCs/>
+                <w:color w:val="000000"/>
+                <w:sz w:val="20"/>
+                <w:szCs w:val="20"/>
+              </w:rPr>
+              <w:t>✓</w:t>
+            </w:r>
+            <w:r>
+              <w:rPr>
+                <w:b/>
+                <w:bCs/>
+                <w:color w:val="000000"/>
+                <w:sz w:val="20"/>
+                <w:szCs w:val="20"/>
+              </w:rPr>
+              <w:t xml:space="preserve"> Meets requirement</w:t>
+            </w:r>
+          </w:p>
+        </w:tc>
+      </w:tr>
+      <w:tr>
+        <w:tc>
+          <w:tcPr>
+            <w:tcW w:w="2200" w:type="dxa"/>
+          </w:tcPr>
+          <w:p>
+            <w:r>
+              <w:rPr>
+                <w:color w:val="000000"/>
+                <w:sz w:val="20"/>
+                <w:szCs w:val="20"/>
+              </w:rPr>
+              <w:t>Hotels</w:t>
+            </w:r>
+          </w:p>
+        </w:tc>
+        <w:tc>
+          <w:tcPr>
+            <w:tcW w:w="1600" w:type="dxa"/>
+          </w:tcPr>
+          <w:p>
+            <w:r>
+              <w:rPr>
+                <w:color w:val="000000"/>
+                <w:sz w:val="20"/>
+                <w:szCs w:val="20"/>
+              </w:rPr>
+              <w:t>100</w:t>
+            </w:r>
+          </w:p>
+        </w:tc>
+        <w:tc>
+          <w:tcPr>
+            <w:tcW w:w="1600" w:type="dxa"/>
+          </w:tcPr>
+          <w:p>
+            <w:r>
+              <w:rPr>
+                <w:color w:val="000000"/>
+                <w:sz w:val="20"/>
+                <w:szCs w:val="20"/>
+              </w:rPr>
+              <w:t>Faker + Real Cities</w:t>
+            </w:r>
+          </w:p>
+        </w:tc>
+        <w:tc>
+          <w:tcPr>
+            <w:tcW w:w="1600" w:type="dxa"/>
+          </w:tcPr>
+          <w:p>
+            <w:r>
+              <w:rPr>
+                <w:color w:val="000000"/>
+                <w:sz w:val="20"/>
+                <w:szCs w:val="20"/>
+              </w:rPr>
+              <w:t>50</w:t>
+            </w:r>
+          </w:p>
+        </w:tc>
+        <w:tc>
+          <w:tcPr>
+            <w:tcW w:w="2360" w:type="dxa"/>
+          </w:tcPr>
+          <w:p>
+            <w:r>
+              <w:rPr>
+                <w:rFonts w:ascii="Segoe UI Symbol" w:hAnsi="Segoe UI Symbol" w:cs="Segoe UI Symbol"/>
+                <w:b/>
+                <w:bCs/>
+                <w:color w:val="000000"/>
+                <w:sz w:val="20"/>
+                <w:szCs w:val="20"/>
+              </w:rPr>
+              <w:t>✓</w:t>
+            </w:r>
+            <w:r>
+              <w:rPr>
+                <w:b/>
+                <w:bCs/>
+                <w:color w:val="000000"/>
+                <w:sz w:val="20"/>
+                <w:szCs w:val="20"/>
+              </w:rPr>
+              <w:t xml:space="preserve"> Meets requirement</w:t>
+            </w:r>
+          </w:p>
+        </w:tc>
+      </w:tr>
+      <w:tr>
+        <w:tc>
+          <w:tcPr>
+            <w:tcW w:w="2200" w:type="dxa"/>
+          </w:tcPr>
+          <w:p>
+            <w:r>
+              <w:rPr>
+                <w:color w:val="000000"/>
+                <w:sz w:val="20"/>
+                <w:szCs w:val="20"/>
+              </w:rPr>
+              <w:t>Activities</w:t>
+            </w:r>
+          </w:p>
+        </w:tc>
+        <w:tc>
+          <w:tcPr>
+            <w:tcW w:w="1600" w:type="dxa"/>
+          </w:tcPr>
+          <w:p>
+            <w:r>
+              <w:rPr>
+                <w:color w:val="000000"/>
+                <w:sz w:val="20"/>
+                <w:szCs w:val="20"/>
+              </w:rPr>
+              <w:t>100</w:t>
+            </w:r>
+          </w:p>
+        </w:tc>
+        <w:tc>
+          <w:tcPr>
+            <w:tcW w:w="1600" w:type="dxa"/>
+          </w:tcPr>
+          <w:p>
+            <w:r>
+              <w:rPr>
+                <w:color w:val="000000"/>
+                <w:sz w:val="20"/>
+                <w:szCs w:val="20"/>
+              </w:rPr>
+              <w:t>Curated Activity List</w:t>
+            </w:r>
+          </w:p>
+        </w:tc>
+        <w:tc>
+          <w:tcPr>
+            <w:tcW w:w="1600" w:type="dxa"/>
+          </w:tcPr>
+          <w:p>
+            <w:r>
+              <w:rPr>
+                <w:color w:val="000000"/>
+                <w:sz w:val="20"/>
+                <w:szCs w:val="20"/>
+              </w:rPr>
+              <w:t>50</w:t>
+            </w:r>
+          </w:p>
+        </w:tc>
+        <w:tc>
+          <w:tcPr>
+            <w:tcW w:w="2360" w:type="dxa"/>
+          </w:tcPr>
+          <w:p>
+            <w:r>
+              <w:rPr>
+                <w:rFonts w:ascii="Segoe UI Symbol" w:hAnsi="Segoe UI Symbol" w:cs="Segoe UI Symbol"/>
+                <w:b/>
+                <w:bCs/>
+                <w:color w:val="000000"/>
+                <w:sz w:val="20"/>
+                <w:szCs w:val="20"/>
+              </w:rPr>
+              <w:t>✓</w:t>
+            </w:r>
+            <w:r>
+              <w:rPr>
+                <w:b/>
+                <w:bCs/>
+                <w:color w:val="000000"/>
+                <w:sz w:val="20"/>
+                <w:szCs w:val="20"/>
+              </w:rPr>
+              <w:t xml:space="preserve"> Meets requirement</w:t>
+            </w:r>
+          </w:p>
+        </w:tc>
+      </w:tr>
+      <w:tr>
+        <w:tc>
+          <w:tcPr>
+            <w:tcW w:w="2200" w:type="dxa"/>
+          </w:tcPr>
+          <w:p>
+            <w:proofErr w:type="spellStart"/>
+            <w:r>
+              <w:rPr>
+                <w:color w:val="000000"/>
+                <w:sz w:val="20"/>
+                <w:szCs w:val="20"/>
+              </w:rPr>
+              <w:t>DaySchedule</w:t>
+            </w:r>
+            <w:proofErr w:type="spellEnd"/>
+          </w:p>
+        </w:tc>
+        <w:tc>
+          <w:tcPr>
+            <w:tcW w:w="1600" w:type="dxa"/>
+          </w:tcPr>
+          <w:p>
+            <w:r>
+              <w:rPr>
+                <w:color w:val="000000"/>
+                <w:sz w:val="20"/>
+                <w:szCs w:val="20"/>
+              </w:rPr>
+              <w:t>100</w:t>
+            </w:r>
+          </w:p>
+        </w:tc>
+        <w:tc>
+          <w:tcPr>
+            <w:tcW w:w="1600" w:type="dxa"/>
+          </w:tcPr>
+          <w:p>
+            <w:r>
+              <w:rPr>
+                <w:color w:val="000000"/>
+                <w:sz w:val="20"/>
+                <w:szCs w:val="20"/>
+              </w:rPr>
+              <w:t>Faker (Python)</w:t>
+            </w:r>
+          </w:p>
+        </w:tc>
+        <w:tc>
+          <w:tcPr>
+            <w:tcW w:w="1600" w:type="dxa"/>
+          </w:tcPr>
+          <w:p>
+            <w:r>
+              <w:rPr>
+                <w:color w:val="000000"/>
+                <w:sz w:val="20"/>
+                <w:szCs w:val="20"/>
+              </w:rPr>
+              <w:t>50</w:t>
+            </w:r>
+          </w:p>
+        </w:tc>
+        <w:tc>
+          <w:tcPr>
+            <w:tcW w:w="2360" w:type="dxa"/>
+          </w:tcPr>
+          <w:p>
+            <w:r>
+              <w:rPr>
+                <w:rFonts w:ascii="Segoe UI Symbol" w:hAnsi="Segoe UI Symbol" w:cs="Segoe UI Symbol"/>
+                <w:b/>
+                <w:bCs/>
+                <w:color w:val="000000"/>
+                <w:sz w:val="20"/>
+                <w:szCs w:val="20"/>
+              </w:rPr>
+              <w:t>✓</w:t>
+            </w:r>
+            <w:r>
+              <w:rPr>
+                <w:b/>
+                <w:bCs/>
+                <w:color w:val="000000"/>
+                <w:sz w:val="20"/>
+                <w:szCs w:val="20"/>
+              </w:rPr>
+              <w:t xml:space="preserve"> Meets requirement</w:t>
+            </w:r>
+          </w:p>
+        </w:tc>
+      </w:tr>
+      <w:tr>
+        <w:tc>
+          <w:tcPr>
+            <w:tcW w:w="2200" w:type="dxa"/>
+          </w:tcPr>
+          <w:p>
+            <w:r>
+              <w:rPr>
+                <w:color w:val="000000"/>
+                <w:sz w:val="20"/>
+                <w:szCs w:val="20"/>
+              </w:rPr>
+              <w:t>Expenses</w:t>
+            </w:r>
+          </w:p>
+        </w:tc>
+        <w:tc>
+          <w:tcPr>
+            <w:tcW w:w="1600" w:type="dxa"/>
+          </w:tcPr>
+          <w:p>
+            <w:r>
+              <w:rPr>
+                <w:color w:val="000000"/>
+                <w:sz w:val="20"/>
+                <w:szCs w:val="20"/>
+              </w:rPr>
+              <w:t>100</w:t>
+            </w:r>
+          </w:p>
+        </w:tc>
+        <w:tc>
+          <w:tcPr>
+            <w:tcW w:w="1600" w:type="dxa"/>
+          </w:tcPr>
+          <w:p>
+            <w:r>
+              <w:rPr>
+                <w:color w:val="000000"/>
+                <w:sz w:val="20"/>
+                <w:szCs w:val="20"/>
+              </w:rPr>
+              <w:t>Faker (Python)</w:t>
+            </w:r>
+          </w:p>
+        </w:tc>
+        <w:tc>
+          <w:tcPr>
+            <w:tcW w:w="1600" w:type="dxa"/>
+          </w:tcPr>
+          <w:p>
+            <w:r>
+              <w:rPr>
+                <w:color w:val="000000"/>
+                <w:sz w:val="20"/>
+                <w:szCs w:val="20"/>
+              </w:rPr>
+              <w:t>50</w:t>
+            </w:r>
+          </w:p>
+        </w:tc>
+        <w:tc>
+          <w:tcPr>
+            <w:tcW w:w="2360" w:type="dxa"/>
+          </w:tcPr>
+          <w:p>
+            <w:r>
+              <w:rPr>
+                <w:rFonts w:ascii="Segoe UI Symbol" w:hAnsi="Segoe UI Symbol" w:cs="Segoe UI Symbol"/>
+                <w:b/>
+                <w:bCs/>
+                <w:color w:val="000000"/>
+                <w:sz w:val="20"/>
+                <w:szCs w:val="20"/>
+              </w:rPr>
+              <w:t>✓</w:t>
+            </w:r>
+            <w:r>
+              <w:rPr>
+                <w:b/>
+                <w:bCs/>
+                <w:color w:val="000000"/>
+                <w:sz w:val="20"/>
+                <w:szCs w:val="20"/>
+              </w:rPr>
+              <w:t xml:space="preserve"> Meets requirement</w:t>
+            </w:r>
+          </w:p>
+        </w:tc>
+      </w:tr>
+    </w:tbl>
+    <w:p>
+      <w:pPr>
+        <w:pStyle w:val="Heading2"/>
+        <w:rPr>
+          <w:color w:val="auto"/>
+          <w:sz w:val="24"/>
+          <w:szCs w:val="24"/>
+        </w:rPr>
+      </w:pPr>
+    </w:p>
+    <w:p>
+      <w:pPr>
+        <w:pStyle w:val="Heading2"/>
+        <w:rPr>
+          <w:color w:val="auto"/>
+          <w:sz w:val="24"/>
+          <w:szCs w:val="24"/>
+        </w:rPr>
+      </w:pPr>
+    </w:p>
+    <w:p>
+      <w:pPr>
+        <w:pStyle w:val="Heading2"/>
+        <w:rPr>
+          <w:color w:val="auto"/>
+          <w:sz w:val="24"/>
+          <w:szCs w:val="24"/>
+        </w:rPr>
+      </w:pPr>
+    </w:p>
+    <w:p>
+      <w:pPr>
+        <w:pStyle w:val="Heading2"/>
+        <w:rPr>
+          <w:color w:val="auto"/>
+          <w:sz w:val="24"/>
+          <w:szCs w:val="24"/>
+        </w:rPr>
+      </w:pPr>
+    </w:p>
+    <w:p>
+      <w:pPr>
+        <w:pStyle w:val="Heading2"/>
+        <w:rPr>
+          <w:color w:val="auto"/>
+          <w:sz w:val="24"/>
+          <w:szCs w:val="24"/>
+        </w:rPr>
+      </w:pPr>
+    </w:p>
+    <w:p>
+      <w:pPr>
+        <w:pStyle w:val="Heading2"/>
+        <w:rPr>
+          <w:color w:val="auto"/>
+          <w:sz w:val="24"/>
+          <w:szCs w:val="24"/>
+        </w:rPr>
+      </w:pPr>
+    </w:p>
+    <w:p>
+      <w:pPr>
+        <w:pStyle w:val="Heading2"/>
+        <w:rPr>
+          <w:color w:val="auto"/>
+          <w:sz w:val="24"/>
+          <w:szCs w:val="24"/>
+        </w:rPr>
+      </w:pPr>
+    </w:p>
+    <w:p>
+      <w:pPr>
+        <w:pStyle w:val="Heading2"/>
+        <w:rPr>
+          <w:color w:val="auto"/>
+          <w:sz w:val="24"/>
+          <w:szCs w:val="24"/>
+        </w:rPr>
+      </w:pPr>
+      <w:r>
+        <w:rPr>
+          <w:color w:val="auto"/>
+          <w:sz w:val="24"/>
+          <w:szCs w:val="24"/>
+        </w:rPr>
+        <w:lastRenderedPageBreak/>
+        <w:t>Preprocessing Steps Applied:</w:t>
+      </w:r>
+    </w:p>
+    <w:p>
+      <w:pPr>
+        <w:spacing w:before="60" w:after="60"/>
+      </w:pPr>
+      <w:r>
+        <w:t>The following preprocessing steps were applied during generation to ensure clean, consistent, and database-ready data:</w:t>
+      </w:r>
+    </w:p>
+    <w:tbl>
+      <w:tblPr>
+        <w:tblStyle w:val="TableGrid"/>
+        <w:tblW w:w="9360" w:type="dxa"/>
+        <w:tblLook w:val="04A0" w:firstRow="1" w:lastRow="0" w:firstColumn="1" w:lastColumn="0" w:noHBand="0" w:noVBand="1"/>
+      </w:tblPr>
+      <w:tblGrid>
+        <w:gridCol w:w="2400"/>
+        <w:gridCol w:w="2400"/>
+        <w:gridCol w:w="4560"/>
+      </w:tblGrid>
+      <w:tr>
+        <w:tc>
+          <w:tcPr>
+            <w:tcW w:w="2400" w:type="dxa"/>
+          </w:tcPr>
+          <w:p>
+            <w:r>
+              <w:rPr>
+                <w:b/>
+                <w:bCs/>
+                <w:sz w:val="20"/>
+                <w:szCs w:val="20"/>
+              </w:rPr>
+              <w:t>Preprocessing Step</w:t>
+            </w:r>
+          </w:p>
+        </w:tc>
+        <w:tc>
+          <w:tcPr>
+            <w:tcW w:w="2400" w:type="dxa"/>
+          </w:tcPr>
+          <w:p>
+            <w:r>
+              <w:rPr>
+                <w:b/>
+                <w:bCs/>
+                <w:sz w:val="20"/>
+                <w:szCs w:val="20"/>
+              </w:rPr>
+              <w:t>Table(s) Affected</w:t>
+            </w:r>
+          </w:p>
+        </w:tc>
+        <w:tc>
+          <w:tcPr>
+            <w:tcW w:w="4560" w:type="dxa"/>
+          </w:tcPr>
+          <w:p>
+            <w:r>
+              <w:rPr>
+                <w:b/>
+                <w:bCs/>
+                <w:sz w:val="20"/>
+                <w:szCs w:val="20"/>
+              </w:rPr>
+              <w:t>Action Taken</w:t>
+            </w:r>
+          </w:p>
+        </w:tc>
+      </w:tr>
+      <w:tr>
+        <w:tc>
+          <w:tcPr>
+            <w:tcW w:w="2400" w:type="dxa"/>
+          </w:tcPr>
+          <w:p>
+            <w:r>
+              <w:rPr>
+                <w:color w:val="000000"/>
+                <w:sz w:val="20"/>
+                <w:szCs w:val="20"/>
+              </w:rPr>
+              <w:t>Duplicate Removal</w:t>
+            </w:r>
+          </w:p>
+        </w:tc>
+        <w:tc>
+          <w:tcPr>
+            <w:tcW w:w="2400" w:type="dxa"/>
+          </w:tcPr>
+          <w:p>
+            <w:r>
+              <w:rPr>
+                <w:color w:val="000000"/>
+                <w:sz w:val="20"/>
+                <w:szCs w:val="20"/>
+              </w:rPr>
+              <w:t>All tables</w:t>
+            </w:r>
+          </w:p>
+        </w:tc>
+        <w:tc>
+          <w:tcPr>
+            <w:tcW w:w="4560" w:type="dxa"/>
+          </w:tcPr>
+          <w:p>
+            <w:r>
+              <w:rPr>
+                <w:color w:val="000000"/>
+                <w:sz w:val="20"/>
+                <w:szCs w:val="20"/>
+              </w:rPr>
+              <w:t>Each table uses AUTO_INCREMENT primary keys (</w:t>
+            </w:r>
+            <w:proofErr w:type="spellStart"/>
+            <w:r>
+              <w:rPr>
+                <w:color w:val="000000"/>
+                <w:sz w:val="20"/>
+                <w:szCs w:val="20"/>
+              </w:rPr>
+              <w:t>UserID</w:t>
+            </w:r>
+            <w:proofErr w:type="spellEnd"/>
+            <w:r>
+              <w:rPr>
+                <w:color w:val="000000"/>
+                <w:sz w:val="20"/>
+                <w:szCs w:val="20"/>
+              </w:rPr>
+              <w:t xml:space="preserve">, </w:t>
+            </w:r>
+            <w:proofErr w:type="spellStart"/>
+            <w:r>
+              <w:rPr>
+                <w:color w:val="000000"/>
+                <w:sz w:val="20"/>
+                <w:szCs w:val="20"/>
+              </w:rPr>
+              <w:t>TripID</w:t>
+            </w:r>
+            <w:proofErr w:type="spellEnd"/>
+            <w:r>
+              <w:rPr>
+                <w:color w:val="000000"/>
+                <w:sz w:val="20"/>
+                <w:szCs w:val="20"/>
+              </w:rPr>
+              <w:t>, etc.). The Python generator tracks used email addresses in a set to guarantee uniqueness. No duplicate rows exist in any CSV.</w:t>
+            </w:r>
+          </w:p>
+        </w:tc>
+      </w:tr>
+      <w:tr>
+        <w:tc>
+          <w:tcPr>
+            <w:tcW w:w="2400" w:type="dxa"/>
+          </w:tcPr>
+          <w:p>
+            <w:r>
+              <w:rPr>
+                <w:color w:val="000000"/>
+                <w:sz w:val="20"/>
+                <w:szCs w:val="20"/>
+              </w:rPr>
+              <w:t>Email Uniqueness</w:t>
+            </w:r>
+          </w:p>
+        </w:tc>
+        <w:tc>
+          <w:tcPr>
+            <w:tcW w:w="2400" w:type="dxa"/>
+          </w:tcPr>
+          <w:p>
+            <w:r>
+              <w:rPr>
+                <w:color w:val="000000"/>
+                <w:sz w:val="20"/>
+                <w:szCs w:val="20"/>
+              </w:rPr>
+              <w:t>Users</w:t>
+            </w:r>
+          </w:p>
+        </w:tc>
+        <w:tc>
+          <w:tcPr>
+            <w:tcW w:w="4560" w:type="dxa"/>
+          </w:tcPr>
+          <w:p>
+            <w:r>
+              <w:rPr>
+                <w:color w:val="000000"/>
+                <w:sz w:val="20"/>
+                <w:szCs w:val="20"/>
+              </w:rPr>
+              <w:t xml:space="preserve">A Python </w:t>
+            </w:r>
+            <w:proofErr w:type="gramStart"/>
+            <w:r>
+              <w:rPr>
+                <w:color w:val="000000"/>
+                <w:sz w:val="20"/>
+                <w:szCs w:val="20"/>
+              </w:rPr>
+              <w:t>set(</w:t>
+            </w:r>
+            <w:proofErr w:type="gramEnd"/>
+            <w:r>
+              <w:rPr>
+                <w:color w:val="000000"/>
+                <w:sz w:val="20"/>
+                <w:szCs w:val="20"/>
+              </w:rPr>
+              <w:t>) tracks all generated emails. If a collision occurs, a new email is regenerated until unique. The UNIQUE constraint in MySQL will enforce this at load time.</w:t>
+            </w:r>
+          </w:p>
+        </w:tc>
+      </w:tr>
+      <w:tr>
+        <w:tc>
+          <w:tcPr>
+            <w:tcW w:w="2400" w:type="dxa"/>
+          </w:tcPr>
+          <w:p>
+            <w:r>
+              <w:rPr>
+                <w:color w:val="000000"/>
+                <w:sz w:val="20"/>
+                <w:szCs w:val="20"/>
+              </w:rPr>
+              <w:t>Date Consistency</w:t>
+            </w:r>
+          </w:p>
+        </w:tc>
+        <w:tc>
+          <w:tcPr>
+            <w:tcW w:w="2400" w:type="dxa"/>
+          </w:tcPr>
+          <w:p>
+            <w:r>
+              <w:rPr>
+                <w:color w:val="000000"/>
+                <w:sz w:val="20"/>
+                <w:szCs w:val="20"/>
+              </w:rPr>
+              <w:t>Trips, Destinations, Hotels</w:t>
+            </w:r>
+          </w:p>
+        </w:tc>
+        <w:tc>
+          <w:tcPr>
+            <w:tcW w:w="4560" w:type="dxa"/>
+          </w:tcPr>
+          <w:p>
+            <w:r>
+              <w:rPr>
+                <w:color w:val="000000"/>
+                <w:sz w:val="20"/>
+                <w:szCs w:val="20"/>
+              </w:rPr>
+              <w:t xml:space="preserve">All </w:t>
+            </w:r>
+            <w:proofErr w:type="spellStart"/>
+            <w:r>
+              <w:rPr>
+                <w:color w:val="000000"/>
+                <w:sz w:val="20"/>
+                <w:szCs w:val="20"/>
+              </w:rPr>
+              <w:t>EndDate</w:t>
+            </w:r>
+            <w:proofErr w:type="spellEnd"/>
+            <w:r>
+              <w:rPr>
+                <w:color w:val="000000"/>
+                <w:sz w:val="20"/>
+                <w:szCs w:val="20"/>
+              </w:rPr>
+              <w:t xml:space="preserve"> &gt; </w:t>
+            </w:r>
+            <w:proofErr w:type="spellStart"/>
+            <w:r>
+              <w:rPr>
+                <w:color w:val="000000"/>
+                <w:sz w:val="20"/>
+                <w:szCs w:val="20"/>
+              </w:rPr>
+              <w:t>StartDate</w:t>
+            </w:r>
+            <w:proofErr w:type="spellEnd"/>
+            <w:r>
+              <w:rPr>
+                <w:color w:val="000000"/>
+                <w:sz w:val="20"/>
+                <w:szCs w:val="20"/>
+              </w:rPr>
+              <w:t xml:space="preserve">, </w:t>
+            </w:r>
+            <w:proofErr w:type="spellStart"/>
+            <w:r>
+              <w:rPr>
+                <w:color w:val="000000"/>
+                <w:sz w:val="20"/>
+                <w:szCs w:val="20"/>
+              </w:rPr>
+              <w:t>DepartureDate</w:t>
+            </w:r>
+            <w:proofErr w:type="spellEnd"/>
+            <w:r>
+              <w:rPr>
+                <w:color w:val="000000"/>
+                <w:sz w:val="20"/>
+                <w:szCs w:val="20"/>
+              </w:rPr>
+              <w:t xml:space="preserve"> &gt; </w:t>
+            </w:r>
+            <w:proofErr w:type="spellStart"/>
+            <w:r>
+              <w:rPr>
+                <w:color w:val="000000"/>
+                <w:sz w:val="20"/>
+                <w:szCs w:val="20"/>
+              </w:rPr>
+              <w:t>ArrivalDate</w:t>
+            </w:r>
+            <w:proofErr w:type="spellEnd"/>
+            <w:r>
+              <w:rPr>
+                <w:color w:val="000000"/>
+                <w:sz w:val="20"/>
+                <w:szCs w:val="20"/>
+              </w:rPr>
+              <w:t xml:space="preserve">, and </w:t>
+            </w:r>
+            <w:proofErr w:type="spellStart"/>
+            <w:r>
+              <w:rPr>
+                <w:color w:val="000000"/>
+                <w:sz w:val="20"/>
+                <w:szCs w:val="20"/>
+              </w:rPr>
+              <w:t>CheckOut</w:t>
+            </w:r>
+            <w:proofErr w:type="spellEnd"/>
+            <w:r>
+              <w:rPr>
+                <w:color w:val="000000"/>
+                <w:sz w:val="20"/>
+                <w:szCs w:val="20"/>
+              </w:rPr>
+              <w:t xml:space="preserve"> &gt; </w:t>
+            </w:r>
+            <w:proofErr w:type="spellStart"/>
+            <w:r>
+              <w:rPr>
+                <w:color w:val="000000"/>
+                <w:sz w:val="20"/>
+                <w:szCs w:val="20"/>
+              </w:rPr>
+              <w:t>CheckIn</w:t>
+            </w:r>
+            <w:proofErr w:type="spellEnd"/>
+            <w:r>
+              <w:rPr>
+                <w:color w:val="000000"/>
+                <w:sz w:val="20"/>
+                <w:szCs w:val="20"/>
+              </w:rPr>
+              <w:t xml:space="preserve"> constraints are enforced in the generator logic before writing rows. No date-inverted rows exist in the CSVs.</w:t>
+            </w:r>
+          </w:p>
+        </w:tc>
+      </w:tr>
+      <w:tr>
+        <w:tc>
+          <w:tcPr>
+            <w:tcW w:w="2400" w:type="dxa"/>
+          </w:tcPr>
+          <w:p>
+            <w:r>
+              <w:rPr>
+                <w:color w:val="000000"/>
+                <w:sz w:val="20"/>
+                <w:szCs w:val="20"/>
+              </w:rPr>
+              <w:t>Data Type Consistency</w:t>
+            </w:r>
+          </w:p>
+        </w:tc>
+        <w:tc>
+          <w:tcPr>
+            <w:tcW w:w="2400" w:type="dxa"/>
+          </w:tcPr>
+          <w:p>
+            <w:r>
+              <w:rPr>
+                <w:color w:val="000000"/>
+                <w:sz w:val="20"/>
+                <w:szCs w:val="20"/>
+              </w:rPr>
+              <w:t>All tables</w:t>
+            </w:r>
+          </w:p>
+        </w:tc>
+        <w:tc>
+          <w:tcPr>
+            <w:tcW w:w="4560" w:type="dxa"/>
+          </w:tcPr>
+          <w:p>
+            <w:r>
+              <w:rPr>
+                <w:color w:val="000000"/>
+                <w:sz w:val="20"/>
+                <w:szCs w:val="20"/>
+              </w:rPr>
+              <w:t>All IDs are integers. All dates are ISO-8601 (YYYY-MM-DD). All times are HH:</w:t>
+            </w:r>
+            <w:proofErr w:type="gramStart"/>
+            <w:r>
+              <w:rPr>
+                <w:color w:val="000000"/>
+                <w:sz w:val="20"/>
+                <w:szCs w:val="20"/>
+              </w:rPr>
+              <w:t>MM:SS.</w:t>
+            </w:r>
+            <w:proofErr w:type="gramEnd"/>
+            <w:r>
+              <w:rPr>
+                <w:color w:val="000000"/>
+                <w:sz w:val="20"/>
+                <w:szCs w:val="20"/>
+              </w:rPr>
+              <w:t xml:space="preserve"> All monetary values are decimal with 2 decimal places. All string fields are non-empty where NOT NULL is required.</w:t>
+            </w:r>
+          </w:p>
+        </w:tc>
+      </w:tr>
+      <w:tr>
+        <w:tc>
+          <w:tcPr>
+            <w:tcW w:w="2400" w:type="dxa"/>
+          </w:tcPr>
+          <w:p>
+            <w:r>
+              <w:rPr>
+                <w:color w:val="000000"/>
+                <w:sz w:val="20"/>
+                <w:szCs w:val="20"/>
+              </w:rPr>
+              <w:t>Null / Missing Values</w:t>
+            </w:r>
+          </w:p>
+        </w:tc>
+        <w:tc>
+          <w:tcPr>
+            <w:tcW w:w="2400" w:type="dxa"/>
+          </w:tcPr>
+          <w:p>
+            <w:proofErr w:type="spellStart"/>
+            <w:r>
+              <w:rPr>
+                <w:color w:val="000000"/>
+                <w:sz w:val="20"/>
+                <w:szCs w:val="20"/>
+              </w:rPr>
+              <w:t>Expenses.Notes</w:t>
+            </w:r>
+            <w:proofErr w:type="spellEnd"/>
+          </w:p>
+        </w:tc>
+        <w:tc>
+          <w:tcPr>
+            <w:tcW w:w="4560" w:type="dxa"/>
+          </w:tcPr>
+          <w:p>
+            <w:r>
+              <w:rPr>
+                <w:color w:val="000000"/>
+                <w:sz w:val="20"/>
+                <w:szCs w:val="20"/>
+              </w:rPr>
+              <w:t xml:space="preserve">Notes is the only </w:t>
+            </w:r>
+            <w:proofErr w:type="spellStart"/>
+            <w:r>
+              <w:rPr>
+                <w:color w:val="000000"/>
+                <w:sz w:val="20"/>
+                <w:szCs w:val="20"/>
+              </w:rPr>
+              <w:t>nullable</w:t>
+            </w:r>
+            <w:proofErr w:type="spellEnd"/>
+            <w:r>
+              <w:rPr>
+                <w:color w:val="000000"/>
+                <w:sz w:val="20"/>
+                <w:szCs w:val="20"/>
+              </w:rPr>
+              <w:t xml:space="preserve"> column in the schema. The generator intentionally leaves it blank for ~37% of rows to reflect realistic data (not all expenses need a note). All other columns are always populated.</w:t>
+            </w:r>
+          </w:p>
+        </w:tc>
+      </w:tr>
+      <w:tr>
+        <w:tc>
+          <w:tcPr>
+            <w:tcW w:w="2400" w:type="dxa"/>
+          </w:tcPr>
+          <w:p>
+            <w:r>
+              <w:rPr>
+                <w:color w:val="000000"/>
+                <w:sz w:val="20"/>
+                <w:szCs w:val="20"/>
+              </w:rPr>
+              <w:t>Referential Integrity</w:t>
+            </w:r>
+          </w:p>
+        </w:tc>
+        <w:tc>
+          <w:tcPr>
+            <w:tcW w:w="2400" w:type="dxa"/>
+          </w:tcPr>
+          <w:p>
+            <w:r>
+              <w:rPr>
+                <w:color w:val="000000"/>
+                <w:sz w:val="20"/>
+                <w:szCs w:val="20"/>
+              </w:rPr>
+              <w:t>All FK columns</w:t>
+            </w:r>
+          </w:p>
+        </w:tc>
+        <w:tc>
+          <w:tcPr>
+            <w:tcW w:w="4560" w:type="dxa"/>
+          </w:tcPr>
+          <w:p>
+            <w:r>
+              <w:rPr>
+                <w:color w:val="000000"/>
+                <w:sz w:val="20"/>
+                <w:szCs w:val="20"/>
+              </w:rPr>
+              <w:t xml:space="preserve">FK values are assigned directly from parent-table IDs during generation (e.g., </w:t>
+            </w:r>
+            <w:proofErr w:type="spellStart"/>
+            <w:r>
+              <w:rPr>
+                <w:color w:val="000000"/>
+                <w:sz w:val="20"/>
+                <w:szCs w:val="20"/>
+              </w:rPr>
+              <w:t>Trips.UserID</w:t>
+            </w:r>
+            <w:proofErr w:type="spellEnd"/>
+            <w:r>
+              <w:rPr>
+                <w:color w:val="000000"/>
+                <w:sz w:val="20"/>
+                <w:szCs w:val="20"/>
+              </w:rPr>
+              <w:t xml:space="preserve"> is always drawn from the Users list). No orphaned foreign keys exist in any CSV.</w:t>
+            </w:r>
+          </w:p>
+        </w:tc>
+      </w:tr>
+      <w:tr>
+        <w:tc>
+          <w:tcPr>
+            <w:tcW w:w="2400" w:type="dxa"/>
+          </w:tcPr>
+          <w:p>
+            <w:r>
+              <w:rPr>
+                <w:color w:val="000000"/>
+                <w:sz w:val="20"/>
+                <w:szCs w:val="20"/>
+              </w:rPr>
+              <w:t>Category Validation</w:t>
+            </w:r>
+          </w:p>
+        </w:tc>
+        <w:tc>
+          <w:tcPr>
+            <w:tcW w:w="2400" w:type="dxa"/>
+          </w:tcPr>
+          <w:p>
+            <w:proofErr w:type="spellStart"/>
+            <w:r>
+              <w:rPr>
+                <w:color w:val="000000"/>
+                <w:sz w:val="20"/>
+                <w:szCs w:val="20"/>
+              </w:rPr>
+              <w:t>Expenses.Category</w:t>
+            </w:r>
+            <w:proofErr w:type="spellEnd"/>
+          </w:p>
+        </w:tc>
+        <w:tc>
+          <w:tcPr>
+            <w:tcW w:w="4560" w:type="dxa"/>
+          </w:tcPr>
+          <w:p>
+            <w:r>
+              <w:rPr>
+                <w:color w:val="000000"/>
+                <w:sz w:val="20"/>
+                <w:szCs w:val="20"/>
+              </w:rPr>
+              <w:t>Only the six allowed values — Hotel, Transport, Food, Activities, Shopping, Other — are used. The generator draws from this exact list, matching the CHECK constraint in the schema.</w:t>
+            </w:r>
+          </w:p>
+        </w:tc>
+      </w:tr>
+      <w:tr>
+        <w:tc>
+          <w:tcPr>
+            <w:tcW w:w="2400" w:type="dxa"/>
+          </w:tcPr>
+          <w:p>
+            <w:r>
+              <w:rPr>
+                <w:color w:val="000000"/>
+                <w:sz w:val="20"/>
+                <w:szCs w:val="20"/>
+              </w:rPr>
+              <w:t>Realistic Data Values</w:t>
+            </w:r>
+          </w:p>
+        </w:tc>
+        <w:tc>
+          <w:tcPr>
+            <w:tcW w:w="2400" w:type="dxa"/>
+          </w:tcPr>
+          <w:p>
+            <w:r>
+              <w:rPr>
+                <w:color w:val="000000"/>
+                <w:sz w:val="20"/>
+                <w:szCs w:val="20"/>
+              </w:rPr>
+              <w:t>Hotels, Activities</w:t>
+            </w:r>
+          </w:p>
+        </w:tc>
+        <w:tc>
+          <w:tcPr>
+            <w:tcW w:w="4560" w:type="dxa"/>
+          </w:tcPr>
+          <w:p>
+            <w:r>
+              <w:rPr>
+                <w:color w:val="000000"/>
+                <w:sz w:val="20"/>
+                <w:szCs w:val="20"/>
+              </w:rPr>
+              <w:t>Hotel names use a real city name combined with random prefix/suffix (e.g., 'Grand Istanbul Resort'). Activities are drawn from a curated list of 20 real travel activities. Cost ranges are realistic (hotel: $40–$450/night, activities: $10–$200).</w:t>
+            </w:r>
+          </w:p>
+        </w:tc>
+      </w:tr>
+    </w:tbl>
+    <w:p>
+      <w:pPr>
+        <w:spacing w:before="120" w:after="60"/>
+      </w:pPr>
+    </w:p>
+    <w:p>
+      <w:pPr>
+        <w:pStyle w:val="Heading2"/>
+      </w:pPr>
+    </w:p>
+    <w:p>
+      <w:pPr>
+        <w:pStyle w:val="Heading2"/>
+      </w:pPr>
+    </w:p>
+    <w:p>
+      <w:pPr>
+        <w:pStyle w:val="Heading2"/>
+      </w:pPr>
+    </w:p>
+    <w:p>
+      <w:r>
+        <w:br w:type="page"/>
+      </w:r>
+    </w:p>
+    <w:p>
+      <w:pPr>
+        <w:pStyle w:val="Heading1"/>
+        <w:rPr>
+          <w:color w:val="auto"/>
+          <w:sz w:val="28"/>
+          <w:szCs w:val="28"/>
+        </w:rPr>
+      </w:pPr>
+      <w:r>
+        <w:rPr>
+          <w:color w:val="auto"/>
+          <w:sz w:val="28"/>
+          <w:szCs w:val="28"/>
+        </w:rPr>
+        <w:lastRenderedPageBreak/>
+        <w:t>Step 2 — Dataflow Definition:</w:t>
+      </w:r>
+    </w:p>
+    <w:p>
+      <w:pPr>
+        <w:spacing w:before="60" w:after="60"/>
+      </w:pPr>
+      <w:r>
+        <w:t>This section explains exactly how data enters the Travel Itinerary Planner system, how it flows through the tables, and what comes out at the end. This is specific to this project — the flow is driven by the hierarchical nature of trip planning.</w:t>
+      </w:r>
+    </w:p>
+    <w:p>
+      <w:pPr>
+        <w:pStyle w:val="Heading2"/>
+        <w:rPr>
+          <w:color w:val="auto"/>
+          <w:sz w:val="24"/>
+          <w:szCs w:val="24"/>
+        </w:rPr>
+      </w:pPr>
+      <w:r>
+        <w:rPr>
+          <w:color w:val="auto"/>
+          <w:sz w:val="24"/>
+          <w:szCs w:val="24"/>
+        </w:rPr>
+        <w:t>Data Entry Point:</w:t>
+      </w:r>
+    </w:p>
+    <w:p>
+      <w:pPr>
+        <w:spacing w:before="60" w:after="60"/>
+      </w:pPr>
+      <w:r>
+        <w:t xml:space="preserve">All data entry begins with the Users table. A user must exist before any trip, destination, hotel, activity, schedule, or expense can be created. This is because every trip is linked to a </w:t>
+      </w:r>
+      <w:proofErr w:type="spellStart"/>
+      <w:r>
+        <w:t>UserID</w:t>
+      </w:r>
+      <w:proofErr w:type="spellEnd"/>
+      <w:r>
+        <w:t xml:space="preserve"> via a foreign key, and all downstream tables link through trips or destinations.</w:t>
+      </w:r>
+    </w:p>
+    <w:p>
+      <w:pPr>
+        <w:pStyle w:val="Heading2"/>
+        <w:rPr>
+          <w:color w:val="auto"/>
+          <w:sz w:val="24"/>
+          <w:szCs w:val="24"/>
+        </w:rPr>
+      </w:pPr>
+      <w:r>
+        <w:rPr>
+          <w:color w:val="auto"/>
+          <w:sz w:val="24"/>
+          <w:szCs w:val="24"/>
+        </w:rPr>
+        <w:t>Dataflow Through the System — Stage by Stage:</w:t>
+      </w:r>
+    </w:p>
+    <w:tbl>
+      <w:tblPr>
+        <w:tblStyle w:val="TableGrid"/>
+        <w:tblW w:w="9360" w:type="dxa"/>
+        <w:tblLook w:val="04A0" w:firstRow="1" w:lastRow="0" w:firstColumn="1" w:lastColumn="0" w:noHBand="0" w:noVBand="1"/>
+      </w:tblPr>
+      <w:tblGrid>
+        <w:gridCol w:w="1800"/>
+        <w:gridCol w:w="2200"/>
+        <w:gridCol w:w="2160"/>
+        <w:gridCol w:w="3200"/>
+      </w:tblGrid>
+      <w:tr>
+        <w:tc>
+          <w:tcPr>
+            <w:tcW w:w="1800" w:type="dxa"/>
+          </w:tcPr>
+          <w:p>
+            <w:r>
+              <w:rPr>
+                <w:b/>
+                <w:bCs/>
+                <w:sz w:val="20"/>
+                <w:szCs w:val="20"/>
+              </w:rPr>
+              <w:t>Stage</w:t>
+            </w:r>
+          </w:p>
+        </w:tc>
+        <w:tc>
+          <w:tcPr>
+            <w:tcW w:w="2200" w:type="dxa"/>
+          </w:tcPr>
+          <w:p>
+            <w:r>
+              <w:rPr>
+                <w:b/>
+                <w:bCs/>
+                <w:sz w:val="20"/>
+                <w:szCs w:val="20"/>
+              </w:rPr>
+              <w:t>Table(s)</w:t>
+            </w:r>
+          </w:p>
+        </w:tc>
+        <w:tc>
+          <w:tcPr>
+            <w:tcW w:w="2160" w:type="dxa"/>
+          </w:tcPr>
+          <w:p>
+            <w:r>
+              <w:rPr>
+                <w:b/>
+                <w:bCs/>
+                <w:sz w:val="20"/>
+                <w:szCs w:val="20"/>
+              </w:rPr>
+              <w:t>Data Direction</w:t>
+            </w:r>
+          </w:p>
+        </w:tc>
+        <w:tc>
+          <w:tcPr>
+            <w:tcW w:w="3200" w:type="dxa"/>
+          </w:tcPr>
+          <w:p>
+            <w:r>
+              <w:rPr>
+                <w:b/>
+                <w:bCs/>
+                <w:sz w:val="20"/>
+                <w:szCs w:val="20"/>
+              </w:rPr>
+              <w:t>Description</w:t>
+            </w:r>
+          </w:p>
+        </w:tc>
+      </w:tr>
+      <w:tr>
+        <w:tc>
+          <w:tcPr>
+            <w:tcW w:w="1800" w:type="dxa"/>
+          </w:tcPr>
+          <w:p>
+            <w:r>
+              <w:rPr>
+                <w:b/>
+                <w:bCs/>
+                <w:color w:val="000000"/>
+                <w:sz w:val="20"/>
+                <w:szCs w:val="20"/>
+              </w:rPr>
+              <w:t>1 — Entry</w:t>
+            </w:r>
+          </w:p>
+        </w:tc>
+        <w:tc>
+          <w:tcPr>
+            <w:tcW w:w="2200" w:type="dxa"/>
+          </w:tcPr>
+          <w:p>
+            <w:r>
+              <w:rPr>
+                <w:color w:val="000000"/>
+                <w:sz w:val="20"/>
+                <w:szCs w:val="20"/>
+              </w:rPr>
+              <w:t>Users</w:t>
+            </w:r>
+          </w:p>
+        </w:tc>
+        <w:tc>
+          <w:tcPr>
+            <w:tcW w:w="2160" w:type="dxa"/>
+          </w:tcPr>
+          <w:p>
+            <w:r>
+              <w:rPr>
+                <w:color w:val="000000"/>
+                <w:sz w:val="20"/>
+                <w:szCs w:val="20"/>
+              </w:rPr>
+              <w:t>INSERT</w:t>
+            </w:r>
+          </w:p>
+        </w:tc>
+        <w:tc>
+          <w:tcPr>
+            <w:tcW w:w="3200" w:type="dxa"/>
+          </w:tcPr>
+          <w:p>
+            <w:r>
+              <w:rPr>
+                <w:color w:val="000000"/>
+                <w:sz w:val="20"/>
+                <w:szCs w:val="20"/>
+              </w:rPr>
+              <w:t>A new user registers with Name, Email, and Password. This is the starting point of all data in the system. No trip can exist without a valid user.</w:t>
+            </w:r>
+          </w:p>
+        </w:tc>
+      </w:tr>
+      <w:tr>
+        <w:tc>
+          <w:tcPr>
+            <w:tcW w:w="1800" w:type="dxa"/>
+          </w:tcPr>
+          <w:p>
+            <w:r>
+              <w:rPr>
+                <w:b/>
+                <w:bCs/>
+                <w:color w:val="000000"/>
+                <w:sz w:val="20"/>
+                <w:szCs w:val="20"/>
+              </w:rPr>
+              <w:t>2 — Trip Creation</w:t>
+            </w:r>
+          </w:p>
+        </w:tc>
+        <w:tc>
+          <w:tcPr>
+            <w:tcW w:w="2200" w:type="dxa"/>
+          </w:tcPr>
+          <w:p>
+            <w:r>
+              <w:rPr>
+                <w:color w:val="000000"/>
+                <w:sz w:val="20"/>
+                <w:szCs w:val="20"/>
+              </w:rPr>
+              <w:t>Trips</w:t>
+            </w:r>
+          </w:p>
+        </w:tc>
+        <w:tc>
+          <w:tcPr>
+            <w:tcW w:w="2160" w:type="dxa"/>
+          </w:tcPr>
+          <w:p>
+            <w:r>
+              <w:rPr>
+                <w:color w:val="000000"/>
+                <w:sz w:val="20"/>
+                <w:szCs w:val="20"/>
+              </w:rPr>
+              <w:t>INSERT (depends on Users)</w:t>
+            </w:r>
+          </w:p>
+        </w:tc>
+        <w:tc>
+          <w:tcPr>
+            <w:tcW w:w="3200" w:type="dxa"/>
+          </w:tcPr>
+          <w:p>
+            <w:r>
+              <w:rPr>
+                <w:color w:val="000000"/>
+                <w:sz w:val="20"/>
+                <w:szCs w:val="20"/>
+              </w:rPr>
+              <w:t xml:space="preserve">The user creates a trip by entering a title, start/end dates, and a total budget. The </w:t>
+            </w:r>
+            <w:proofErr w:type="spellStart"/>
+            <w:r>
+              <w:rPr>
+                <w:color w:val="000000"/>
+                <w:sz w:val="20"/>
+                <w:szCs w:val="20"/>
+              </w:rPr>
+              <w:t>UserID</w:t>
+            </w:r>
+            <w:proofErr w:type="spellEnd"/>
+            <w:r>
+              <w:rPr>
+                <w:color w:val="000000"/>
+                <w:sz w:val="20"/>
+                <w:szCs w:val="20"/>
+              </w:rPr>
+              <w:t xml:space="preserve"> foreign key links it to the registered user.</w:t>
+            </w:r>
+          </w:p>
+        </w:tc>
+      </w:tr>
+      <w:tr>
+        <w:tc>
+          <w:tcPr>
+            <w:tcW w:w="1800" w:type="dxa"/>
+          </w:tcPr>
+          <w:p>
+            <w:r>
+              <w:rPr>
+                <w:b/>
+                <w:bCs/>
+                <w:color w:val="000000"/>
+                <w:sz w:val="20"/>
+                <w:szCs w:val="20"/>
+              </w:rPr>
+              <w:t>3 — Destination Planning</w:t>
+            </w:r>
+          </w:p>
+        </w:tc>
+        <w:tc>
+          <w:tcPr>
+            <w:tcW w:w="2200" w:type="dxa"/>
+          </w:tcPr>
+          <w:p>
+            <w:r>
+              <w:rPr>
+                <w:color w:val="000000"/>
+                <w:sz w:val="20"/>
+                <w:szCs w:val="20"/>
+              </w:rPr>
+              <w:t>Destinations</w:t>
+            </w:r>
+          </w:p>
+        </w:tc>
+        <w:tc>
+          <w:tcPr>
+            <w:tcW w:w="2160" w:type="dxa"/>
+          </w:tcPr>
+          <w:p>
+            <w:r>
+              <w:rPr>
+                <w:color w:val="000000"/>
+                <w:sz w:val="20"/>
+                <w:szCs w:val="20"/>
+              </w:rPr>
+              <w:t>INSERT (depends on Trips)</w:t>
+            </w:r>
+          </w:p>
+        </w:tc>
+        <w:tc>
+          <w:tcPr>
+            <w:tcW w:w="3200" w:type="dxa"/>
+          </w:tcPr>
+          <w:p>
+            <w:r>
+              <w:rPr>
+                <w:color w:val="000000"/>
+                <w:sz w:val="20"/>
+                <w:szCs w:val="20"/>
+              </w:rPr>
+              <w:t>For each trip, one or more destinations are added with city, country, arrival, and departure dates. A trip can include multiple destinations (e.g., Dubai then Paris).</w:t>
+            </w:r>
+          </w:p>
+        </w:tc>
+      </w:tr>
+      <w:tr>
+        <w:tc>
+          <w:tcPr>
+            <w:tcW w:w="1800" w:type="dxa"/>
+          </w:tcPr>
+          <w:p>
+            <w:r>
+              <w:rPr>
+                <w:b/>
+                <w:bCs/>
+                <w:color w:val="000000"/>
+                <w:sz w:val="20"/>
+                <w:szCs w:val="20"/>
+              </w:rPr>
+              <w:t>4 — Hotel Booking</w:t>
+            </w:r>
+          </w:p>
+        </w:tc>
+        <w:tc>
+          <w:tcPr>
+            <w:tcW w:w="2200" w:type="dxa"/>
+          </w:tcPr>
+          <w:p>
+            <w:r>
+              <w:rPr>
+                <w:color w:val="000000"/>
+                <w:sz w:val="20"/>
+                <w:szCs w:val="20"/>
+              </w:rPr>
+              <w:t>Hotels</w:t>
+            </w:r>
+          </w:p>
+        </w:tc>
+        <w:tc>
+          <w:tcPr>
+            <w:tcW w:w="2160" w:type="dxa"/>
+          </w:tcPr>
+          <w:p>
+            <w:r>
+              <w:rPr>
+                <w:color w:val="000000"/>
+                <w:sz w:val="20"/>
+                <w:szCs w:val="20"/>
+              </w:rPr>
+              <w:t>INSERT (depends on Destinations)</w:t>
+            </w:r>
+          </w:p>
+        </w:tc>
+        <w:tc>
+          <w:tcPr>
+            <w:tcW w:w="3200" w:type="dxa"/>
+          </w:tcPr>
+          <w:p>
+            <w:r>
+              <w:rPr>
+                <w:color w:val="000000"/>
+                <w:sz w:val="20"/>
+                <w:szCs w:val="20"/>
+              </w:rPr>
+              <w:t>Each destination gets a hotel assigned — with name, check-in/out dates, and cost per night. Hotels are scoped to a specific destination, not the trip directly.</w:t>
+            </w:r>
+          </w:p>
+        </w:tc>
+      </w:tr>
+      <w:tr>
+        <w:tc>
+          <w:tcPr>
+            <w:tcW w:w="1800" w:type="dxa"/>
+          </w:tcPr>
+          <w:p>
+            <w:r>
+              <w:rPr>
+                <w:b/>
+                <w:bCs/>
+                <w:color w:val="000000"/>
+                <w:sz w:val="20"/>
+                <w:szCs w:val="20"/>
+              </w:rPr>
+              <w:t>5 — Activity Scheduling</w:t>
+            </w:r>
+          </w:p>
+        </w:tc>
+        <w:tc>
+          <w:tcPr>
+            <w:tcW w:w="2200" w:type="dxa"/>
+          </w:tcPr>
+          <w:p>
+            <w:r>
+              <w:rPr>
+                <w:color w:val="000000"/>
+                <w:sz w:val="20"/>
+                <w:szCs w:val="20"/>
+              </w:rPr>
+              <w:t>Activities</w:t>
+            </w:r>
+          </w:p>
+        </w:tc>
+        <w:tc>
+          <w:tcPr>
+            <w:tcW w:w="2160" w:type="dxa"/>
+          </w:tcPr>
+          <w:p>
+            <w:r>
+              <w:rPr>
+                <w:color w:val="000000"/>
+                <w:sz w:val="20"/>
+                <w:szCs w:val="20"/>
+              </w:rPr>
+              <w:t>INSERT (depends on Destinations)</w:t>
+            </w:r>
+          </w:p>
+        </w:tc>
+        <w:tc>
+          <w:tcPr>
+            <w:tcW w:w="3200" w:type="dxa"/>
+          </w:tcPr>
+          <w:p>
+            <w:r>
+              <w:rPr>
+                <w:color w:val="000000"/>
+                <w:sz w:val="20"/>
+                <w:szCs w:val="20"/>
+              </w:rPr>
+              <w:t>Activities (tours, safaris, cruises, etc.) are attached to a destination, with time and cost. Multiple activities can exist per destination.</w:t>
+            </w:r>
+          </w:p>
+        </w:tc>
+      </w:tr>
+      <w:tr>
+        <w:tc>
+          <w:tcPr>
+            <w:tcW w:w="1800" w:type="dxa"/>
+          </w:tcPr>
+          <w:p>
+            <w:r>
+              <w:rPr>
+                <w:b/>
+                <w:bCs/>
+                <w:color w:val="000000"/>
+                <w:sz w:val="20"/>
+                <w:szCs w:val="20"/>
+              </w:rPr>
+              <w:t>6 — Day Planning</w:t>
+            </w:r>
+          </w:p>
+        </w:tc>
+        <w:tc>
+          <w:tcPr>
+            <w:tcW w:w="2200" w:type="dxa"/>
+          </w:tcPr>
+          <w:p>
+            <w:proofErr w:type="spellStart"/>
+            <w:r>
+              <w:rPr>
+                <w:color w:val="000000"/>
+                <w:sz w:val="20"/>
+                <w:szCs w:val="20"/>
+              </w:rPr>
+              <w:t>DaySchedule</w:t>
+            </w:r>
+            <w:proofErr w:type="spellEnd"/>
+          </w:p>
+        </w:tc>
+        <w:tc>
+          <w:tcPr>
+            <w:tcW w:w="2160" w:type="dxa"/>
+          </w:tcPr>
+          <w:p>
+            <w:r>
+              <w:rPr>
+                <w:color w:val="000000"/>
+                <w:sz w:val="20"/>
+                <w:szCs w:val="20"/>
+              </w:rPr>
+              <w:t>INSERT (depends on Trips)</w:t>
+            </w:r>
+          </w:p>
+        </w:tc>
+        <w:tc>
+          <w:tcPr>
+            <w:tcW w:w="3200" w:type="dxa"/>
+          </w:tcPr>
+          <w:p>
+            <w:r>
+              <w:rPr>
+                <w:color w:val="000000"/>
+                <w:sz w:val="20"/>
+                <w:szCs w:val="20"/>
+              </w:rPr>
+              <w:t>Day-by-day task scheduling is added for the trip — each row represents one time slot on one day, with a description of the planned task.</w:t>
+            </w:r>
+          </w:p>
+        </w:tc>
+      </w:tr>
+      <w:tr>
+        <w:tc>
+          <w:tcPr>
+            <w:tcW w:w="1800" w:type="dxa"/>
+          </w:tcPr>
+          <w:p>
+            <w:r>
+              <w:rPr>
+                <w:b/>
+                <w:bCs/>
+                <w:color w:val="000000"/>
+                <w:sz w:val="20"/>
+                <w:szCs w:val="20"/>
+              </w:rPr>
+              <w:t>7 — Expense Tracking</w:t>
+            </w:r>
+          </w:p>
+        </w:tc>
+        <w:tc>
+          <w:tcPr>
+            <w:tcW w:w="2200" w:type="dxa"/>
+          </w:tcPr>
+          <w:p>
+            <w:r>
+              <w:rPr>
+                <w:color w:val="000000"/>
+                <w:sz w:val="20"/>
+                <w:szCs w:val="20"/>
+              </w:rPr>
+              <w:t>Expenses</w:t>
+            </w:r>
+          </w:p>
+        </w:tc>
+        <w:tc>
+          <w:tcPr>
+            <w:tcW w:w="2160" w:type="dxa"/>
+          </w:tcPr>
+          <w:p>
+            <w:r>
+              <w:rPr>
+                <w:color w:val="000000"/>
+                <w:sz w:val="20"/>
+                <w:szCs w:val="20"/>
+              </w:rPr>
+              <w:t>INSERT (depends on Trips)</w:t>
+            </w:r>
+          </w:p>
+        </w:tc>
+        <w:tc>
+          <w:tcPr>
+            <w:tcW w:w="3200" w:type="dxa"/>
+          </w:tcPr>
+          <w:p>
+            <w:r>
+              <w:rPr>
+                <w:color w:val="000000"/>
+                <w:sz w:val="20"/>
+                <w:szCs w:val="20"/>
+              </w:rPr>
+              <w:t>As money is spent, expense records are added — linked to the trip with a category, amount, date, and optional notes.</w:t>
+            </w:r>
+          </w:p>
+        </w:tc>
+      </w:tr>
+      <w:tr>
+        <w:tc>
+          <w:tcPr>
+            <w:tcW w:w="1800" w:type="dxa"/>
+          </w:tcPr>
+          <w:p>
+            <w:r>
+              <w:rPr>
+                <w:b/>
+                <w:bCs/>
+                <w:color w:val="000000"/>
+                <w:sz w:val="20"/>
+                <w:szCs w:val="20"/>
+              </w:rPr>
+              <w:t>8 — Query Output</w:t>
+            </w:r>
+          </w:p>
+        </w:tc>
+        <w:tc>
+          <w:tcPr>
+            <w:tcW w:w="2200" w:type="dxa"/>
+          </w:tcPr>
+          <w:p>
+            <w:r>
+              <w:rPr>
+                <w:color w:val="000000"/>
+                <w:sz w:val="20"/>
+                <w:szCs w:val="20"/>
+              </w:rPr>
+              <w:t>All Tables</w:t>
+            </w:r>
+          </w:p>
+        </w:tc>
+        <w:tc>
+          <w:tcPr>
+            <w:tcW w:w="2160" w:type="dxa"/>
+          </w:tcPr>
+          <w:p>
+            <w:r>
+              <w:rPr>
+                <w:color w:val="000000"/>
+                <w:sz w:val="20"/>
+                <w:szCs w:val="20"/>
+              </w:rPr>
+              <w:t>SELECT (READ)</w:t>
+            </w:r>
+          </w:p>
+        </w:tc>
+        <w:tc>
+          <w:tcPr>
+            <w:tcW w:w="3200" w:type="dxa"/>
+          </w:tcPr>
+          <w:p>
+            <w:r>
+              <w:rPr>
+                <w:color w:val="000000"/>
+                <w:sz w:val="20"/>
+                <w:szCs w:val="20"/>
+              </w:rPr>
+              <w:t>Users query the system to view itineraries, calculate total costs (SUM of hotel nights + activity costs + expenses), filter trips by date, or export reports.</w:t>
+            </w:r>
+          </w:p>
+        </w:tc>
+      </w:tr>
+    </w:tbl>
+    <w:p>
+      <w:pPr>
+        <w:spacing w:before="120" w:after="60"/>
+      </w:pPr>
+    </w:p>
+    <w:p>
+      <w:pPr>
+        <w:pStyle w:val="Heading2"/>
+        <w:rPr>
+          <w:color w:val="auto"/>
+          <w:sz w:val="24"/>
+          <w:szCs w:val="24"/>
+        </w:rPr>
+      </w:pPr>
+      <w:r>
+        <w:rPr>
+          <w:color w:val="auto"/>
+          <w:sz w:val="24"/>
+          <w:szCs w:val="24"/>
+        </w:rPr>
+        <w:t>Dataflow Diagram (Textual)</w:t>
+      </w:r>
+      <w:r>
+        <w:rPr>
+          <w:color w:val="auto"/>
+          <w:sz w:val="24"/>
+          <w:szCs w:val="24"/>
+        </w:rPr>
+        <w:t>:</w:t>
+      </w:r>
+    </w:p>
+    <w:p>
+      <w:pPr>
+        <w:spacing w:before="60" w:after="60"/>
+      </w:pPr>
+      <w:r>
+        <w:t>The dependency chain below shows the order in which tables must receive data:</w:t>
+      </w:r>
+    </w:p>
+    <w:p>
+      <w:pPr>
+        <w:spacing w:before="120" w:after="60"/>
+      </w:pPr>
+    </w:p>
+    <w:p>
+      <w:pPr>
+        <w:spacing w:before="30" w:after="30"/>
+      </w:pPr>
+      <w:r>
+        <w:rPr>
+          <w:rFonts w:ascii="Courier New" w:eastAsia="Courier New" w:hAnsi="Courier New" w:cs="Courier New"/>
+          <w:color w:val="1A1A2E"/>
+          <w:sz w:val="18"/>
+          <w:szCs w:val="18"/>
+        </w:rPr>
+        <w:t xml:space="preserve">  [User registers]</w:t>
+      </w:r>
+    </w:p>
+    <w:p>
+      <w:pPr>
+        <w:spacing w:before="30" w:after="30"/>
+      </w:pPr>
+      <w:r>
+        <w:rPr>
+          <w:rFonts w:ascii="Courier New" w:eastAsia="Courier New" w:hAnsi="Courier New" w:cs="Courier New"/>
+          <w:color w:val="1A1A2E"/>
+          <w:sz w:val="18"/>
+          <w:szCs w:val="18"/>
+        </w:rPr>
+        <w:t xml:space="preserve">       │</w:t>
+      </w:r>
+    </w:p>
+    <w:p>
+      <w:pPr>
+        <w:spacing w:before="30" w:after="30"/>
+      </w:pPr>
+      <w:r>
+        <w:rPr>
+          <w:rFonts w:ascii="Courier New" w:eastAsia="Courier New" w:hAnsi="Courier New" w:cs="Courier New"/>
+          <w:color w:val="1A1A2E"/>
+          <w:sz w:val="18"/>
+          <w:szCs w:val="18"/>
+        </w:rPr>
+        <w:t xml:space="preserve">       ▼</w:t>
+      </w:r>
+    </w:p>
+    <w:p>
+      <w:pPr>
+        <w:spacing w:before="30" w:after="30"/>
+      </w:pPr>
+      <w:r>
+        <w:rPr>
+          <w:rFonts w:ascii="Courier New" w:eastAsia="Courier New" w:hAnsi="Courier New" w:cs="Courier New"/>
+          <w:color w:val="1A1A2E"/>
+          <w:sz w:val="18"/>
+          <w:szCs w:val="18"/>
+        </w:rPr>
+        <w:t xml:space="preserve">  USERS (</w:t>
+      </w:r>
+      <w:proofErr w:type="spellStart"/>
+      <w:r>
+        <w:rPr>
+          <w:rFonts w:ascii="Courier New" w:eastAsia="Courier New" w:hAnsi="Courier New" w:cs="Courier New"/>
+          <w:color w:val="1A1A2E"/>
+          <w:sz w:val="18"/>
+          <w:szCs w:val="18"/>
+        </w:rPr>
+        <w:t>UserID</w:t>
+      </w:r>
+      <w:proofErr w:type="spellEnd"/>
+      <w:r>
+        <w:rPr>
+          <w:rFonts w:ascii="Courier New" w:eastAsia="Courier New" w:hAnsi="Courier New" w:cs="Courier New"/>
+          <w:color w:val="1A1A2E"/>
+          <w:sz w:val="18"/>
+          <w:szCs w:val="18"/>
+        </w:rPr>
+        <w:t>, Name, Email, Password)</w:t>
+      </w:r>
+    </w:p>
+    <w:p>
+      <w:pPr>
+        <w:spacing w:before="30" w:after="30"/>
+      </w:pPr>
+      <w:r>
+        <w:rPr>
+          <w:rFonts w:ascii="Courier New" w:eastAsia="Courier New" w:hAnsi="Courier New" w:cs="Courier New"/>
+          <w:color w:val="1A1A2E"/>
+          <w:sz w:val="18"/>
+          <w:szCs w:val="18"/>
+        </w:rPr>
+        <w:t xml:space="preserve">       │</w:t>
+      </w:r>
+    </w:p>
+    <w:p>
+      <w:pPr>
+        <w:spacing w:before="30" w:after="30"/>
+      </w:pPr>
+      <w:r>
+        <w:rPr>
+          <w:rFonts w:ascii="Courier New" w:eastAsia="Courier New" w:hAnsi="Courier New" w:cs="Courier New"/>
+          <w:color w:val="1A1A2E"/>
+          <w:sz w:val="18"/>
+          <w:szCs w:val="18"/>
+        </w:rPr>
+        <w:t xml:space="preserve">       ▼</w:t>
+      </w:r>
+    </w:p>
+    <w:p>
+      <w:pPr>
+        <w:spacing w:before="30" w:after="30"/>
+      </w:pPr>
+      <w:r>
+        <w:rPr>
+          <w:rFonts w:ascii="Courier New" w:eastAsia="Courier New" w:hAnsi="Courier New" w:cs="Courier New"/>
+          <w:color w:val="1A1A2E"/>
+          <w:sz w:val="18"/>
+          <w:szCs w:val="18"/>
+        </w:rPr>
+        <w:t xml:space="preserve">  TRIPS (</w:t>
+      </w:r>
+      <w:proofErr w:type="spellStart"/>
+      <w:r>
+        <w:rPr>
+          <w:rFonts w:ascii="Courier New" w:eastAsia="Courier New" w:hAnsi="Courier New" w:cs="Courier New"/>
+          <w:color w:val="1A1A2E"/>
+          <w:sz w:val="18"/>
+          <w:szCs w:val="18"/>
+        </w:rPr>
+        <w:t>TripID</w:t>
+      </w:r>
+      <w:proofErr w:type="spellEnd"/>
+      <w:r>
+        <w:rPr>
+          <w:rFonts w:ascii="Courier New" w:eastAsia="Courier New" w:hAnsi="Courier New" w:cs="Courier New"/>
+          <w:color w:val="1A1A2E"/>
+          <w:sz w:val="18"/>
+          <w:szCs w:val="18"/>
+        </w:rPr>
+        <w:t xml:space="preserve"> ← </w:t>
+      </w:r>
+      <w:proofErr w:type="spellStart"/>
+      <w:r>
+        <w:rPr>
+          <w:rFonts w:ascii="Courier New" w:eastAsia="Courier New" w:hAnsi="Courier New" w:cs="Courier New"/>
+          <w:color w:val="1A1A2E"/>
+          <w:sz w:val="18"/>
+          <w:szCs w:val="18"/>
+        </w:rPr>
+        <w:t>UserID</w:t>
+      </w:r>
+      <w:proofErr w:type="spellEnd"/>
+      <w:r>
+        <w:rPr>
+          <w:rFonts w:ascii="Courier New" w:eastAsia="Courier New" w:hAnsi="Courier New" w:cs="Courier New"/>
+          <w:color w:val="1A1A2E"/>
+          <w:sz w:val="18"/>
+          <w:szCs w:val="18"/>
+        </w:rPr>
+        <w:t xml:space="preserve">, </w:t>
+      </w:r>
+      <w:proofErr w:type="spellStart"/>
+      <w:r>
+        <w:rPr>
+          <w:rFonts w:ascii="Courier New" w:eastAsia="Courier New" w:hAnsi="Courier New" w:cs="Courier New"/>
+          <w:color w:val="1A1A2E"/>
+          <w:sz w:val="18"/>
+          <w:szCs w:val="18"/>
+        </w:rPr>
+        <w:t>TripTitle</w:t>
+      </w:r>
+      <w:proofErr w:type="spellEnd"/>
+      <w:r>
+        <w:rPr>
+          <w:rFonts w:ascii="Courier New" w:eastAsia="Courier New" w:hAnsi="Courier New" w:cs="Courier New"/>
+          <w:color w:val="1A1A2E"/>
+          <w:sz w:val="18"/>
+          <w:szCs w:val="18"/>
+        </w:rPr>
+        <w:t xml:space="preserve">, </w:t>
+      </w:r>
+      <w:proofErr w:type="spellStart"/>
+      <w:r>
+        <w:rPr>
+          <w:rFonts w:ascii="Courier New" w:eastAsia="Courier New" w:hAnsi="Courier New" w:cs="Courier New"/>
+          <w:color w:val="1A1A2E"/>
+          <w:sz w:val="18"/>
+          <w:szCs w:val="18"/>
+        </w:rPr>
+        <w:t>StartDate</w:t>
+      </w:r>
+      <w:proofErr w:type="spellEnd"/>
+      <w:r>
+        <w:rPr>
+          <w:rFonts w:ascii="Courier New" w:eastAsia="Courier New" w:hAnsi="Courier New" w:cs="Courier New"/>
+          <w:color w:val="1A1A2E"/>
+          <w:sz w:val="18"/>
+          <w:szCs w:val="18"/>
+        </w:rPr>
+        <w:t xml:space="preserve">, </w:t>
+      </w:r>
+      <w:proofErr w:type="spellStart"/>
+      <w:r>
+        <w:rPr>
+          <w:rFonts w:ascii="Courier New" w:eastAsia="Courier New" w:hAnsi="Courier New" w:cs="Courier New"/>
+          <w:color w:val="1A1A2E"/>
+          <w:sz w:val="18"/>
+          <w:szCs w:val="18"/>
+        </w:rPr>
+        <w:t>EndDate</w:t>
+      </w:r>
+      <w:proofErr w:type="spellEnd"/>
+      <w:r>
+        <w:rPr>
+          <w:rFonts w:ascii="Courier New" w:eastAsia="Courier New" w:hAnsi="Courier New" w:cs="Courier New"/>
+          <w:color w:val="1A1A2E"/>
+          <w:sz w:val="18"/>
+          <w:szCs w:val="18"/>
+        </w:rPr>
+        <w:t xml:space="preserve">, </w:t>
+      </w:r>
+      <w:proofErr w:type="spellStart"/>
+      <w:r>
+        <w:rPr>
+          <w:rFonts w:ascii="Courier New" w:eastAsia="Courier New" w:hAnsi="Courier New" w:cs="Courier New"/>
+          <w:color w:val="1A1A2E"/>
+          <w:sz w:val="18"/>
+          <w:szCs w:val="18"/>
+        </w:rPr>
+        <w:t>TotalBudget</w:t>
+      </w:r>
+      <w:proofErr w:type="spellEnd"/>
+      <w:r>
+        <w:rPr>
+          <w:rFonts w:ascii="Courier New" w:eastAsia="Courier New" w:hAnsi="Courier New" w:cs="Courier New"/>
+          <w:color w:val="1A1A2E"/>
+          <w:sz w:val="18"/>
+          <w:szCs w:val="18"/>
+        </w:rPr>
+        <w:t>)</w:t>
+      </w:r>
+    </w:p>
+    <w:p>
+      <w:pPr>
+        <w:spacing w:before="30" w:after="30"/>
+      </w:pPr>
+      <w:r>
+        <w:rPr>
+          <w:rFonts w:ascii="Courier New" w:eastAsia="Courier New" w:hAnsi="Courier New" w:cs="Courier New"/>
+          <w:color w:val="1A1A2E"/>
+          <w:sz w:val="18"/>
+          <w:szCs w:val="18"/>
+        </w:rPr>
+        <w:t xml:space="preserve">       │</w:t>
+      </w:r>
+    </w:p>
+    <w:p>
+      <w:pPr>
+        <w:spacing w:before="30" w:after="30"/>
+      </w:pPr>
+      <w:r>
+        <w:rPr>
+          <w:rFonts w:ascii="Courier New" w:eastAsia="Courier New" w:hAnsi="Courier New" w:cs="Courier New"/>
+          <w:color w:val="1A1A2E"/>
+          <w:sz w:val="18"/>
+          <w:szCs w:val="18"/>
+        </w:rPr>
+        <w:t xml:space="preserve">       ├──────────────────────────┬──────────────────────────┐</w:t>
+      </w:r>
+    </w:p>
+    <w:p>
+      <w:pPr>
+        <w:spacing w:before="30" w:after="30"/>
+      </w:pPr>
+      <w:r>
+        <w:rPr>
+          <w:rFonts w:ascii="Courier New" w:eastAsia="Courier New" w:hAnsi="Courier New" w:cs="Courier New"/>
+          <w:color w:val="1A1A2E"/>
+          <w:sz w:val="18"/>
+          <w:szCs w:val="18"/>
+        </w:rPr>
+        <w:t xml:space="preserve">       ▼                          ▼                          ▼</w:t>
+      </w:r>
+    </w:p>
+    <w:p>
+      <w:pPr>
+        <w:spacing w:before="30" w:after="30"/>
+      </w:pPr>
+      <w:r>
+        <w:rPr>
+          <w:rFonts w:ascii="Courier New" w:eastAsia="Courier New" w:hAnsi="Courier New" w:cs="Courier New"/>
+          <w:color w:val="1A1A2E"/>
+          <w:sz w:val="18"/>
+          <w:szCs w:val="18"/>
+        </w:rPr>
+        <w:t xml:space="preserve">  DESTINATIONS              DAYSCHEDULE                EXPENSES</w:t>
+      </w:r>
+    </w:p>
+    <w:p>
+      <w:pPr>
+        <w:spacing w:before="30" w:after="30"/>
+      </w:pPr>
+      <w:r>
+        <w:rPr>
+          <w:rFonts w:ascii="Courier New" w:eastAsia="Courier New" w:hAnsi="Courier New" w:cs="Courier New"/>
+          <w:color w:val="1A1A2E"/>
+          <w:sz w:val="18"/>
+          <w:szCs w:val="18"/>
+        </w:rPr>
+        <w:t xml:space="preserve">  (</w:t>
+      </w:r>
+      <w:proofErr w:type="spellStart"/>
+      <w:r>
+        <w:rPr>
+          <w:rFonts w:ascii="Courier New" w:eastAsia="Courier New" w:hAnsi="Courier New" w:cs="Courier New"/>
+          <w:color w:val="1A1A2E"/>
+          <w:sz w:val="18"/>
+          <w:szCs w:val="18"/>
+        </w:rPr>
+        <w:t>DestinationID</w:t>
+      </w:r>
+      <w:proofErr w:type="spellEnd"/>
+      <w:r>
+        <w:rPr>
+          <w:rFonts w:ascii="Courier New" w:eastAsia="Courier New" w:hAnsi="Courier New" w:cs="Courier New"/>
+          <w:color w:val="1A1A2E"/>
+          <w:sz w:val="18"/>
+          <w:szCs w:val="18"/>
+        </w:rPr>
+        <w:t xml:space="preserve"> ← </w:t>
+      </w:r>
+      <w:proofErr w:type="spellStart"/>
+      <w:proofErr w:type="gramStart"/>
+      <w:r>
+        <w:rPr>
+          <w:rFonts w:ascii="Courier New" w:eastAsia="Courier New" w:hAnsi="Courier New" w:cs="Courier New"/>
+          <w:color w:val="1A1A2E"/>
+          <w:sz w:val="18"/>
+          <w:szCs w:val="18"/>
+        </w:rPr>
+        <w:t>TripID</w:t>
+      </w:r>
+      <w:proofErr w:type="spellEnd"/>
+      <w:r>
+        <w:rPr>
+          <w:rFonts w:ascii="Courier New" w:eastAsia="Courier New" w:hAnsi="Courier New" w:cs="Courier New"/>
+          <w:color w:val="1A1A2E"/>
+          <w:sz w:val="18"/>
+          <w:szCs w:val="18"/>
+        </w:rPr>
+        <w:t>)  (</w:t>
+      </w:r>
+      <w:proofErr w:type="spellStart"/>
+      <w:proofErr w:type="gramEnd"/>
+      <w:r>
+        <w:rPr>
+          <w:rFonts w:ascii="Courier New" w:eastAsia="Courier New" w:hAnsi="Courier New" w:cs="Courier New"/>
+          <w:color w:val="1A1A2E"/>
+          <w:sz w:val="18"/>
+          <w:szCs w:val="18"/>
+        </w:rPr>
+        <w:t>ScheduleID</w:t>
+      </w:r>
+      <w:proofErr w:type="spellEnd"/>
+      <w:r>
+        <w:rPr>
+          <w:rFonts w:ascii="Courier New" w:eastAsia="Courier New" w:hAnsi="Courier New" w:cs="Courier New"/>
+          <w:color w:val="1A1A2E"/>
+          <w:sz w:val="18"/>
+          <w:szCs w:val="18"/>
+        </w:rPr>
+        <w:t xml:space="preserve"> ← </w:t>
+      </w:r>
+      <w:proofErr w:type="spellStart"/>
+      <w:r>
+        <w:rPr>
+          <w:rFonts w:ascii="Courier New" w:eastAsia="Courier New" w:hAnsi="Courier New" w:cs="Courier New"/>
+          <w:color w:val="1A1A2E"/>
+          <w:sz w:val="18"/>
+          <w:szCs w:val="18"/>
+        </w:rPr>
+        <w:t>TripID</w:t>
+      </w:r>
+      <w:proofErr w:type="spellEnd"/>
+      <w:r>
+        <w:rPr>
+          <w:rFonts w:ascii="Courier New" w:eastAsia="Courier New" w:hAnsi="Courier New" w:cs="Courier New"/>
+          <w:color w:val="1A1A2E"/>
+          <w:sz w:val="18"/>
+          <w:szCs w:val="18"/>
+        </w:rPr>
+        <w:t>)   (</w:t>
+      </w:r>
+      <w:proofErr w:type="spellStart"/>
+      <w:r>
+        <w:rPr>
+          <w:rFonts w:ascii="Courier New" w:eastAsia="Courier New" w:hAnsi="Courier New" w:cs="Courier New"/>
+          <w:color w:val="1A1A2E"/>
+          <w:sz w:val="18"/>
+          <w:szCs w:val="18"/>
+        </w:rPr>
+        <w:t>ExpenseID</w:t>
+      </w:r>
+      <w:proofErr w:type="spellEnd"/>
+      <w:r>
+        <w:rPr>
+          <w:rFonts w:ascii="Courier New" w:eastAsia="Courier New" w:hAnsi="Courier New" w:cs="Courier New"/>
+          <w:color w:val="1A1A2E"/>
+          <w:sz w:val="18"/>
+          <w:szCs w:val="18"/>
+        </w:rPr>
+        <w:t xml:space="preserve"> ← </w:t>
+      </w:r>
+      <w:proofErr w:type="spellStart"/>
+      <w:r>
+        <w:rPr>
+          <w:rFonts w:ascii="Courier New" w:eastAsia="Courier New" w:hAnsi="Courier New" w:cs="Courier New"/>
+          <w:color w:val="1A1A2E"/>
+          <w:sz w:val="18"/>
+          <w:szCs w:val="18"/>
+        </w:rPr>
+        <w:t>TripID</w:t>
+      </w:r>
+      <w:proofErr w:type="spellEnd"/>
+      <w:r>
+        <w:rPr>
+          <w:rFonts w:ascii="Courier New" w:eastAsia="Courier New" w:hAnsi="Courier New" w:cs="Courier New"/>
+          <w:color w:val="1A1A2E"/>
+          <w:sz w:val="18"/>
+          <w:szCs w:val="18"/>
+        </w:rPr>
+        <w:t>)</w:t>
+      </w:r>
+    </w:p>
+    <w:p>
+      <w:pPr>
+        <w:spacing w:before="30" w:after="30"/>
+      </w:pPr>
+      <w:r>
+        <w:rPr>
+          <w:rFonts w:ascii="Courier New" w:eastAsia="Courier New" w:hAnsi="Courier New" w:cs="Courier New"/>
+          <w:color w:val="1A1A2E"/>
+          <w:sz w:val="18"/>
+          <w:szCs w:val="18"/>
+        </w:rPr>
+        <w:t xml:space="preserve">       │</w:t>
+      </w:r>
+    </w:p>
+    <w:p>
+      <w:pPr>
+        <w:spacing w:before="30" w:after="30"/>
+      </w:pPr>
+      <w:r>
+        <w:rPr>
+          <w:rFonts w:ascii="Courier New" w:eastAsia="Courier New" w:hAnsi="Courier New" w:cs="Courier New"/>
+          <w:color w:val="1A1A2E"/>
+          <w:sz w:val="18"/>
+          <w:szCs w:val="18"/>
+        </w:rPr>
+        <w:t xml:space="preserve">       ├──────────────────────────┐</w:t>
+      </w:r>
+    </w:p>
+    <w:p>
+      <w:pPr>
+        <w:spacing w:before="30" w:after="30"/>
+      </w:pPr>
+      <w:r>
+        <w:rPr>
+          <w:rFonts w:ascii="Courier New" w:eastAsia="Courier New" w:hAnsi="Courier New" w:cs="Courier New"/>
+          <w:color w:val="1A1A2E"/>
+          <w:sz w:val="18"/>
+          <w:szCs w:val="18"/>
+        </w:rPr>
+        <w:t xml:space="preserve">       ▼                          ▼</w:t>
+      </w:r>
+    </w:p>
+    <w:p>
+      <w:pPr>
+        <w:spacing w:before="30" w:after="30"/>
+      </w:pPr>
+      <w:r>
+        <w:rPr>
+          <w:rFonts w:ascii="Courier New" w:eastAsia="Courier New" w:hAnsi="Courier New" w:cs="Courier New"/>
+          <w:color w:val="1A1A2E"/>
+          <w:sz w:val="18"/>
+          <w:szCs w:val="18"/>
+        </w:rPr>
+        <w:t xml:space="preserve">  HOTELS                     ACTIVITIES</w:t>
+      </w:r>
+    </w:p>
+    <w:p>
+      <w:pPr>
+        <w:spacing w:before="30" w:after="30"/>
+      </w:pPr>
+      <w:r>
+        <w:rPr>
+          <w:rFonts w:ascii="Courier New" w:eastAsia="Courier New" w:hAnsi="Courier New" w:cs="Courier New"/>
+          <w:color w:val="1A1A2E"/>
+          <w:sz w:val="18"/>
+          <w:szCs w:val="18"/>
+        </w:rPr>
+        <w:t xml:space="preserve">  (</w:t>
+      </w:r>
+      <w:proofErr w:type="spellStart"/>
+      <w:r>
+        <w:rPr>
+          <w:rFonts w:ascii="Courier New" w:eastAsia="Courier New" w:hAnsi="Courier New" w:cs="Courier New"/>
+          <w:color w:val="1A1A2E"/>
+          <w:sz w:val="18"/>
+          <w:szCs w:val="18"/>
+        </w:rPr>
+        <w:t>HotelID</w:t>
+      </w:r>
+      <w:proofErr w:type="spellEnd"/>
+      <w:r>
+        <w:rPr>
+          <w:rFonts w:ascii="Courier New" w:eastAsia="Courier New" w:hAnsi="Courier New" w:cs="Courier New"/>
+          <w:color w:val="1A1A2E"/>
+          <w:sz w:val="18"/>
+          <w:szCs w:val="18"/>
+        </w:rPr>
+        <w:t xml:space="preserve"> ← </w:t>
+      </w:r>
+      <w:proofErr w:type="spellStart"/>
+      <w:proofErr w:type="gramStart"/>
+      <w:r>
+        <w:rPr>
+          <w:rFonts w:ascii="Courier New" w:eastAsia="Courier New" w:hAnsi="Courier New" w:cs="Courier New"/>
+          <w:color w:val="1A1A2E"/>
+          <w:sz w:val="18"/>
+          <w:szCs w:val="18"/>
+        </w:rPr>
+        <w:t>DestinationID</w:t>
+      </w:r>
+      <w:proofErr w:type="spellEnd"/>
+      <w:r>
+        <w:rPr>
+          <w:rFonts w:ascii="Courier New" w:eastAsia="Courier New" w:hAnsi="Courier New" w:cs="Courier New"/>
+          <w:color w:val="1A1A2E"/>
+          <w:sz w:val="18"/>
+          <w:szCs w:val="18"/>
+        </w:rPr>
+        <w:t>)  (</w:t>
+      </w:r>
+      <w:proofErr w:type="spellStart"/>
+      <w:proofErr w:type="gramEnd"/>
+      <w:r>
+        <w:rPr>
+          <w:rFonts w:ascii="Courier New" w:eastAsia="Courier New" w:hAnsi="Courier New" w:cs="Courier New"/>
+          <w:color w:val="1A1A2E"/>
+          <w:sz w:val="18"/>
+          <w:szCs w:val="18"/>
+        </w:rPr>
+        <w:t>ActivityID</w:t>
+      </w:r>
+      <w:proofErr w:type="spellEnd"/>
+      <w:r>
+        <w:rPr>
+          <w:rFonts w:ascii="Courier New" w:eastAsia="Courier New" w:hAnsi="Courier New" w:cs="Courier New"/>
+          <w:color w:val="1A1A2E"/>
+          <w:sz w:val="18"/>
+          <w:szCs w:val="18"/>
+        </w:rPr>
+        <w:t xml:space="preserve"> ← </w:t>
+      </w:r>
+      <w:proofErr w:type="spellStart"/>
+      <w:r>
+        <w:rPr>
+          <w:rFonts w:ascii="Courier New" w:eastAsia="Courier New" w:hAnsi="Courier New" w:cs="Courier New"/>
+          <w:color w:val="1A1A2E"/>
+          <w:sz w:val="18"/>
+          <w:szCs w:val="18"/>
+        </w:rPr>
+        <w:t>DestinationID</w:t>
+      </w:r>
+      <w:proofErr w:type="spellEnd"/>
+      <w:r>
+        <w:rPr>
+          <w:rFonts w:ascii="Courier New" w:eastAsia="Courier New" w:hAnsi="Courier New" w:cs="Courier New"/>
+          <w:color w:val="1A1A2E"/>
+          <w:sz w:val="18"/>
+          <w:szCs w:val="18"/>
+        </w:rPr>
+        <w:t>)</w:t>
+      </w:r>
+    </w:p>
+    <w:p>
+      <w:pPr>
+        <w:spacing w:before="30" w:after="30"/>
+      </w:pPr>
+      <w:r>
+        <w:rPr>
+          <w:rFonts w:ascii="Courier New" w:eastAsia="Courier New" w:hAnsi="Courier New" w:cs="Courier New"/>
+          <w:color w:val="1A1A2E"/>
+          <w:sz w:val="18"/>
+          <w:szCs w:val="18"/>
+        </w:rPr>
+        <w:t xml:space="preserve">       │</w:t>
+      </w:r>
+    </w:p>
+    <w:p>
+      <w:pPr>
+        <w:spacing w:before="30" w:after="30"/>
+      </w:pPr>
+      <w:r>
+        <w:rPr>
+          <w:rFonts w:ascii="Courier New" w:eastAsia="Courier New" w:hAnsi="Courier New" w:cs="Courier New"/>
+          <w:color w:val="1A1A2E"/>
+          <w:sz w:val="18"/>
+          <w:szCs w:val="18"/>
+        </w:rPr>
+        <w:t xml:space="preserve">       ▼</w:t>
+      </w:r>
+    </w:p>
+    <w:p>
+      <w:pPr>
+        <w:spacing w:before="30" w:after="30"/>
+      </w:pPr>
+      <w:r>
+        <w:rPr>
+          <w:rFonts w:ascii="Courier New" w:eastAsia="Courier New" w:hAnsi="Courier New" w:cs="Courier New"/>
+          <w:color w:val="1A1A2E"/>
+          <w:sz w:val="18"/>
+          <w:szCs w:val="18"/>
+        </w:rPr>
+        <w:t xml:space="preserve">  [Query Output: Itineraries, Cost Reports, Schedules, Exports]</w:t>
+      </w:r>
+    </w:p>
+    <w:p>
+      <w:pPr>
+        <w:spacing w:before="30" w:after="30"/>
+      </w:pPr>
+    </w:p>
+    <w:p>
+      <w:pPr>
+        <w:pStyle w:val="Heading2"/>
+        <w:rPr>
+          <w:color w:val="auto"/>
+          <w:sz w:val="24"/>
+          <w:szCs w:val="24"/>
+        </w:rPr>
+      </w:pPr>
+      <w:r>
+        <w:rPr>
+          <w:color w:val="auto"/>
+          <w:sz w:val="24"/>
+          <w:szCs w:val="24"/>
+        </w:rPr>
+        <w:t>What Comes Out of the System:</w:t>
+      </w:r>
+    </w:p>
+    <w:p>
+      <w:pPr>
+        <w:spacing w:before="60" w:after="60"/>
+      </w:pPr>
+      <w:r>
+        <w:t>The Travel Itinerary Planner produces the following outputs through SELECT queries:</w:t>
+      </w:r>
+    </w:p>
+    <w:p>
+      <w:pPr>
+        <w:spacing w:before="120" w:after="60"/>
+      </w:pPr>
+    </w:p>
+    <w:p>
+      <w:pPr>
+        <w:pStyle w:val="ListParagraph"/>
+        <w:numPr>
+          <w:ilvl w:val="0"/>
+          <w:numId w:val="1"/>
+        </w:numPr>
+        <w:spacing w:before="40" w:after="40"/>
+      </w:pPr>
+      <w:r>
+        <w:t xml:space="preserve">Full Trip Itinerary — A user can retrieve all destinations, hotels, activities, and day schedule entries for any trip with a JOIN across Trips, Destinations, Hotels, Activities, and </w:t>
+      </w:r>
+      <w:proofErr w:type="spellStart"/>
+      <w:r>
+        <w:t>DaySchedule</w:t>
+      </w:r>
+      <w:proofErr w:type="spellEnd"/>
+      <w:r>
+        <w:t>.</w:t>
+      </w:r>
+    </w:p>
+    <w:p>
+      <w:pPr>
+        <w:pStyle w:val="ListParagraph"/>
+        <w:numPr>
+          <w:ilvl w:val="0"/>
+          <w:numId w:val="1"/>
+        </w:numPr>
+        <w:spacing w:before="40" w:after="40"/>
+      </w:pPr>
+      <w:r>
+        <w:t xml:space="preserve">Total Trip Cost Report — Calculated by summing hotel nightly costs × nights stayed, activity costs per destination, and all expense amounts for a given </w:t>
+      </w:r>
+      <w:proofErr w:type="spellStart"/>
+      <w:r>
+        <w:t>TripID</w:t>
+      </w:r>
+      <w:proofErr w:type="spellEnd"/>
+      <w:r>
+        <w:t>.</w:t>
+      </w:r>
+    </w:p>
+    <w:p>
+      <w:pPr>
+        <w:pStyle w:val="ListParagraph"/>
+        <w:numPr>
+          <w:ilvl w:val="0"/>
+          <w:numId w:val="1"/>
+        </w:numPr>
+        <w:spacing w:before="40" w:after="40"/>
+      </w:pPr>
+      <w:r>
+        <w:t xml:space="preserve">Day-by-Day Schedule — Extracted from </w:t>
+      </w:r>
+      <w:proofErr w:type="spellStart"/>
+      <w:r>
+        <w:t>DaySchedule</w:t>
+      </w:r>
+      <w:proofErr w:type="spellEnd"/>
+      <w:r>
+        <w:t xml:space="preserve"> filtered by </w:t>
+      </w:r>
+      <w:proofErr w:type="spellStart"/>
+      <w:r>
+        <w:t>TripID</w:t>
+      </w:r>
+      <w:proofErr w:type="spellEnd"/>
+      <w:r>
+        <w:t xml:space="preserve">, ordered by </w:t>
+      </w:r>
+      <w:proofErr w:type="spellStart"/>
+      <w:r>
+        <w:t>DayNumber</w:t>
+      </w:r>
+      <w:proofErr w:type="spellEnd"/>
+      <w:r>
+        <w:t xml:space="preserve"> and </w:t>
+      </w:r>
+      <w:proofErr w:type="spellStart"/>
+      <w:r>
+        <w:t>ScheduleTime</w:t>
+      </w:r>
+      <w:proofErr w:type="spellEnd"/>
+      <w:r>
+        <w:t>.</w:t>
+      </w:r>
+    </w:p>
+    <w:p>
+      <w:pPr>
+        <w:pStyle w:val="ListParagraph"/>
+        <w:numPr>
+          <w:ilvl w:val="0"/>
+          <w:numId w:val="1"/>
+        </w:numPr>
+        <w:spacing w:before="40" w:after="40"/>
+      </w:pPr>
+      <w:r>
+        <w:t xml:space="preserve">Budget vs Actual Spending — </w:t>
+      </w:r>
+      <w:proofErr w:type="spellStart"/>
+      <w:r>
+        <w:t>Trips.TotalBudget</w:t>
+      </w:r>
+      <w:proofErr w:type="spellEnd"/>
+      <w:r>
+        <w:t xml:space="preserve"> compared against </w:t>
+      </w:r>
+      <w:proofErr w:type="gramStart"/>
+      <w:r>
+        <w:t>SUM(</w:t>
+      </w:r>
+      <w:proofErr w:type="spellStart"/>
+      <w:proofErr w:type="gramEnd"/>
+      <w:r>
+        <w:t>Expenses.Amount</w:t>
+      </w:r>
+      <w:proofErr w:type="spellEnd"/>
+      <w:r>
+        <w:t xml:space="preserve">) for the same </w:t>
+      </w:r>
+      <w:proofErr w:type="spellStart"/>
+      <w:r>
+        <w:t>TripID</w:t>
+      </w:r>
+      <w:proofErr w:type="spellEnd"/>
+      <w:r>
+        <w:t>.</w:t>
+      </w:r>
+    </w:p>
+    <w:p>
+      <w:pPr>
+        <w:pStyle w:val="ListParagraph"/>
+        <w:numPr>
+          <w:ilvl w:val="0"/>
+          <w:numId w:val="1"/>
+        </w:numPr>
+        <w:spacing w:before="40" w:after="40"/>
+      </w:pPr>
+      <w:r>
+        <w:t xml:space="preserve">Destination Summary — All cities and countries visited across all trips for a given </w:t>
+      </w:r>
+      <w:proofErr w:type="spellStart"/>
+      <w:r>
+        <w:t>UserID</w:t>
+      </w:r>
+      <w:proofErr w:type="spellEnd"/>
+      <w:r>
+        <w:t>.</w:t>
+      </w:r>
+    </w:p>
+    <w:p>
+      <w:pPr>
+        <w:pStyle w:val="ListParagraph"/>
+        <w:numPr>
+          <w:ilvl w:val="0"/>
+          <w:numId w:val="1"/>
+        </w:numPr>
+        <w:spacing w:before="40" w:after="40"/>
+      </w:pPr>
+      <w:r>
+        <w:t>CSV Export — The clean dataset CSVs generated in Step 1 and Step 3 are used in Milestone 5 to load data into the live MySQL database via LOAD DATA INFILE or INSERT statements.</w:t>
+      </w:r>
+    </w:p>
+    <w:p>
+      <w:pPr>
+        <w:spacing w:before="120" w:after="60"/>
+      </w:pPr>
+    </w:p>
+    <w:p>
+      <w:pPr>
+        <w:spacing w:before="60" w:after="60"/>
+      </w:pPr>
+    </w:p>
+    <w:p>
+      <w:r>
+        <w:br w:type="page"/>
+      </w:r>
+    </w:p>
+    <w:p>
+      <w:pPr>
+        <w:pStyle w:val="Heading1"/>
+        <w:rPr>
+          <w:color w:val="auto"/>
+          <w:sz w:val="28"/>
+          <w:szCs w:val="28"/>
+        </w:rPr>
+      </w:pPr>
+      <w:r>
+        <w:rPr>
+          <w:color w:val="auto"/>
+          <w:sz w:val="28"/>
+          <w:szCs w:val="28"/>
+        </w:rPr>
+        <w:lastRenderedPageBreak/>
+        <w:t>Step 3 — Exported Clean CSV Files:</w:t>
+      </w:r>
+    </w:p>
+    <w:p>
+      <w:pPr>
+        <w:spacing w:before="60" w:after="60"/>
+      </w:pPr>
+      <w:r>
+        <w:t>Seven CSV files were exported — one per table — using the Python generation script. Each file is clean, consistent, and ready for database import in Milestone 5. The files must be loaded in the order shown below to satisfy foreign key constraints.</w:t>
+      </w:r>
+    </w:p>
+    <w:p>
+      <w:pPr>
+        <w:spacing w:before="120" w:after="60"/>
+      </w:pPr>
+    </w:p>
+    <w:tbl>
+      <w:tblPr>
+        <w:tblStyle w:val="TableGrid"/>
+        <w:tblW w:w="9360" w:type="dxa"/>
+        <w:tblLook w:val="04A0" w:firstRow="1" w:lastRow="0" w:firstColumn="1" w:lastColumn="0" w:noHBand="0" w:noVBand="1"/>
+      </w:tblPr>
+      <w:tblGrid>
+        <w:gridCol w:w="2400"/>
+        <w:gridCol w:w="1800"/>
+        <w:gridCol w:w="2160"/>
+        <w:gridCol w:w="3000"/>
+      </w:tblGrid>
+      <w:tr>
+        <w:tc>
+          <w:tcPr>
+            <w:tcW w:w="2400" w:type="dxa"/>
+          </w:tcPr>
+          <w:p>
+            <w:r>
+              <w:rPr>
+                <w:b/>
+                <w:bCs/>
+                <w:sz w:val="20"/>
+                <w:szCs w:val="20"/>
+              </w:rPr>
+              <w:t>File Name</w:t>
+            </w:r>
+          </w:p>
+        </w:tc>
+        <w:tc>
+          <w:tcPr>
+            <w:tcW w:w="1800" w:type="dxa"/>
+          </w:tcPr>
+          <w:p>
+            <w:r>
+              <w:rPr>
+                <w:b/>
+                <w:bCs/>
+                <w:sz w:val="20"/>
+                <w:szCs w:val="20"/>
+              </w:rPr>
+              <w:t>Rows</w:t>
+            </w:r>
+          </w:p>
+        </w:tc>
+        <w:tc>
+          <w:tcPr>
+            <w:tcW w:w="2160" w:type="dxa"/>
+          </w:tcPr>
+          <w:p>
+            <w:r>
+              <w:rPr>
+                <w:b/>
+                <w:bCs/>
+                <w:sz w:val="20"/>
+                <w:szCs w:val="20"/>
+              </w:rPr>
+              <w:t>Primary Key</w:t>
+            </w:r>
+          </w:p>
+        </w:tc>
+        <w:tc>
+          <w:tcPr>
+            <w:tcW w:w="3000" w:type="dxa"/>
+          </w:tcPr>
+          <w:p>
+            <w:r>
+              <w:rPr>
+                <w:b/>
+                <w:bCs/>
+                <w:sz w:val="20"/>
+                <w:szCs w:val="20"/>
+              </w:rPr>
+              <w:t>Foreign Keys</w:t>
+            </w:r>
+          </w:p>
+        </w:tc>
+      </w:tr>
+      <w:tr>
+        <w:tc>
+          <w:tcPr>
+            <w:tcW w:w="2400" w:type="dxa"/>
+          </w:tcPr>
+          <w:p>
+            <w:r>
+              <w:rPr>
+                <w:b/>
+                <w:bCs/>
+                <w:color w:val="000000"/>
+                <w:sz w:val="20"/>
+                <w:szCs w:val="20"/>
+              </w:rPr>
+              <w:t>users.csv</w:t>
+            </w:r>
+          </w:p>
+        </w:tc>
+        <w:tc>
+          <w:tcPr>
+            <w:tcW w:w="1800" w:type="dxa"/>
+          </w:tcPr>
+          <w:p>
+            <w:r>
+              <w:rPr>
+                <w:color w:val="000000"/>
+                <w:sz w:val="20"/>
+                <w:szCs w:val="20"/>
+              </w:rPr>
+              <w:t>75</w:t>
+            </w:r>
+          </w:p>
+        </w:tc>
+        <w:tc>
+          <w:tcPr>
+            <w:tcW w:w="2160" w:type="dxa"/>
+          </w:tcPr>
+          <w:p>
+            <w:proofErr w:type="spellStart"/>
+            <w:r>
+              <w:rPr>
+                <w:color w:val="000000"/>
+                <w:sz w:val="20"/>
+                <w:szCs w:val="20"/>
+              </w:rPr>
+              <w:t>UserID</w:t>
+            </w:r>
+            <w:proofErr w:type="spellEnd"/>
+          </w:p>
+        </w:tc>
+        <w:tc>
+          <w:tcPr>
+            <w:tcW w:w="3000" w:type="dxa"/>
+          </w:tcPr>
+          <w:p>
+            <w:r>
+              <w:rPr>
+                <w:color w:val="000000"/>
+                <w:sz w:val="20"/>
+                <w:szCs w:val="20"/>
+              </w:rPr>
+              <w:t>None</w:t>
+            </w:r>
+          </w:p>
+        </w:tc>
+      </w:tr>
+      <w:tr>
+        <w:tc>
+          <w:tcPr>
+            <w:tcW w:w="2400" w:type="dxa"/>
+          </w:tcPr>
+          <w:p>
+            <w:r>
+              <w:rPr>
+                <w:b/>
+                <w:bCs/>
+                <w:color w:val="000000"/>
+                <w:sz w:val="20"/>
+                <w:szCs w:val="20"/>
+              </w:rPr>
+              <w:t>trips.csv</w:t>
+            </w:r>
+          </w:p>
+        </w:tc>
+        <w:tc>
+          <w:tcPr>
+            <w:tcW w:w="1800" w:type="dxa"/>
+          </w:tcPr>
+          <w:p>
+            <w:r>
+              <w:rPr>
+                <w:color w:val="000000"/>
+                <w:sz w:val="20"/>
+                <w:szCs w:val="20"/>
+              </w:rPr>
+              <w:t>90</w:t>
+            </w:r>
+          </w:p>
+        </w:tc>
+        <w:tc>
+          <w:tcPr>
+            <w:tcW w:w="2160" w:type="dxa"/>
+          </w:tcPr>
+          <w:p>
+            <w:proofErr w:type="spellStart"/>
+            <w:r>
+              <w:rPr>
+                <w:color w:val="000000"/>
+                <w:sz w:val="20"/>
+                <w:szCs w:val="20"/>
+              </w:rPr>
+              <w:t>TripID</w:t>
+            </w:r>
+            <w:proofErr w:type="spellEnd"/>
+          </w:p>
+        </w:tc>
+        <w:tc>
+          <w:tcPr>
+            <w:tcW w:w="3000" w:type="dxa"/>
+          </w:tcPr>
+          <w:p>
+            <w:proofErr w:type="spellStart"/>
+            <w:r>
+              <w:rPr>
+                <w:color w:val="000000"/>
+                <w:sz w:val="20"/>
+                <w:szCs w:val="20"/>
+              </w:rPr>
+              <w:t>UserID</w:t>
+            </w:r>
+            <w:proofErr w:type="spellEnd"/>
+            <w:r>
+              <w:rPr>
+                <w:color w:val="000000"/>
+                <w:sz w:val="20"/>
+                <w:szCs w:val="20"/>
+              </w:rPr>
+              <w:t xml:space="preserve"> → users.csv</w:t>
+            </w:r>
+          </w:p>
+        </w:tc>
+      </w:tr>
+      <w:tr>
+        <w:tc>
+          <w:tcPr>
+            <w:tcW w:w="2400" w:type="dxa"/>
+          </w:tcPr>
+          <w:p>
+            <w:r>
+              <w:rPr>
+                <w:b/>
+                <w:bCs/>
+                <w:color w:val="000000"/>
+                <w:sz w:val="20"/>
+                <w:szCs w:val="20"/>
+              </w:rPr>
+              <w:t>destinations.csv</w:t>
+            </w:r>
+          </w:p>
+        </w:tc>
+        <w:tc>
+          <w:tcPr>
+            <w:tcW w:w="1800" w:type="dxa"/>
+          </w:tcPr>
+          <w:p>
+            <w:r>
+              <w:rPr>
+                <w:color w:val="000000"/>
+                <w:sz w:val="20"/>
+                <w:szCs w:val="20"/>
+              </w:rPr>
+              <w:t>100</w:t>
+            </w:r>
+          </w:p>
+        </w:tc>
+        <w:tc>
+          <w:tcPr>
+            <w:tcW w:w="2160" w:type="dxa"/>
+          </w:tcPr>
+          <w:p>
+            <w:proofErr w:type="spellStart"/>
+            <w:r>
+              <w:rPr>
+                <w:color w:val="000000"/>
+                <w:sz w:val="20"/>
+                <w:szCs w:val="20"/>
+              </w:rPr>
+              <w:t>DestinationID</w:t>
+            </w:r>
+            <w:proofErr w:type="spellEnd"/>
+          </w:p>
+        </w:tc>
+        <w:tc>
+          <w:tcPr>
+            <w:tcW w:w="3000" w:type="dxa"/>
+          </w:tcPr>
+          <w:p>
+            <w:proofErr w:type="spellStart"/>
+            <w:r>
+              <w:rPr>
+                <w:color w:val="000000"/>
+                <w:sz w:val="20"/>
+                <w:szCs w:val="20"/>
+              </w:rPr>
+              <w:t>TripID</w:t>
+            </w:r>
+            <w:proofErr w:type="spellEnd"/>
+            <w:r>
+              <w:rPr>
+                <w:color w:val="000000"/>
+                <w:sz w:val="20"/>
+                <w:szCs w:val="20"/>
+              </w:rPr>
+              <w:t xml:space="preserve"> → trips.csv</w:t>
+            </w:r>
+          </w:p>
+        </w:tc>
+      </w:tr>
+      <w:tr>
+        <w:tc>
+          <w:tcPr>
+            <w:tcW w:w="2400" w:type="dxa"/>
+          </w:tcPr>
+          <w:p>
+            <w:r>
+              <w:rPr>
+                <w:b/>
+                <w:bCs/>
+                <w:color w:val="000000"/>
+                <w:sz w:val="20"/>
+                <w:szCs w:val="20"/>
+              </w:rPr>
+              <w:t>hotels.csv</w:t>
+            </w:r>
+          </w:p>
+        </w:tc>
+        <w:tc>
+          <w:tcPr>
+            <w:tcW w:w="1800" w:type="dxa"/>
+          </w:tcPr>
+          <w:p>
+            <w:r>
+              <w:rPr>
+                <w:color w:val="000000"/>
+                <w:sz w:val="20"/>
+                <w:szCs w:val="20"/>
+              </w:rPr>
+              <w:t>100</w:t>
+            </w:r>
+          </w:p>
+        </w:tc>
+        <w:tc>
+          <w:tcPr>
+            <w:tcW w:w="2160" w:type="dxa"/>
+          </w:tcPr>
+          <w:p>
+            <w:proofErr w:type="spellStart"/>
+            <w:r>
+              <w:rPr>
+                <w:color w:val="000000"/>
+                <w:sz w:val="20"/>
+                <w:szCs w:val="20"/>
+              </w:rPr>
+              <w:t>HotelID</w:t>
+            </w:r>
+            <w:proofErr w:type="spellEnd"/>
+          </w:p>
+        </w:tc>
+        <w:tc>
+          <w:tcPr>
+            <w:tcW w:w="3000" w:type="dxa"/>
+          </w:tcPr>
+          <w:p>
+            <w:proofErr w:type="spellStart"/>
+            <w:r>
+              <w:rPr>
+                <w:color w:val="000000"/>
+                <w:sz w:val="20"/>
+                <w:szCs w:val="20"/>
+              </w:rPr>
+              <w:t>DestinationID</w:t>
+            </w:r>
+            <w:proofErr w:type="spellEnd"/>
+            <w:r>
+              <w:rPr>
+                <w:color w:val="000000"/>
+                <w:sz w:val="20"/>
+                <w:szCs w:val="20"/>
+              </w:rPr>
+              <w:t xml:space="preserve"> → destinations.csv</w:t>
+            </w:r>
+          </w:p>
+        </w:tc>
+      </w:tr>
+      <w:tr>
+        <w:tc>
+          <w:tcPr>
+            <w:tcW w:w="2400" w:type="dxa"/>
+          </w:tcPr>
+          <w:p>
+            <w:r>
+              <w:rPr>
+                <w:b/>
+                <w:bCs/>
+                <w:color w:val="000000"/>
+                <w:sz w:val="20"/>
+                <w:szCs w:val="20"/>
+              </w:rPr>
+              <w:t>activities.csv</w:t>
+            </w:r>
+          </w:p>
+        </w:tc>
+        <w:tc>
+          <w:tcPr>
+            <w:tcW w:w="1800" w:type="dxa"/>
+          </w:tcPr>
+          <w:p>
+            <w:r>
+              <w:rPr>
+                <w:color w:val="000000"/>
+                <w:sz w:val="20"/>
+                <w:szCs w:val="20"/>
+              </w:rPr>
+              <w:t>100</w:t>
+            </w:r>
+          </w:p>
+        </w:tc>
+        <w:tc>
+          <w:tcPr>
+            <w:tcW w:w="2160" w:type="dxa"/>
+          </w:tcPr>
+          <w:p>
+            <w:proofErr w:type="spellStart"/>
+            <w:r>
+              <w:rPr>
+                <w:color w:val="000000"/>
+                <w:sz w:val="20"/>
+                <w:szCs w:val="20"/>
+              </w:rPr>
+              <w:t>ActivityID</w:t>
+            </w:r>
+            <w:proofErr w:type="spellEnd"/>
+          </w:p>
+        </w:tc>
+        <w:tc>
+          <w:tcPr>
+            <w:tcW w:w="3000" w:type="dxa"/>
+          </w:tcPr>
+          <w:p>
+            <w:proofErr w:type="spellStart"/>
+            <w:r>
+              <w:rPr>
+                <w:color w:val="000000"/>
+                <w:sz w:val="20"/>
+                <w:szCs w:val="20"/>
+              </w:rPr>
+              <w:t>DestinationID</w:t>
+            </w:r>
+            <w:proofErr w:type="spellEnd"/>
+            <w:r>
+              <w:rPr>
+                <w:color w:val="000000"/>
+                <w:sz w:val="20"/>
+                <w:szCs w:val="20"/>
+              </w:rPr>
+              <w:t xml:space="preserve"> → destinations.csv</w:t>
+            </w:r>
+          </w:p>
+        </w:tc>
+      </w:tr>
+      <w:tr>
+        <w:tc>
+          <w:tcPr>
+            <w:tcW w:w="2400" w:type="dxa"/>
+          </w:tcPr>
+          <w:p>
+            <w:r>
+              <w:rPr>
+                <w:b/>
+                <w:bCs/>
+                <w:color w:val="000000"/>
+                <w:sz w:val="20"/>
+                <w:szCs w:val="20"/>
+              </w:rPr>
+              <w:t>dayschedule.csv</w:t>
+            </w:r>
+          </w:p>
+        </w:tc>
+        <w:tc>
+          <w:tcPr>
+            <w:tcW w:w="1800" w:type="dxa"/>
+          </w:tcPr>
+          <w:p>
+            <w:r>
+              <w:rPr>
+                <w:color w:val="000000"/>
+                <w:sz w:val="20"/>
+                <w:szCs w:val="20"/>
+              </w:rPr>
+              <w:t>100</w:t>
+            </w:r>
+          </w:p>
+        </w:tc>
+        <w:tc>
+          <w:tcPr>
+            <w:tcW w:w="2160" w:type="dxa"/>
+          </w:tcPr>
+          <w:p>
+            <w:proofErr w:type="spellStart"/>
+            <w:r>
+              <w:rPr>
+                <w:color w:val="000000"/>
+                <w:sz w:val="20"/>
+                <w:szCs w:val="20"/>
+              </w:rPr>
+              <w:t>ScheduleID</w:t>
+            </w:r>
+            <w:proofErr w:type="spellEnd"/>
+          </w:p>
+        </w:tc>
+        <w:tc>
+          <w:tcPr>
+            <w:tcW w:w="3000" w:type="dxa"/>
+          </w:tcPr>
+          <w:p>
+            <w:proofErr w:type="spellStart"/>
+            <w:r>
+              <w:rPr>
+                <w:color w:val="000000"/>
+                <w:sz w:val="20"/>
+                <w:szCs w:val="20"/>
+              </w:rPr>
+              <w:t>TripID</w:t>
+            </w:r>
+            <w:proofErr w:type="spellEnd"/>
+            <w:r>
+              <w:rPr>
+                <w:color w:val="000000"/>
+                <w:sz w:val="20"/>
+                <w:szCs w:val="20"/>
+              </w:rPr>
+              <w:t xml:space="preserve"> → trips.csv</w:t>
+            </w:r>
+          </w:p>
+        </w:tc>
+      </w:tr>
+      <w:tr>
+        <w:tc>
+          <w:tcPr>
+            <w:tcW w:w="2400" w:type="dxa"/>
+          </w:tcPr>
+          <w:p>
+            <w:r>
+              <w:rPr>
+                <w:b/>
+                <w:bCs/>
+                <w:color w:val="000000"/>
+                <w:sz w:val="20"/>
+                <w:szCs w:val="20"/>
+              </w:rPr>
+              <w:t>expenses.csv</w:t>
+            </w:r>
+          </w:p>
+        </w:tc>
+        <w:tc>
+          <w:tcPr>
+            <w:tcW w:w="1800" w:type="dxa"/>
+          </w:tcPr>
+          <w:p>
+            <w:r>
+              <w:rPr>
+                <w:color w:val="000000"/>
+                <w:sz w:val="20"/>
+                <w:szCs w:val="20"/>
+              </w:rPr>
+              <w:t>100</w:t>
+            </w:r>
+          </w:p>
+        </w:tc>
+        <w:tc>
+          <w:tcPr>
+            <w:tcW w:w="2160" w:type="dxa"/>
+          </w:tcPr>
+          <w:p>
+            <w:proofErr w:type="spellStart"/>
+            <w:r>
+              <w:rPr>
+                <w:color w:val="000000"/>
+                <w:sz w:val="20"/>
+                <w:szCs w:val="20"/>
+              </w:rPr>
+              <w:t>ExpenseID</w:t>
+            </w:r>
+            <w:proofErr w:type="spellEnd"/>
+          </w:p>
+        </w:tc>
+        <w:tc>
+          <w:tcPr>
+            <w:tcW w:w="3000" w:type="dxa"/>
+          </w:tcPr>
+          <w:p>
+            <w:proofErr w:type="spellStart"/>
+            <w:r>
+              <w:rPr>
+                <w:color w:val="000000"/>
+                <w:sz w:val="20"/>
+                <w:szCs w:val="20"/>
+              </w:rPr>
+              <w:t>TripID</w:t>
+            </w:r>
+            <w:proofErr w:type="spellEnd"/>
+            <w:r>
+              <w:rPr>
+                <w:color w:val="000000"/>
+                <w:sz w:val="20"/>
+                <w:szCs w:val="20"/>
+              </w:rPr>
+              <w:t xml:space="preserve"> → trips.csv</w:t>
+            </w:r>
+          </w:p>
+        </w:tc>
+      </w:tr>
+    </w:tbl>
+    <w:p>
+      <w:pPr>
+        <w:spacing w:before="120" w:after="60"/>
+      </w:pPr>
+    </w:p>
+    <w:p>
+      <w:pPr>
+        <w:pStyle w:val="Heading2"/>
+        <w:rPr>
+          <w:color w:val="auto"/>
+        </w:rPr>
+      </w:pPr>
+      <w:r>
+        <w:rPr>
+          <w:color w:val="auto"/>
+        </w:rPr>
+        <w:t>CSV Load Order for Milestone 5:</w:t>
+      </w:r>
+    </w:p>
+    <w:p>
+      <w:pPr>
+        <w:spacing w:before="60" w:after="60"/>
+      </w:pPr>
+      <w:r>
+        <w:t>When importing into MySQL, the following order must be followed:</w:t>
+      </w:r>
+    </w:p>
+    <w:p>
+      <w:pPr>
+        <w:spacing w:before="120" w:after="60"/>
+      </w:pPr>
+    </w:p>
+    <w:p>
+      <w:pPr>
+        <w:spacing w:before="30" w:after="30"/>
+      </w:pPr>
+      <w:r>
+        <w:rPr>
+          <w:rFonts w:ascii="Courier New" w:eastAsia="Courier New" w:hAnsi="Courier New" w:cs="Courier New"/>
+          <w:color w:val="1A1A2E"/>
+          <w:sz w:val="18"/>
+          <w:szCs w:val="18"/>
+        </w:rPr>
+        <w:t xml:space="preserve">  Load Order:</w:t>
+      </w:r>
+    </w:p>
+    <w:p>
+      <w:pPr>
+        <w:spacing w:before="30" w:after="30"/>
+      </w:pPr>
+      <w:r>
+        <w:rPr>
+          <w:rFonts w:ascii="Courier New" w:eastAsia="Courier New" w:hAnsi="Courier New" w:cs="Courier New"/>
+          <w:color w:val="1A1A2E"/>
+          <w:sz w:val="18"/>
+          <w:szCs w:val="18"/>
+        </w:rPr>
+        <w:t xml:space="preserve">  1. users.csv       </w:t>
+      </w:r>
+      <w:proofErr w:type="gramStart"/>
+      <w:r>
+        <w:rPr>
+          <w:rFonts w:ascii="Courier New" w:eastAsia="Courier New" w:hAnsi="Courier New" w:cs="Courier New"/>
+          <w:color w:val="1A1A2E"/>
+          <w:sz w:val="18"/>
+          <w:szCs w:val="18"/>
+        </w:rPr>
+        <w:t xml:space="preserve">   (</w:t>
+      </w:r>
+      <w:proofErr w:type="gramEnd"/>
+      <w:r>
+        <w:rPr>
+          <w:rFonts w:ascii="Courier New" w:eastAsia="Courier New" w:hAnsi="Courier New" w:cs="Courier New"/>
+          <w:color w:val="1A1A2E"/>
+          <w:sz w:val="18"/>
+          <w:szCs w:val="18"/>
+        </w:rPr>
+        <w:t>no dependencies)</w:t>
+      </w:r>
+    </w:p>
+    <w:p>
+      <w:pPr>
+        <w:spacing w:before="30" w:after="30"/>
+      </w:pPr>
+      <w:r>
+        <w:rPr>
+          <w:rFonts w:ascii="Courier New" w:eastAsia="Courier New" w:hAnsi="Courier New" w:cs="Courier New"/>
+          <w:color w:val="1A1A2E"/>
+          <w:sz w:val="18"/>
+          <w:szCs w:val="18"/>
+        </w:rPr>
+        <w:t xml:space="preserve">  2. trips.csv       </w:t>
+      </w:r>
+      <w:proofErr w:type="gramStart"/>
+      <w:r>
+        <w:rPr>
+          <w:rFonts w:ascii="Courier New" w:eastAsia="Courier New" w:hAnsi="Courier New" w:cs="Courier New"/>
+          <w:color w:val="1A1A2E"/>
+          <w:sz w:val="18"/>
+          <w:szCs w:val="18"/>
+        </w:rPr>
+        <w:t xml:space="preserve">   (</w:t>
+      </w:r>
+      <w:proofErr w:type="gramEnd"/>
+      <w:r>
+        <w:rPr>
+          <w:rFonts w:ascii="Courier New" w:eastAsia="Courier New" w:hAnsi="Courier New" w:cs="Courier New"/>
+          <w:color w:val="1A1A2E"/>
+          <w:sz w:val="18"/>
+          <w:szCs w:val="18"/>
+        </w:rPr>
+        <w:t>depends on users.csv)</w:t>
+      </w:r>
+    </w:p>
+    <w:p>
+      <w:pPr>
+        <w:spacing w:before="30" w:after="30"/>
+      </w:pPr>
+      <w:r>
+        <w:rPr>
+          <w:rFonts w:ascii="Courier New" w:eastAsia="Courier New" w:hAnsi="Courier New" w:cs="Courier New"/>
+          <w:color w:val="1A1A2E"/>
+          <w:sz w:val="18"/>
+          <w:szCs w:val="18"/>
+        </w:rPr>
+        <w:t xml:space="preserve">  3. destinations.csv</w:t>
+      </w:r>
+      <w:proofErr w:type="gramStart"/>
+      <w:r>
+        <w:rPr>
+          <w:rFonts w:ascii="Courier New" w:eastAsia="Courier New" w:hAnsi="Courier New" w:cs="Courier New"/>
+          <w:color w:val="1A1A2E"/>
+          <w:sz w:val="18"/>
+          <w:szCs w:val="18"/>
+        </w:rPr>
+        <w:t xml:space="preserve">   (</w:t>
+      </w:r>
+      <w:proofErr w:type="gramEnd"/>
+      <w:r>
+        <w:rPr>
+          <w:rFonts w:ascii="Courier New" w:eastAsia="Courier New" w:hAnsi="Courier New" w:cs="Courier New"/>
+          <w:color w:val="1A1A2E"/>
+          <w:sz w:val="18"/>
+          <w:szCs w:val="18"/>
+        </w:rPr>
+        <w:t>depends on trips.csv)</w:t>
+      </w:r>
+    </w:p>
+    <w:p>
+      <w:pPr>
+        <w:spacing w:before="30" w:after="30"/>
+      </w:pPr>
+      <w:r>
+        <w:rPr>
+          <w:rFonts w:ascii="Courier New" w:eastAsia="Courier New" w:hAnsi="Courier New" w:cs="Courier New"/>
+          <w:color w:val="1A1A2E"/>
+          <w:sz w:val="18"/>
+          <w:szCs w:val="18"/>
+        </w:rPr>
+        <w:t xml:space="preserve">  4. hotels.csv      </w:t>
+      </w:r>
+      <w:proofErr w:type="gramStart"/>
+      <w:r>
+        <w:rPr>
+          <w:rFonts w:ascii="Courier New" w:eastAsia="Courier New" w:hAnsi="Courier New" w:cs="Courier New"/>
+          <w:color w:val="1A1A2E"/>
+          <w:sz w:val="18"/>
+          <w:szCs w:val="18"/>
+        </w:rPr>
+        <w:t xml:space="preserve">   (</w:t>
+      </w:r>
+      <w:proofErr w:type="gramEnd"/>
+      <w:r>
+        <w:rPr>
+          <w:rFonts w:ascii="Courier New" w:eastAsia="Courier New" w:hAnsi="Courier New" w:cs="Courier New"/>
+          <w:color w:val="1A1A2E"/>
+          <w:sz w:val="18"/>
+          <w:szCs w:val="18"/>
+        </w:rPr>
+        <w:t>depends on destinations.csv)</w:t>
+      </w:r>
+    </w:p>
+    <w:p>
+      <w:pPr>
+        <w:spacing w:before="30" w:after="30"/>
+      </w:pPr>
+      <w:r>
+        <w:rPr>
+          <w:rFonts w:ascii="Courier New" w:eastAsia="Courier New" w:hAnsi="Courier New" w:cs="Courier New"/>
+          <w:color w:val="1A1A2E"/>
+          <w:sz w:val="18"/>
+          <w:szCs w:val="18"/>
+        </w:rPr>
+        <w:t xml:space="preserve">  5. activities.csv  </w:t>
+      </w:r>
+      <w:proofErr w:type="gramStart"/>
+      <w:r>
+        <w:rPr>
+          <w:rFonts w:ascii="Courier New" w:eastAsia="Courier New" w:hAnsi="Courier New" w:cs="Courier New"/>
+          <w:color w:val="1A1A2E"/>
+          <w:sz w:val="18"/>
+          <w:szCs w:val="18"/>
+        </w:rPr>
+        <w:t xml:space="preserve">   (</w:t>
+      </w:r>
+      <w:proofErr w:type="gramEnd"/>
+      <w:r>
+        <w:rPr>
+          <w:rFonts w:ascii="Courier New" w:eastAsia="Courier New" w:hAnsi="Courier New" w:cs="Courier New"/>
+          <w:color w:val="1A1A2E"/>
+          <w:sz w:val="18"/>
+          <w:szCs w:val="18"/>
+        </w:rPr>
+        <w:t>depends on destinations.csv)</w:t>
+      </w:r>
+    </w:p>
+    <w:p>
+      <w:pPr>
+        <w:spacing w:before="30" w:after="30"/>
+      </w:pPr>
+      <w:r>
+        <w:rPr>
+          <w:rFonts w:ascii="Courier New" w:eastAsia="Courier New" w:hAnsi="Courier New" w:cs="Courier New"/>
+          <w:color w:val="1A1A2E"/>
+          <w:sz w:val="18"/>
+          <w:szCs w:val="18"/>
+        </w:rPr>
+        <w:t xml:space="preserve">  6. dayschedule.csv </w:t>
+      </w:r>
+      <w:proofErr w:type="gramStart"/>
+      <w:r>
+        <w:rPr>
+          <w:rFonts w:ascii="Courier New" w:eastAsia="Courier New" w:hAnsi="Courier New" w:cs="Courier New"/>
+          <w:color w:val="1A1A2E"/>
+          <w:sz w:val="18"/>
+          <w:szCs w:val="18"/>
+        </w:rPr>
+        <w:t xml:space="preserve">   (</w:t>
+      </w:r>
+      <w:proofErr w:type="gramEnd"/>
+      <w:r>
+        <w:rPr>
+          <w:rFonts w:ascii="Courier New" w:eastAsia="Courier New" w:hAnsi="Courier New" w:cs="Courier New"/>
+          <w:color w:val="1A1A2E"/>
+          <w:sz w:val="18"/>
+          <w:szCs w:val="18"/>
+        </w:rPr>
+        <w:t>depends on trips.csv)</w:t>
+      </w:r>
+    </w:p>
+    <w:p>
+      <w:pPr>
+        <w:spacing w:before="120" w:after="60"/>
+      </w:pPr>
+      <w:r>
+        <w:rPr>
+          <w:rFonts w:ascii="Courier New" w:eastAsia="Courier New" w:hAnsi="Courier New" w:cs="Courier New"/>
+          <w:color w:val="1A1A2E"/>
+          <w:sz w:val="18"/>
+          <w:szCs w:val="18"/>
+        </w:rPr>
+        <w:t xml:space="preserve">  7. expenses.csv    </w:t>
+      </w:r>
+      <w:proofErr w:type="gramStart"/>
+      <w:r>
+        <w:rPr>
+          <w:rFonts w:ascii="Courier New" w:eastAsia="Courier New" w:hAnsi="Courier New" w:cs="Courier New"/>
+          <w:color w:val="1A1A2E"/>
+          <w:sz w:val="18"/>
+          <w:szCs w:val="18"/>
+        </w:rPr>
+        <w:t xml:space="preserve">   (</w:t>
+      </w:r>
+      <w:proofErr w:type="gramEnd"/>
+      <w:r>
+        <w:rPr>
+          <w:rFonts w:ascii="Courier New" w:eastAsia="Courier New" w:hAnsi="Courier New" w:cs="Courier New"/>
+          <w:color w:val="1A1A2E"/>
+          <w:sz w:val="18"/>
+          <w:szCs w:val="18"/>
+        </w:rPr>
+        <w:t>depends on trips.csv)</w:t>
+      </w:r>
       <w:bookmarkStart w:id="0" w:name="_GoBack"/>
       <w:bookmarkEnd w:id="0"/>
     </w:p>
+    <w:p>
+      <w:pPr>
+        <w:spacing w:after="120"/>
+      </w:pPr>
+    </w:p>
     <w:sectPr>
-      <w:headerReference w:type="default" r:id="rId7"/>
-      <w:footerReference w:type="default" r:id="rId8"/>
+      <w:headerReference w:type="default" r:id="rId9"/>
+      <w:footerReference w:type="default" r:id="rId10"/>
       <w:pgSz w:w="12240" w:h="15840"/>
       <w:pgMar w:top="1440" w:right="1440" w:bottom="1440" w:left="1440" w:header="708" w:footer="708" w:gutter="0"/>
       <w:cols w:space="720"/>
@@ -8012,6 +12165,25 @@
     </w:sectPr>
   </w:body>
 </w:document>
+</file>
+
+<file path=word/endnotes.xml><?xml version="1.0" encoding="utf-8"?>
+<w:endnotes xmlns:wpc="http://schemas.microsoft.com/office/word/2010/wordprocessingCanvas" xmlns:cx="http://schemas.microsoft.com/office/drawing/2014/chartex" xmlns:mc="http://schemas.openxmlformats.org/markup-compatibility/2006" xmlns:o="urn:schemas-microsoft-com:office:office" xmlns:r="http://schemas.openxmlformats.org/officeDocument/2006/relationships" xmlns:m="http://schemas.openxmlformats.org/officeDocument/2006/math" xmlns:v="urn:schemas-microsoft-com:vml" xmlns:wp14="http://schemas.microsoft.com/office/word/2010/wordprocessingDrawing" xmlns:wp="http://schemas.openxmlformats.org/drawingml/2006/wordprocessingDrawing" xmlns:w10="urn:schemas-microsoft-com:office:word" xmlns:w="http://schemas.openxmlformats.org/wordprocessingml/2006/main" xmlns:w14="http://schemas.microsoft.com/office/word/2010/wordml" xmlns:w15="http://schemas.microsoft.com/office/word/2012/wordml" xmlns:w16se="http://schemas.microsoft.com/office/word/2015/wordml/symex" xmlns:wpg="http://schemas.microsoft.com/office/word/2010/wordprocessingGroup" xmlns:wpi="http://schemas.microsoft.com/office/word/2010/wordprocessingInk" xmlns:wne="http://schemas.microsoft.com/office/word/2006/wordml" xmlns:wps="http://schemas.microsoft.com/office/word/2010/wordprocessingShape" mc:Ignorable="w14 w15 w16se wp14">
+  <w:endnote w:type="separator" w:id="-1">
+    <w:p>
+      <w:r>
+        <w:separator/>
+      </w:r>
+    </w:p>
+  </w:endnote>
+  <w:endnote w:type="continuationSeparator" w:id="0">
+    <w:p>
+      <w:r>
+        <w:continuationSeparator/>
+      </w:r>
+    </w:p>
+  </w:endnote>
+</w:endnotes>
 </file>
 
 <file path=word/footer1.xml><?xml version="1.0" encoding="utf-8"?>
@@ -8023,6 +12195,25 @@
     </w:pPr>
   </w:p>
 </w:ftr>
+</file>
+
+<file path=word/footnotes.xml><?xml version="1.0" encoding="utf-8"?>
+<w:footnotes xmlns:wpc="http://schemas.microsoft.com/office/word/2010/wordprocessingCanvas" xmlns:cx="http://schemas.microsoft.com/office/drawing/2014/chartex" xmlns:mc="http://schemas.openxmlformats.org/markup-compatibility/2006" xmlns:o="urn:schemas-microsoft-com:office:office" xmlns:r="http://schemas.openxmlformats.org/officeDocument/2006/relationships" xmlns:m="http://schemas.openxmlformats.org/officeDocument/2006/math" xmlns:v="urn:schemas-microsoft-com:vml" xmlns:wp14="http://schemas.microsoft.com/office/word/2010/wordprocessingDrawing" xmlns:wp="http://schemas.openxmlformats.org/drawingml/2006/wordprocessingDrawing" xmlns:w10="urn:schemas-microsoft-com:office:word" xmlns:w="http://schemas.openxmlformats.org/wordprocessingml/2006/main" xmlns:w14="http://schemas.microsoft.com/office/word/2010/wordml" xmlns:w15="http://schemas.microsoft.com/office/word/2012/wordml" xmlns:w16se="http://schemas.microsoft.com/office/word/2015/wordml/symex" xmlns:wpg="http://schemas.microsoft.com/office/word/2010/wordprocessingGroup" xmlns:wpi="http://schemas.microsoft.com/office/word/2010/wordprocessingInk" xmlns:wne="http://schemas.microsoft.com/office/word/2006/wordml" xmlns:wps="http://schemas.microsoft.com/office/word/2010/wordprocessingShape" mc:Ignorable="w14 w15 w16se wp14">
+  <w:footnote w:type="separator" w:id="-1">
+    <w:p>
+      <w:r>
+        <w:separator/>
+      </w:r>
+    </w:p>
+  </w:footnote>
+  <w:footnote w:type="continuationSeparator" w:id="0">
+    <w:p>
+      <w:r>
+        <w:continuationSeparator/>
+      </w:r>
+    </w:p>
+  </w:footnote>
+</w:footnotes>
 </file>
 
 <file path=word/header1.xml><?xml version="1.0" encoding="utf-8"?>

</xml_diff>

<commit_message>
M4: Database Setup (DDL)
 DDL scripts added, EER Diagram is Verified
</commit_message>
<xml_diff>
--- a/BSSE_A_Version_Control_DBLabProject.docx
+++ b/BSSE_A_Version_Control_DBLabProject.docx
@@ -12147,17 +12147,182 @@
         </w:rPr>
         <w:t>depends on trips.csv)</w:t>
       </w:r>
+    </w:p>
+    <w:p>
+      <w:pPr>
+        <w:spacing w:after="120"/>
+      </w:pPr>
+    </w:p>
+    <w:p>
+      <w:pPr>
+        <w:spacing w:after="120"/>
+      </w:pPr>
+    </w:p>
+    <w:p>
+      <w:pPr>
+        <w:spacing w:after="60"/>
+        <w:rPr>
+          <w:b/>
+          <w:sz w:val="24"/>
+          <w:szCs w:val="24"/>
+        </w:rPr>
+      </w:pPr>
+      <w:r>
+        <w:rPr>
+          <w:b/>
+          <w:sz w:val="24"/>
+          <w:szCs w:val="24"/>
+        </w:rPr>
+        <w:t>MILESTONE 4:</w:t>
+      </w:r>
+    </w:p>
+    <w:p>
+      <w:pPr>
+        <w:pStyle w:val="Heading2"/>
+        <w:rPr>
+          <w:color w:val="auto"/>
+        </w:rPr>
+      </w:pPr>
+      <w:r>
+        <w:rPr>
+          <w:color w:val="auto"/>
+        </w:rPr>
+        <w:t>Database Setup (DDL):</w:t>
+      </w:r>
+    </w:p>
+    <w:p>
+      <w:pPr>
+        <w:pStyle w:val="NormalWeb"/>
+        <w:rPr>
+          <w:rFonts w:ascii="Arial" w:hAnsi="Arial" w:cs="Arial"/>
+        </w:rPr>
+      </w:pPr>
+      <w:r>
+        <w:rPr>
+          <w:rFonts w:ascii="Arial" w:hAnsi="Arial" w:cs="Arial"/>
+        </w:rPr>
+        <w:t xml:space="preserve">In this milestone, the finalized normalized database schema for the Travel Itinerary Planning System was implemented using SQL Data Definition Language (DDL) statements in MySQL. All required tables including Users, Trips, Destinations, Hotels, Activities, </w:t>
+      </w:r>
+      <w:proofErr w:type="spellStart"/>
+      <w:r>
+        <w:rPr>
+          <w:rFonts w:ascii="Arial" w:hAnsi="Arial" w:cs="Arial"/>
+        </w:rPr>
+        <w:t>DaySchedule</w:t>
+      </w:r>
+      <w:proofErr w:type="spellEnd"/>
+      <w:r>
+        <w:rPr>
+          <w:rFonts w:ascii="Arial" w:hAnsi="Arial" w:cs="Arial"/>
+        </w:rPr>
+        <w:t>, and Expenses were created with properly defined primary keys and foreign key relationships to maintain referential integrity between entities.</w:t>
+      </w:r>
+    </w:p>
+    <w:p>
+      <w:pPr>
+        <w:pStyle w:val="NormalWeb"/>
+        <w:rPr>
+          <w:rFonts w:ascii="Arial" w:hAnsi="Arial" w:cs="Arial"/>
+        </w:rPr>
+      </w:pPr>
+      <w:r>
+        <w:rPr>
+          <w:rFonts w:ascii="Arial" w:hAnsi="Arial" w:cs="Arial"/>
+        </w:rPr>
+        <w:t>Appropriate constraints such as NOT NULL, UNIQUE, and CHECK constraints were applied to ensure data accuracy, consistency, and validation. Additional indexes were created on foreign key columns and frequently searched attributes to improve query performance and database efficiency.</w:t>
+      </w:r>
+    </w:p>
+    <w:p>
+      <w:pPr>
+        <w:pStyle w:val="NormalWeb"/>
+        <w:rPr>
+          <w:rFonts w:ascii="Arial" w:hAnsi="Arial" w:cs="Arial"/>
+        </w:rPr>
+      </w:pPr>
+      <w:r>
+        <w:rPr>
+          <w:rFonts w:ascii="Arial" w:hAnsi="Arial" w:cs="Arial"/>
+        </w:rPr>
+        <w:lastRenderedPageBreak/>
+        <w:t>The complete schema was successfully verified in MySQL Workbench, and the generated EER (Enhanced Entity Relationship) diagram confirmed that all tables, relationships, and constraints matched the designed database structure.</w:t>
+      </w:r>
+    </w:p>
+    <w:p>
+      <w:pPr>
+        <w:pStyle w:val="NormalWeb"/>
+        <w:rPr>
+          <w:rFonts w:ascii="Arial" w:hAnsi="Arial" w:cs="Arial"/>
+        </w:rPr>
+      </w:pPr>
+    </w:p>
+    <w:p>
+      <w:pPr>
+        <w:pStyle w:val="Heading2"/>
+        <w:rPr>
+          <w:color w:val="auto"/>
+        </w:rPr>
+      </w:pPr>
+      <w:r>
+        <w:rPr>
+          <w:color w:val="auto"/>
+        </w:rPr>
+        <w:t>EER Diagram:</w:t>
+      </w:r>
+    </w:p>
+    <w:p>
+      <w:pPr>
+        <w:pStyle w:val="Heading2"/>
+        <w:rPr>
+          <w:color w:val="auto"/>
+        </w:rPr>
+      </w:pPr>
+      <w:r>
+        <w:rPr>
+          <w:noProof/>
+          <w:color w:val="auto"/>
+        </w:rPr>
+        <w:drawing>
+          <wp:inline distT="0" distB="0" distL="0" distR="0" wp14:anchorId="7B219B39" wp14:editId="534CE0E0">
+            <wp:extent cx="5943600" cy="6590665"/>
+            <wp:effectExtent l="0" t="0" r="0" b="635"/>
+            <wp:docPr id="2" name="Picture 2"/>
+            <wp:cNvGraphicFramePr>
+              <a:graphicFrameLocks xmlns:a="http://schemas.openxmlformats.org/drawingml/2006/main" noChangeAspect="1"/>
+            </wp:cNvGraphicFramePr>
+            <a:graphic xmlns:a="http://schemas.openxmlformats.org/drawingml/2006/main">
+              <a:graphicData uri="http://schemas.openxmlformats.org/drawingml/2006/picture">
+                <pic:pic xmlns:pic="http://schemas.openxmlformats.org/drawingml/2006/picture">
+                  <pic:nvPicPr>
+                    <pic:cNvPr id="1" name=""/>
+                    <pic:cNvPicPr/>
+                  </pic:nvPicPr>
+                  <pic:blipFill>
+                    <a:blip r:embed="rId9"/>
+                    <a:stretch>
+                      <a:fillRect/>
+                    </a:stretch>
+                  </pic:blipFill>
+                  <pic:spPr>
+                    <a:xfrm>
+                      <a:off x="0" y="0"/>
+                      <a:ext cx="5943600" cy="6590665"/>
+                    </a:xfrm>
+                    <a:prstGeom prst="rect">
+                      <a:avLst/>
+                    </a:prstGeom>
+                  </pic:spPr>
+                </pic:pic>
+              </a:graphicData>
+            </a:graphic>
+          </wp:inline>
+        </w:drawing>
+      </w:r>
       <w:bookmarkStart w:id="0" w:name="_GoBack"/>
       <w:bookmarkEnd w:id="0"/>
     </w:p>
-    <w:p>
-      <w:pPr>
-        <w:spacing w:after="120"/>
-      </w:pPr>
-    </w:p>
     <w:sectPr>
-      <w:headerReference w:type="default" r:id="rId9"/>
-      <w:footerReference w:type="default" r:id="rId10"/>
+      <w:headerReference w:type="default" r:id="rId10"/>
+      <w:footerReference w:type="default" r:id="rId11"/>
       <w:pgSz w:w="12240" w:h="15840"/>
       <w:pgMar w:top="1440" w:right="1440" w:bottom="1440" w:left="1440" w:header="708" w:footer="708" w:gutter="0"/>
       <w:cols w:space="720"/>
@@ -12816,6 +12981,22 @@
       </w:tblBorders>
     </w:tblPr>
   </w:style>
+  <w:style w:type="paragraph" w:styleId="NormalWeb">
+    <w:name w:val="Normal (Web)"/>
+    <w:basedOn w:val="Normal"/>
+    <w:uiPriority w:val="99"/>
+    <w:semiHidden/>
+    <w:unhideWhenUsed/>
+    <w:rsid w:val="002B5E31"/>
+    <w:pPr>
+      <w:spacing w:before="100" w:beforeAutospacing="1" w:after="100" w:afterAutospacing="1"/>
+    </w:pPr>
+    <w:rPr>
+      <w:rFonts w:ascii="Times New Roman" w:eastAsia="Times New Roman" w:hAnsi="Times New Roman" w:cs="Times New Roman"/>
+      <w:sz w:val="24"/>
+      <w:szCs w:val="24"/>
+    </w:rPr>
+  </w:style>
 </w:styles>
 </file>
 

</xml_diff>

<commit_message>
M5: Data populated validation queries added
</commit_message>
<xml_diff>
--- a/BSSE_A_Version_Control_DBLabProject.docx
+++ b/BSSE_A_Version_Control_DBLabProject.docx
@@ -78,8 +78,10 @@
           <w:sz w:val="24"/>
           <w:szCs w:val="24"/>
         </w:rPr>
-        <w:t>Travel Itinerary Planner — Schema, ERD, Normalization &amp; Dataset</w:t>
-      </w:r>
+        <w:t xml:space="preserve">Travel Itinerary Planner </w:t>
+      </w:r>
+      <w:bookmarkStart w:id="0" w:name="_GoBack"/>
+      <w:bookmarkEnd w:id="0"/>
     </w:p>
     <w:tbl>
       <w:tblPr>
@@ -573,8 +575,56 @@
               </w:rPr>
               <w:t>1.3</w:t>
             </w:r>
-            <w:bookmarkStart w:id="0" w:name="_GoBack"/>
-            <w:bookmarkEnd w:id="0"/>
+          </w:p>
+        </w:tc>
+      </w:tr>
+      <w:tr>
+        <w:tc>
+          <w:tcPr>
+            <w:tcW w:w="4680" w:type="dxa"/>
+          </w:tcPr>
+          <w:p>
+            <w:pPr>
+              <w:rPr>
+                <w:bCs/>
+                <w:color w:val="000000"/>
+                <w:sz w:val="20"/>
+                <w:szCs w:val="20"/>
+              </w:rPr>
+            </w:pPr>
+            <w:r>
+              <w:rPr>
+                <w:bCs/>
+                <w:color w:val="000000"/>
+                <w:sz w:val="20"/>
+                <w:szCs w:val="20"/>
+              </w:rPr>
+              <w:t>Data populated validation queries added</w:t>
+            </w:r>
+          </w:p>
+        </w:tc>
+        <w:tc>
+          <w:tcPr>
+            <w:tcW w:w="4680" w:type="dxa"/>
+          </w:tcPr>
+          <w:p>
+            <w:pPr>
+              <w:rPr>
+                <w:bCs/>
+                <w:color w:val="000000"/>
+                <w:sz w:val="20"/>
+                <w:szCs w:val="20"/>
+              </w:rPr>
+            </w:pPr>
+            <w:r>
+              <w:rPr>
+                <w:bCs/>
+                <w:color w:val="000000"/>
+                <w:sz w:val="20"/>
+                <w:szCs w:val="20"/>
+              </w:rPr>
+              <w:t>1.4</w:t>
+            </w:r>
           </w:p>
         </w:tc>
       </w:tr>
@@ -600,18 +650,16 @@
           <w:szCs w:val="24"/>
         </w:rPr>
         <w:lastRenderedPageBreak/>
-        <w:t xml:space="preserve">MILESTONE </w:t>
-      </w:r>
-      <w:proofErr w:type="gramStart"/>
+        <w:t>MILESTONE 1</w:t>
+      </w:r>
       <w:r>
         <w:rPr>
           <w:b/>
           <w:sz w:val="24"/>
           <w:szCs w:val="24"/>
         </w:rPr>
-        <w:t>1 :</w:t>
-      </w:r>
-      <w:proofErr w:type="gramEnd"/>
+        <w:t>:</w:t>
+      </w:r>
     </w:p>
     <w:p>
       <w:pPr>
@@ -3917,7 +3965,23 @@
           <w:szCs w:val="24"/>
         </w:rPr>
         <w:lastRenderedPageBreak/>
-        <w:t xml:space="preserve">MILESTONE 2  </w:t>
+        <w:t>MILESTONE 2</w:t>
+      </w:r>
+      <w:r>
+        <w:rPr>
+          <w:b/>
+          <w:sz w:val="24"/>
+          <w:szCs w:val="24"/>
+        </w:rPr>
+        <w:t>:</w:t>
+      </w:r>
+      <w:r>
+        <w:rPr>
+          <w:b/>
+          <w:sz w:val="24"/>
+          <w:szCs w:val="24"/>
+        </w:rPr>
+        <w:t xml:space="preserve">  </w:t>
       </w:r>
     </w:p>
     <w:p>
@@ -12370,9 +12434,2664 @@
         </w:drawing>
       </w:r>
     </w:p>
+    <w:p>
+      <w:pPr>
+        <w:spacing w:after="60"/>
+        <w:rPr>
+          <w:b/>
+          <w:sz w:val="24"/>
+          <w:szCs w:val="24"/>
+        </w:rPr>
+      </w:pPr>
+      <w:r>
+        <w:rPr>
+          <w:b/>
+          <w:sz w:val="24"/>
+          <w:szCs w:val="24"/>
+        </w:rPr>
+        <w:lastRenderedPageBreak/>
+        <w:t>MILESTONE 5:</w:t>
+      </w:r>
+    </w:p>
+    <w:p>
+      <w:pPr>
+        <w:spacing w:before="100" w:beforeAutospacing="1" w:after="100" w:afterAutospacing="1"/>
+        <w:rPr>
+          <w:rFonts w:eastAsia="Times New Roman"/>
+          <w:sz w:val="24"/>
+          <w:szCs w:val="24"/>
+        </w:rPr>
+      </w:pPr>
+      <w:r>
+        <w:rPr>
+          <w:rFonts w:eastAsia="Times New Roman"/>
+          <w:sz w:val="24"/>
+          <w:szCs w:val="24"/>
+        </w:rPr>
+        <w:t>This milestone focuses on populating the Travel Itinerary Planner database with real data using SQL DML (Data Manipulation Language) statements, followed by validation qu</w:t>
+      </w:r>
+      <w:r>
+        <w:rPr>
+          <w:rFonts w:eastAsia="Times New Roman"/>
+          <w:sz w:val="24"/>
+          <w:szCs w:val="24"/>
+        </w:rPr>
+        <w:t>eries to confirm data integrity</w:t>
+      </w:r>
+    </w:p>
+    <w:p>
+      <w:pPr>
+        <w:spacing w:before="100" w:beforeAutospacing="1" w:after="100" w:afterAutospacing="1"/>
+        <w:rPr>
+          <w:rFonts w:eastAsia="Times New Roman"/>
+          <w:sz w:val="24"/>
+          <w:szCs w:val="24"/>
+        </w:rPr>
+      </w:pPr>
+      <w:r>
+        <w:rPr>
+          <w:rFonts w:eastAsia="Times New Roman"/>
+          <w:b/>
+          <w:bCs/>
+          <w:sz w:val="24"/>
+          <w:szCs w:val="24"/>
+        </w:rPr>
+        <w:t>1. Data Loading (INSERT statements)</w:t>
+      </w:r>
+      <w:r>
+        <w:rPr>
+          <w:rFonts w:eastAsia="Times New Roman"/>
+          <w:b/>
+          <w:bCs/>
+          <w:sz w:val="24"/>
+          <w:szCs w:val="24"/>
+        </w:rPr>
+        <w:t>:</w:t>
+      </w:r>
+    </w:p>
+    <w:p>
+      <w:pPr>
+        <w:spacing w:before="100" w:beforeAutospacing="1" w:after="100" w:afterAutospacing="1"/>
+        <w:rPr>
+          <w:rFonts w:eastAsia="Times New Roman"/>
+          <w:sz w:val="24"/>
+          <w:szCs w:val="24"/>
+        </w:rPr>
+      </w:pPr>
+      <w:r>
+        <w:rPr>
+          <w:rFonts w:eastAsia="Times New Roman"/>
+          <w:sz w:val="24"/>
+          <w:szCs w:val="24"/>
+        </w:rPr>
+        <w:t>All 665 rows were loaded across 7 tables using multi-row INSERT statements in foreign-key-safe order:</w:t>
+      </w:r>
+    </w:p>
+    <w:tbl>
+      <w:tblPr>
+        <w:tblStyle w:val="TableGrid"/>
+        <w:tblW w:w="0" w:type="auto"/>
+        <w:tblLook w:val="04A0" w:firstRow="1" w:lastRow="0" w:firstColumn="1" w:lastColumn="0" w:noHBand="0" w:noVBand="1"/>
+      </w:tblPr>
+      <w:tblGrid>
+        <w:gridCol w:w="1644"/>
+        <w:gridCol w:w="1857"/>
+      </w:tblGrid>
+      <w:tr>
+        <w:tc>
+          <w:tcPr>
+            <w:tcW w:w="0" w:type="auto"/>
+            <w:hideMark/>
+          </w:tcPr>
+          <w:p>
+            <w:pPr>
+              <w:rPr>
+                <w:rFonts w:eastAsia="Times New Roman"/>
+                <w:b/>
+                <w:bCs/>
+                <w:sz w:val="24"/>
+                <w:szCs w:val="24"/>
+              </w:rPr>
+            </w:pPr>
+            <w:r>
+              <w:rPr>
+                <w:rFonts w:eastAsia="Times New Roman"/>
+                <w:b/>
+                <w:bCs/>
+                <w:sz w:val="24"/>
+                <w:szCs w:val="24"/>
+              </w:rPr>
+              <w:t>Table</w:t>
+            </w:r>
+          </w:p>
+        </w:tc>
+        <w:tc>
+          <w:tcPr>
+            <w:tcW w:w="0" w:type="auto"/>
+            <w:hideMark/>
+          </w:tcPr>
+          <w:p>
+            <w:pPr>
+              <w:jc w:val="center"/>
+              <w:rPr>
+                <w:rFonts w:eastAsia="Times New Roman"/>
+                <w:b/>
+                <w:bCs/>
+                <w:sz w:val="24"/>
+                <w:szCs w:val="24"/>
+              </w:rPr>
+            </w:pPr>
+            <w:r>
+              <w:rPr>
+                <w:rFonts w:eastAsia="Times New Roman"/>
+                <w:b/>
+                <w:bCs/>
+                <w:sz w:val="24"/>
+                <w:szCs w:val="24"/>
+              </w:rPr>
+              <w:t>Rows Inserted</w:t>
+            </w:r>
+          </w:p>
+        </w:tc>
+      </w:tr>
+      <w:tr>
+        <w:tc>
+          <w:tcPr>
+            <w:tcW w:w="0" w:type="auto"/>
+            <w:hideMark/>
+          </w:tcPr>
+          <w:p>
+            <w:pPr>
+              <w:rPr>
+                <w:rFonts w:eastAsia="Times New Roman"/>
+                <w:sz w:val="24"/>
+                <w:szCs w:val="24"/>
+              </w:rPr>
+            </w:pPr>
+            <w:r>
+              <w:rPr>
+                <w:rFonts w:eastAsia="Times New Roman"/>
+                <w:sz w:val="24"/>
+                <w:szCs w:val="24"/>
+              </w:rPr>
+              <w:t>Users</w:t>
+            </w:r>
+          </w:p>
+        </w:tc>
+        <w:tc>
+          <w:tcPr>
+            <w:tcW w:w="0" w:type="auto"/>
+            <w:hideMark/>
+          </w:tcPr>
+          <w:p>
+            <w:pPr>
+              <w:rPr>
+                <w:rFonts w:eastAsia="Times New Roman"/>
+                <w:sz w:val="24"/>
+                <w:szCs w:val="24"/>
+              </w:rPr>
+            </w:pPr>
+            <w:r>
+              <w:rPr>
+                <w:rFonts w:eastAsia="Times New Roman"/>
+                <w:sz w:val="24"/>
+                <w:szCs w:val="24"/>
+              </w:rPr>
+              <w:t>75</w:t>
+            </w:r>
+          </w:p>
+        </w:tc>
+      </w:tr>
+      <w:tr>
+        <w:tc>
+          <w:tcPr>
+            <w:tcW w:w="0" w:type="auto"/>
+            <w:hideMark/>
+          </w:tcPr>
+          <w:p>
+            <w:pPr>
+              <w:rPr>
+                <w:rFonts w:eastAsia="Times New Roman"/>
+                <w:sz w:val="24"/>
+                <w:szCs w:val="24"/>
+              </w:rPr>
+            </w:pPr>
+            <w:r>
+              <w:rPr>
+                <w:rFonts w:eastAsia="Times New Roman"/>
+                <w:sz w:val="24"/>
+                <w:szCs w:val="24"/>
+              </w:rPr>
+              <w:t>Trips</w:t>
+            </w:r>
+          </w:p>
+        </w:tc>
+        <w:tc>
+          <w:tcPr>
+            <w:tcW w:w="0" w:type="auto"/>
+            <w:hideMark/>
+          </w:tcPr>
+          <w:p>
+            <w:pPr>
+              <w:rPr>
+                <w:rFonts w:eastAsia="Times New Roman"/>
+                <w:sz w:val="24"/>
+                <w:szCs w:val="24"/>
+              </w:rPr>
+            </w:pPr>
+            <w:r>
+              <w:rPr>
+                <w:rFonts w:eastAsia="Times New Roman"/>
+                <w:sz w:val="24"/>
+                <w:szCs w:val="24"/>
+              </w:rPr>
+              <w:t>90</w:t>
+            </w:r>
+          </w:p>
+        </w:tc>
+      </w:tr>
+      <w:tr>
+        <w:tc>
+          <w:tcPr>
+            <w:tcW w:w="0" w:type="auto"/>
+            <w:hideMark/>
+          </w:tcPr>
+          <w:p>
+            <w:pPr>
+              <w:rPr>
+                <w:rFonts w:eastAsia="Times New Roman"/>
+                <w:sz w:val="24"/>
+                <w:szCs w:val="24"/>
+              </w:rPr>
+            </w:pPr>
+            <w:r>
+              <w:rPr>
+                <w:rFonts w:eastAsia="Times New Roman"/>
+                <w:sz w:val="24"/>
+                <w:szCs w:val="24"/>
+              </w:rPr>
+              <w:t>Destinations</w:t>
+            </w:r>
+          </w:p>
+        </w:tc>
+        <w:tc>
+          <w:tcPr>
+            <w:tcW w:w="0" w:type="auto"/>
+            <w:hideMark/>
+          </w:tcPr>
+          <w:p>
+            <w:pPr>
+              <w:rPr>
+                <w:rFonts w:eastAsia="Times New Roman"/>
+                <w:sz w:val="24"/>
+                <w:szCs w:val="24"/>
+              </w:rPr>
+            </w:pPr>
+            <w:r>
+              <w:rPr>
+                <w:rFonts w:eastAsia="Times New Roman"/>
+                <w:sz w:val="24"/>
+                <w:szCs w:val="24"/>
+              </w:rPr>
+              <w:t>100</w:t>
+            </w:r>
+          </w:p>
+        </w:tc>
+      </w:tr>
+      <w:tr>
+        <w:tc>
+          <w:tcPr>
+            <w:tcW w:w="0" w:type="auto"/>
+            <w:hideMark/>
+          </w:tcPr>
+          <w:p>
+            <w:pPr>
+              <w:rPr>
+                <w:rFonts w:eastAsia="Times New Roman"/>
+                <w:sz w:val="24"/>
+                <w:szCs w:val="24"/>
+              </w:rPr>
+            </w:pPr>
+            <w:r>
+              <w:rPr>
+                <w:rFonts w:eastAsia="Times New Roman"/>
+                <w:sz w:val="24"/>
+                <w:szCs w:val="24"/>
+              </w:rPr>
+              <w:t>Hotels</w:t>
+            </w:r>
+          </w:p>
+        </w:tc>
+        <w:tc>
+          <w:tcPr>
+            <w:tcW w:w="0" w:type="auto"/>
+            <w:hideMark/>
+          </w:tcPr>
+          <w:p>
+            <w:pPr>
+              <w:rPr>
+                <w:rFonts w:eastAsia="Times New Roman"/>
+                <w:sz w:val="24"/>
+                <w:szCs w:val="24"/>
+              </w:rPr>
+            </w:pPr>
+            <w:r>
+              <w:rPr>
+                <w:rFonts w:eastAsia="Times New Roman"/>
+                <w:sz w:val="24"/>
+                <w:szCs w:val="24"/>
+              </w:rPr>
+              <w:t>100</w:t>
+            </w:r>
+          </w:p>
+        </w:tc>
+      </w:tr>
+      <w:tr>
+        <w:tc>
+          <w:tcPr>
+            <w:tcW w:w="0" w:type="auto"/>
+            <w:hideMark/>
+          </w:tcPr>
+          <w:p>
+            <w:pPr>
+              <w:rPr>
+                <w:rFonts w:eastAsia="Times New Roman"/>
+                <w:sz w:val="24"/>
+                <w:szCs w:val="24"/>
+              </w:rPr>
+            </w:pPr>
+            <w:r>
+              <w:rPr>
+                <w:rFonts w:eastAsia="Times New Roman"/>
+                <w:sz w:val="24"/>
+                <w:szCs w:val="24"/>
+              </w:rPr>
+              <w:t>Activities</w:t>
+            </w:r>
+          </w:p>
+        </w:tc>
+        <w:tc>
+          <w:tcPr>
+            <w:tcW w:w="0" w:type="auto"/>
+            <w:hideMark/>
+          </w:tcPr>
+          <w:p>
+            <w:pPr>
+              <w:rPr>
+                <w:rFonts w:eastAsia="Times New Roman"/>
+                <w:sz w:val="24"/>
+                <w:szCs w:val="24"/>
+              </w:rPr>
+            </w:pPr>
+            <w:r>
+              <w:rPr>
+                <w:rFonts w:eastAsia="Times New Roman"/>
+                <w:sz w:val="24"/>
+                <w:szCs w:val="24"/>
+              </w:rPr>
+              <w:t>100</w:t>
+            </w:r>
+          </w:p>
+        </w:tc>
+      </w:tr>
+      <w:tr>
+        <w:tc>
+          <w:tcPr>
+            <w:tcW w:w="0" w:type="auto"/>
+            <w:hideMark/>
+          </w:tcPr>
+          <w:p>
+            <w:pPr>
+              <w:rPr>
+                <w:rFonts w:eastAsia="Times New Roman"/>
+                <w:sz w:val="24"/>
+                <w:szCs w:val="24"/>
+              </w:rPr>
+            </w:pPr>
+            <w:r>
+              <w:rPr>
+                <w:rFonts w:eastAsia="Times New Roman"/>
+                <w:sz w:val="24"/>
+                <w:szCs w:val="24"/>
+              </w:rPr>
+              <w:t>Expenses</w:t>
+            </w:r>
+          </w:p>
+        </w:tc>
+        <w:tc>
+          <w:tcPr>
+            <w:tcW w:w="0" w:type="auto"/>
+            <w:hideMark/>
+          </w:tcPr>
+          <w:p>
+            <w:pPr>
+              <w:rPr>
+                <w:rFonts w:eastAsia="Times New Roman"/>
+                <w:sz w:val="24"/>
+                <w:szCs w:val="24"/>
+              </w:rPr>
+            </w:pPr>
+            <w:r>
+              <w:rPr>
+                <w:rFonts w:eastAsia="Times New Roman"/>
+                <w:sz w:val="24"/>
+                <w:szCs w:val="24"/>
+              </w:rPr>
+              <w:t>100</w:t>
+            </w:r>
+          </w:p>
+        </w:tc>
+      </w:tr>
+      <w:tr>
+        <w:tc>
+          <w:tcPr>
+            <w:tcW w:w="0" w:type="auto"/>
+            <w:hideMark/>
+          </w:tcPr>
+          <w:p>
+            <w:pPr>
+              <w:rPr>
+                <w:rFonts w:eastAsia="Times New Roman"/>
+                <w:sz w:val="24"/>
+                <w:szCs w:val="24"/>
+              </w:rPr>
+            </w:pPr>
+            <w:proofErr w:type="spellStart"/>
+            <w:r>
+              <w:rPr>
+                <w:rFonts w:eastAsia="Times New Roman"/>
+                <w:sz w:val="24"/>
+                <w:szCs w:val="24"/>
+              </w:rPr>
+              <w:t>DaySchedule</w:t>
+            </w:r>
+            <w:proofErr w:type="spellEnd"/>
+          </w:p>
+        </w:tc>
+        <w:tc>
+          <w:tcPr>
+            <w:tcW w:w="0" w:type="auto"/>
+            <w:hideMark/>
+          </w:tcPr>
+          <w:p>
+            <w:pPr>
+              <w:rPr>
+                <w:rFonts w:eastAsia="Times New Roman"/>
+                <w:sz w:val="24"/>
+                <w:szCs w:val="24"/>
+              </w:rPr>
+            </w:pPr>
+            <w:r>
+              <w:rPr>
+                <w:rFonts w:eastAsia="Times New Roman"/>
+                <w:sz w:val="24"/>
+                <w:szCs w:val="24"/>
+              </w:rPr>
+              <w:t>100</w:t>
+            </w:r>
+          </w:p>
+        </w:tc>
+      </w:tr>
+    </w:tbl>
+    <w:p>
+      <w:pPr>
+        <w:spacing w:before="100" w:beforeAutospacing="1" w:after="100" w:afterAutospacing="1"/>
+        <w:rPr>
+          <w:rFonts w:eastAsia="Times New Roman"/>
+          <w:sz w:val="24"/>
+          <w:szCs w:val="24"/>
+        </w:rPr>
+      </w:pPr>
+      <w:r>
+        <w:rPr>
+          <w:rFonts w:eastAsia="Times New Roman"/>
+          <w:sz w:val="24"/>
+          <w:szCs w:val="24"/>
+        </w:rPr>
+        <w:t>Data was sourced from preprocessed Excel files (</w:t>
+      </w:r>
+      <w:r>
+        <w:rPr>
+          <w:rFonts w:eastAsia="Times New Roman"/>
+          <w:sz w:val="20"/>
+          <w:szCs w:val="20"/>
+        </w:rPr>
+        <w:t>.</w:t>
+      </w:r>
+      <w:proofErr w:type="spellStart"/>
+      <w:r>
+        <w:rPr>
+          <w:rFonts w:eastAsia="Times New Roman"/>
+          <w:sz w:val="20"/>
+          <w:szCs w:val="20"/>
+        </w:rPr>
+        <w:t>xltx</w:t>
+      </w:r>
+      <w:proofErr w:type="spellEnd"/>
+      <w:r>
+        <w:rPr>
+          <w:rFonts w:eastAsia="Times New Roman"/>
+          <w:sz w:val="24"/>
+          <w:szCs w:val="24"/>
+        </w:rPr>
+        <w:t xml:space="preserve">) prepared in Milestone 3. Tables were loaded in dependency order (Users → Trips → Destinations → Hotels → Activities → Expenses → </w:t>
+      </w:r>
+      <w:proofErr w:type="spellStart"/>
+      <w:r>
+        <w:rPr>
+          <w:rFonts w:eastAsia="Times New Roman"/>
+          <w:sz w:val="24"/>
+          <w:szCs w:val="24"/>
+        </w:rPr>
+        <w:t>DaySchedule</w:t>
+      </w:r>
+      <w:proofErr w:type="spellEnd"/>
+      <w:r>
+        <w:rPr>
+          <w:rFonts w:eastAsia="Times New Roman"/>
+          <w:sz w:val="24"/>
+          <w:szCs w:val="24"/>
+        </w:rPr>
+        <w:t xml:space="preserve">) to respect foreign key constraints. </w:t>
+      </w:r>
+      <w:r>
+        <w:rPr>
+          <w:rFonts w:eastAsia="Times New Roman"/>
+          <w:sz w:val="20"/>
+          <w:szCs w:val="20"/>
+        </w:rPr>
+        <w:t>SET FOREIGN_KEY_CHECKS = 0</w:t>
+      </w:r>
+      <w:r>
+        <w:rPr>
+          <w:rFonts w:eastAsia="Times New Roman"/>
+          <w:sz w:val="24"/>
+          <w:szCs w:val="24"/>
+        </w:rPr>
+        <w:t xml:space="preserve"> was used during the bulk load for efficiency, then re-enabled after.</w:t>
+      </w:r>
+    </w:p>
+    <w:p>
+      <w:pPr>
+        <w:spacing w:before="100" w:beforeAutospacing="1" w:after="100" w:afterAutospacing="1"/>
+        <w:rPr>
+          <w:rFonts w:eastAsia="Times New Roman"/>
+          <w:sz w:val="24"/>
+          <w:szCs w:val="24"/>
+        </w:rPr>
+      </w:pPr>
+      <w:r>
+        <w:rPr>
+          <w:rFonts w:eastAsia="Times New Roman"/>
+          <w:b/>
+          <w:bCs/>
+          <w:sz w:val="24"/>
+          <w:szCs w:val="24"/>
+        </w:rPr>
+        <w:t>2. UPDATE Operations</w:t>
+      </w:r>
+      <w:r>
+        <w:rPr>
+          <w:rFonts w:eastAsia="Times New Roman"/>
+          <w:b/>
+          <w:bCs/>
+          <w:sz w:val="24"/>
+          <w:szCs w:val="24"/>
+        </w:rPr>
+        <w:t>:</w:t>
+      </w:r>
+    </w:p>
+    <w:p>
+      <w:pPr>
+        <w:spacing w:before="100" w:beforeAutospacing="1" w:after="100" w:afterAutospacing="1"/>
+        <w:rPr>
+          <w:rFonts w:eastAsia="Times New Roman"/>
+          <w:sz w:val="24"/>
+          <w:szCs w:val="24"/>
+        </w:rPr>
+      </w:pPr>
+      <w:r>
+        <w:rPr>
+          <w:rFonts w:eastAsia="Times New Roman"/>
+          <w:sz w:val="24"/>
+          <w:szCs w:val="24"/>
+        </w:rPr>
+        <w:t>Three UPDATE statements with WHERE conditions were demonstrated:</w:t>
+      </w:r>
+    </w:p>
+    <w:p>
+      <w:pPr>
+        <w:numPr>
+          <w:ilvl w:val="0"/>
+          <w:numId w:val="2"/>
+        </w:numPr>
+        <w:spacing w:before="100" w:beforeAutospacing="1" w:after="100" w:afterAutospacing="1"/>
+        <w:rPr>
+          <w:rFonts w:eastAsia="Times New Roman"/>
+          <w:sz w:val="24"/>
+          <w:szCs w:val="24"/>
+        </w:rPr>
+      </w:pPr>
+      <w:r>
+        <w:rPr>
+          <w:rFonts w:eastAsia="Times New Roman"/>
+          <w:sz w:val="24"/>
+          <w:szCs w:val="24"/>
+        </w:rPr>
+        <w:t xml:space="preserve">Updated </w:t>
+      </w:r>
+      <w:proofErr w:type="spellStart"/>
+      <w:r>
+        <w:rPr>
+          <w:rFonts w:eastAsia="Times New Roman"/>
+          <w:b/>
+          <w:sz w:val="24"/>
+          <w:szCs w:val="24"/>
+        </w:rPr>
+        <w:t>TotalBudget</w:t>
+      </w:r>
+      <w:proofErr w:type="spellEnd"/>
+      <w:r>
+        <w:rPr>
+          <w:rFonts w:eastAsia="Times New Roman"/>
+          <w:sz w:val="24"/>
+          <w:szCs w:val="24"/>
+        </w:rPr>
+        <w:t xml:space="preserve"> by 10% for all trips belonging to a specific user</w:t>
+      </w:r>
+    </w:p>
+    <w:p>
+      <w:pPr>
+        <w:numPr>
+          <w:ilvl w:val="0"/>
+          <w:numId w:val="2"/>
+        </w:numPr>
+        <w:spacing w:before="100" w:beforeAutospacing="1" w:after="100" w:afterAutospacing="1"/>
+        <w:rPr>
+          <w:rFonts w:eastAsia="Times New Roman"/>
+          <w:sz w:val="24"/>
+          <w:szCs w:val="24"/>
+        </w:rPr>
+      </w:pPr>
+      <w:r>
+        <w:rPr>
+          <w:rFonts w:eastAsia="Times New Roman"/>
+          <w:sz w:val="24"/>
+          <w:szCs w:val="24"/>
+        </w:rPr>
+        <w:t xml:space="preserve">Corrected </w:t>
+      </w:r>
+      <w:proofErr w:type="spellStart"/>
+      <w:r>
+        <w:rPr>
+          <w:rFonts w:eastAsia="Times New Roman"/>
+          <w:b/>
+          <w:sz w:val="24"/>
+          <w:szCs w:val="24"/>
+        </w:rPr>
+        <w:t>CostPerNight</w:t>
+      </w:r>
+      <w:proofErr w:type="spellEnd"/>
+      <w:r>
+        <w:rPr>
+          <w:rFonts w:eastAsia="Times New Roman"/>
+          <w:sz w:val="24"/>
+          <w:szCs w:val="24"/>
+        </w:rPr>
+        <w:t xml:space="preserve"> for a specific hotel by </w:t>
+      </w:r>
+      <w:proofErr w:type="spellStart"/>
+      <w:r>
+        <w:rPr>
+          <w:rFonts w:eastAsia="Times New Roman"/>
+          <w:sz w:val="24"/>
+          <w:szCs w:val="24"/>
+        </w:rPr>
+        <w:t>HotelID</w:t>
+      </w:r>
+      <w:proofErr w:type="spellEnd"/>
+      <w:r>
+        <w:rPr>
+          <w:rFonts w:eastAsia="Times New Roman"/>
+          <w:sz w:val="24"/>
+          <w:szCs w:val="24"/>
+        </w:rPr>
+        <w:t xml:space="preserve"> and name</w:t>
+      </w:r>
+    </w:p>
+    <w:p>
+      <w:pPr>
+        <w:numPr>
+          <w:ilvl w:val="0"/>
+          <w:numId w:val="2"/>
+        </w:numPr>
+        <w:spacing w:before="100" w:beforeAutospacing="1" w:after="100" w:afterAutospacing="1"/>
+        <w:rPr>
+          <w:rFonts w:eastAsia="Times New Roman"/>
+          <w:sz w:val="24"/>
+          <w:szCs w:val="24"/>
+        </w:rPr>
+      </w:pPr>
+      <w:r>
+        <w:rPr>
+          <w:rFonts w:eastAsia="Times New Roman"/>
+          <w:sz w:val="24"/>
+          <w:szCs w:val="24"/>
+        </w:rPr>
+        <w:t>Added explanatory notes to high-value Food expenses (over $1000) that had no note</w:t>
+      </w:r>
+    </w:p>
+    <w:p>
+      <w:pPr>
+        <w:spacing w:before="100" w:beforeAutospacing="1" w:after="100" w:afterAutospacing="1"/>
+        <w:ind w:left="720"/>
+        <w:rPr>
+          <w:rFonts w:eastAsia="Times New Roman"/>
+          <w:b/>
+          <w:sz w:val="24"/>
+          <w:szCs w:val="24"/>
+        </w:rPr>
+      </w:pPr>
+      <w:r>
+        <w:rPr>
+          <w:rFonts w:eastAsia="Times New Roman"/>
+          <w:b/>
+          <w:sz w:val="24"/>
+          <w:szCs w:val="24"/>
+        </w:rPr>
+        <w:t>Before:</w:t>
+      </w:r>
+      <w:r>
+        <w:rPr>
+          <w:rFonts w:eastAsia="Times New Roman"/>
+          <w:b/>
+          <w:sz w:val="24"/>
+          <w:szCs w:val="24"/>
+        </w:rPr>
+        <w:t xml:space="preserve">                                                   After:</w:t>
+      </w:r>
+    </w:p>
+    <w:p>
+      <w:pPr>
+        <w:spacing w:before="100" w:beforeAutospacing="1" w:after="100" w:afterAutospacing="1"/>
+        <w:ind w:left="720"/>
+        <w:rPr>
+          <w:rFonts w:eastAsia="Times New Roman"/>
+          <w:sz w:val="24"/>
+          <w:szCs w:val="24"/>
+        </w:rPr>
+      </w:pPr>
+      <w:r>
+        <w:rPr>
+          <w:rFonts w:eastAsia="Times New Roman"/>
+          <w:noProof/>
+          <w:sz w:val="24"/>
+          <w:szCs w:val="24"/>
+        </w:rPr>
+        <w:drawing>
+          <wp:inline distT="0" distB="0" distL="0" distR="0" wp14:anchorId="67C1C701" wp14:editId="624D1CF8">
+            <wp:extent cx="1810003" cy="952633"/>
+            <wp:effectExtent l="0" t="0" r="0" b="0"/>
+            <wp:docPr id="18" name="Picture 18"/>
+            <wp:cNvGraphicFramePr>
+              <a:graphicFrameLocks xmlns:a="http://schemas.openxmlformats.org/drawingml/2006/main" noChangeAspect="1"/>
+            </wp:cNvGraphicFramePr>
+            <a:graphic xmlns:a="http://schemas.openxmlformats.org/drawingml/2006/main">
+              <a:graphicData uri="http://schemas.openxmlformats.org/drawingml/2006/picture">
+                <pic:pic xmlns:pic="http://schemas.openxmlformats.org/drawingml/2006/picture">
+                  <pic:nvPicPr>
+                    <pic:cNvPr id="1" name=""/>
+                    <pic:cNvPicPr/>
+                  </pic:nvPicPr>
+                  <pic:blipFill>
+                    <a:blip r:embed="rId10"/>
+                    <a:stretch>
+                      <a:fillRect/>
+                    </a:stretch>
+                  </pic:blipFill>
+                  <pic:spPr>
+                    <a:xfrm>
+                      <a:off x="0" y="0"/>
+                      <a:ext cx="1810003" cy="952633"/>
+                    </a:xfrm>
+                    <a:prstGeom prst="rect">
+                      <a:avLst/>
+                    </a:prstGeom>
+                  </pic:spPr>
+                </pic:pic>
+              </a:graphicData>
+            </a:graphic>
+          </wp:inline>
+        </w:drawing>
+      </w:r>
+      <w:r>
+        <w:rPr>
+          <w:rFonts w:eastAsia="Times New Roman"/>
+          <w:sz w:val="24"/>
+          <w:szCs w:val="24"/>
+        </w:rPr>
+        <w:t xml:space="preserve">                      </w:t>
+      </w:r>
+      <w:r>
+        <w:rPr>
+          <w:rFonts w:eastAsia="Times New Roman"/>
+          <w:noProof/>
+          <w:sz w:val="24"/>
+          <w:szCs w:val="24"/>
+        </w:rPr>
+        <w:drawing>
+          <wp:inline distT="0" distB="0" distL="0" distR="0" wp14:anchorId="23D642DD" wp14:editId="5BE06646">
+            <wp:extent cx="1545774" cy="826617"/>
+            <wp:effectExtent l="0" t="0" r="0" b="0"/>
+            <wp:docPr id="19" name="Picture 19"/>
+            <wp:cNvGraphicFramePr>
+              <a:graphicFrameLocks xmlns:a="http://schemas.openxmlformats.org/drawingml/2006/main" noChangeAspect="1"/>
+            </wp:cNvGraphicFramePr>
+            <a:graphic xmlns:a="http://schemas.openxmlformats.org/drawingml/2006/main">
+              <a:graphicData uri="http://schemas.openxmlformats.org/drawingml/2006/picture">
+                <pic:pic xmlns:pic="http://schemas.openxmlformats.org/drawingml/2006/picture">
+                  <pic:nvPicPr>
+                    <pic:cNvPr id="1" name=""/>
+                    <pic:cNvPicPr/>
+                  </pic:nvPicPr>
+                  <pic:blipFill>
+                    <a:blip r:embed="rId11"/>
+                    <a:stretch>
+                      <a:fillRect/>
+                    </a:stretch>
+                  </pic:blipFill>
+                  <pic:spPr>
+                    <a:xfrm>
+                      <a:off x="0" y="0"/>
+                      <a:ext cx="1556089" cy="832133"/>
+                    </a:xfrm>
+                    <a:prstGeom prst="rect">
+                      <a:avLst/>
+                    </a:prstGeom>
+                  </pic:spPr>
+                </pic:pic>
+              </a:graphicData>
+            </a:graphic>
+          </wp:inline>
+        </w:drawing>
+      </w:r>
+    </w:p>
+    <w:p>
+      <w:pPr>
+        <w:spacing w:before="100" w:beforeAutospacing="1" w:after="100" w:afterAutospacing="1"/>
+        <w:rPr>
+          <w:rFonts w:eastAsia="Times New Roman"/>
+          <w:b/>
+          <w:bCs/>
+          <w:sz w:val="24"/>
+          <w:szCs w:val="24"/>
+        </w:rPr>
+      </w:pPr>
+    </w:p>
+    <w:p>
+      <w:pPr>
+        <w:spacing w:before="100" w:beforeAutospacing="1" w:after="100" w:afterAutospacing="1"/>
+        <w:rPr>
+          <w:rFonts w:eastAsia="Times New Roman"/>
+          <w:b/>
+          <w:bCs/>
+          <w:sz w:val="24"/>
+          <w:szCs w:val="24"/>
+        </w:rPr>
+      </w:pPr>
+    </w:p>
+    <w:p>
+      <w:pPr>
+        <w:spacing w:before="100" w:beforeAutospacing="1" w:after="100" w:afterAutospacing="1"/>
+        <w:rPr>
+          <w:rFonts w:eastAsia="Times New Roman"/>
+          <w:sz w:val="24"/>
+          <w:szCs w:val="24"/>
+        </w:rPr>
+      </w:pPr>
+      <w:r>
+        <w:rPr>
+          <w:rFonts w:eastAsia="Times New Roman"/>
+          <w:b/>
+          <w:bCs/>
+          <w:sz w:val="24"/>
+          <w:szCs w:val="24"/>
+        </w:rPr>
+        <w:lastRenderedPageBreak/>
+        <w:t>3</w:t>
+      </w:r>
+      <w:r>
+        <w:rPr>
+          <w:rFonts w:eastAsia="Times New Roman"/>
+          <w:b/>
+          <w:bCs/>
+          <w:sz w:val="24"/>
+          <w:szCs w:val="24"/>
+        </w:rPr>
+        <w:t xml:space="preserve"> DELETE Operations</w:t>
+      </w:r>
+    </w:p>
+    <w:p>
+      <w:pPr>
+        <w:spacing w:before="100" w:beforeAutospacing="1" w:after="100" w:afterAutospacing="1"/>
+        <w:rPr>
+          <w:rFonts w:eastAsia="Times New Roman"/>
+          <w:sz w:val="24"/>
+          <w:szCs w:val="24"/>
+        </w:rPr>
+      </w:pPr>
+      <w:r>
+        <w:rPr>
+          <w:rFonts w:eastAsia="Times New Roman"/>
+          <w:sz w:val="24"/>
+          <w:szCs w:val="24"/>
+        </w:rPr>
+        <w:t>Two DELETE statements with WHERE conditions were demonstrated:</w:t>
+      </w:r>
+    </w:p>
+    <w:p>
+      <w:pPr>
+        <w:numPr>
+          <w:ilvl w:val="0"/>
+          <w:numId w:val="3"/>
+        </w:numPr>
+        <w:spacing w:before="100" w:beforeAutospacing="1" w:after="100" w:afterAutospacing="1"/>
+        <w:rPr>
+          <w:rFonts w:eastAsia="Times New Roman"/>
+          <w:sz w:val="24"/>
+          <w:szCs w:val="24"/>
+        </w:rPr>
+      </w:pPr>
+      <w:r>
+        <w:rPr>
+          <w:rFonts w:eastAsia="Times New Roman"/>
+          <w:sz w:val="24"/>
+          <w:szCs w:val="24"/>
+        </w:rPr>
+        <w:t xml:space="preserve">Removed a specific duplicate expense record by </w:t>
+      </w:r>
+      <w:proofErr w:type="spellStart"/>
+      <w:r>
+        <w:rPr>
+          <w:rFonts w:eastAsia="Times New Roman"/>
+          <w:sz w:val="24"/>
+          <w:szCs w:val="24"/>
+        </w:rPr>
+        <w:t>ExpenseID</w:t>
+      </w:r>
+      <w:proofErr w:type="spellEnd"/>
+    </w:p>
+    <w:p>
+      <w:pPr>
+        <w:numPr>
+          <w:ilvl w:val="0"/>
+          <w:numId w:val="3"/>
+        </w:numPr>
+        <w:spacing w:before="100" w:beforeAutospacing="1" w:after="100" w:afterAutospacing="1"/>
+        <w:rPr>
+          <w:rFonts w:eastAsia="Times New Roman"/>
+          <w:sz w:val="24"/>
+          <w:szCs w:val="24"/>
+        </w:rPr>
+      </w:pPr>
+      <w:r>
+        <w:rPr>
+          <w:rFonts w:eastAsia="Times New Roman"/>
+          <w:sz w:val="24"/>
+          <w:szCs w:val="24"/>
+        </w:rPr>
+        <w:t xml:space="preserve">Removed </w:t>
+      </w:r>
+      <w:proofErr w:type="spellStart"/>
+      <w:r>
+        <w:rPr>
+          <w:rFonts w:eastAsia="Times New Roman"/>
+          <w:sz w:val="24"/>
+          <w:szCs w:val="24"/>
+        </w:rPr>
+        <w:t>DaySchedule</w:t>
+      </w:r>
+      <w:proofErr w:type="spellEnd"/>
+      <w:r>
+        <w:rPr>
+          <w:rFonts w:eastAsia="Times New Roman"/>
+          <w:sz w:val="24"/>
+          <w:szCs w:val="24"/>
+        </w:rPr>
+        <w:t xml:space="preserve"> entries whose </w:t>
+      </w:r>
+      <w:proofErr w:type="spellStart"/>
+      <w:r>
+        <w:rPr>
+          <w:rFonts w:eastAsia="Times New Roman"/>
+          <w:sz w:val="24"/>
+          <w:szCs w:val="24"/>
+        </w:rPr>
+        <w:t>ScheduleDate</w:t>
+      </w:r>
+      <w:proofErr w:type="spellEnd"/>
+      <w:r>
+        <w:rPr>
+          <w:rFonts w:eastAsia="Times New Roman"/>
+          <w:sz w:val="24"/>
+          <w:szCs w:val="24"/>
+        </w:rPr>
+        <w:t xml:space="preserve"> fell before their linked trip's </w:t>
+      </w:r>
+      <w:proofErr w:type="spellStart"/>
+      <w:r>
+        <w:rPr>
+          <w:rFonts w:eastAsia="Times New Roman"/>
+          <w:sz w:val="24"/>
+          <w:szCs w:val="24"/>
+        </w:rPr>
+        <w:t>StartDate</w:t>
+      </w:r>
+      <w:proofErr w:type="spellEnd"/>
+      <w:r>
+        <w:rPr>
+          <w:rFonts w:eastAsia="Times New Roman"/>
+          <w:sz w:val="24"/>
+          <w:szCs w:val="24"/>
+        </w:rPr>
+        <w:t>, using a JOIN-based subquery for data quality cleanup</w:t>
+      </w:r>
+    </w:p>
+    <w:p>
+      <w:pPr>
+        <w:pStyle w:val="ListParagraph"/>
+        <w:spacing w:before="100" w:beforeAutospacing="1" w:after="100" w:afterAutospacing="1"/>
+        <w:ind w:left="720"/>
+        <w:rPr>
+          <w:rFonts w:eastAsia="Times New Roman"/>
+          <w:b/>
+          <w:sz w:val="24"/>
+          <w:szCs w:val="24"/>
+        </w:rPr>
+      </w:pPr>
+      <w:r>
+        <w:rPr>
+          <w:rFonts w:eastAsia="Times New Roman"/>
+          <w:b/>
+          <w:sz w:val="24"/>
+          <w:szCs w:val="24"/>
+        </w:rPr>
+        <w:t>Before:                                                   After:</w:t>
+      </w:r>
+    </w:p>
+    <w:p>
+      <w:pPr>
+        <w:spacing w:before="100" w:beforeAutospacing="1" w:after="100" w:afterAutospacing="1"/>
+        <w:rPr>
+          <w:rFonts w:eastAsia="Times New Roman"/>
+          <w:b/>
+          <w:sz w:val="24"/>
+          <w:szCs w:val="24"/>
+        </w:rPr>
+      </w:pPr>
+      <w:r>
+        <w:rPr>
+          <w:rFonts w:eastAsia="Times New Roman"/>
+          <w:sz w:val="24"/>
+          <w:szCs w:val="24"/>
+        </w:rPr>
+        <w:t xml:space="preserve">       </w:t>
+      </w:r>
+      <w:r>
+        <w:rPr>
+          <w:rFonts w:eastAsia="Times New Roman"/>
+          <w:noProof/>
+          <w:sz w:val="24"/>
+          <w:szCs w:val="24"/>
+        </w:rPr>
+        <w:drawing>
+          <wp:inline distT="0" distB="0" distL="0" distR="0" wp14:anchorId="74AE3C2A" wp14:editId="4F1A15AF">
+            <wp:extent cx="1305107" cy="685896"/>
+            <wp:effectExtent l="0" t="0" r="0" b="0"/>
+            <wp:docPr id="20" name="Picture 20"/>
+            <wp:cNvGraphicFramePr>
+              <a:graphicFrameLocks xmlns:a="http://schemas.openxmlformats.org/drawingml/2006/main" noChangeAspect="1"/>
+            </wp:cNvGraphicFramePr>
+            <a:graphic xmlns:a="http://schemas.openxmlformats.org/drawingml/2006/main">
+              <a:graphicData uri="http://schemas.openxmlformats.org/drawingml/2006/picture">
+                <pic:pic xmlns:pic="http://schemas.openxmlformats.org/drawingml/2006/picture">
+                  <pic:nvPicPr>
+                    <pic:cNvPr id="1" name=""/>
+                    <pic:cNvPicPr/>
+                  </pic:nvPicPr>
+                  <pic:blipFill>
+                    <a:blip r:embed="rId12"/>
+                    <a:stretch>
+                      <a:fillRect/>
+                    </a:stretch>
+                  </pic:blipFill>
+                  <pic:spPr>
+                    <a:xfrm>
+                      <a:off x="0" y="0"/>
+                      <a:ext cx="1305107" cy="685896"/>
+                    </a:xfrm>
+                    <a:prstGeom prst="rect">
+                      <a:avLst/>
+                    </a:prstGeom>
+                  </pic:spPr>
+                </pic:pic>
+              </a:graphicData>
+            </a:graphic>
+          </wp:inline>
+        </w:drawing>
+      </w:r>
+      <w:r>
+        <w:rPr>
+          <w:rFonts w:eastAsia="Times New Roman"/>
+          <w:sz w:val="24"/>
+          <w:szCs w:val="24"/>
+        </w:rPr>
+        <w:t xml:space="preserve">                                     </w:t>
+      </w:r>
+      <w:r>
+        <w:rPr>
+          <w:rFonts w:eastAsia="Times New Roman"/>
+          <w:noProof/>
+          <w:sz w:val="24"/>
+          <w:szCs w:val="24"/>
+        </w:rPr>
+        <w:drawing>
+          <wp:inline distT="0" distB="0" distL="0" distR="0" wp14:anchorId="30927BCB" wp14:editId="6EDD3ED9">
+            <wp:extent cx="1581371" cy="619211"/>
+            <wp:effectExtent l="0" t="0" r="0" b="0"/>
+            <wp:docPr id="21" name="Picture 21"/>
+            <wp:cNvGraphicFramePr>
+              <a:graphicFrameLocks xmlns:a="http://schemas.openxmlformats.org/drawingml/2006/main" noChangeAspect="1"/>
+            </wp:cNvGraphicFramePr>
+            <a:graphic xmlns:a="http://schemas.openxmlformats.org/drawingml/2006/main">
+              <a:graphicData uri="http://schemas.openxmlformats.org/drawingml/2006/picture">
+                <pic:pic xmlns:pic="http://schemas.openxmlformats.org/drawingml/2006/picture">
+                  <pic:nvPicPr>
+                    <pic:cNvPr id="1" name=""/>
+                    <pic:cNvPicPr/>
+                  </pic:nvPicPr>
+                  <pic:blipFill>
+                    <a:blip r:embed="rId13"/>
+                    <a:stretch>
+                      <a:fillRect/>
+                    </a:stretch>
+                  </pic:blipFill>
+                  <pic:spPr>
+                    <a:xfrm>
+                      <a:off x="0" y="0"/>
+                      <a:ext cx="1581371" cy="619211"/>
+                    </a:xfrm>
+                    <a:prstGeom prst="rect">
+                      <a:avLst/>
+                    </a:prstGeom>
+                  </pic:spPr>
+                </pic:pic>
+              </a:graphicData>
+            </a:graphic>
+          </wp:inline>
+        </w:drawing>
+      </w:r>
+    </w:p>
+    <w:p>
+      <w:pPr>
+        <w:spacing w:before="100" w:beforeAutospacing="1" w:after="100" w:afterAutospacing="1"/>
+        <w:rPr>
+          <w:rFonts w:eastAsia="Times New Roman"/>
+          <w:sz w:val="24"/>
+          <w:szCs w:val="24"/>
+        </w:rPr>
+      </w:pPr>
+      <w:r>
+        <w:rPr>
+          <w:rFonts w:eastAsia="Times New Roman"/>
+          <w:b/>
+          <w:bCs/>
+          <w:sz w:val="24"/>
+          <w:szCs w:val="24"/>
+        </w:rPr>
+        <w:t xml:space="preserve">4. Validation </w:t>
+      </w:r>
+      <w:proofErr w:type="spellStart"/>
+      <w:proofErr w:type="gramStart"/>
+      <w:r>
+        <w:rPr>
+          <w:rFonts w:eastAsia="Times New Roman"/>
+          <w:b/>
+          <w:bCs/>
+          <w:sz w:val="24"/>
+          <w:szCs w:val="24"/>
+        </w:rPr>
+        <w:t>Queries</w:t>
+      </w:r>
+      <w:r>
+        <w:rPr>
+          <w:rFonts w:eastAsia="Times New Roman"/>
+          <w:b/>
+          <w:bCs/>
+          <w:sz w:val="24"/>
+          <w:szCs w:val="24"/>
+        </w:rPr>
+        <w:t>:</w:t>
+      </w:r>
+      <w:r>
+        <w:rPr>
+          <w:rFonts w:eastAsia="Times New Roman"/>
+          <w:sz w:val="24"/>
+          <w:szCs w:val="24"/>
+        </w:rPr>
+        <w:t>Three</w:t>
+      </w:r>
+      <w:proofErr w:type="spellEnd"/>
+      <w:proofErr w:type="gramEnd"/>
+      <w:r>
+        <w:rPr>
+          <w:rFonts w:eastAsia="Times New Roman"/>
+          <w:sz w:val="24"/>
+          <w:szCs w:val="24"/>
+        </w:rPr>
+        <w:t xml:space="preserve"> categories of validation were run after loading:</w:t>
+      </w:r>
+    </w:p>
+    <w:p>
+      <w:pPr>
+        <w:spacing w:before="100" w:beforeAutospacing="1" w:after="100" w:afterAutospacing="1"/>
+        <w:rPr>
+          <w:rFonts w:eastAsia="Times New Roman"/>
+          <w:sz w:val="24"/>
+          <w:szCs w:val="24"/>
+        </w:rPr>
+      </w:pPr>
+      <w:r>
+        <w:rPr>
+          <w:rFonts w:eastAsia="Times New Roman"/>
+          <w:b/>
+          <w:bCs/>
+          <w:sz w:val="24"/>
+          <w:szCs w:val="24"/>
+        </w:rPr>
+        <w:t>Row Count Check</w:t>
+      </w:r>
+      <w:r>
+        <w:rPr>
+          <w:rFonts w:eastAsia="Times New Roman"/>
+          <w:b/>
+          <w:bCs/>
+          <w:sz w:val="24"/>
+          <w:szCs w:val="24"/>
+        </w:rPr>
+        <w:t>:</w:t>
+      </w:r>
+      <w:r>
+        <w:rPr>
+          <w:rFonts w:eastAsia="Times New Roman"/>
+          <w:sz w:val="24"/>
+          <w:szCs w:val="24"/>
+        </w:rPr>
+        <w:t xml:space="preserve"> A single UNION query confirmed correct row counts across all 7 tables using </w:t>
+      </w:r>
+      <w:proofErr w:type="gramStart"/>
+      <w:r>
+        <w:rPr>
+          <w:rFonts w:eastAsia="Times New Roman"/>
+          <w:sz w:val="24"/>
+          <w:szCs w:val="24"/>
+        </w:rPr>
+        <w:t>COUNT(</w:t>
+      </w:r>
+      <w:proofErr w:type="gramEnd"/>
+      <w:r>
+        <w:rPr>
+          <w:rFonts w:eastAsia="Times New Roman"/>
+          <w:sz w:val="24"/>
+          <w:szCs w:val="24"/>
+        </w:rPr>
+        <w:t>*).</w:t>
+      </w:r>
+    </w:p>
+    <w:p>
+      <w:pPr>
+        <w:spacing w:before="100" w:beforeAutospacing="1" w:after="100" w:afterAutospacing="1"/>
+        <w:jc w:val="center"/>
+        <w:rPr>
+          <w:rFonts w:eastAsia="Times New Roman"/>
+          <w:sz w:val="24"/>
+          <w:szCs w:val="24"/>
+        </w:rPr>
+      </w:pPr>
+      <w:r>
+        <w:rPr>
+          <w:rFonts w:eastAsia="Times New Roman"/>
+          <w:noProof/>
+          <w:sz w:val="24"/>
+          <w:szCs w:val="24"/>
+        </w:rPr>
+        <w:drawing>
+          <wp:inline distT="0" distB="0" distL="0" distR="0" wp14:anchorId="4707ECA3" wp14:editId="0847E504">
+            <wp:extent cx="5047488" cy="4424641"/>
+            <wp:effectExtent l="0" t="0" r="1270" b="0"/>
+            <wp:docPr id="4" name="Picture 4"/>
+            <wp:cNvGraphicFramePr>
+              <a:graphicFrameLocks xmlns:a="http://schemas.openxmlformats.org/drawingml/2006/main" noChangeAspect="1"/>
+            </wp:cNvGraphicFramePr>
+            <a:graphic xmlns:a="http://schemas.openxmlformats.org/drawingml/2006/main">
+              <a:graphicData uri="http://schemas.openxmlformats.org/drawingml/2006/picture">
+                <pic:pic xmlns:pic="http://schemas.openxmlformats.org/drawingml/2006/picture">
+                  <pic:nvPicPr>
+                    <pic:cNvPr id="1" name=""/>
+                    <pic:cNvPicPr/>
+                  </pic:nvPicPr>
+                  <pic:blipFill>
+                    <a:blip r:embed="rId14"/>
+                    <a:stretch>
+                      <a:fillRect/>
+                    </a:stretch>
+                  </pic:blipFill>
+                  <pic:spPr>
+                    <a:xfrm>
+                      <a:off x="0" y="0"/>
+                      <a:ext cx="5061775" cy="4437165"/>
+                    </a:xfrm>
+                    <a:prstGeom prst="rect">
+                      <a:avLst/>
+                    </a:prstGeom>
+                  </pic:spPr>
+                </pic:pic>
+              </a:graphicData>
+            </a:graphic>
+          </wp:inline>
+        </w:drawing>
+      </w:r>
+    </w:p>
+    <w:p>
+      <w:pPr>
+        <w:spacing w:before="100" w:beforeAutospacing="1" w:after="100" w:afterAutospacing="1"/>
+        <w:rPr>
+          <w:rFonts w:eastAsia="Times New Roman"/>
+          <w:b/>
+          <w:bCs/>
+          <w:sz w:val="24"/>
+          <w:szCs w:val="24"/>
+        </w:rPr>
+      </w:pPr>
+    </w:p>
+    <w:p>
+      <w:pPr>
+        <w:spacing w:before="100" w:beforeAutospacing="1" w:after="100" w:afterAutospacing="1"/>
+        <w:rPr>
+          <w:rFonts w:eastAsia="Times New Roman"/>
+          <w:sz w:val="24"/>
+          <w:szCs w:val="24"/>
+        </w:rPr>
+      </w:pPr>
+      <w:r>
+        <w:rPr>
+          <w:rFonts w:eastAsia="Times New Roman"/>
+          <w:b/>
+          <w:bCs/>
+          <w:sz w:val="24"/>
+          <w:szCs w:val="24"/>
+        </w:rPr>
+        <w:t>NULL Check</w:t>
+      </w:r>
+      <w:r>
+        <w:rPr>
+          <w:rFonts w:eastAsia="Times New Roman"/>
+          <w:b/>
+          <w:bCs/>
+          <w:sz w:val="24"/>
+          <w:szCs w:val="24"/>
+        </w:rPr>
+        <w:t>:</w:t>
+      </w:r>
+      <w:r>
+        <w:rPr>
+          <w:rFonts w:eastAsia="Times New Roman"/>
+          <w:sz w:val="24"/>
+          <w:szCs w:val="24"/>
+        </w:rPr>
+        <w:t xml:space="preserve"> Every non-</w:t>
+      </w:r>
+      <w:proofErr w:type="spellStart"/>
+      <w:r>
+        <w:rPr>
+          <w:rFonts w:eastAsia="Times New Roman"/>
+          <w:sz w:val="24"/>
+          <w:szCs w:val="24"/>
+        </w:rPr>
+        <w:t>nullable</w:t>
+      </w:r>
+      <w:proofErr w:type="spellEnd"/>
+      <w:r>
+        <w:rPr>
+          <w:rFonts w:eastAsia="Times New Roman"/>
+          <w:sz w:val="24"/>
+          <w:szCs w:val="24"/>
+        </w:rPr>
+        <w:t xml:space="preserve"> key column in all 7 tables was checked. All returned 0 NULL values, confirming data completeness.</w:t>
+      </w:r>
+    </w:p>
+    <w:p>
+      <w:pPr>
+        <w:spacing w:before="100" w:beforeAutospacing="1" w:after="100" w:afterAutospacing="1"/>
+        <w:rPr>
+          <w:noProof/>
+        </w:rPr>
+      </w:pPr>
+      <w:r>
+        <w:rPr>
+          <w:rFonts w:eastAsia="Times New Roman"/>
+          <w:noProof/>
+          <w:sz w:val="24"/>
+          <w:szCs w:val="24"/>
+        </w:rPr>
+        <w:drawing>
+          <wp:inline distT="0" distB="0" distL="0" distR="0" wp14:anchorId="6A1785B5" wp14:editId="0C2D0BAC">
+            <wp:extent cx="2238687" cy="1324160"/>
+            <wp:effectExtent l="0" t="0" r="0" b="9525"/>
+            <wp:docPr id="5" name="Picture 5"/>
+            <wp:cNvGraphicFramePr>
+              <a:graphicFrameLocks xmlns:a="http://schemas.openxmlformats.org/drawingml/2006/main" noChangeAspect="1"/>
+            </wp:cNvGraphicFramePr>
+            <a:graphic xmlns:a="http://schemas.openxmlformats.org/drawingml/2006/main">
+              <a:graphicData uri="http://schemas.openxmlformats.org/drawingml/2006/picture">
+                <pic:pic xmlns:pic="http://schemas.openxmlformats.org/drawingml/2006/picture">
+                  <pic:nvPicPr>
+                    <pic:cNvPr id="1" name=""/>
+                    <pic:cNvPicPr/>
+                  </pic:nvPicPr>
+                  <pic:blipFill>
+                    <a:blip r:embed="rId15"/>
+                    <a:stretch>
+                      <a:fillRect/>
+                    </a:stretch>
+                  </pic:blipFill>
+                  <pic:spPr>
+                    <a:xfrm>
+                      <a:off x="0" y="0"/>
+                      <a:ext cx="2238687" cy="1324160"/>
+                    </a:xfrm>
+                    <a:prstGeom prst="rect">
+                      <a:avLst/>
+                    </a:prstGeom>
+                  </pic:spPr>
+                </pic:pic>
+              </a:graphicData>
+            </a:graphic>
+          </wp:inline>
+        </w:drawing>
+      </w:r>
+      <w:r>
+        <w:rPr>
+          <w:rFonts w:eastAsia="Times New Roman"/>
+          <w:sz w:val="24"/>
+          <w:szCs w:val="24"/>
+        </w:rPr>
+        <w:t xml:space="preserve">   </w:t>
+      </w:r>
+      <w:r>
+        <w:rPr>
+          <w:rFonts w:eastAsia="Times New Roman"/>
+          <w:noProof/>
+          <w:sz w:val="24"/>
+          <w:szCs w:val="24"/>
+        </w:rPr>
+        <w:drawing>
+          <wp:inline distT="0" distB="0" distL="0" distR="0" wp14:anchorId="7D1401E5" wp14:editId="38BE9622">
+            <wp:extent cx="2381250" cy="1321613"/>
+            <wp:effectExtent l="0" t="0" r="0" b="0"/>
+            <wp:docPr id="6" name="Picture 6"/>
+            <wp:cNvGraphicFramePr>
+              <a:graphicFrameLocks xmlns:a="http://schemas.openxmlformats.org/drawingml/2006/main" noChangeAspect="1"/>
+            </wp:cNvGraphicFramePr>
+            <a:graphic xmlns:a="http://schemas.openxmlformats.org/drawingml/2006/main">
+              <a:graphicData uri="http://schemas.openxmlformats.org/drawingml/2006/picture">
+                <pic:pic xmlns:pic="http://schemas.openxmlformats.org/drawingml/2006/picture">
+                  <pic:nvPicPr>
+                    <pic:cNvPr id="1" name=""/>
+                    <pic:cNvPicPr/>
+                  </pic:nvPicPr>
+                  <pic:blipFill>
+                    <a:blip r:embed="rId16"/>
+                    <a:stretch>
+                      <a:fillRect/>
+                    </a:stretch>
+                  </pic:blipFill>
+                  <pic:spPr>
+                    <a:xfrm>
+                      <a:off x="0" y="0"/>
+                      <a:ext cx="2386124" cy="1324318"/>
+                    </a:xfrm>
+                    <a:prstGeom prst="rect">
+                      <a:avLst/>
+                    </a:prstGeom>
+                  </pic:spPr>
+                </pic:pic>
+              </a:graphicData>
+            </a:graphic>
+          </wp:inline>
+        </w:drawing>
+      </w:r>
+      <w:r>
+        <w:rPr>
+          <w:noProof/>
+        </w:rPr>
+        <w:t xml:space="preserve"> </w:t>
+      </w:r>
+    </w:p>
+    <w:p>
+      <w:pPr>
+        <w:spacing w:before="100" w:beforeAutospacing="1" w:after="100" w:afterAutospacing="1"/>
+        <w:rPr>
+          <w:rFonts w:eastAsia="Times New Roman"/>
+          <w:sz w:val="24"/>
+          <w:szCs w:val="24"/>
+        </w:rPr>
+      </w:pPr>
+      <w:r>
+        <w:rPr>
+          <w:rFonts w:eastAsia="Times New Roman"/>
+          <w:noProof/>
+          <w:sz w:val="24"/>
+          <w:szCs w:val="24"/>
+        </w:rPr>
+        <w:drawing>
+          <wp:inline distT="0" distB="0" distL="0" distR="0" wp14:anchorId="0000E308" wp14:editId="07E469AB">
+            <wp:extent cx="2421331" cy="1280909"/>
+            <wp:effectExtent l="0" t="0" r="0" b="0"/>
+            <wp:docPr id="7" name="Picture 7"/>
+            <wp:cNvGraphicFramePr>
+              <a:graphicFrameLocks xmlns:a="http://schemas.openxmlformats.org/drawingml/2006/main" noChangeAspect="1"/>
+            </wp:cNvGraphicFramePr>
+            <a:graphic xmlns:a="http://schemas.openxmlformats.org/drawingml/2006/main">
+              <a:graphicData uri="http://schemas.openxmlformats.org/drawingml/2006/picture">
+                <pic:pic xmlns:pic="http://schemas.openxmlformats.org/drawingml/2006/picture">
+                  <pic:nvPicPr>
+                    <pic:cNvPr id="1" name=""/>
+                    <pic:cNvPicPr/>
+                  </pic:nvPicPr>
+                  <pic:blipFill>
+                    <a:blip r:embed="rId17"/>
+                    <a:stretch>
+                      <a:fillRect/>
+                    </a:stretch>
+                  </pic:blipFill>
+                  <pic:spPr>
+                    <a:xfrm>
+                      <a:off x="0" y="0"/>
+                      <a:ext cx="2438843" cy="1290173"/>
+                    </a:xfrm>
+                    <a:prstGeom prst="rect">
+                      <a:avLst/>
+                    </a:prstGeom>
+                  </pic:spPr>
+                </pic:pic>
+              </a:graphicData>
+            </a:graphic>
+          </wp:inline>
+        </w:drawing>
+      </w:r>
+      <w:r>
+        <w:rPr>
+          <w:rFonts w:eastAsia="Times New Roman"/>
+          <w:sz w:val="24"/>
+          <w:szCs w:val="24"/>
+        </w:rPr>
+        <w:t xml:space="preserve">   </w:t>
+      </w:r>
+      <w:r>
+        <w:rPr>
+          <w:rFonts w:eastAsia="Times New Roman"/>
+          <w:noProof/>
+          <w:sz w:val="24"/>
+          <w:szCs w:val="24"/>
+        </w:rPr>
+        <w:drawing>
+          <wp:inline distT="0" distB="0" distL="0" distR="0" wp14:anchorId="7A0E7027" wp14:editId="588BFF66">
+            <wp:extent cx="2505425" cy="1238423"/>
+            <wp:effectExtent l="0" t="0" r="9525" b="0"/>
+            <wp:docPr id="8" name="Picture 8"/>
+            <wp:cNvGraphicFramePr>
+              <a:graphicFrameLocks xmlns:a="http://schemas.openxmlformats.org/drawingml/2006/main" noChangeAspect="1"/>
+            </wp:cNvGraphicFramePr>
+            <a:graphic xmlns:a="http://schemas.openxmlformats.org/drawingml/2006/main">
+              <a:graphicData uri="http://schemas.openxmlformats.org/drawingml/2006/picture">
+                <pic:pic xmlns:pic="http://schemas.openxmlformats.org/drawingml/2006/picture">
+                  <pic:nvPicPr>
+                    <pic:cNvPr id="1" name=""/>
+                    <pic:cNvPicPr/>
+                  </pic:nvPicPr>
+                  <pic:blipFill>
+                    <a:blip r:embed="rId18"/>
+                    <a:stretch>
+                      <a:fillRect/>
+                    </a:stretch>
+                  </pic:blipFill>
+                  <pic:spPr>
+                    <a:xfrm>
+                      <a:off x="0" y="0"/>
+                      <a:ext cx="2505425" cy="1238423"/>
+                    </a:xfrm>
+                    <a:prstGeom prst="rect">
+                      <a:avLst/>
+                    </a:prstGeom>
+                  </pic:spPr>
+                </pic:pic>
+              </a:graphicData>
+            </a:graphic>
+          </wp:inline>
+        </w:drawing>
+      </w:r>
+    </w:p>
+    <w:p>
+      <w:pPr>
+        <w:spacing w:before="100" w:beforeAutospacing="1" w:after="100" w:afterAutospacing="1"/>
+        <w:rPr>
+          <w:rFonts w:eastAsia="Times New Roman"/>
+          <w:sz w:val="24"/>
+          <w:szCs w:val="24"/>
+        </w:rPr>
+      </w:pPr>
+    </w:p>
+    <w:p>
+      <w:pPr>
+        <w:spacing w:before="100" w:beforeAutospacing="1" w:after="100" w:afterAutospacing="1"/>
+        <w:rPr>
+          <w:rFonts w:eastAsia="Times New Roman"/>
+          <w:sz w:val="24"/>
+          <w:szCs w:val="24"/>
+        </w:rPr>
+      </w:pPr>
+      <w:r>
+        <w:rPr>
+          <w:rFonts w:eastAsia="Times New Roman"/>
+          <w:noProof/>
+          <w:sz w:val="24"/>
+          <w:szCs w:val="24"/>
+        </w:rPr>
+        <w:drawing>
+          <wp:inline distT="0" distB="0" distL="0" distR="0" wp14:anchorId="1212DBE1" wp14:editId="606220E0">
+            <wp:extent cx="2534004" cy="1352739"/>
+            <wp:effectExtent l="0" t="0" r="0" b="0"/>
+            <wp:docPr id="9" name="Picture 9"/>
+            <wp:cNvGraphicFramePr>
+              <a:graphicFrameLocks xmlns:a="http://schemas.openxmlformats.org/drawingml/2006/main" noChangeAspect="1"/>
+            </wp:cNvGraphicFramePr>
+            <a:graphic xmlns:a="http://schemas.openxmlformats.org/drawingml/2006/main">
+              <a:graphicData uri="http://schemas.openxmlformats.org/drawingml/2006/picture">
+                <pic:pic xmlns:pic="http://schemas.openxmlformats.org/drawingml/2006/picture">
+                  <pic:nvPicPr>
+                    <pic:cNvPr id="1" name=""/>
+                    <pic:cNvPicPr/>
+                  </pic:nvPicPr>
+                  <pic:blipFill>
+                    <a:blip r:embed="rId19"/>
+                    <a:stretch>
+                      <a:fillRect/>
+                    </a:stretch>
+                  </pic:blipFill>
+                  <pic:spPr>
+                    <a:xfrm>
+                      <a:off x="0" y="0"/>
+                      <a:ext cx="2534004" cy="1352739"/>
+                    </a:xfrm>
+                    <a:prstGeom prst="rect">
+                      <a:avLst/>
+                    </a:prstGeom>
+                  </pic:spPr>
+                </pic:pic>
+              </a:graphicData>
+            </a:graphic>
+          </wp:inline>
+        </w:drawing>
+      </w:r>
+      <w:r>
+        <w:rPr>
+          <w:rFonts w:eastAsia="Times New Roman"/>
+          <w:sz w:val="24"/>
+          <w:szCs w:val="24"/>
+        </w:rPr>
+        <w:t xml:space="preserve">  </w:t>
+      </w:r>
+      <w:r>
+        <w:rPr>
+          <w:rFonts w:eastAsia="Times New Roman"/>
+          <w:noProof/>
+          <w:sz w:val="24"/>
+          <w:szCs w:val="24"/>
+        </w:rPr>
+        <w:drawing>
+          <wp:inline distT="0" distB="0" distL="0" distR="0" wp14:anchorId="03A08F5E" wp14:editId="7E56BA74">
+            <wp:extent cx="2591162" cy="1333686"/>
+            <wp:effectExtent l="0" t="0" r="0" b="0"/>
+            <wp:docPr id="10" name="Picture 10"/>
+            <wp:cNvGraphicFramePr>
+              <a:graphicFrameLocks xmlns:a="http://schemas.openxmlformats.org/drawingml/2006/main" noChangeAspect="1"/>
+            </wp:cNvGraphicFramePr>
+            <a:graphic xmlns:a="http://schemas.openxmlformats.org/drawingml/2006/main">
+              <a:graphicData uri="http://schemas.openxmlformats.org/drawingml/2006/picture">
+                <pic:pic xmlns:pic="http://schemas.openxmlformats.org/drawingml/2006/picture">
+                  <pic:nvPicPr>
+                    <pic:cNvPr id="1" name=""/>
+                    <pic:cNvPicPr/>
+                  </pic:nvPicPr>
+                  <pic:blipFill>
+                    <a:blip r:embed="rId20"/>
+                    <a:stretch>
+                      <a:fillRect/>
+                    </a:stretch>
+                  </pic:blipFill>
+                  <pic:spPr>
+                    <a:xfrm>
+                      <a:off x="0" y="0"/>
+                      <a:ext cx="2591162" cy="1333686"/>
+                    </a:xfrm>
+                    <a:prstGeom prst="rect">
+                      <a:avLst/>
+                    </a:prstGeom>
+                  </pic:spPr>
+                </pic:pic>
+              </a:graphicData>
+            </a:graphic>
+          </wp:inline>
+        </w:drawing>
+      </w:r>
+    </w:p>
+    <w:p>
+      <w:pPr>
+        <w:spacing w:before="100" w:beforeAutospacing="1" w:after="100" w:afterAutospacing="1"/>
+        <w:rPr>
+          <w:rFonts w:eastAsia="Times New Roman"/>
+          <w:sz w:val="24"/>
+          <w:szCs w:val="24"/>
+        </w:rPr>
+      </w:pPr>
+    </w:p>
+    <w:p>
+      <w:pPr>
+        <w:spacing w:before="100" w:beforeAutospacing="1" w:after="100" w:afterAutospacing="1"/>
+        <w:rPr>
+          <w:rFonts w:eastAsia="Times New Roman"/>
+          <w:sz w:val="24"/>
+          <w:szCs w:val="24"/>
+        </w:rPr>
+      </w:pPr>
+      <w:r>
+        <w:rPr>
+          <w:rFonts w:eastAsia="Times New Roman"/>
+          <w:noProof/>
+          <w:sz w:val="24"/>
+          <w:szCs w:val="24"/>
+        </w:rPr>
+        <w:drawing>
+          <wp:inline distT="0" distB="0" distL="0" distR="0" wp14:anchorId="09107419" wp14:editId="3134D682">
+            <wp:extent cx="2781688" cy="1200318"/>
+            <wp:effectExtent l="0" t="0" r="0" b="0"/>
+            <wp:docPr id="11" name="Picture 11"/>
+            <wp:cNvGraphicFramePr>
+              <a:graphicFrameLocks xmlns:a="http://schemas.openxmlformats.org/drawingml/2006/main" noChangeAspect="1"/>
+            </wp:cNvGraphicFramePr>
+            <a:graphic xmlns:a="http://schemas.openxmlformats.org/drawingml/2006/main">
+              <a:graphicData uri="http://schemas.openxmlformats.org/drawingml/2006/picture">
+                <pic:pic xmlns:pic="http://schemas.openxmlformats.org/drawingml/2006/picture">
+                  <pic:nvPicPr>
+                    <pic:cNvPr id="1" name=""/>
+                    <pic:cNvPicPr/>
+                  </pic:nvPicPr>
+                  <pic:blipFill>
+                    <a:blip r:embed="rId21"/>
+                    <a:stretch>
+                      <a:fillRect/>
+                    </a:stretch>
+                  </pic:blipFill>
+                  <pic:spPr>
+                    <a:xfrm>
+                      <a:off x="0" y="0"/>
+                      <a:ext cx="2781688" cy="1200318"/>
+                    </a:xfrm>
+                    <a:prstGeom prst="rect">
+                      <a:avLst/>
+                    </a:prstGeom>
+                  </pic:spPr>
+                </pic:pic>
+              </a:graphicData>
+            </a:graphic>
+          </wp:inline>
+        </w:drawing>
+      </w:r>
+    </w:p>
+    <w:p>
+      <w:pPr>
+        <w:spacing w:before="100" w:beforeAutospacing="1" w:after="100" w:afterAutospacing="1"/>
+        <w:rPr>
+          <w:rFonts w:eastAsia="Times New Roman"/>
+          <w:b/>
+          <w:bCs/>
+          <w:sz w:val="24"/>
+          <w:szCs w:val="24"/>
+        </w:rPr>
+      </w:pPr>
+    </w:p>
+    <w:p>
+      <w:pPr>
+        <w:spacing w:before="100" w:beforeAutospacing="1" w:after="100" w:afterAutospacing="1"/>
+        <w:rPr>
+          <w:rFonts w:eastAsia="Times New Roman"/>
+          <w:b/>
+          <w:bCs/>
+          <w:sz w:val="24"/>
+          <w:szCs w:val="24"/>
+        </w:rPr>
+      </w:pPr>
+    </w:p>
+    <w:p>
+      <w:pPr>
+        <w:spacing w:before="100" w:beforeAutospacing="1" w:after="100" w:afterAutospacing="1"/>
+        <w:rPr>
+          <w:rFonts w:eastAsia="Times New Roman"/>
+          <w:b/>
+          <w:bCs/>
+          <w:sz w:val="24"/>
+          <w:szCs w:val="24"/>
+        </w:rPr>
+      </w:pPr>
+    </w:p>
+    <w:p>
+      <w:pPr>
+        <w:spacing w:before="100" w:beforeAutospacing="1" w:after="100" w:afterAutospacing="1"/>
+        <w:rPr>
+          <w:rFonts w:eastAsia="Times New Roman"/>
+          <w:sz w:val="24"/>
+          <w:szCs w:val="24"/>
+        </w:rPr>
+      </w:pPr>
+      <w:r>
+        <w:rPr>
+          <w:rFonts w:eastAsia="Times New Roman"/>
+          <w:b/>
+          <w:bCs/>
+          <w:sz w:val="24"/>
+          <w:szCs w:val="24"/>
+        </w:rPr>
+        <w:t>Foreign Key Integrity (JOIN-based)</w:t>
+      </w:r>
+      <w:r>
+        <w:rPr>
+          <w:rFonts w:eastAsia="Times New Roman"/>
+          <w:b/>
+          <w:bCs/>
+          <w:sz w:val="24"/>
+          <w:szCs w:val="24"/>
+        </w:rPr>
+        <w:t>:</w:t>
+      </w:r>
+      <w:r>
+        <w:rPr>
+          <w:rFonts w:eastAsia="Times New Roman"/>
+          <w:sz w:val="24"/>
+          <w:szCs w:val="24"/>
+        </w:rPr>
+        <w:t xml:space="preserve"> Six LEFT JOIN queries were run, one per foreign key relationship:</w:t>
+      </w:r>
+    </w:p>
+    <w:p>
+      <w:pPr>
+        <w:numPr>
+          <w:ilvl w:val="0"/>
+          <w:numId w:val="4"/>
+        </w:numPr>
+        <w:spacing w:before="100" w:beforeAutospacing="1" w:after="100" w:afterAutospacing="1"/>
+        <w:rPr>
+          <w:rFonts w:eastAsia="Times New Roman"/>
+          <w:sz w:val="24"/>
+          <w:szCs w:val="24"/>
+        </w:rPr>
+      </w:pPr>
+      <w:r>
+        <w:rPr>
+          <w:rFonts w:eastAsia="Times New Roman"/>
+          <w:sz w:val="24"/>
+          <w:szCs w:val="24"/>
+        </w:rPr>
+        <w:t>Trips → Users</w:t>
+      </w:r>
+    </w:p>
+    <w:p>
+      <w:pPr>
+        <w:numPr>
+          <w:ilvl w:val="0"/>
+          <w:numId w:val="4"/>
+        </w:numPr>
+        <w:spacing w:before="100" w:beforeAutospacing="1" w:after="100" w:afterAutospacing="1"/>
+        <w:rPr>
+          <w:rFonts w:eastAsia="Times New Roman"/>
+          <w:sz w:val="24"/>
+          <w:szCs w:val="24"/>
+        </w:rPr>
+      </w:pPr>
+      <w:r>
+        <w:rPr>
+          <w:rFonts w:eastAsia="Times New Roman"/>
+          <w:sz w:val="24"/>
+          <w:szCs w:val="24"/>
+        </w:rPr>
+        <w:t>Destinations → Trips</w:t>
+      </w:r>
+    </w:p>
+    <w:p>
+      <w:pPr>
+        <w:numPr>
+          <w:ilvl w:val="0"/>
+          <w:numId w:val="4"/>
+        </w:numPr>
+        <w:spacing w:before="100" w:beforeAutospacing="1" w:after="100" w:afterAutospacing="1"/>
+        <w:rPr>
+          <w:rFonts w:eastAsia="Times New Roman"/>
+          <w:sz w:val="24"/>
+          <w:szCs w:val="24"/>
+        </w:rPr>
+      </w:pPr>
+      <w:r>
+        <w:rPr>
+          <w:rFonts w:eastAsia="Times New Roman"/>
+          <w:sz w:val="24"/>
+          <w:szCs w:val="24"/>
+        </w:rPr>
+        <w:t>Hotels → Destinations</w:t>
+      </w:r>
+    </w:p>
+    <w:p>
+      <w:pPr>
+        <w:numPr>
+          <w:ilvl w:val="0"/>
+          <w:numId w:val="4"/>
+        </w:numPr>
+        <w:spacing w:before="100" w:beforeAutospacing="1" w:after="100" w:afterAutospacing="1"/>
+        <w:rPr>
+          <w:rFonts w:eastAsia="Times New Roman"/>
+          <w:sz w:val="24"/>
+          <w:szCs w:val="24"/>
+        </w:rPr>
+      </w:pPr>
+      <w:r>
+        <w:rPr>
+          <w:rFonts w:eastAsia="Times New Roman"/>
+          <w:sz w:val="24"/>
+          <w:szCs w:val="24"/>
+        </w:rPr>
+        <w:t>Activities → Destinations</w:t>
+      </w:r>
+    </w:p>
+    <w:p>
+      <w:pPr>
+        <w:numPr>
+          <w:ilvl w:val="0"/>
+          <w:numId w:val="4"/>
+        </w:numPr>
+        <w:spacing w:before="100" w:beforeAutospacing="1" w:after="100" w:afterAutospacing="1"/>
+        <w:rPr>
+          <w:rFonts w:eastAsia="Times New Roman"/>
+          <w:sz w:val="24"/>
+          <w:szCs w:val="24"/>
+        </w:rPr>
+      </w:pPr>
+      <w:r>
+        <w:rPr>
+          <w:rFonts w:eastAsia="Times New Roman"/>
+          <w:sz w:val="24"/>
+          <w:szCs w:val="24"/>
+        </w:rPr>
+        <w:t>Expenses → Trips</w:t>
+      </w:r>
+    </w:p>
+    <w:p>
+      <w:pPr>
+        <w:numPr>
+          <w:ilvl w:val="0"/>
+          <w:numId w:val="4"/>
+        </w:numPr>
+        <w:spacing w:before="100" w:beforeAutospacing="1" w:after="100" w:afterAutospacing="1"/>
+        <w:rPr>
+          <w:rFonts w:eastAsia="Times New Roman"/>
+          <w:sz w:val="24"/>
+          <w:szCs w:val="24"/>
+        </w:rPr>
+      </w:pPr>
+      <w:proofErr w:type="spellStart"/>
+      <w:r>
+        <w:rPr>
+          <w:rFonts w:eastAsia="Times New Roman"/>
+          <w:sz w:val="24"/>
+          <w:szCs w:val="24"/>
+        </w:rPr>
+        <w:t>DaySchedule</w:t>
+      </w:r>
+      <w:proofErr w:type="spellEnd"/>
+      <w:r>
+        <w:rPr>
+          <w:rFonts w:eastAsia="Times New Roman"/>
+          <w:sz w:val="24"/>
+          <w:szCs w:val="24"/>
+        </w:rPr>
+        <w:t xml:space="preserve"> → Trips</w:t>
+      </w:r>
+    </w:p>
+    <w:p>
+      <w:pPr>
+        <w:spacing w:before="100" w:beforeAutospacing="1" w:after="100" w:afterAutospacing="1"/>
+        <w:ind w:left="720"/>
+        <w:rPr>
+          <w:rFonts w:eastAsia="Times New Roman"/>
+          <w:sz w:val="24"/>
+          <w:szCs w:val="24"/>
+        </w:rPr>
+      </w:pPr>
+      <w:r>
+        <w:rPr>
+          <w:rFonts w:eastAsia="Times New Roman"/>
+          <w:noProof/>
+          <w:sz w:val="24"/>
+          <w:szCs w:val="24"/>
+        </w:rPr>
+        <w:drawing>
+          <wp:inline distT="0" distB="0" distL="0" distR="0" wp14:anchorId="3EBCBB3F" wp14:editId="62A07B3D">
+            <wp:extent cx="1324160" cy="476316"/>
+            <wp:effectExtent l="0" t="0" r="9525" b="0"/>
+            <wp:docPr id="12" name="Picture 12"/>
+            <wp:cNvGraphicFramePr>
+              <a:graphicFrameLocks xmlns:a="http://schemas.openxmlformats.org/drawingml/2006/main" noChangeAspect="1"/>
+            </wp:cNvGraphicFramePr>
+            <a:graphic xmlns:a="http://schemas.openxmlformats.org/drawingml/2006/main">
+              <a:graphicData uri="http://schemas.openxmlformats.org/drawingml/2006/picture">
+                <pic:pic xmlns:pic="http://schemas.openxmlformats.org/drawingml/2006/picture">
+                  <pic:nvPicPr>
+                    <pic:cNvPr id="1" name=""/>
+                    <pic:cNvPicPr/>
+                  </pic:nvPicPr>
+                  <pic:blipFill>
+                    <a:blip r:embed="rId22"/>
+                    <a:stretch>
+                      <a:fillRect/>
+                    </a:stretch>
+                  </pic:blipFill>
+                  <pic:spPr>
+                    <a:xfrm>
+                      <a:off x="0" y="0"/>
+                      <a:ext cx="1324160" cy="476316"/>
+                    </a:xfrm>
+                    <a:prstGeom prst="rect">
+                      <a:avLst/>
+                    </a:prstGeom>
+                  </pic:spPr>
+                </pic:pic>
+              </a:graphicData>
+            </a:graphic>
+          </wp:inline>
+        </w:drawing>
+      </w:r>
+      <w:r>
+        <w:rPr>
+          <w:rFonts w:eastAsia="Times New Roman"/>
+          <w:sz w:val="24"/>
+          <w:szCs w:val="24"/>
+        </w:rPr>
+        <w:t xml:space="preserve">    </w:t>
+      </w:r>
+      <w:r>
+        <w:rPr>
+          <w:rFonts w:eastAsia="Times New Roman"/>
+          <w:noProof/>
+          <w:sz w:val="24"/>
+          <w:szCs w:val="24"/>
+        </w:rPr>
+        <w:drawing>
+          <wp:inline distT="0" distB="0" distL="0" distR="0" wp14:anchorId="251B8110" wp14:editId="57F9ACCA">
+            <wp:extent cx="1905266" cy="390580"/>
+            <wp:effectExtent l="0" t="0" r="0" b="9525"/>
+            <wp:docPr id="13" name="Picture 13"/>
+            <wp:cNvGraphicFramePr>
+              <a:graphicFrameLocks xmlns:a="http://schemas.openxmlformats.org/drawingml/2006/main" noChangeAspect="1"/>
+            </wp:cNvGraphicFramePr>
+            <a:graphic xmlns:a="http://schemas.openxmlformats.org/drawingml/2006/main">
+              <a:graphicData uri="http://schemas.openxmlformats.org/drawingml/2006/picture">
+                <pic:pic xmlns:pic="http://schemas.openxmlformats.org/drawingml/2006/picture">
+                  <pic:nvPicPr>
+                    <pic:cNvPr id="1" name=""/>
+                    <pic:cNvPicPr/>
+                  </pic:nvPicPr>
+                  <pic:blipFill>
+                    <a:blip r:embed="rId23"/>
+                    <a:stretch>
+                      <a:fillRect/>
+                    </a:stretch>
+                  </pic:blipFill>
+                  <pic:spPr>
+                    <a:xfrm>
+                      <a:off x="0" y="0"/>
+                      <a:ext cx="1905266" cy="390580"/>
+                    </a:xfrm>
+                    <a:prstGeom prst="rect">
+                      <a:avLst/>
+                    </a:prstGeom>
+                  </pic:spPr>
+                </pic:pic>
+              </a:graphicData>
+            </a:graphic>
+          </wp:inline>
+        </w:drawing>
+      </w:r>
+      <w:r>
+        <w:rPr>
+          <w:rFonts w:eastAsia="Times New Roman"/>
+          <w:sz w:val="24"/>
+          <w:szCs w:val="24"/>
+        </w:rPr>
+        <w:t xml:space="preserve">   </w:t>
+      </w:r>
+      <w:r>
+        <w:rPr>
+          <w:rFonts w:eastAsia="Times New Roman"/>
+          <w:noProof/>
+          <w:sz w:val="24"/>
+          <w:szCs w:val="24"/>
+        </w:rPr>
+        <w:drawing>
+          <wp:inline distT="0" distB="0" distL="0" distR="0" wp14:anchorId="5AC62C36" wp14:editId="1207E806">
+            <wp:extent cx="1880007" cy="483870"/>
+            <wp:effectExtent l="0" t="0" r="6350" b="0"/>
+            <wp:docPr id="14" name="Picture 14"/>
+            <wp:cNvGraphicFramePr>
+              <a:graphicFrameLocks xmlns:a="http://schemas.openxmlformats.org/drawingml/2006/main" noChangeAspect="1"/>
+            </wp:cNvGraphicFramePr>
+            <a:graphic xmlns:a="http://schemas.openxmlformats.org/drawingml/2006/main">
+              <a:graphicData uri="http://schemas.openxmlformats.org/drawingml/2006/picture">
+                <pic:pic xmlns:pic="http://schemas.openxmlformats.org/drawingml/2006/picture">
+                  <pic:nvPicPr>
+                    <pic:cNvPr id="1" name=""/>
+                    <pic:cNvPicPr/>
+                  </pic:nvPicPr>
+                  <pic:blipFill>
+                    <a:blip r:embed="rId24"/>
+                    <a:stretch>
+                      <a:fillRect/>
+                    </a:stretch>
+                  </pic:blipFill>
+                  <pic:spPr>
+                    <a:xfrm>
+                      <a:off x="0" y="0"/>
+                      <a:ext cx="1924707" cy="495375"/>
+                    </a:xfrm>
+                    <a:prstGeom prst="rect">
+                      <a:avLst/>
+                    </a:prstGeom>
+                  </pic:spPr>
+                </pic:pic>
+              </a:graphicData>
+            </a:graphic>
+          </wp:inline>
+        </w:drawing>
+      </w:r>
+    </w:p>
+    <w:p>
+      <w:pPr>
+        <w:spacing w:before="100" w:beforeAutospacing="1" w:after="100" w:afterAutospacing="1"/>
+        <w:ind w:left="720"/>
+        <w:rPr>
+          <w:rFonts w:eastAsia="Times New Roman"/>
+          <w:sz w:val="24"/>
+          <w:szCs w:val="24"/>
+        </w:rPr>
+      </w:pPr>
+    </w:p>
+    <w:p>
+      <w:pPr>
+        <w:spacing w:before="100" w:beforeAutospacing="1" w:after="100" w:afterAutospacing="1"/>
+        <w:ind w:left="720"/>
+        <w:rPr>
+          <w:rFonts w:eastAsia="Times New Roman"/>
+          <w:sz w:val="24"/>
+          <w:szCs w:val="24"/>
+        </w:rPr>
+      </w:pPr>
+      <w:r>
+        <w:rPr>
+          <w:rFonts w:eastAsia="Times New Roman"/>
+          <w:noProof/>
+          <w:sz w:val="24"/>
+          <w:szCs w:val="24"/>
+        </w:rPr>
+        <w:drawing>
+          <wp:inline distT="0" distB="0" distL="0" distR="0" wp14:anchorId="3DEA2803" wp14:editId="3B780E1A">
+            <wp:extent cx="1924319" cy="533474"/>
+            <wp:effectExtent l="0" t="0" r="0" b="0"/>
+            <wp:docPr id="15" name="Picture 15"/>
+            <wp:cNvGraphicFramePr>
+              <a:graphicFrameLocks xmlns:a="http://schemas.openxmlformats.org/drawingml/2006/main" noChangeAspect="1"/>
+            </wp:cNvGraphicFramePr>
+            <a:graphic xmlns:a="http://schemas.openxmlformats.org/drawingml/2006/main">
+              <a:graphicData uri="http://schemas.openxmlformats.org/drawingml/2006/picture">
+                <pic:pic xmlns:pic="http://schemas.openxmlformats.org/drawingml/2006/picture">
+                  <pic:nvPicPr>
+                    <pic:cNvPr id="1" name=""/>
+                    <pic:cNvPicPr/>
+                  </pic:nvPicPr>
+                  <pic:blipFill>
+                    <a:blip r:embed="rId25"/>
+                    <a:stretch>
+                      <a:fillRect/>
+                    </a:stretch>
+                  </pic:blipFill>
+                  <pic:spPr>
+                    <a:xfrm>
+                      <a:off x="0" y="0"/>
+                      <a:ext cx="1924319" cy="533474"/>
+                    </a:xfrm>
+                    <a:prstGeom prst="rect">
+                      <a:avLst/>
+                    </a:prstGeom>
+                  </pic:spPr>
+                </pic:pic>
+              </a:graphicData>
+            </a:graphic>
+          </wp:inline>
+        </w:drawing>
+      </w:r>
+      <w:r>
+        <w:rPr>
+          <w:rFonts w:eastAsia="Times New Roman"/>
+          <w:sz w:val="24"/>
+          <w:szCs w:val="24"/>
+        </w:rPr>
+        <w:t xml:space="preserve"> </w:t>
+      </w:r>
+      <w:r>
+        <w:rPr>
+          <w:rFonts w:eastAsia="Times New Roman"/>
+          <w:noProof/>
+          <w:sz w:val="24"/>
+          <w:szCs w:val="24"/>
+        </w:rPr>
+        <w:drawing>
+          <wp:inline distT="0" distB="0" distL="0" distR="0" wp14:anchorId="6E28A371" wp14:editId="6EF66BCE">
+            <wp:extent cx="1914792" cy="609685"/>
+            <wp:effectExtent l="0" t="0" r="9525" b="0"/>
+            <wp:docPr id="16" name="Picture 16"/>
+            <wp:cNvGraphicFramePr>
+              <a:graphicFrameLocks xmlns:a="http://schemas.openxmlformats.org/drawingml/2006/main" noChangeAspect="1"/>
+            </wp:cNvGraphicFramePr>
+            <a:graphic xmlns:a="http://schemas.openxmlformats.org/drawingml/2006/main">
+              <a:graphicData uri="http://schemas.openxmlformats.org/drawingml/2006/picture">
+                <pic:pic xmlns:pic="http://schemas.openxmlformats.org/drawingml/2006/picture">
+                  <pic:nvPicPr>
+                    <pic:cNvPr id="1" name=""/>
+                    <pic:cNvPicPr/>
+                  </pic:nvPicPr>
+                  <pic:blipFill>
+                    <a:blip r:embed="rId26"/>
+                    <a:stretch>
+                      <a:fillRect/>
+                    </a:stretch>
+                  </pic:blipFill>
+                  <pic:spPr>
+                    <a:xfrm>
+                      <a:off x="0" y="0"/>
+                      <a:ext cx="1914792" cy="609685"/>
+                    </a:xfrm>
+                    <a:prstGeom prst="rect">
+                      <a:avLst/>
+                    </a:prstGeom>
+                  </pic:spPr>
+                </pic:pic>
+              </a:graphicData>
+            </a:graphic>
+          </wp:inline>
+        </w:drawing>
+      </w:r>
+      <w:r>
+        <w:rPr>
+          <w:rFonts w:eastAsia="Times New Roman"/>
+          <w:sz w:val="24"/>
+          <w:szCs w:val="24"/>
+        </w:rPr>
+        <w:t xml:space="preserve"> </w:t>
+      </w:r>
+    </w:p>
+    <w:p>
+      <w:pPr>
+        <w:spacing w:before="100" w:beforeAutospacing="1" w:after="100" w:afterAutospacing="1"/>
+        <w:rPr>
+          <w:rFonts w:eastAsia="Times New Roman"/>
+          <w:sz w:val="24"/>
+          <w:szCs w:val="24"/>
+        </w:rPr>
+      </w:pPr>
+      <w:r>
+        <w:rPr>
+          <w:rFonts w:eastAsia="Times New Roman"/>
+          <w:sz w:val="24"/>
+          <w:szCs w:val="24"/>
+        </w:rPr>
+        <w:t>All returned 0 orphan rows, confirming referential integrity is fully intact.</w:t>
+      </w:r>
+    </w:p>
+    <w:p>
+      <w:pPr>
+        <w:spacing w:before="100" w:beforeAutospacing="1" w:after="100" w:afterAutospacing="1"/>
+        <w:rPr>
+          <w:rFonts w:eastAsia="Times New Roman"/>
+          <w:b/>
+          <w:bCs/>
+          <w:sz w:val="24"/>
+          <w:szCs w:val="24"/>
+        </w:rPr>
+      </w:pPr>
+    </w:p>
+    <w:p>
+      <w:pPr>
+        <w:spacing w:before="100" w:beforeAutospacing="1" w:after="100" w:afterAutospacing="1"/>
+        <w:rPr>
+          <w:rFonts w:eastAsia="Times New Roman"/>
+          <w:b/>
+          <w:bCs/>
+          <w:sz w:val="24"/>
+          <w:szCs w:val="24"/>
+        </w:rPr>
+      </w:pPr>
+    </w:p>
+    <w:p>
+      <w:pPr>
+        <w:spacing w:before="100" w:beforeAutospacing="1" w:after="100" w:afterAutospacing="1"/>
+        <w:rPr>
+          <w:rFonts w:eastAsia="Times New Roman"/>
+          <w:b/>
+          <w:bCs/>
+          <w:sz w:val="24"/>
+          <w:szCs w:val="24"/>
+        </w:rPr>
+      </w:pPr>
+    </w:p>
+    <w:p>
+      <w:pPr>
+        <w:spacing w:before="100" w:beforeAutospacing="1" w:after="100" w:afterAutospacing="1"/>
+        <w:rPr>
+          <w:rFonts w:eastAsia="Times New Roman"/>
+          <w:b/>
+          <w:bCs/>
+          <w:sz w:val="24"/>
+          <w:szCs w:val="24"/>
+        </w:rPr>
+      </w:pPr>
+    </w:p>
+    <w:p>
+      <w:pPr>
+        <w:spacing w:before="100" w:beforeAutospacing="1" w:after="100" w:afterAutospacing="1"/>
+        <w:rPr>
+          <w:rFonts w:eastAsia="Times New Roman"/>
+          <w:b/>
+          <w:bCs/>
+          <w:sz w:val="24"/>
+          <w:szCs w:val="24"/>
+        </w:rPr>
+      </w:pPr>
+    </w:p>
+    <w:p>
+      <w:pPr>
+        <w:spacing w:before="100" w:beforeAutospacing="1" w:after="100" w:afterAutospacing="1"/>
+        <w:rPr>
+          <w:rFonts w:eastAsia="Times New Roman"/>
+          <w:b/>
+          <w:bCs/>
+          <w:sz w:val="24"/>
+          <w:szCs w:val="24"/>
+        </w:rPr>
+      </w:pPr>
+    </w:p>
+    <w:p>
+      <w:pPr>
+        <w:spacing w:before="100" w:beforeAutospacing="1" w:after="100" w:afterAutospacing="1"/>
+        <w:rPr>
+          <w:rFonts w:eastAsia="Times New Roman"/>
+          <w:b/>
+          <w:bCs/>
+          <w:sz w:val="24"/>
+          <w:szCs w:val="24"/>
+        </w:rPr>
+      </w:pPr>
+    </w:p>
+    <w:p>
+      <w:pPr>
+        <w:spacing w:before="100" w:beforeAutospacing="1" w:after="100" w:afterAutospacing="1"/>
+        <w:rPr>
+          <w:rFonts w:eastAsia="Times New Roman"/>
+          <w:b/>
+          <w:bCs/>
+          <w:sz w:val="24"/>
+          <w:szCs w:val="24"/>
+        </w:rPr>
+      </w:pPr>
+    </w:p>
+    <w:p>
+      <w:pPr>
+        <w:spacing w:before="100" w:beforeAutospacing="1" w:after="100" w:afterAutospacing="1"/>
+        <w:rPr>
+          <w:rFonts w:eastAsia="Times New Roman"/>
+          <w:b/>
+          <w:bCs/>
+          <w:sz w:val="24"/>
+          <w:szCs w:val="24"/>
+        </w:rPr>
+      </w:pPr>
+    </w:p>
+    <w:p>
+      <w:pPr>
+        <w:spacing w:before="100" w:beforeAutospacing="1" w:after="100" w:afterAutospacing="1"/>
+        <w:rPr>
+          <w:rFonts w:eastAsia="Times New Roman"/>
+          <w:b/>
+          <w:bCs/>
+          <w:sz w:val="24"/>
+          <w:szCs w:val="24"/>
+        </w:rPr>
+      </w:pPr>
+    </w:p>
+    <w:p>
+      <w:pPr>
+        <w:spacing w:before="100" w:beforeAutospacing="1" w:after="100" w:afterAutospacing="1"/>
+        <w:rPr>
+          <w:rFonts w:eastAsia="Times New Roman"/>
+          <w:sz w:val="24"/>
+          <w:szCs w:val="24"/>
+        </w:rPr>
+      </w:pPr>
+      <w:r>
+        <w:rPr>
+          <w:rFonts w:eastAsia="Times New Roman"/>
+          <w:b/>
+          <w:bCs/>
+          <w:sz w:val="24"/>
+          <w:szCs w:val="24"/>
+        </w:rPr>
+        <w:lastRenderedPageBreak/>
+        <w:t>Bonus Cross-table JOIN</w:t>
+      </w:r>
+      <w:r>
+        <w:rPr>
+          <w:rFonts w:eastAsia="Times New Roman"/>
+          <w:b/>
+          <w:bCs/>
+          <w:sz w:val="24"/>
+          <w:szCs w:val="24"/>
+        </w:rPr>
+        <w:t>:</w:t>
+      </w:r>
+      <w:r>
+        <w:rPr>
+          <w:rFonts w:eastAsia="Times New Roman"/>
+          <w:sz w:val="24"/>
+          <w:szCs w:val="24"/>
+        </w:rPr>
+        <w:t xml:space="preserve"> A summary query joining all 5 main tables was included, showing </w:t>
+      </w:r>
+      <w:proofErr w:type="spellStart"/>
+      <w:r>
+        <w:rPr>
+          <w:rFonts w:eastAsia="Times New Roman"/>
+          <w:sz w:val="24"/>
+          <w:szCs w:val="24"/>
+        </w:rPr>
+        <w:t>traveller</w:t>
+      </w:r>
+      <w:proofErr w:type="spellEnd"/>
+      <w:r>
+        <w:rPr>
+          <w:rFonts w:eastAsia="Times New Roman"/>
+          <w:sz w:val="24"/>
+          <w:szCs w:val="24"/>
+        </w:rPr>
+        <w:t xml:space="preserve"> name, destination count, total hotel nights, total expenses, and remaining budget per trip.</w:t>
+      </w:r>
+    </w:p>
+    <w:p>
+      <w:pPr>
+        <w:pStyle w:val="Heading2"/>
+        <w:rPr>
+          <w:color w:val="auto"/>
+        </w:rPr>
+      </w:pPr>
+      <w:r>
+        <w:rPr>
+          <w:noProof/>
+          <w:color w:val="auto"/>
+        </w:rPr>
+        <w:drawing>
+          <wp:inline distT="0" distB="0" distL="0" distR="0" wp14:anchorId="3015ECBE" wp14:editId="726D86B1">
+            <wp:extent cx="5943600" cy="5337175"/>
+            <wp:effectExtent l="0" t="0" r="0" b="0"/>
+            <wp:docPr id="22" name="Picture 22"/>
+            <wp:cNvGraphicFramePr>
+              <a:graphicFrameLocks xmlns:a="http://schemas.openxmlformats.org/drawingml/2006/main" noChangeAspect="1"/>
+            </wp:cNvGraphicFramePr>
+            <a:graphic xmlns:a="http://schemas.openxmlformats.org/drawingml/2006/main">
+              <a:graphicData uri="http://schemas.openxmlformats.org/drawingml/2006/picture">
+                <pic:pic xmlns:pic="http://schemas.openxmlformats.org/drawingml/2006/picture">
+                  <pic:nvPicPr>
+                    <pic:cNvPr id="1" name=""/>
+                    <pic:cNvPicPr/>
+                  </pic:nvPicPr>
+                  <pic:blipFill>
+                    <a:blip r:embed="rId27"/>
+                    <a:stretch>
+                      <a:fillRect/>
+                    </a:stretch>
+                  </pic:blipFill>
+                  <pic:spPr>
+                    <a:xfrm>
+                      <a:off x="0" y="0"/>
+                      <a:ext cx="5943600" cy="5337175"/>
+                    </a:xfrm>
+                    <a:prstGeom prst="rect">
+                      <a:avLst/>
+                    </a:prstGeom>
+                  </pic:spPr>
+                </pic:pic>
+              </a:graphicData>
+            </a:graphic>
+          </wp:inline>
+        </w:drawing>
+      </w:r>
+    </w:p>
+    <w:p>
+      <w:pPr>
+        <w:pStyle w:val="Heading2"/>
+        <w:rPr>
+          <w:color w:val="auto"/>
+        </w:rPr>
+      </w:pPr>
+    </w:p>
+    <w:p>
+      <w:pPr>
+        <w:pStyle w:val="Heading2"/>
+        <w:rPr>
+          <w:color w:val="auto"/>
+          <w:sz w:val="24"/>
+          <w:szCs w:val="24"/>
+        </w:rPr>
+      </w:pPr>
+      <w:r>
+        <w:rPr>
+          <w:color w:val="auto"/>
+          <w:sz w:val="24"/>
+          <w:szCs w:val="24"/>
+        </w:rPr>
+        <w:t>GitHub repository link</w:t>
+      </w:r>
+      <w:r>
+        <w:rPr>
+          <w:color w:val="auto"/>
+          <w:sz w:val="24"/>
+          <w:szCs w:val="24"/>
+        </w:rPr>
+        <w:t>:</w:t>
+      </w:r>
+    </w:p>
+    <w:p>
+      <w:pPr>
+        <w:pStyle w:val="Heading2"/>
+        <w:rPr>
+          <w:color w:val="auto"/>
+          <w:sz w:val="24"/>
+          <w:szCs w:val="24"/>
+        </w:rPr>
+      </w:pPr>
+      <w:r>
+        <w:rPr>
+          <w:color w:val="auto"/>
+          <w:sz w:val="24"/>
+          <w:szCs w:val="24"/>
+        </w:rPr>
+        <w:t xml:space="preserve"> </w:t>
+      </w:r>
+      <w:hyperlink r:id="rId28" w:history="1">
+        <w:r>
+          <w:rPr>
+            <w:rStyle w:val="Hyperlink"/>
+            <w:sz w:val="24"/>
+            <w:szCs w:val="24"/>
+          </w:rPr>
+          <w:t>https://github.com/muhammadmeherali/DatabaseLabProject</w:t>
+        </w:r>
+      </w:hyperlink>
+    </w:p>
+    <w:p>
+      <w:pPr>
+        <w:pStyle w:val="Heading2"/>
+        <w:rPr>
+          <w:color w:val="auto"/>
+          <w:sz w:val="24"/>
+          <w:szCs w:val="24"/>
+        </w:rPr>
+      </w:pPr>
+      <w:hyperlink r:id="rId29" w:history="1">
+        <w:r>
+          <w:rPr>
+            <w:rStyle w:val="Hyperlink"/>
+            <w:sz w:val="24"/>
+            <w:szCs w:val="24"/>
+          </w:rPr>
+          <w:t>https://github.com/muhammadmeherali/DatabaseLabProject.git</w:t>
+        </w:r>
+      </w:hyperlink>
+    </w:p>
+    <w:p>
+      <w:pPr>
+        <w:pStyle w:val="Heading2"/>
+        <w:rPr>
+          <w:color w:val="auto"/>
+        </w:rPr>
+      </w:pPr>
+    </w:p>
     <w:sectPr>
-      <w:headerReference w:type="default" r:id="rId10"/>
-      <w:footerReference w:type="default" r:id="rId11"/>
+      <w:headerReference w:type="default" r:id="rId30"/>
+      <w:footerReference w:type="default" r:id="rId31"/>
       <w:pgSz w:w="12240" w:h="15840"/>
       <w:pgMar w:top="1440" w:right="1440" w:bottom="1440" w:left="1440" w:header="708" w:footer="708" w:gutter="0"/>
       <w:cols w:space="720"/>
@@ -12444,6 +15163,453 @@
 <file path=word/numbering.xml><?xml version="1.0" encoding="utf-8"?>
 <w:numbering xmlns:wpc="http://schemas.microsoft.com/office/word/2010/wordprocessingCanvas" xmlns:cx="http://schemas.microsoft.com/office/drawing/2014/chartex" xmlns:mc="http://schemas.openxmlformats.org/markup-compatibility/2006" xmlns:o="urn:schemas-microsoft-com:office:office" xmlns:r="http://schemas.openxmlformats.org/officeDocument/2006/relationships" xmlns:m="http://schemas.openxmlformats.org/officeDocument/2006/math" xmlns:v="urn:schemas-microsoft-com:vml" xmlns:wp14="http://schemas.microsoft.com/office/word/2010/wordprocessingDrawing" xmlns:wp="http://schemas.openxmlformats.org/drawingml/2006/wordprocessingDrawing" xmlns:w10="urn:schemas-microsoft-com:office:word" xmlns:w="http://schemas.openxmlformats.org/wordprocessingml/2006/main" xmlns:w14="http://schemas.microsoft.com/office/word/2010/wordml" xmlns:w15="http://schemas.microsoft.com/office/word/2012/wordml" xmlns:w16se="http://schemas.microsoft.com/office/word/2015/wordml/symex" xmlns:wpg="http://schemas.microsoft.com/office/word/2010/wordprocessingGroup" xmlns:wpi="http://schemas.microsoft.com/office/word/2010/wordprocessingInk" xmlns:wne="http://schemas.microsoft.com/office/word/2006/wordml" xmlns:wps="http://schemas.microsoft.com/office/word/2010/wordprocessingShape" mc:Ignorable="w14 w15 w16se wp14">
   <w:abstractNum w:abstractNumId="0" w15:restartNumberingAfterBreak="0">
+    <w:nsid w:val="09C20DA9"/>
+    <w:multiLevelType w:val="multilevel"/>
+    <w:tmpl w:val="74F0B0AE"/>
+    <w:lvl w:ilvl="0">
+      <w:start w:val="1"/>
+      <w:numFmt w:val="bullet"/>
+      <w:lvlText w:val=""/>
+      <w:lvlJc w:val="left"/>
+      <w:pPr>
+        <w:tabs>
+          <w:tab w:val="num" w:pos="720"/>
+        </w:tabs>
+        <w:ind w:left="720" w:hanging="360"/>
+      </w:pPr>
+      <w:rPr>
+        <w:rFonts w:ascii="Symbol" w:hAnsi="Symbol" w:hint="default"/>
+        <w:sz w:val="20"/>
+      </w:rPr>
+    </w:lvl>
+    <w:lvl w:ilvl="1" w:tentative="1">
+      <w:start w:val="1"/>
+      <w:numFmt w:val="bullet"/>
+      <w:lvlText w:val="o"/>
+      <w:lvlJc w:val="left"/>
+      <w:pPr>
+        <w:tabs>
+          <w:tab w:val="num" w:pos="1440"/>
+        </w:tabs>
+        <w:ind w:left="1440" w:hanging="360"/>
+      </w:pPr>
+      <w:rPr>
+        <w:rFonts w:ascii="Courier New" w:hAnsi="Courier New" w:hint="default"/>
+        <w:sz w:val="20"/>
+      </w:rPr>
+    </w:lvl>
+    <w:lvl w:ilvl="2" w:tentative="1">
+      <w:start w:val="1"/>
+      <w:numFmt w:val="bullet"/>
+      <w:lvlText w:val=""/>
+      <w:lvlJc w:val="left"/>
+      <w:pPr>
+        <w:tabs>
+          <w:tab w:val="num" w:pos="2160"/>
+        </w:tabs>
+        <w:ind w:left="2160" w:hanging="360"/>
+      </w:pPr>
+      <w:rPr>
+        <w:rFonts w:ascii="Wingdings" w:hAnsi="Wingdings" w:hint="default"/>
+        <w:sz w:val="20"/>
+      </w:rPr>
+    </w:lvl>
+    <w:lvl w:ilvl="3" w:tentative="1">
+      <w:start w:val="1"/>
+      <w:numFmt w:val="bullet"/>
+      <w:lvlText w:val=""/>
+      <w:lvlJc w:val="left"/>
+      <w:pPr>
+        <w:tabs>
+          <w:tab w:val="num" w:pos="2880"/>
+        </w:tabs>
+        <w:ind w:left="2880" w:hanging="360"/>
+      </w:pPr>
+      <w:rPr>
+        <w:rFonts w:ascii="Wingdings" w:hAnsi="Wingdings" w:hint="default"/>
+        <w:sz w:val="20"/>
+      </w:rPr>
+    </w:lvl>
+    <w:lvl w:ilvl="4" w:tentative="1">
+      <w:start w:val="1"/>
+      <w:numFmt w:val="bullet"/>
+      <w:lvlText w:val=""/>
+      <w:lvlJc w:val="left"/>
+      <w:pPr>
+        <w:tabs>
+          <w:tab w:val="num" w:pos="3600"/>
+        </w:tabs>
+        <w:ind w:left="3600" w:hanging="360"/>
+      </w:pPr>
+      <w:rPr>
+        <w:rFonts w:ascii="Wingdings" w:hAnsi="Wingdings" w:hint="default"/>
+        <w:sz w:val="20"/>
+      </w:rPr>
+    </w:lvl>
+    <w:lvl w:ilvl="5" w:tentative="1">
+      <w:start w:val="1"/>
+      <w:numFmt w:val="bullet"/>
+      <w:lvlText w:val=""/>
+      <w:lvlJc w:val="left"/>
+      <w:pPr>
+        <w:tabs>
+          <w:tab w:val="num" w:pos="4320"/>
+        </w:tabs>
+        <w:ind w:left="4320" w:hanging="360"/>
+      </w:pPr>
+      <w:rPr>
+        <w:rFonts w:ascii="Wingdings" w:hAnsi="Wingdings" w:hint="default"/>
+        <w:sz w:val="20"/>
+      </w:rPr>
+    </w:lvl>
+    <w:lvl w:ilvl="6" w:tentative="1">
+      <w:start w:val="1"/>
+      <w:numFmt w:val="bullet"/>
+      <w:lvlText w:val=""/>
+      <w:lvlJc w:val="left"/>
+      <w:pPr>
+        <w:tabs>
+          <w:tab w:val="num" w:pos="5040"/>
+        </w:tabs>
+        <w:ind w:left="5040" w:hanging="360"/>
+      </w:pPr>
+      <w:rPr>
+        <w:rFonts w:ascii="Wingdings" w:hAnsi="Wingdings" w:hint="default"/>
+        <w:sz w:val="20"/>
+      </w:rPr>
+    </w:lvl>
+    <w:lvl w:ilvl="7" w:tentative="1">
+      <w:start w:val="1"/>
+      <w:numFmt w:val="bullet"/>
+      <w:lvlText w:val=""/>
+      <w:lvlJc w:val="left"/>
+      <w:pPr>
+        <w:tabs>
+          <w:tab w:val="num" w:pos="5760"/>
+        </w:tabs>
+        <w:ind w:left="5760" w:hanging="360"/>
+      </w:pPr>
+      <w:rPr>
+        <w:rFonts w:ascii="Wingdings" w:hAnsi="Wingdings" w:hint="default"/>
+        <w:sz w:val="20"/>
+      </w:rPr>
+    </w:lvl>
+    <w:lvl w:ilvl="8" w:tentative="1">
+      <w:start w:val="1"/>
+      <w:numFmt w:val="bullet"/>
+      <w:lvlText w:val=""/>
+      <w:lvlJc w:val="left"/>
+      <w:pPr>
+        <w:tabs>
+          <w:tab w:val="num" w:pos="6480"/>
+        </w:tabs>
+        <w:ind w:left="6480" w:hanging="360"/>
+      </w:pPr>
+      <w:rPr>
+        <w:rFonts w:ascii="Wingdings" w:hAnsi="Wingdings" w:hint="default"/>
+        <w:sz w:val="20"/>
+      </w:rPr>
+    </w:lvl>
+  </w:abstractNum>
+  <w:abstractNum w:abstractNumId="1" w15:restartNumberingAfterBreak="0">
+    <w:nsid w:val="2BCF57D2"/>
+    <w:multiLevelType w:val="multilevel"/>
+    <w:tmpl w:val="C2D052F0"/>
+    <w:lvl w:ilvl="0">
+      <w:start w:val="1"/>
+      <w:numFmt w:val="bullet"/>
+      <w:lvlText w:val=""/>
+      <w:lvlJc w:val="left"/>
+      <w:pPr>
+        <w:tabs>
+          <w:tab w:val="num" w:pos="720"/>
+        </w:tabs>
+        <w:ind w:left="720" w:hanging="360"/>
+      </w:pPr>
+      <w:rPr>
+        <w:rFonts w:ascii="Symbol" w:hAnsi="Symbol" w:hint="default"/>
+        <w:sz w:val="20"/>
+      </w:rPr>
+    </w:lvl>
+    <w:lvl w:ilvl="1" w:tentative="1">
+      <w:start w:val="1"/>
+      <w:numFmt w:val="bullet"/>
+      <w:lvlText w:val="o"/>
+      <w:lvlJc w:val="left"/>
+      <w:pPr>
+        <w:tabs>
+          <w:tab w:val="num" w:pos="1440"/>
+        </w:tabs>
+        <w:ind w:left="1440" w:hanging="360"/>
+      </w:pPr>
+      <w:rPr>
+        <w:rFonts w:ascii="Courier New" w:hAnsi="Courier New" w:hint="default"/>
+        <w:sz w:val="20"/>
+      </w:rPr>
+    </w:lvl>
+    <w:lvl w:ilvl="2" w:tentative="1">
+      <w:start w:val="1"/>
+      <w:numFmt w:val="bullet"/>
+      <w:lvlText w:val=""/>
+      <w:lvlJc w:val="left"/>
+      <w:pPr>
+        <w:tabs>
+          <w:tab w:val="num" w:pos="2160"/>
+        </w:tabs>
+        <w:ind w:left="2160" w:hanging="360"/>
+      </w:pPr>
+      <w:rPr>
+        <w:rFonts w:ascii="Wingdings" w:hAnsi="Wingdings" w:hint="default"/>
+        <w:sz w:val="20"/>
+      </w:rPr>
+    </w:lvl>
+    <w:lvl w:ilvl="3" w:tentative="1">
+      <w:start w:val="1"/>
+      <w:numFmt w:val="bullet"/>
+      <w:lvlText w:val=""/>
+      <w:lvlJc w:val="left"/>
+      <w:pPr>
+        <w:tabs>
+          <w:tab w:val="num" w:pos="2880"/>
+        </w:tabs>
+        <w:ind w:left="2880" w:hanging="360"/>
+      </w:pPr>
+      <w:rPr>
+        <w:rFonts w:ascii="Wingdings" w:hAnsi="Wingdings" w:hint="default"/>
+        <w:sz w:val="20"/>
+      </w:rPr>
+    </w:lvl>
+    <w:lvl w:ilvl="4" w:tentative="1">
+      <w:start w:val="1"/>
+      <w:numFmt w:val="bullet"/>
+      <w:lvlText w:val=""/>
+      <w:lvlJc w:val="left"/>
+      <w:pPr>
+        <w:tabs>
+          <w:tab w:val="num" w:pos="3600"/>
+        </w:tabs>
+        <w:ind w:left="3600" w:hanging="360"/>
+      </w:pPr>
+      <w:rPr>
+        <w:rFonts w:ascii="Wingdings" w:hAnsi="Wingdings" w:hint="default"/>
+        <w:sz w:val="20"/>
+      </w:rPr>
+    </w:lvl>
+    <w:lvl w:ilvl="5" w:tentative="1">
+      <w:start w:val="1"/>
+      <w:numFmt w:val="bullet"/>
+      <w:lvlText w:val=""/>
+      <w:lvlJc w:val="left"/>
+      <w:pPr>
+        <w:tabs>
+          <w:tab w:val="num" w:pos="4320"/>
+        </w:tabs>
+        <w:ind w:left="4320" w:hanging="360"/>
+      </w:pPr>
+      <w:rPr>
+        <w:rFonts w:ascii="Wingdings" w:hAnsi="Wingdings" w:hint="default"/>
+        <w:sz w:val="20"/>
+      </w:rPr>
+    </w:lvl>
+    <w:lvl w:ilvl="6" w:tentative="1">
+      <w:start w:val="1"/>
+      <w:numFmt w:val="bullet"/>
+      <w:lvlText w:val=""/>
+      <w:lvlJc w:val="left"/>
+      <w:pPr>
+        <w:tabs>
+          <w:tab w:val="num" w:pos="5040"/>
+        </w:tabs>
+        <w:ind w:left="5040" w:hanging="360"/>
+      </w:pPr>
+      <w:rPr>
+        <w:rFonts w:ascii="Wingdings" w:hAnsi="Wingdings" w:hint="default"/>
+        <w:sz w:val="20"/>
+      </w:rPr>
+    </w:lvl>
+    <w:lvl w:ilvl="7" w:tentative="1">
+      <w:start w:val="1"/>
+      <w:numFmt w:val="bullet"/>
+      <w:lvlText w:val=""/>
+      <w:lvlJc w:val="left"/>
+      <w:pPr>
+        <w:tabs>
+          <w:tab w:val="num" w:pos="5760"/>
+        </w:tabs>
+        <w:ind w:left="5760" w:hanging="360"/>
+      </w:pPr>
+      <w:rPr>
+        <w:rFonts w:ascii="Wingdings" w:hAnsi="Wingdings" w:hint="default"/>
+        <w:sz w:val="20"/>
+      </w:rPr>
+    </w:lvl>
+    <w:lvl w:ilvl="8" w:tentative="1">
+      <w:start w:val="1"/>
+      <w:numFmt w:val="bullet"/>
+      <w:lvlText w:val=""/>
+      <w:lvlJc w:val="left"/>
+      <w:pPr>
+        <w:tabs>
+          <w:tab w:val="num" w:pos="6480"/>
+        </w:tabs>
+        <w:ind w:left="6480" w:hanging="360"/>
+      </w:pPr>
+      <w:rPr>
+        <w:rFonts w:ascii="Wingdings" w:hAnsi="Wingdings" w:hint="default"/>
+        <w:sz w:val="20"/>
+      </w:rPr>
+    </w:lvl>
+  </w:abstractNum>
+  <w:abstractNum w:abstractNumId="2" w15:restartNumberingAfterBreak="0">
+    <w:nsid w:val="2DEC7CBE"/>
+    <w:multiLevelType w:val="multilevel"/>
+    <w:tmpl w:val="91448838"/>
+    <w:lvl w:ilvl="0">
+      <w:start w:val="1"/>
+      <w:numFmt w:val="bullet"/>
+      <w:lvlText w:val=""/>
+      <w:lvlJc w:val="left"/>
+      <w:pPr>
+        <w:tabs>
+          <w:tab w:val="num" w:pos="720"/>
+        </w:tabs>
+        <w:ind w:left="720" w:hanging="360"/>
+      </w:pPr>
+      <w:rPr>
+        <w:rFonts w:ascii="Symbol" w:hAnsi="Symbol" w:hint="default"/>
+        <w:sz w:val="20"/>
+      </w:rPr>
+    </w:lvl>
+    <w:lvl w:ilvl="1" w:tentative="1">
+      <w:start w:val="1"/>
+      <w:numFmt w:val="bullet"/>
+      <w:lvlText w:val="o"/>
+      <w:lvlJc w:val="left"/>
+      <w:pPr>
+        <w:tabs>
+          <w:tab w:val="num" w:pos="1440"/>
+        </w:tabs>
+        <w:ind w:left="1440" w:hanging="360"/>
+      </w:pPr>
+      <w:rPr>
+        <w:rFonts w:ascii="Courier New" w:hAnsi="Courier New" w:hint="default"/>
+        <w:sz w:val="20"/>
+      </w:rPr>
+    </w:lvl>
+    <w:lvl w:ilvl="2" w:tentative="1">
+      <w:start w:val="1"/>
+      <w:numFmt w:val="bullet"/>
+      <w:lvlText w:val=""/>
+      <w:lvlJc w:val="left"/>
+      <w:pPr>
+        <w:tabs>
+          <w:tab w:val="num" w:pos="2160"/>
+        </w:tabs>
+        <w:ind w:left="2160" w:hanging="360"/>
+      </w:pPr>
+      <w:rPr>
+        <w:rFonts w:ascii="Wingdings" w:hAnsi="Wingdings" w:hint="default"/>
+        <w:sz w:val="20"/>
+      </w:rPr>
+    </w:lvl>
+    <w:lvl w:ilvl="3" w:tentative="1">
+      <w:start w:val="1"/>
+      <w:numFmt w:val="bullet"/>
+      <w:lvlText w:val=""/>
+      <w:lvlJc w:val="left"/>
+      <w:pPr>
+        <w:tabs>
+          <w:tab w:val="num" w:pos="2880"/>
+        </w:tabs>
+        <w:ind w:left="2880" w:hanging="360"/>
+      </w:pPr>
+      <w:rPr>
+        <w:rFonts w:ascii="Wingdings" w:hAnsi="Wingdings" w:hint="default"/>
+        <w:sz w:val="20"/>
+      </w:rPr>
+    </w:lvl>
+    <w:lvl w:ilvl="4" w:tentative="1">
+      <w:start w:val="1"/>
+      <w:numFmt w:val="bullet"/>
+      <w:lvlText w:val=""/>
+      <w:lvlJc w:val="left"/>
+      <w:pPr>
+        <w:tabs>
+          <w:tab w:val="num" w:pos="3600"/>
+        </w:tabs>
+        <w:ind w:left="3600" w:hanging="360"/>
+      </w:pPr>
+      <w:rPr>
+        <w:rFonts w:ascii="Wingdings" w:hAnsi="Wingdings" w:hint="default"/>
+        <w:sz w:val="20"/>
+      </w:rPr>
+    </w:lvl>
+    <w:lvl w:ilvl="5" w:tentative="1">
+      <w:start w:val="1"/>
+      <w:numFmt w:val="bullet"/>
+      <w:lvlText w:val=""/>
+      <w:lvlJc w:val="left"/>
+      <w:pPr>
+        <w:tabs>
+          <w:tab w:val="num" w:pos="4320"/>
+        </w:tabs>
+        <w:ind w:left="4320" w:hanging="360"/>
+      </w:pPr>
+      <w:rPr>
+        <w:rFonts w:ascii="Wingdings" w:hAnsi="Wingdings" w:hint="default"/>
+        <w:sz w:val="20"/>
+      </w:rPr>
+    </w:lvl>
+    <w:lvl w:ilvl="6" w:tentative="1">
+      <w:start w:val="1"/>
+      <w:numFmt w:val="bullet"/>
+      <w:lvlText w:val=""/>
+      <w:lvlJc w:val="left"/>
+      <w:pPr>
+        <w:tabs>
+          <w:tab w:val="num" w:pos="5040"/>
+        </w:tabs>
+        <w:ind w:left="5040" w:hanging="360"/>
+      </w:pPr>
+      <w:rPr>
+        <w:rFonts w:ascii="Wingdings" w:hAnsi="Wingdings" w:hint="default"/>
+        <w:sz w:val="20"/>
+      </w:rPr>
+    </w:lvl>
+    <w:lvl w:ilvl="7" w:tentative="1">
+      <w:start w:val="1"/>
+      <w:numFmt w:val="bullet"/>
+      <w:lvlText w:val=""/>
+      <w:lvlJc w:val="left"/>
+      <w:pPr>
+        <w:tabs>
+          <w:tab w:val="num" w:pos="5760"/>
+        </w:tabs>
+        <w:ind w:left="5760" w:hanging="360"/>
+      </w:pPr>
+      <w:rPr>
+        <w:rFonts w:ascii="Wingdings" w:hAnsi="Wingdings" w:hint="default"/>
+        <w:sz w:val="20"/>
+      </w:rPr>
+    </w:lvl>
+    <w:lvl w:ilvl="8" w:tentative="1">
+      <w:start w:val="1"/>
+      <w:numFmt w:val="bullet"/>
+      <w:lvlText w:val=""/>
+      <w:lvlJc w:val="left"/>
+      <w:pPr>
+        <w:tabs>
+          <w:tab w:val="num" w:pos="6480"/>
+        </w:tabs>
+        <w:ind w:left="6480" w:hanging="360"/>
+      </w:pPr>
+      <w:rPr>
+        <w:rFonts w:ascii="Wingdings" w:hAnsi="Wingdings" w:hint="default"/>
+        <w:sz w:val="20"/>
+      </w:rPr>
+    </w:lvl>
+  </w:abstractNum>
+  <w:abstractNum w:abstractNumId="3" w15:restartNumberingAfterBreak="0">
     <w:nsid w:val="3143223D"/>
     <w:multiLevelType w:val="hybridMultilevel"/>
     <w:tmpl w:val="86C84FB6"/>
@@ -12498,10 +15664,19 @@
     </w:lvl>
   </w:abstractNum>
   <w:num w:numId="1">
-    <w:abstractNumId w:val="0"/>
+    <w:abstractNumId w:val="3"/>
     <w:lvlOverride w:ilvl="0">
       <w:startOverride w:val="1"/>
     </w:lvlOverride>
+  </w:num>
+  <w:num w:numId="2">
+    <w:abstractNumId w:val="2"/>
+  </w:num>
+  <w:num w:numId="3">
+    <w:abstractNumId w:val="1"/>
+  </w:num>
+  <w:num w:numId="4">
+    <w:abstractNumId w:val="0"/>
   </w:num>
 </w:numbering>
 </file>
@@ -12899,7 +16074,7 @@
   <w:style w:type="paragraph" w:default="1" w:styleId="Normal">
     <w:name w:val="Normal"/>
     <w:qFormat/>
-    <w:rsid w:val="006B461F"/>
+    <w:rsid w:val="00E172DC"/>
     <w:pPr>
       <w:spacing w:after="0" w:line="240" w:lineRule="auto"/>
     </w:pPr>
@@ -13045,6 +16220,66 @@
       <w:rFonts w:ascii="Times New Roman" w:eastAsia="Times New Roman" w:hAnsi="Times New Roman" w:cs="Times New Roman"/>
       <w:sz w:val="24"/>
       <w:szCs w:val="24"/>
+    </w:rPr>
+  </w:style>
+  <w:style w:type="paragraph" w:customStyle="1" w:styleId="font-claude-response-body">
+    <w:name w:val="font-claude-response-body"/>
+    <w:basedOn w:val="Normal"/>
+    <w:rsid w:val="00C21FB6"/>
+    <w:pPr>
+      <w:spacing w:before="100" w:beforeAutospacing="1" w:after="100" w:afterAutospacing="1"/>
+    </w:pPr>
+    <w:rPr>
+      <w:rFonts w:ascii="Times New Roman" w:eastAsia="Times New Roman" w:hAnsi="Times New Roman" w:cs="Times New Roman"/>
+      <w:sz w:val="24"/>
+      <w:szCs w:val="24"/>
+    </w:rPr>
+  </w:style>
+  <w:style w:type="character" w:styleId="Strong">
+    <w:name w:val="Strong"/>
+    <w:basedOn w:val="DefaultParagraphFont"/>
+    <w:uiPriority w:val="22"/>
+    <w:qFormat/>
+    <w:rsid w:val="00C21FB6"/>
+    <w:rPr>
+      <w:b/>
+      <w:bCs/>
+    </w:rPr>
+  </w:style>
+  <w:style w:type="character" w:styleId="HTMLCode">
+    <w:name w:val="HTML Code"/>
+    <w:basedOn w:val="DefaultParagraphFont"/>
+    <w:uiPriority w:val="99"/>
+    <w:semiHidden/>
+    <w:unhideWhenUsed/>
+    <w:rsid w:val="00C21FB6"/>
+    <w:rPr>
+      <w:rFonts w:ascii="Courier New" w:eastAsia="Times New Roman" w:hAnsi="Courier New" w:cs="Courier New"/>
+      <w:sz w:val="20"/>
+      <w:szCs w:val="20"/>
+    </w:rPr>
+  </w:style>
+  <w:style w:type="character" w:styleId="Hyperlink">
+    <w:name w:val="Hyperlink"/>
+    <w:basedOn w:val="DefaultParagraphFont"/>
+    <w:uiPriority w:val="99"/>
+    <w:unhideWhenUsed/>
+    <w:rsid w:val="00EF3258"/>
+    <w:rPr>
+      <w:color w:val="0563C1" w:themeColor="hyperlink"/>
+      <w:u w:val="single"/>
+    </w:rPr>
+  </w:style>
+  <w:style w:type="character" w:styleId="FollowedHyperlink">
+    <w:name w:val="FollowedHyperlink"/>
+    <w:basedOn w:val="DefaultParagraphFont"/>
+    <w:uiPriority w:val="99"/>
+    <w:semiHidden/>
+    <w:unhideWhenUsed/>
+    <w:rsid w:val="00886349"/>
+    <w:rPr>
+      <w:color w:val="954F72" w:themeColor="followedHyperlink"/>
+      <w:u w:val="single"/>
     </w:rPr>
   </w:style>
 </w:styles>

</xml_diff>